<commit_message>
docs(reflect): document completion of modularization phases 1-3
</commit_message>
<xml_diff>
--- a/Documento_Tecnico_Aplicacion_Predios.docx
+++ b/Documento_Tecnico_Aplicacion_Predios.docx
@@ -11101,6 +11101,1099 @@
     </w:p>
     <w:p>
       <w:pPr>
+        <w:pStyle w:val="Heading3"/>
+        <w:spacing w:lineRule="auto"/>
+      </w:pPr>
+      <w:r>
+        <w:rPr/>
+        <w:t xml:space="preserve">12.10 [2026-08-06] [CONC-FE-02] Subdivisión modular de app_js.html — Fase 3 (Build) — cierre acumulado Fases 1-3</w:t>
+      </w:r>
+    </w:p>
+    <w:p>
+      <w:pPr>
+        <w:spacing w:lineRule="auto"/>
+      </w:pPr>
+      <w:r>
+        <w:rPr>
+          <w:b/>
+        </w:rPr>
+        <w:t xml:space="preserve">Archivo(s) Intervenido(s):</w:t>
+      </w:r>
+    </w:p>
+    <w:p>
+      <w:pPr>
+        <w:numPr>
+          <w:ilvl w:val="0"/>
+          <w:numId w:val="63"/>
+        </w:numPr>
+        <w:spacing w:lineRule="auto"/>
+      </w:pPr>
+      <w:r>
+        <w:rPr/>
+        <w:t xml:space="preserve">app_permisos_js.html</w:t>
+      </w:r>
+      <w:r>
+        <w:rPr/>
+        <w:t xml:space="preserve"> (archivo nuevo)</w:t>
+      </w:r>
+    </w:p>
+    <w:p>
+      <w:pPr>
+        <w:numPr>
+          <w:ilvl w:val="0"/>
+          <w:numId w:val="63"/>
+        </w:numPr>
+        <w:spacing w:lineRule="auto"/>
+      </w:pPr>
+      <w:r>
+        <w:rPr/>
+        <w:t xml:space="preserve">app_js.html#L2140-L2502</w:t>
+      </w:r>
+      <w:r>
+        <w:rPr/>
+        <w:t xml:space="preserve"> (bloque removido)</w:t>
+      </w:r>
+    </w:p>
+    <w:p>
+      <w:pPr>
+        <w:numPr>
+          <w:ilvl w:val="0"/>
+          <w:numId w:val="63"/>
+        </w:numPr>
+        <w:spacing w:lineRule="auto"/>
+      </w:pPr>
+      <w:r>
+        <w:rPr/>
+        <w:t xml:space="preserve">Index.html#L1595-L1598</w:t>
+      </w:r>
+      <w:r>
+        <w:rPr/>
+        <w:t xml:space="preserve"> (directiva </w:t>
+      </w:r>
+      <w:r>
+        <w:rPr/>
+        <w:t xml:space="preserve">include()</w:t>
+      </w:r>
+      <w:r>
+        <w:rPr/>
+        <w:t xml:space="preserve"> añadida)</w:t>
+      </w:r>
+    </w:p>
+    <w:p>
+      <w:pPr>
+        <w:spacing w:lineRule="auto"/>
+      </w:pPr>
+      <w:r>
+        <w:rPr>
+          <w:b/>
+        </w:rPr>
+        <w:t xml:space="preserve">Propósito del Archivo en el Sistema:</w:t>
+      </w:r>
+      <w:r>
+        <w:rPr/>
+        <w:t xml:space="preserve"> Continuación directa de 12.9 (Fases 1-2). </w:t>
+      </w:r>
+      <w:r>
+        <w:rPr/>
+        <w:t xml:space="preserve">app_permisos_js.html</w:t>
+      </w:r>
+      <w:r>
+        <w:rPr/>
+        <w:t xml:space="preserve"> concentra el dominio de gestión de usuarios, roles, reportes guardados, historial y auditoría — antes mezclado en </w:t>
+      </w:r>
+      <w:r>
+        <w:rPr/>
+        <w:t xml:space="preserve">app_js.html</w:t>
+      </w:r>
+      <w:r>
+        <w:rPr/>
+        <w:t xml:space="preserve"> junto con matriz.</w:t>
+      </w:r>
+    </w:p>
+    <w:p>
+      <w:pPr>
+        <w:spacing w:lineRule="auto"/>
+      </w:pPr>
+      <w:r>
+        <w:rPr>
+          <w:b/>
+        </w:rPr>
+        <w:t xml:space="preserve">Cambios Técnicos Realizados:</w:t>
+      </w:r>
+    </w:p>
+    <w:p>
+      <w:pPr>
+        <w:numPr>
+          <w:ilvl w:val="0"/>
+          <w:numId w:val="64"/>
+        </w:numPr>
+        <w:spacing w:lineRule="auto"/>
+      </w:pPr>
+      <w:r>
+        <w:rPr/>
+        <w:t xml:space="preserve">Extraídas las 24 funciones del dominio de permisos/reportes/auditoría: </w:t>
+      </w:r>
+      <w:r>
+        <w:rPr/>
+        <w:t xml:space="preserve">applyHistorialFilters</w:t>
+      </w:r>
+      <w:r>
+        <w:rPr/>
+        <w:t xml:space="preserve">, </w:t>
+      </w:r>
+      <w:r>
+        <w:rPr/>
+        <w:t xml:space="preserve">onHistorialLoaded</w:t>
+      </w:r>
+      <w:r>
+        <w:rPr/>
+        <w:t xml:space="preserve">, </w:t>
+      </w:r>
+      <w:r>
+        <w:rPr/>
+        <w:t xml:space="preserve">applyAuditoriaFilters</w:t>
+      </w:r>
+      <w:r>
+        <w:rPr/>
+        <w:t xml:space="preserve">, </w:t>
+      </w:r>
+      <w:r>
+        <w:rPr/>
+        <w:t xml:space="preserve">onAuditoriaLoaded</w:t>
+      </w:r>
+      <w:r>
+        <w:rPr/>
+        <w:t xml:space="preserve">, </w:t>
+      </w:r>
+      <w:r>
+        <w:rPr/>
+        <w:t xml:space="preserve">openPermissionModal</w:t>
+      </w:r>
+      <w:r>
+        <w:rPr/>
+        <w:t xml:space="preserve">, </w:t>
+      </w:r>
+      <w:r>
+        <w:rPr/>
+        <w:t xml:space="preserve">savePermission</w:t>
+      </w:r>
+      <w:r>
+        <w:rPr/>
+        <w:t xml:space="preserve">, </w:t>
+      </w:r>
+      <w:r>
+        <w:rPr/>
+        <w:t xml:space="preserve">onPermissionSaved</w:t>
+      </w:r>
+      <w:r>
+        <w:rPr/>
+        <w:t xml:space="preserve">, </w:t>
+      </w:r>
+      <w:r>
+        <w:rPr/>
+        <w:t xml:space="preserve">loadPermissions</w:t>
+      </w:r>
+      <w:r>
+        <w:rPr/>
+        <w:t xml:space="preserve">, </w:t>
+      </w:r>
+      <w:r>
+        <w:rPr/>
+        <w:t xml:space="preserve">onPermissionsLoaded</w:t>
+      </w:r>
+      <w:r>
+        <w:rPr/>
+        <w:t xml:space="preserve">, </w:t>
+      </w:r>
+      <w:r>
+        <w:rPr/>
+        <w:t xml:space="preserve">deletePermission</w:t>
+      </w:r>
+      <w:r>
+        <w:rPr/>
+        <w:t xml:space="preserve">, </w:t>
+      </w:r>
+      <w:r>
+        <w:rPr/>
+        <w:t xml:space="preserve">onPermissionDeleted</w:t>
+      </w:r>
+      <w:r>
+        <w:rPr/>
+        <w:t xml:space="preserve">, </w:t>
+      </w:r>
+      <w:r>
+        <w:rPr/>
+        <w:t xml:space="preserve">createNewReport</w:t>
+      </w:r>
+      <w:r>
+        <w:rPr/>
+        <w:t xml:space="preserve">, </w:t>
+      </w:r>
+      <w:r>
+        <w:rPr/>
+        <w:t xml:space="preserve">generateReport</w:t>
+      </w:r>
+      <w:r>
+        <w:rPr/>
+        <w:t xml:space="preserve">, </w:t>
+      </w:r>
+      <w:r>
+        <w:rPr/>
+        <w:t xml:space="preserve">onReportGenerated</w:t>
+      </w:r>
+      <w:r>
+        <w:rPr/>
+        <w:t xml:space="preserve">, </w:t>
+      </w:r>
+      <w:r>
+        <w:rPr/>
+        <w:t xml:space="preserve">loadReports</w:t>
+      </w:r>
+      <w:r>
+        <w:rPr/>
+        <w:t xml:space="preserve">, </w:t>
+      </w:r>
+      <w:r>
+        <w:rPr/>
+        <w:t xml:space="preserve">onReportsLoaded</w:t>
+      </w:r>
+      <w:r>
+        <w:rPr/>
+        <w:t xml:space="preserve">, </w:t>
+      </w:r>
+      <w:r>
+        <w:rPr/>
+        <w:t xml:space="preserve">downloadReport</w:t>
+      </w:r>
+      <w:r>
+        <w:rPr/>
+        <w:t xml:space="preserve">, </w:t>
+      </w:r>
+      <w:r>
+        <w:rPr/>
+        <w:t xml:space="preserve">deleteReport</w:t>
+      </w:r>
+      <w:r>
+        <w:rPr/>
+        <w:t xml:space="preserve">, </w:t>
+      </w:r>
+      <w:r>
+        <w:rPr/>
+        <w:t xml:space="preserve">onReportDeleted</w:t>
+      </w:r>
+      <w:r>
+        <w:rPr/>
+        <w:t xml:space="preserve">, </w:t>
+      </w:r>
+      <w:r>
+        <w:rPr/>
+        <w:t xml:space="preserve">validateIntegrity</w:t>
+      </w:r>
+      <w:r>
+        <w:rPr/>
+        <w:t xml:space="preserve">, </w:t>
+      </w:r>
+      <w:r>
+        <w:rPr/>
+        <w:t xml:space="preserve">onIntegrityValidated</w:t>
+      </w:r>
+      <w:r>
+        <w:rPr/>
+        <w:t xml:space="preserve">, </w:t>
+      </w:r>
+      <w:r>
+        <w:rPr/>
+        <w:t xml:space="preserve">clearCache</w:t>
+      </w:r>
+      <w:r>
+        <w:rPr/>
+        <w:t xml:space="preserve">, </w:t>
+      </w:r>
+      <w:r>
+        <w:rPr/>
+        <w:t xml:space="preserve">exportSystemInfo</w:t>
+      </w:r>
+      <w:r>
+        <w:rPr/>
+        <w:t xml:space="preserve">, </w:t>
+      </w:r>
+      <w:r>
+        <w:rPr/>
+        <w:t xml:space="preserve">onSystemInfoExported</w:t>
+      </w:r>
+      <w:r>
+        <w:rPr/>
+        <w:t xml:space="preserve">.</w:t>
+      </w:r>
+    </w:p>
+    <w:p>
+      <w:pPr>
+        <w:numPr>
+          <w:ilvl w:val="0"/>
+          <w:numId w:val="64"/>
+        </w:numPr>
+        <w:spacing w:lineRule="auto"/>
+      </w:pPr>
+      <w:r>
+        <w:rPr/>
+        <w:t xml:space="preserve">Bloque contiguo sin código intercalado de otros dominios (a diferencia de Fase 2, aquí no hubo que preservar ningún handler de evento en medio).</w:t>
+      </w:r>
+    </w:p>
+    <w:p>
+      <w:pPr>
+        <w:numPr>
+          <w:ilvl w:val="0"/>
+          <w:numId w:val="64"/>
+        </w:numPr>
+        <w:spacing w:lineRule="auto"/>
+      </w:pPr>
+      <w:r>
+        <w:rPr/>
+        <w:t xml:space="preserve">Orden de </w:t>
+      </w:r>
+      <w:r>
+        <w:rPr/>
+        <w:t xml:space="preserve">include()</w:t>
+      </w:r>
+      <w:r>
+        <w:rPr/>
+        <w:t xml:space="preserve"> en </w:t>
+      </w:r>
+      <w:r>
+        <w:rPr/>
+        <w:t xml:space="preserve">Index.html</w:t>
+      </w:r>
+      <w:r>
+        <w:rPr/>
+        <w:t xml:space="preserve"> (líneas 1595-1598): </w:t>
+      </w:r>
+      <w:r>
+        <w:rPr/>
+        <w:t xml:space="preserve">app_core_js</w:t>
+      </w:r>
+      <w:r>
+        <w:rPr/>
+        <w:t xml:space="preserve"> → </w:t>
+      </w:r>
+      <w:r>
+        <w:rPr/>
+        <w:t xml:space="preserve">app_alertas_js</w:t>
+      </w:r>
+      <w:r>
+        <w:rPr/>
+        <w:t xml:space="preserve"> → </w:t>
+      </w:r>
+      <w:r>
+        <w:rPr/>
+        <w:t xml:space="preserve">app_permisos_js</w:t>
+      </w:r>
+      <w:r>
+        <w:rPr/>
+        <w:t xml:space="preserve"> → </w:t>
+      </w:r>
+      <w:r>
+        <w:rPr/>
+        <w:t xml:space="preserve">app_js</w:t>
+      </w:r>
+      <w:r>
+        <w:rPr/>
+        <w:t xml:space="preserve">.</w:t>
+      </w:r>
+    </w:p>
+    <w:p>
+      <w:pPr>
+        <w:spacing w:lineRule="auto"/>
+      </w:pPr>
+      <w:r>
+        <w:rPr>
+          <w:b/>
+        </w:rPr>
+        <w:t xml:space="preserve">Métricas del Cambio (acumulado Fases 1-3):</w:t>
+      </w:r>
+    </w:p>
+    <w:tbl>
+      <w:tblPr>
+        <w:tblBorders>
+          <w:top w:val="single" w:sz="2" w:space="0" w:color="000000"/>
+          <w:bottom w:val="single" w:sz="2" w:space="0" w:color="000000"/>
+          <w:left w:val="single" w:sz="2" w:space="0" w:color="000000"/>
+          <w:right w:val="single" w:sz="2" w:space="0" w:color="000000"/>
+        </w:tblBorders>
+        <w:tblCellSpacing w:w="0" w:type="dxa"/>
+        <w:tblCellMar>
+          <w:top w:type="dxa" w:w="80"/>
+          <w:bottom w:type="dxa" w:w="80"/>
+          <w:left w:type="dxa" w:w="160"/>
+          <w:right w:type="dxa" w:w="160"/>
+        </w:tblCellMar>
+        <w:jc w:val="center"/>
+      </w:tblPr>
+      <w:tblGrid>
+        <w:gridCol w:w="2880"/>
+        <w:gridCol w:w="2880"/>
+        <w:gridCol w:w="2880"/>
+      </w:tblGrid>
+      <w:tr>
+        <w:trPr/>
+        <w:tc>
+          <w:tcPr>
+            <w:tcBorders>
+              <w:top w:val="single" w:sz="1" w:space="0" w:color="000000"/>
+              <w:bottom w:val="single" w:sz="1" w:space="0" w:color="000000"/>
+              <w:left w:val="single" w:sz="1" w:space="0" w:color="000000"/>
+              <w:right w:val="single" w:sz="1" w:space="0" w:color="000000"/>
+            </w:tcBorders>
+          </w:tcPr>
+          <w:p>
+            <w:pPr>
+              <w:spacing w:lineRule="auto"/>
+            </w:pPr>
+            <w:r>
+              <w:rPr/>
+              <w:t xml:space="preserve">Archivo</w:t>
+            </w:r>
+          </w:p>
+        </w:tc>
+        <w:tc>
+          <w:tcPr>
+            <w:tcBorders>
+              <w:top w:val="single" w:sz="1" w:space="0" w:color="000000"/>
+              <w:bottom w:val="single" w:sz="1" w:space="0" w:color="000000"/>
+              <w:left w:val="single" w:sz="1" w:space="0" w:color="000000"/>
+              <w:right w:val="single" w:sz="1" w:space="0" w:color="000000"/>
+            </w:tcBorders>
+          </w:tcPr>
+          <w:p>
+            <w:pPr>
+              <w:spacing w:lineRule="auto"/>
+            </w:pPr>
+            <w:r>
+              <w:rPr/>
+              <w:t xml:space="preserve">LOC</w:t>
+            </w:r>
+          </w:p>
+        </w:tc>
+        <w:tc>
+          <w:tcPr>
+            <w:tcBorders>
+              <w:top w:val="single" w:sz="1" w:space="0" w:color="000000"/>
+              <w:bottom w:val="single" w:sz="1" w:space="0" w:color="000000"/>
+              <w:left w:val="single" w:sz="1" w:space="0" w:color="000000"/>
+              <w:right w:val="single" w:sz="1" w:space="0" w:color="000000"/>
+            </w:tcBorders>
+          </w:tcPr>
+          <w:p>
+            <w:pPr>
+              <w:spacing w:lineRule="auto"/>
+            </w:pPr>
+            <w:r>
+              <w:rPr/>
+              <w:t xml:space="preserve">Nota</w:t>
+            </w:r>
+          </w:p>
+        </w:tc>
+      </w:tr>
+      <w:tblGrid>
+        <w:gridCol w:w="2880"/>
+        <w:gridCol w:w="2880"/>
+        <w:gridCol w:w="2880"/>
+      </w:tblGrid>
+      <w:tr>
+        <w:trPr/>
+        <w:tc>
+          <w:tcPr>
+            <w:tcBorders>
+              <w:top w:val="single" w:sz="1" w:space="0" w:color="000000"/>
+              <w:bottom w:val="single" w:sz="1" w:space="0" w:color="000000"/>
+              <w:left w:val="single" w:sz="1" w:space="0" w:color="000000"/>
+              <w:right w:val="single" w:sz="1" w:space="0" w:color="000000"/>
+            </w:tcBorders>
+          </w:tcPr>
+          <w:p>
+            <w:pPr>
+              <w:spacing w:lineRule="auto"/>
+            </w:pPr>
+            <w:r>
+              <w:rPr>
+                <w:highlight w:val="lightGray"/>
+              </w:rPr>
+              <w:t xml:space="preserve">app_js.html</w:t>
+            </w:r>
+          </w:p>
+        </w:tc>
+        <w:tc>
+          <w:tcPr>
+            <w:tcBorders>
+              <w:top w:val="single" w:sz="1" w:space="0" w:color="000000"/>
+              <w:bottom w:val="single" w:sz="1" w:space="0" w:color="000000"/>
+              <w:left w:val="single" w:sz="1" w:space="0" w:color="000000"/>
+              <w:right w:val="single" w:sz="1" w:space="0" w:color="000000"/>
+            </w:tcBorders>
+          </w:tcPr>
+          <w:p>
+            <w:pPr>
+              <w:spacing w:lineRule="auto"/>
+            </w:pPr>
+            <w:r>
+              <w:rPr/>
+              <w:t xml:space="preserve">4281 → 3450 → 2952 → </w:t>
+            </w:r>
+          </w:p>
+          <w:p>
+            <w:pPr>
+              <w:spacing w:lineRule="auto"/>
+            </w:pPr>
+            <w:r>
+              <w:rPr>
+                <w:b/>
+              </w:rPr>
+              <w:t xml:space="preserve">2591</w:t>
+            </w:r>
+          </w:p>
+        </w:tc>
+        <w:tc>
+          <w:tcPr>
+            <w:tcBorders>
+              <w:top w:val="single" w:sz="1" w:space="0" w:color="000000"/>
+              <w:bottom w:val="single" w:sz="1" w:space="0" w:color="000000"/>
+              <w:left w:val="single" w:sz="1" w:space="0" w:color="000000"/>
+              <w:right w:val="single" w:sz="1" w:space="0" w:color="000000"/>
+            </w:tcBorders>
+          </w:tcPr>
+          <w:p>
+            <w:pPr>
+              <w:spacing w:lineRule="auto"/>
+            </w:pPr>
+            <w:r>
+              <w:rPr>
+                <w:b/>
+              </w:rPr>
+              <w:t xml:space="preserve">-1690 LOC (-39.5%)</w:t>
+            </w:r>
+          </w:p>
+          <w:p>
+            <w:pPr>
+              <w:spacing w:lineRule="auto"/>
+            </w:pPr>
+            <w:r>
+              <w:rPr/>
+              <w:t xml:space="preserve"> acumulado sobre el original</w:t>
+            </w:r>
+          </w:p>
+        </w:tc>
+      </w:tr>
+      <w:tr>
+        <w:trPr/>
+        <w:tc>
+          <w:tcPr>
+            <w:tcBorders>
+              <w:top w:val="single" w:sz="1" w:space="0" w:color="000000"/>
+              <w:bottom w:val="single" w:sz="1" w:space="0" w:color="000000"/>
+              <w:left w:val="single" w:sz="1" w:space="0" w:color="000000"/>
+              <w:right w:val="single" w:sz="1" w:space="0" w:color="000000"/>
+            </w:tcBorders>
+          </w:tcPr>
+          <w:p>
+            <w:pPr>
+              <w:spacing w:lineRule="auto"/>
+            </w:pPr>
+            <w:r>
+              <w:rPr>
+                <w:highlight w:val="lightGray"/>
+              </w:rPr>
+              <w:t xml:space="preserve">app_core_js.html</w:t>
+            </w:r>
+          </w:p>
+        </w:tc>
+        <w:tc>
+          <w:tcPr>
+            <w:tcBorders>
+              <w:top w:val="single" w:sz="1" w:space="0" w:color="000000"/>
+              <w:bottom w:val="single" w:sz="1" w:space="0" w:color="000000"/>
+              <w:left w:val="single" w:sz="1" w:space="0" w:color="000000"/>
+              <w:right w:val="single" w:sz="1" w:space="0" w:color="000000"/>
+            </w:tcBorders>
+          </w:tcPr>
+          <w:p>
+            <w:pPr>
+              <w:spacing w:lineRule="auto"/>
+            </w:pPr>
+            <w:r>
+              <w:rPr/>
+              <w:t xml:space="preserve">698</w:t>
+            </w:r>
+          </w:p>
+        </w:tc>
+        <w:tc>
+          <w:tcPr>
+            <w:tcBorders>
+              <w:top w:val="single" w:sz="1" w:space="0" w:color="000000"/>
+              <w:bottom w:val="single" w:sz="1" w:space="0" w:color="000000"/>
+              <w:left w:val="single" w:sz="1" w:space="0" w:color="000000"/>
+              <w:right w:val="single" w:sz="1" w:space="0" w:color="000000"/>
+            </w:tcBorders>
+          </w:tcPr>
+          <w:p>
+            <w:pPr>
+              <w:spacing w:lineRule="auto"/>
+            </w:pPr>
+            <w:r>
+              <w:rPr/>
+              <w:t xml:space="preserve">Fase 1</w:t>
+            </w:r>
+          </w:p>
+        </w:tc>
+      </w:tr>
+      <w:tr>
+        <w:trPr/>
+        <w:tc>
+          <w:tcPr>
+            <w:tcBorders>
+              <w:top w:val="single" w:sz="1" w:space="0" w:color="000000"/>
+              <w:bottom w:val="single" w:sz="1" w:space="0" w:color="000000"/>
+              <w:left w:val="single" w:sz="1" w:space="0" w:color="000000"/>
+              <w:right w:val="single" w:sz="1" w:space="0" w:color="000000"/>
+            </w:tcBorders>
+          </w:tcPr>
+          <w:p>
+            <w:pPr>
+              <w:spacing w:lineRule="auto"/>
+            </w:pPr>
+            <w:r>
+              <w:rPr>
+                <w:highlight w:val="lightGray"/>
+              </w:rPr>
+              <w:t xml:space="preserve">app_alertas_js.html</w:t>
+            </w:r>
+          </w:p>
+        </w:tc>
+        <w:tc>
+          <w:tcPr>
+            <w:tcBorders>
+              <w:top w:val="single" w:sz="1" w:space="0" w:color="000000"/>
+              <w:bottom w:val="single" w:sz="1" w:space="0" w:color="000000"/>
+              <w:left w:val="single" w:sz="1" w:space="0" w:color="000000"/>
+              <w:right w:val="single" w:sz="1" w:space="0" w:color="000000"/>
+            </w:tcBorders>
+          </w:tcPr>
+          <w:p>
+            <w:pPr>
+              <w:spacing w:lineRule="auto"/>
+            </w:pPr>
+            <w:r>
+              <w:rPr/>
+              <w:t xml:space="preserve">502</w:t>
+            </w:r>
+          </w:p>
+        </w:tc>
+        <w:tc>
+          <w:tcPr>
+            <w:tcBorders>
+              <w:top w:val="single" w:sz="1" w:space="0" w:color="000000"/>
+              <w:bottom w:val="single" w:sz="1" w:space="0" w:color="000000"/>
+              <w:left w:val="single" w:sz="1" w:space="0" w:color="000000"/>
+              <w:right w:val="single" w:sz="1" w:space="0" w:color="000000"/>
+            </w:tcBorders>
+          </w:tcPr>
+          <w:p>
+            <w:pPr>
+              <w:spacing w:lineRule="auto"/>
+            </w:pPr>
+            <w:r>
+              <w:rPr/>
+              <w:t xml:space="preserve">Fase 2</w:t>
+            </w:r>
+          </w:p>
+        </w:tc>
+      </w:tr>
+      <w:tr>
+        <w:trPr/>
+        <w:tc>
+          <w:tcPr>
+            <w:tcBorders>
+              <w:top w:val="single" w:sz="1" w:space="0" w:color="000000"/>
+              <w:bottom w:val="single" w:sz="1" w:space="0" w:color="000000"/>
+              <w:left w:val="single" w:sz="1" w:space="0" w:color="000000"/>
+              <w:right w:val="single" w:sz="1" w:space="0" w:color="000000"/>
+            </w:tcBorders>
+          </w:tcPr>
+          <w:p>
+            <w:pPr>
+              <w:spacing w:lineRule="auto"/>
+            </w:pPr>
+            <w:r>
+              <w:rPr>
+                <w:highlight w:val="lightGray"/>
+              </w:rPr>
+              <w:t xml:space="preserve">app_permisos_js.html</w:t>
+            </w:r>
+          </w:p>
+        </w:tc>
+        <w:tc>
+          <w:tcPr>
+            <w:tcBorders>
+              <w:top w:val="single" w:sz="1" w:space="0" w:color="000000"/>
+              <w:bottom w:val="single" w:sz="1" w:space="0" w:color="000000"/>
+              <w:left w:val="single" w:sz="1" w:space="0" w:color="000000"/>
+              <w:right w:val="single" w:sz="1" w:space="0" w:color="000000"/>
+            </w:tcBorders>
+          </w:tcPr>
+          <w:p>
+            <w:pPr>
+              <w:spacing w:lineRule="auto"/>
+            </w:pPr>
+            <w:r>
+              <w:rPr>
+                <w:b/>
+              </w:rPr>
+              <w:t xml:space="preserve">371</w:t>
+            </w:r>
+          </w:p>
+        </w:tc>
+        <w:tc>
+          <w:tcPr>
+            <w:tcBorders>
+              <w:top w:val="single" w:sz="1" w:space="0" w:color="000000"/>
+              <w:bottom w:val="single" w:sz="1" w:space="0" w:color="000000"/>
+              <w:left w:val="single" w:sz="1" w:space="0" w:color="000000"/>
+              <w:right w:val="single" w:sz="1" w:space="0" w:color="000000"/>
+            </w:tcBorders>
+          </w:tcPr>
+          <w:p>
+            <w:pPr>
+              <w:spacing w:lineRule="auto"/>
+            </w:pPr>
+            <w:r>
+              <w:rPr/>
+              <w:t xml:space="preserve">Fase 3 (nuevo)</w:t>
+            </w:r>
+          </w:p>
+        </w:tc>
+      </w:tr>
+    </w:tbl>
+    <w:p>
+      <w:pPr>
+        <w:spacing w:lineRule="auto"/>
+      </w:pPr>
+      <w:r>
+        <w:rPr/>
+      </w:r>
+    </w:p>
+    <w:p>
+      <w:pPr>
+        <w:spacing w:lineRule="auto"/>
+      </w:pPr>
+      <w:r>
+        <w:rPr/>
+        <w:t xml:space="preserve">Desglose Fase 3: </w:t>
+      </w:r>
+      <w:r>
+        <w:rPr/>
+        <w:t xml:space="preserve">app_js.html</w:t>
+      </w:r>
+      <w:r>
+        <w:rPr/>
+        <w:t xml:space="preserve"> de 2952 a 2591 (-361 líneas).</w:t>
+      </w:r>
+    </w:p>
+    <w:p>
+      <w:pPr>
+        <w:spacing w:lineRule="auto"/>
+      </w:pPr>
+      <w:r>
+        <w:rPr>
+          <w:b/>
+        </w:rPr>
+        <w:t xml:space="preserve">Validación y Pruebas Ejecutadas:</w:t>
+      </w:r>
+    </w:p>
+    <w:p>
+      <w:pPr>
+        <w:numPr>
+          <w:ilvl w:val="0"/>
+          <w:numId w:val="65"/>
+        </w:numPr>
+        <w:spacing w:lineRule="auto"/>
+      </w:pPr>
+      <w:r>
+        <w:rPr/>
+      </w:r>
+      <w:r>
+        <w:rPr/>
+        <w:t xml:space="preserve"> Sintaxis validada con </w:t>
+      </w:r>
+      <w:r>
+        <w:rPr/>
+        <w:t xml:space="preserve">node --check</w:t>
+      </w:r>
+      <w:r>
+        <w:rPr/>
+        <w:t xml:space="preserve"> sobre los 4 partials activos (</w:t>
+      </w:r>
+      <w:r>
+        <w:rPr/>
+        <w:t xml:space="preserve">app_core_js.html</w:t>
+      </w:r>
+      <w:r>
+        <w:rPr/>
+        <w:t xml:space="preserve">, </w:t>
+      </w:r>
+      <w:r>
+        <w:rPr/>
+        <w:t xml:space="preserve">app_alertas_js.html</w:t>
+      </w:r>
+      <w:r>
+        <w:rPr/>
+        <w:t xml:space="preserve">, </w:t>
+      </w:r>
+      <w:r>
+        <w:rPr/>
+        <w:t xml:space="preserve">app_permisos_js.html</w:t>
+      </w:r>
+      <w:r>
+        <w:rPr/>
+        <w:t xml:space="preserve">, </w:t>
+      </w:r>
+      <w:r>
+        <w:rPr/>
+        <w:t xml:space="preserve">app_js.html</w:t>
+      </w:r>
+      <w:r>
+        <w:rPr/>
+        <w:t xml:space="preserve">)</w:t>
+      </w:r>
+    </w:p>
+    <w:p>
+      <w:pPr>
+        <w:numPr>
+          <w:ilvl w:val="0"/>
+          <w:numId w:val="65"/>
+        </w:numPr>
+        <w:spacing w:lineRule="auto"/>
+      </w:pPr>
+      <w:r>
+        <w:rPr/>
+      </w:r>
+      <w:r>
+        <w:rPr/>
+        <w:t xml:space="preserve"> Auditoría de integridad: las 24 funciones de permisos verificadas presentes exactamente una vez, solo en </w:t>
+      </w:r>
+      <w:r>
+        <w:rPr/>
+        <w:t xml:space="preserve">app_permisos_js.html</w:t>
+      </w:r>
+      <w:r>
+        <w:rPr/>
+        <w:t xml:space="preserve">; cero referencias a globals de </w:t>
+      </w:r>
+      <w:r>
+        <w:rPr/>
+        <w:t xml:space="preserve">alertas</w:t>
+      </w:r>
+      <w:r>
+        <w:rPr/>
+        <w:t xml:space="preserve"> (</w:t>
+      </w:r>
+      <w:r>
+        <w:rPr/>
+        <w:t xml:space="preserve">motorReglasData</w:t>
+      </w:r>
+      <w:r>
+        <w:rPr/>
+        <w:t xml:space="preserve">/</w:t>
+      </w:r>
+      <w:r>
+        <w:rPr/>
+        <w:t xml:space="preserve">alertasGlobales</w:t>
+      </w:r>
+      <w:r>
+        <w:rPr/>
+        <w:t xml:space="preserve">/</w:t>
+      </w:r>
+      <w:r>
+        <w:rPr/>
+        <w:t xml:space="preserve">filtroNivelActivo</w:t>
+      </w:r>
+      <w:r>
+        <w:rPr/>
+        <w:t xml:space="preserve">) ni llamadas a funciones de </w:t>
+      </w:r>
+      <w:r>
+        <w:rPr/>
+        <w:t xml:space="preserve">matriz</w:t>
+      </w:r>
+      <w:r>
+        <w:rPr/>
+        <w:t xml:space="preserve">; los 7 IDs del DOM que usa (</w:t>
+      </w:r>
+      <w:r>
+        <w:rPr/>
+        <w:t xml:space="preserve">permissionModal</w:t>
+      </w:r>
+      <w:r>
+        <w:rPr/>
+        <w:t xml:space="preserve">, </w:t>
+      </w:r>
+      <w:r>
+        <w:rPr/>
+        <w:t xml:space="preserve">reportModal</w:t>
+      </w:r>
+      <w:r>
+        <w:rPr/>
+        <w:t xml:space="preserve">, </w:t>
+      </w:r>
+      <w:r>
+        <w:rPr/>
+        <w:t xml:space="preserve">historialBody</w:t>
+      </w:r>
+      <w:r>
+        <w:rPr/>
+        <w:t xml:space="preserve">, </w:t>
+      </w:r>
+      <w:r>
+        <w:rPr/>
+        <w:t xml:space="preserve">auditoriaBody</w:t>
+      </w:r>
+      <w:r>
+        <w:rPr/>
+        <w:t xml:space="preserve">, </w:t>
+      </w:r>
+      <w:r>
+        <w:rPr/>
+        <w:t xml:space="preserve">permisosBody</w:t>
+      </w:r>
+      <w:r>
+        <w:rPr/>
+        <w:t xml:space="preserve">, </w:t>
+      </w:r>
+      <w:r>
+        <w:rPr/>
+        <w:t xml:space="preserve">reportesContainer</w:t>
+      </w:r>
+      <w:r>
+        <w:rPr/>
+        <w:t xml:space="preserve">, </w:t>
+      </w:r>
+      <w:r>
+        <w:rPr/>
+        <w:t xml:space="preserve">detailModal</w:t>
+      </w:r>
+      <w:r>
+        <w:rPr/>
+        <w:t xml:space="preserve">) confirmados presentes en </w:t>
+      </w:r>
+      <w:r>
+        <w:rPr/>
+        <w:t xml:space="preserve">Index.html</w:t>
+      </w:r>
+      <w:r>
+        <w:rPr/>
+        <w:t xml:space="preserve">. Única colisión de nombre en el repo: </w:t>
+      </w:r>
+      <w:r>
+        <w:rPr/>
+        <w:t xml:space="preserve">onTramoChange</w:t>
+      </w:r>
+      <w:r>
+        <w:rPr/>
+        <w:t xml:space="preserve">, preexistente, contenida enteramente en </w:t>
+      </w:r>
+      <w:r>
+        <w:rPr/>
+        <w:t xml:space="preserve">app_js.html</w:t>
+      </w:r>
+      <w:r>
+        <w:rPr/>
+        <w:t xml:space="preserve">, pendiente de la Fase 4</w:t>
+      </w:r>
+    </w:p>
+    <w:p>
+      <w:pPr>
+        <w:numPr>
+          <w:ilvl w:val="0"/>
+          <w:numId w:val="65"/>
+        </w:numPr>
+        <w:spacing w:lineRule="auto"/>
+      </w:pPr>
+      <w:r>
+        <w:rPr/>
+      </w:r>
+      <w:r>
+        <w:rPr/>
+        <w:t xml:space="preserve">clasp push</w:t>
+      </w:r>
+      <w:r>
+        <w:rPr/>
+        <w:t xml:space="preserve"> (40 archivos) al entorno de pruebas confirmado NO-producción, para que </w:t>
+      </w:r>
+      <w:r>
+        <w:rPr/>
+        <w:t xml:space="preserve">@HEAD</w:t>
+      </w:r>
+      <w:r>
+        <w:rPr/>
+        <w:t xml:space="preserve"> sirva el código de las Fases 1-3</w:t>
+      </w:r>
+    </w:p>
+    <w:p>
+      <w:pPr>
+        <w:numPr>
+          <w:ilvl w:val="0"/>
+          <w:numId w:val="65"/>
+        </w:numPr>
+        <w:spacing w:lineRule="auto"/>
+      </w:pPr>
+      <w:r>
+        <w:rPr/>
+      </w:r>
+      <w:r>
+        <w:rPr>
+          <w:b/>
+        </w:rPr>
+        <w:t xml:space="preserve">QA manual en navegador real: sigue pendiente.</w:t>
+      </w:r>
+      <w:r>
+        <w:rPr/>
+        <w:t xml:space="preserve"> Se pidió dos veces (cierre de Fase 2 y cierre de Fase 3) y aún no se recibió confirmación de resultado del usuario. No se marca como verificado — las Fases 1-3 están desplegadas en </w:t>
+      </w:r>
+      <w:r>
+        <w:rPr/>
+        <w:t xml:space="preserve">@HEAD</w:t>
+      </w:r>
+      <w:r>
+        <w:rPr/>
+        <w:t xml:space="preserve"> pero su comportamiento en navegador real no ha sido confirmado en esta sesión.</w:t>
+      </w:r>
+    </w:p>
+    <w:p>
+      <w:pPr>
+        <w:spacing w:lineRule="auto"/>
+      </w:pPr>
+      <w:r>
+        <w:rPr>
+          <w:b/>
+        </w:rPr>
+        <w:t xml:space="preserve">Impacto en Producción:</w:t>
+      </w:r>
+      <w:r>
+        <w:rPr/>
+        <w:t xml:space="preserve">app_js.html</w:t>
+      </w:r>
+      <w:r>
+        <w:rPr/>
+        <w:t xml:space="preserve"> acumula una reducción de 1690 líneas (-39.5%) sobre el original de 4281, repartidas en 3 extracciones de bajo riesgo (core → alertas → permisos), todas con cero llamadas cruzadas entre los módulos hoja creados hasta ahora. Queda pendiente la Fase 4 (</w:t>
+      </w:r>
+      <w:r>
+        <w:rPr/>
+        <w:t xml:space="preserve">app_matriz_js.html</w:t>
+      </w:r>
+      <w:r>
+        <w:rPr/>
+        <w:t xml:space="preserve">, el módulo más grande, ~2390 LOC, y el único que exige reconciliar duplicados de matriz) y, transversalmente, la verificación en navegador real de las 3 fases ya desplegadas.</w:t>
+      </w:r>
+    </w:p>
+    <w:p>
+      <w:pPr>
         <w:pStyle w:val="Heading2"/>
         <w:spacing w:lineRule="auto"/>
       </w:pPr>
@@ -14258,7 +15351,7 @@
       <w:pPr>
         <w:numPr>
           <w:ilvl w:val="0"/>
-          <w:numId w:val="63"/>
+          <w:numId w:val="66"/>
         </w:numPr>
         <w:spacing w:lineRule="auto"/>
       </w:pPr>
@@ -14327,7 +15420,7 @@
       <w:pPr>
         <w:numPr>
           <w:ilvl w:val="0"/>
-          <w:numId w:val="63"/>
+          <w:numId w:val="66"/>
         </w:numPr>
         <w:spacing w:lineRule="auto"/>
       </w:pPr>
@@ -14356,7 +15449,7 @@
       <w:pPr>
         <w:numPr>
           <w:ilvl w:val="0"/>
-          <w:numId w:val="63"/>
+          <w:numId w:val="66"/>
         </w:numPr>
         <w:spacing w:lineRule="auto"/>
       </w:pPr>
@@ -15710,7 +16803,7 @@
       <w:pPr>
         <w:numPr>
           <w:ilvl w:val="0"/>
-          <w:numId w:val="64"/>
+          <w:numId w:val="67"/>
         </w:numPr>
         <w:spacing w:lineRule="auto"/>
       </w:pPr>
@@ -15733,7 +16826,7 @@
       <w:pPr>
         <w:numPr>
           <w:ilvl w:val="0"/>
-          <w:numId w:val="64"/>
+          <w:numId w:val="67"/>
         </w:numPr>
         <w:spacing w:lineRule="auto"/>
       </w:pPr>
@@ -15752,7 +16845,7 @@
       <w:pPr>
         <w:numPr>
           <w:ilvl w:val="0"/>
-          <w:numId w:val="64"/>
+          <w:numId w:val="67"/>
         </w:numPr>
         <w:spacing w:lineRule="auto"/>
       </w:pPr>
@@ -15803,7 +16896,7 @@
       <w:pPr>
         <w:numPr>
           <w:ilvl w:val="0"/>
-          <w:numId w:val="64"/>
+          <w:numId w:val="67"/>
         </w:numPr>
         <w:spacing w:lineRule="auto"/>
       </w:pPr>
@@ -15844,7 +16937,7 @@
       <w:pPr>
         <w:numPr>
           <w:ilvl w:val="0"/>
-          <w:numId w:val="64"/>
+          <w:numId w:val="67"/>
         </w:numPr>
         <w:spacing w:lineRule="auto"/>
       </w:pPr>
@@ -15871,7 +16964,7 @@
       <w:pPr>
         <w:numPr>
           <w:ilvl w:val="0"/>
-          <w:numId w:val="64"/>
+          <w:numId w:val="67"/>
         </w:numPr>
         <w:spacing w:lineRule="auto"/>
       </w:pPr>
@@ -23731,6 +24824,372 @@
     </w:lvl>
   </w:abstractNum>
   <w:abstractNum w:abstractNumId="64">
+    <w:lvl w:ilvl="0">
+      <w:start w:val="1"/>
+      <w:numFmt w:val="bullet"/>
+      <w:lvlText w:val=""/>
+      <w:lvlJc w:val="left"/>
+      <w:pPr>
+        <w:tabs>
+          <w:tab w:val="num" w:pos="720"/>
+        </w:tabs>
+        <w:ind w:left="720" w:hanging="360"/>
+      </w:pPr>
+      <w:rPr>
+        <w:rFonts w:ascii="Symbol" w:hAnsi="Symbol" w:hint="default"/>
+      </w:rPr>
+    </w:lvl>
+    <w:lvl w:ilvl="1">
+      <w:start w:val="1"/>
+      <w:numFmt w:val="bullet"/>
+      <w:lvlText w:val=""/>
+      <w:lvlJc w:val="left"/>
+      <w:pPr>
+        <w:tabs>
+          <w:tab w:val="num" w:pos="1440"/>
+        </w:tabs>
+        <w:ind w:left="1440" w:hanging="360"/>
+      </w:pPr>
+      <w:rPr>
+        <w:rFonts w:ascii="Symbol" w:hAnsi="Symbol" w:hint="default"/>
+      </w:rPr>
+    </w:lvl>
+    <w:lvl w:ilvl="2">
+      <w:start w:val="1"/>
+      <w:numFmt w:val="bullet"/>
+      <w:lvlText w:val=""/>
+      <w:lvlJc w:val="left"/>
+      <w:pPr>
+        <w:tabs>
+          <w:tab w:val="num" w:pos="2160"/>
+        </w:tabs>
+        <w:ind w:left="2160" w:hanging="360"/>
+      </w:pPr>
+      <w:rPr>
+        <w:rFonts w:ascii="Symbol" w:hAnsi="Symbol" w:hint="default"/>
+      </w:rPr>
+    </w:lvl>
+    <w:lvl w:ilvl="3">
+      <w:start w:val="1"/>
+      <w:numFmt w:val="bullet"/>
+      <w:lvlText w:val=""/>
+      <w:lvlJc w:val="left"/>
+      <w:pPr>
+        <w:tabs>
+          <w:tab w:val="num" w:pos="2880"/>
+        </w:tabs>
+        <w:ind w:left="2880" w:hanging="360"/>
+      </w:pPr>
+      <w:rPr>
+        <w:rFonts w:ascii="Symbol" w:hAnsi="Symbol" w:hint="default"/>
+      </w:rPr>
+    </w:lvl>
+    <w:lvl w:ilvl="4">
+      <w:start w:val="1"/>
+      <w:numFmt w:val="bullet"/>
+      <w:lvlText w:val=""/>
+      <w:lvlJc w:val="left"/>
+      <w:pPr>
+        <w:tabs>
+          <w:tab w:val="num" w:pos="3600"/>
+        </w:tabs>
+        <w:ind w:left="3600" w:hanging="360"/>
+      </w:pPr>
+      <w:rPr>
+        <w:rFonts w:ascii="Symbol" w:hAnsi="Symbol" w:hint="default"/>
+      </w:rPr>
+    </w:lvl>
+    <w:lvl w:ilvl="5">
+      <w:start w:val="1"/>
+      <w:numFmt w:val="bullet"/>
+      <w:lvlText w:val=""/>
+      <w:lvlJc w:val="left"/>
+      <w:pPr>
+        <w:tabs>
+          <w:tab w:val="num" w:pos="4320"/>
+        </w:tabs>
+        <w:ind w:left="4320" w:hanging="360"/>
+      </w:pPr>
+      <w:rPr>
+        <w:rFonts w:ascii="Symbol" w:hAnsi="Symbol" w:hint="default"/>
+      </w:rPr>
+    </w:lvl>
+    <w:lvl w:ilvl="6">
+      <w:start w:val="1"/>
+      <w:numFmt w:val="bullet"/>
+      <w:lvlText w:val=""/>
+      <w:lvlJc w:val="left"/>
+      <w:pPr>
+        <w:tabs>
+          <w:tab w:val="num" w:pos="5040"/>
+        </w:tabs>
+        <w:ind w:left="5040" w:hanging="360"/>
+      </w:pPr>
+      <w:rPr>
+        <w:rFonts w:ascii="Symbol" w:hAnsi="Symbol" w:hint="default"/>
+      </w:rPr>
+    </w:lvl>
+    <w:lvl w:ilvl="7">
+      <w:start w:val="1"/>
+      <w:numFmt w:val="bullet"/>
+      <w:lvlText w:val=""/>
+      <w:lvlJc w:val="left"/>
+      <w:pPr>
+        <w:tabs>
+          <w:tab w:val="num" w:pos="5760"/>
+        </w:tabs>
+        <w:ind w:left="5760" w:hanging="360"/>
+      </w:pPr>
+      <w:rPr>
+        <w:rFonts w:ascii="Symbol" w:hAnsi="Symbol" w:hint="default"/>
+      </w:rPr>
+    </w:lvl>
+  </w:abstractNum>
+  <w:abstractNum w:abstractNumId="65">
+    <w:lvl w:ilvl="0">
+      <w:start w:val="1"/>
+      <w:numFmt w:val="bullet"/>
+      <w:lvlText w:val=""/>
+      <w:lvlJc w:val="left"/>
+      <w:pPr>
+        <w:tabs>
+          <w:tab w:val="num" w:pos="720"/>
+        </w:tabs>
+        <w:ind w:left="720" w:hanging="360"/>
+      </w:pPr>
+      <w:rPr>
+        <w:rFonts w:ascii="Symbol" w:hAnsi="Symbol" w:hint="default"/>
+      </w:rPr>
+    </w:lvl>
+    <w:lvl w:ilvl="1">
+      <w:start w:val="1"/>
+      <w:numFmt w:val="bullet"/>
+      <w:lvlText w:val=""/>
+      <w:lvlJc w:val="left"/>
+      <w:pPr>
+        <w:tabs>
+          <w:tab w:val="num" w:pos="1440"/>
+        </w:tabs>
+        <w:ind w:left="1440" w:hanging="360"/>
+      </w:pPr>
+      <w:rPr>
+        <w:rFonts w:ascii="Symbol" w:hAnsi="Symbol" w:hint="default"/>
+      </w:rPr>
+    </w:lvl>
+    <w:lvl w:ilvl="2">
+      <w:start w:val="1"/>
+      <w:numFmt w:val="bullet"/>
+      <w:lvlText w:val=""/>
+      <w:lvlJc w:val="left"/>
+      <w:pPr>
+        <w:tabs>
+          <w:tab w:val="num" w:pos="2160"/>
+        </w:tabs>
+        <w:ind w:left="2160" w:hanging="360"/>
+      </w:pPr>
+      <w:rPr>
+        <w:rFonts w:ascii="Symbol" w:hAnsi="Symbol" w:hint="default"/>
+      </w:rPr>
+    </w:lvl>
+    <w:lvl w:ilvl="3">
+      <w:start w:val="1"/>
+      <w:numFmt w:val="bullet"/>
+      <w:lvlText w:val=""/>
+      <w:lvlJc w:val="left"/>
+      <w:pPr>
+        <w:tabs>
+          <w:tab w:val="num" w:pos="2880"/>
+        </w:tabs>
+        <w:ind w:left="2880" w:hanging="360"/>
+      </w:pPr>
+      <w:rPr>
+        <w:rFonts w:ascii="Symbol" w:hAnsi="Symbol" w:hint="default"/>
+      </w:rPr>
+    </w:lvl>
+    <w:lvl w:ilvl="4">
+      <w:start w:val="1"/>
+      <w:numFmt w:val="bullet"/>
+      <w:lvlText w:val=""/>
+      <w:lvlJc w:val="left"/>
+      <w:pPr>
+        <w:tabs>
+          <w:tab w:val="num" w:pos="3600"/>
+        </w:tabs>
+        <w:ind w:left="3600" w:hanging="360"/>
+      </w:pPr>
+      <w:rPr>
+        <w:rFonts w:ascii="Symbol" w:hAnsi="Symbol" w:hint="default"/>
+      </w:rPr>
+    </w:lvl>
+    <w:lvl w:ilvl="5">
+      <w:start w:val="1"/>
+      <w:numFmt w:val="bullet"/>
+      <w:lvlText w:val=""/>
+      <w:lvlJc w:val="left"/>
+      <w:pPr>
+        <w:tabs>
+          <w:tab w:val="num" w:pos="4320"/>
+        </w:tabs>
+        <w:ind w:left="4320" w:hanging="360"/>
+      </w:pPr>
+      <w:rPr>
+        <w:rFonts w:ascii="Symbol" w:hAnsi="Symbol" w:hint="default"/>
+      </w:rPr>
+    </w:lvl>
+    <w:lvl w:ilvl="6">
+      <w:start w:val="1"/>
+      <w:numFmt w:val="bullet"/>
+      <w:lvlText w:val=""/>
+      <w:lvlJc w:val="left"/>
+      <w:pPr>
+        <w:tabs>
+          <w:tab w:val="num" w:pos="5040"/>
+        </w:tabs>
+        <w:ind w:left="5040" w:hanging="360"/>
+      </w:pPr>
+      <w:rPr>
+        <w:rFonts w:ascii="Symbol" w:hAnsi="Symbol" w:hint="default"/>
+      </w:rPr>
+    </w:lvl>
+    <w:lvl w:ilvl="7">
+      <w:start w:val="1"/>
+      <w:numFmt w:val="bullet"/>
+      <w:lvlText w:val=""/>
+      <w:lvlJc w:val="left"/>
+      <w:pPr>
+        <w:tabs>
+          <w:tab w:val="num" w:pos="5760"/>
+        </w:tabs>
+        <w:ind w:left="5760" w:hanging="360"/>
+      </w:pPr>
+      <w:rPr>
+        <w:rFonts w:ascii="Symbol" w:hAnsi="Symbol" w:hint="default"/>
+      </w:rPr>
+    </w:lvl>
+  </w:abstractNum>
+  <w:abstractNum w:abstractNumId="66">
+    <w:lvl w:ilvl="0">
+      <w:start w:val="1"/>
+      <w:numFmt w:val="bullet"/>
+      <w:lvlText w:val=""/>
+      <w:lvlJc w:val="left"/>
+      <w:pPr>
+        <w:tabs>
+          <w:tab w:val="num" w:pos="720"/>
+        </w:tabs>
+        <w:ind w:left="720" w:hanging="360"/>
+      </w:pPr>
+      <w:rPr>
+        <w:rFonts w:ascii="Symbol" w:hAnsi="Symbol" w:hint="default"/>
+      </w:rPr>
+    </w:lvl>
+    <w:lvl w:ilvl="1">
+      <w:start w:val="1"/>
+      <w:numFmt w:val="bullet"/>
+      <w:lvlText w:val=""/>
+      <w:lvlJc w:val="left"/>
+      <w:pPr>
+        <w:tabs>
+          <w:tab w:val="num" w:pos="1440"/>
+        </w:tabs>
+        <w:ind w:left="1440" w:hanging="360"/>
+      </w:pPr>
+      <w:rPr>
+        <w:rFonts w:ascii="Symbol" w:hAnsi="Symbol" w:hint="default"/>
+      </w:rPr>
+    </w:lvl>
+    <w:lvl w:ilvl="2">
+      <w:start w:val="1"/>
+      <w:numFmt w:val="bullet"/>
+      <w:lvlText w:val=""/>
+      <w:lvlJc w:val="left"/>
+      <w:pPr>
+        <w:tabs>
+          <w:tab w:val="num" w:pos="2160"/>
+        </w:tabs>
+        <w:ind w:left="2160" w:hanging="360"/>
+      </w:pPr>
+      <w:rPr>
+        <w:rFonts w:ascii="Symbol" w:hAnsi="Symbol" w:hint="default"/>
+      </w:rPr>
+    </w:lvl>
+    <w:lvl w:ilvl="3">
+      <w:start w:val="1"/>
+      <w:numFmt w:val="bullet"/>
+      <w:lvlText w:val=""/>
+      <w:lvlJc w:val="left"/>
+      <w:pPr>
+        <w:tabs>
+          <w:tab w:val="num" w:pos="2880"/>
+        </w:tabs>
+        <w:ind w:left="2880" w:hanging="360"/>
+      </w:pPr>
+      <w:rPr>
+        <w:rFonts w:ascii="Symbol" w:hAnsi="Symbol" w:hint="default"/>
+      </w:rPr>
+    </w:lvl>
+    <w:lvl w:ilvl="4">
+      <w:start w:val="1"/>
+      <w:numFmt w:val="bullet"/>
+      <w:lvlText w:val=""/>
+      <w:lvlJc w:val="left"/>
+      <w:pPr>
+        <w:tabs>
+          <w:tab w:val="num" w:pos="3600"/>
+        </w:tabs>
+        <w:ind w:left="3600" w:hanging="360"/>
+      </w:pPr>
+      <w:rPr>
+        <w:rFonts w:ascii="Symbol" w:hAnsi="Symbol" w:hint="default"/>
+      </w:rPr>
+    </w:lvl>
+    <w:lvl w:ilvl="5">
+      <w:start w:val="1"/>
+      <w:numFmt w:val="bullet"/>
+      <w:lvlText w:val=""/>
+      <w:lvlJc w:val="left"/>
+      <w:pPr>
+        <w:tabs>
+          <w:tab w:val="num" w:pos="4320"/>
+        </w:tabs>
+        <w:ind w:left="4320" w:hanging="360"/>
+      </w:pPr>
+      <w:rPr>
+        <w:rFonts w:ascii="Symbol" w:hAnsi="Symbol" w:hint="default"/>
+      </w:rPr>
+    </w:lvl>
+    <w:lvl w:ilvl="6">
+      <w:start w:val="1"/>
+      <w:numFmt w:val="bullet"/>
+      <w:lvlText w:val=""/>
+      <w:lvlJc w:val="left"/>
+      <w:pPr>
+        <w:tabs>
+          <w:tab w:val="num" w:pos="5040"/>
+        </w:tabs>
+        <w:ind w:left="5040" w:hanging="360"/>
+      </w:pPr>
+      <w:rPr>
+        <w:rFonts w:ascii="Symbol" w:hAnsi="Symbol" w:hint="default"/>
+      </w:rPr>
+    </w:lvl>
+    <w:lvl w:ilvl="7">
+      <w:start w:val="1"/>
+      <w:numFmt w:val="bullet"/>
+      <w:lvlText w:val=""/>
+      <w:lvlJc w:val="left"/>
+      <w:pPr>
+        <w:tabs>
+          <w:tab w:val="num" w:pos="5760"/>
+        </w:tabs>
+        <w:ind w:left="5760" w:hanging="360"/>
+      </w:pPr>
+      <w:rPr>
+        <w:rFonts w:ascii="Symbol" w:hAnsi="Symbol" w:hint="default"/>
+      </w:rPr>
+    </w:lvl>
+  </w:abstractNum>
+  <w:abstractNum w:abstractNumId="67">
     <w:lvl w:ilvl="0">
       <w:start w:val="1"/>
       <w:numFmt w:val="decimal"/>
@@ -24019,6 +25478,15 @@
   </w:num>
   <w:num w:numId="64">
     <w:abstractNumId w:val="64"/>
+  </w:num>
+  <w:num w:numId="65">
+    <w:abstractNumId w:val="65"/>
+  </w:num>
+  <w:num w:numId="66">
+    <w:abstractNumId w:val="66"/>
+  </w:num>
+  <w:num w:numId="67">
+    <w:abstractNumId w:val="67"/>
   </w:num>
 </w:numbering>
 </file>

</xml_diff>

<commit_message>
docs(reflect): document completion of modularization phase 4 (final)
</commit_message>
<xml_diff>
--- a/Documento_Tecnico_Aplicacion_Predios.docx
+++ b/Documento_Tecnico_Aplicacion_Predios.docx
@@ -12194,6 +12194,1127 @@
     </w:p>
     <w:p>
       <w:pPr>
+        <w:pStyle w:val="Heading3"/>
+        <w:spacing w:lineRule="auto"/>
+      </w:pPr>
+      <w:r>
+        <w:rPr/>
+        <w:t xml:space="preserve">12.11 [2026-08-06] [CONC-FE-02] Subdivisión modular de app_js.html — Fase 4 y FINAL: app_matriz_js.html</w:t>
+      </w:r>
+    </w:p>
+    <w:p>
+      <w:pPr>
+        <w:spacing w:lineRule="auto"/>
+      </w:pPr>
+      <w:r>
+        <w:rPr>
+          <w:b/>
+        </w:rPr>
+        <w:t xml:space="preserve">Archivo(s) Intervenido(s):</w:t>
+      </w:r>
+    </w:p>
+    <w:p>
+      <w:pPr>
+        <w:numPr>
+          <w:ilvl w:val="0"/>
+          <w:numId w:val="66"/>
+        </w:numPr>
+        <w:spacing w:lineRule="auto"/>
+      </w:pPr>
+      <w:r>
+        <w:rPr/>
+        <w:t xml:space="preserve">app_matriz_js.html</w:t>
+      </w:r>
+      <w:r>
+        <w:rPr/>
+        <w:t xml:space="preserve"> (archivo nuevo — sucesor directo de </w:t>
+      </w:r>
+      <w:r>
+        <w:rPr/>
+        <w:t xml:space="preserve">app_js.html</w:t>
+      </w:r>
+      <w:r>
+        <w:rPr/>
+        <w:t xml:space="preserve">)</w:t>
+      </w:r>
+    </w:p>
+    <w:p>
+      <w:pPr>
+        <w:numPr>
+          <w:ilvl w:val="0"/>
+          <w:numId w:val="66"/>
+        </w:numPr>
+        <w:spacing w:lineRule="auto"/>
+      </w:pPr>
+      <w:r>
+        <w:rPr/>
+        <w:t xml:space="preserve">app_js.html</w:t>
+      </w:r>
+      <w:r>
+        <w:rPr/>
+        <w:t xml:space="preserve"> (retirado por completo, </w:t>
+      </w:r>
+      <w:r>
+        <w:rPr/>
+        <w:t xml:space="preserve">git rm</w:t>
+      </w:r>
+      <w:r>
+        <w:rPr/>
+        <w:t xml:space="preserve">)</w:t>
+      </w:r>
+    </w:p>
+    <w:p>
+      <w:pPr>
+        <w:numPr>
+          <w:ilvl w:val="0"/>
+          <w:numId w:val="66"/>
+        </w:numPr>
+        <w:spacing w:lineRule="auto"/>
+      </w:pPr>
+      <w:r>
+        <w:rPr/>
+        <w:t xml:space="preserve">Index.html#L1595-L1598</w:t>
+      </w:r>
+      <w:r>
+        <w:rPr/>
+        <w:t xml:space="preserve"> (directiva </w:t>
+      </w:r>
+      <w:r>
+        <w:rPr/>
+        <w:t xml:space="preserve">include()</w:t>
+      </w:r>
+      <w:r>
+        <w:rPr/>
+        <w:t xml:space="preserve"> final)</w:t>
+      </w:r>
+    </w:p>
+    <w:p>
+      <w:pPr>
+        <w:spacing w:lineRule="auto"/>
+      </w:pPr>
+      <w:r>
+        <w:rPr>
+          <w:b/>
+        </w:rPr>
+        <w:t xml:space="preserve">Propósito del Archivo en el Sistema:</w:t>
+      </w:r>
+      <w:r>
+        <w:rPr/>
+        <w:t xml:space="preserve"> Cierre de la subdivisión modular de la interfaz iniciada en 12.8. </w:t>
+      </w:r>
+      <w:r>
+        <w:rPr/>
+        <w:t xml:space="preserve">app_matriz_js.html</w:t>
+      </w:r>
+      <w:r>
+        <w:rPr/>
+        <w:t xml:space="preserve"> concentra el último dominio funcional pendiente: filtros, paginación, KPIs, cronograma trimestral, render de tabla y el flujo transaccional de guardado de seguimiento (</w:t>
+      </w:r>
+      <w:r>
+        <w:rPr/>
+        <w:t xml:space="preserve">submitTracking</w:t>
+      </w:r>
+      <w:r>
+        <w:rPr/>
+        <w:t xml:space="preserve"> → </w:t>
+      </w:r>
+      <w:r>
+        <w:rPr/>
+        <w:t xml:space="preserve">saveFollowupData</w:t>
+      </w:r>
+      <w:r>
+        <w:rPr/>
+        <w:t xml:space="preserve">).</w:t>
+      </w:r>
+    </w:p>
+    <w:p>
+      <w:pPr>
+        <w:spacing w:lineRule="auto"/>
+      </w:pPr>
+      <w:r>
+        <w:rPr>
+          <w:b/>
+        </w:rPr>
+        <w:t xml:space="preserve">Motivo de la Intervención:</w:t>
+      </w:r>
+      <w:r>
+        <w:rPr/>
+        <w:t xml:space="preserve"> Última fase del plan 12.8 / ítem 7 de </w:t>
+      </w:r>
+      <w:r>
+        <w:rPr/>
+        <w:t xml:space="preserve">TODOS.md</w:t>
+      </w:r>
+      <w:r>
+        <w:rPr/>
+        <w:t xml:space="preserve">. Con </w:t>
+      </w:r>
+      <w:r>
+        <w:rPr/>
+        <w:t xml:space="preserve">app_matriz_js.html</w:t>
+      </w:r>
+      <w:r>
+        <w:rPr/>
+        <w:t xml:space="preserve"> desplegado, </w:t>
+      </w:r>
+      <w:r>
+        <w:rPr/>
+        <w:t xml:space="preserve">app_js.html</w:t>
+      </w:r>
+      <w:r>
+        <w:rPr/>
+        <w:t xml:space="preserve"> deja de tener contenido propio que justifique su existencia como partial — se retira en vez de dejarlo como cascarón vacío.</w:t>
+      </w:r>
+    </w:p>
+    <w:p>
+      <w:pPr>
+        <w:spacing w:lineRule="auto"/>
+      </w:pPr>
+      <w:r>
+        <w:rPr>
+          <w:b/>
+        </w:rPr>
+        <w:t xml:space="preserve">Cambios Técnicos Realizados:</w:t>
+      </w:r>
+    </w:p>
+    <w:p>
+      <w:pPr>
+        <w:numPr>
+          <w:ilvl w:val="0"/>
+          <w:numId w:val="67"/>
+        </w:numPr>
+        <w:spacing w:lineRule="auto"/>
+      </w:pPr>
+      <w:r>
+        <w:rPr/>
+        <w:t xml:space="preserve">El remanente completo de </w:t>
+      </w:r>
+      <w:r>
+        <w:rPr/>
+        <w:t xml:space="preserve">app_js.html</w:t>
+      </w:r>
+      <w:r>
+        <w:rPr/>
+        <w:t xml:space="preserve"> (2591 líneas) se copió íntegro a </w:t>
+      </w:r>
+      <w:r>
+        <w:rPr/>
+        <w:t xml:space="preserve">app_matriz_js.html</w:t>
+      </w:r>
+      <w:r>
+        <w:rPr/>
+        <w:t xml:space="preserve"> como base, para minimizar el riesgo de una reconstrucción manual de un archivo de ese tamaño.</w:t>
+      </w:r>
+    </w:p>
+    <w:p>
+      <w:pPr>
+        <w:numPr>
+          <w:ilvl w:val="0"/>
+          <w:numId w:val="67"/>
+        </w:numPr>
+        <w:spacing w:lineRule="auto"/>
+      </w:pPr>
+      <w:r>
+        <w:rPr/>
+        <w:t xml:space="preserve">Reconciliadas las 3 parejas de funciones duplicadas de matriz que quedaban en todo el sistema: </w:t>
+      </w:r>
+      <w:r>
+        <w:rPr/>
+        <w:t xml:space="preserve">populateDropdowns</w:t>
+      </w:r>
+      <w:r>
+        <w:rPr/>
+        <w:t xml:space="preserve">, </w:t>
+      </w:r>
+      <w:r>
+        <w:rPr/>
+        <w:t xml:space="preserve">onProyectoChange</w:t>
+      </w:r>
+      <w:r>
+        <w:rPr/>
+        <w:t xml:space="preserve">, </w:t>
+      </w:r>
+      <w:r>
+        <w:rPr/>
+        <w:t xml:space="preserve">onTramoChange</w:t>
+      </w:r>
+      <w:r>
+        <w:rPr/>
+        <w:t xml:space="preserve">. En los tres casos la copia declarada en segundo lugar (y por tanto la que ya estaba activa en producción, por las reglas de shadowing de JS) es también la versión más completa — integra el widget de select buscable (</w:t>
+      </w:r>
+      <w:r>
+        <w:rPr/>
+        <w:t xml:space="preserve">refreshSelectSearch</w:t>
+      </w:r>
+      <w:r>
+        <w:rPr/>
+        <w:t xml:space="preserve">, restauración de valor previamente seleccionado) que la copia descartada no tenía. A diferencia de la reconciliación de </w:t>
+      </w:r>
+      <w:r>
+        <w:rPr/>
+        <w:t xml:space="preserve">setupModalCleanup</w:t>
+      </w:r>
+      <w:r>
+        <w:rPr/>
+        <w:t xml:space="preserve"> en la Fase 1, aquí “última declarada” y “más completa” coinciden — no hubo necesidad de confirmar con el usuario, decisión no ambigua.</w:t>
+      </w:r>
+    </w:p>
+    <w:p>
+      <w:pPr>
+        <w:numPr>
+          <w:ilvl w:val="0"/>
+          <w:numId w:val="67"/>
+        </w:numPr>
+        <w:spacing w:lineRule="auto"/>
+      </w:pPr>
+      <w:r>
+        <w:rPr/>
+        <w:t xml:space="preserve">app_js.html</w:t>
+      </w:r>
+      <w:r>
+        <w:rPr/>
+        <w:t xml:space="preserve"> eliminado del repositorio (</w:t>
+      </w:r>
+      <w:r>
+        <w:rPr/>
+        <w:t xml:space="preserve">git rm</w:t>
+      </w:r>
+      <w:r>
+        <w:rPr/>
+        <w:t xml:space="preserve">) — ya no existe como partial.</w:t>
+      </w:r>
+    </w:p>
+    <w:p>
+      <w:pPr>
+        <w:numPr>
+          <w:ilvl w:val="0"/>
+          <w:numId w:val="67"/>
+        </w:numPr>
+        <w:spacing w:lineRule="auto"/>
+      </w:pPr>
+      <w:r>
+        <w:rPr/>
+        <w:t xml:space="preserve">Index.html</w:t>
+      </w:r>
+      <w:r>
+        <w:rPr/>
+        <w:t xml:space="preserve"> actualizado: </w:t>
+      </w:r>
+      <w:r>
+        <w:rPr/>
+        <w:t xml:space="preserve">&lt;?!= include('app_js') ?&gt;</w:t>
+      </w:r>
+      <w:r>
+        <w:rPr/>
+        <w:t xml:space="preserve"> → </w:t>
+      </w:r>
+      <w:r>
+        <w:rPr/>
+        <w:t xml:space="preserve">&lt;?!= include('app_matriz_js') ?&gt;</w:t>
+      </w:r>
+      <w:r>
+        <w:rPr/>
+        <w:t xml:space="preserve">, como última línea de la cadena de </w:t>
+      </w:r>
+      <w:r>
+        <w:rPr/>
+        <w:t xml:space="preserve">include()</w:t>
+      </w:r>
+      <w:r>
+        <w:rPr/>
+        <w:t xml:space="preserve">.</w:t>
+      </w:r>
+    </w:p>
+    <w:p>
+      <w:pPr>
+        <w:spacing w:lineRule="auto"/>
+      </w:pPr>
+      <w:r>
+        <w:rPr>
+          <w:b/>
+        </w:rPr>
+        <w:t xml:space="preserve">Orden final de </w:t>
+      </w:r>
+      <w:r>
+        <w:rPr>
+          <w:b/>
+        </w:rPr>
+        <w:t xml:space="preserve">include()</w:t>
+      </w:r>
+      <w:r>
+        <w:rPr>
+          <w:b/>
+        </w:rPr>
+        <w:t xml:space="preserve"> en </w:t>
+      </w:r>
+      <w:r>
+        <w:rPr>
+          <w:b/>
+        </w:rPr>
+        <w:t xml:space="preserve">Index.html</w:t>
+      </w:r>
+      <w:r>
+        <w:rPr>
+          <w:b/>
+        </w:rPr>
+        <w:t xml:space="preserve"> (líneas 1595-1598), definitivo:</w:t>
+      </w:r>
+    </w:p>
+    <w:p>
+      <w:pPr>
+        <w:spacing w:lineRule="auto"/>
+      </w:pPr>
+      <w:r>
+        <w:rPr>
+          <w:rFonts w:ascii="Courier" w:hAnsi="Courier"/>
+        </w:rPr>
+        <w:t xml:space="preserve">&lt;?!= include('app_core_js') ?&gt; &lt;?!= include('app_alertas_js') ?&gt; &lt;?!= include('app_permisos_js') ?&gt; &lt;?!= include('app_matriz_js') ?&gt; </w:t>
+      </w:r>
+    </w:p>
+    <w:p>
+      <w:pPr>
+        <w:spacing w:lineRule="auto"/>
+      </w:pPr>
+      <w:r>
+        <w:rPr>
+          <w:b/>
+        </w:rPr>
+        <w:t xml:space="preserve">Métricas del Cambio (cierre del proyecto completo):</w:t>
+      </w:r>
+    </w:p>
+    <w:tbl>
+      <w:tblPr>
+        <w:tblBorders>
+          <w:top w:val="single" w:sz="2" w:space="0" w:color="000000"/>
+          <w:bottom w:val="single" w:sz="2" w:space="0" w:color="000000"/>
+          <w:left w:val="single" w:sz="2" w:space="0" w:color="000000"/>
+          <w:right w:val="single" w:sz="2" w:space="0" w:color="000000"/>
+        </w:tblBorders>
+        <w:tblCellSpacing w:w="0" w:type="dxa"/>
+        <w:tblCellMar>
+          <w:top w:type="dxa" w:w="80"/>
+          <w:bottom w:type="dxa" w:w="80"/>
+          <w:left w:type="dxa" w:w="160"/>
+          <w:right w:type="dxa" w:w="160"/>
+        </w:tblCellMar>
+        <w:jc w:val="center"/>
+      </w:tblPr>
+      <w:tblGrid>
+        <w:gridCol w:w="2880"/>
+        <w:gridCol w:w="2880"/>
+        <w:gridCol w:w="2880"/>
+      </w:tblGrid>
+      <w:tr>
+        <w:trPr/>
+        <w:tc>
+          <w:tcPr>
+            <w:tcBorders>
+              <w:top w:val="single" w:sz="1" w:space="0" w:color="000000"/>
+              <w:bottom w:val="single" w:sz="1" w:space="0" w:color="000000"/>
+              <w:left w:val="single" w:sz="1" w:space="0" w:color="000000"/>
+              <w:right w:val="single" w:sz="1" w:space="0" w:color="000000"/>
+            </w:tcBorders>
+          </w:tcPr>
+          <w:p>
+            <w:pPr>
+              <w:spacing w:lineRule="auto"/>
+            </w:pPr>
+            <w:r>
+              <w:rPr/>
+              <w:t xml:space="preserve">Archivo</w:t>
+            </w:r>
+          </w:p>
+        </w:tc>
+        <w:tc>
+          <w:tcPr>
+            <w:tcBorders>
+              <w:top w:val="single" w:sz="1" w:space="0" w:color="000000"/>
+              <w:bottom w:val="single" w:sz="1" w:space="0" w:color="000000"/>
+              <w:left w:val="single" w:sz="1" w:space="0" w:color="000000"/>
+              <w:right w:val="single" w:sz="1" w:space="0" w:color="000000"/>
+            </w:tcBorders>
+          </w:tcPr>
+          <w:p>
+            <w:pPr>
+              <w:spacing w:lineRule="auto"/>
+            </w:pPr>
+            <w:r>
+              <w:rPr/>
+              <w:t xml:space="preserve">LOC</w:t>
+            </w:r>
+          </w:p>
+        </w:tc>
+        <w:tc>
+          <w:tcPr>
+            <w:tcBorders>
+              <w:top w:val="single" w:sz="1" w:space="0" w:color="000000"/>
+              <w:bottom w:val="single" w:sz="1" w:space="0" w:color="000000"/>
+              <w:left w:val="single" w:sz="1" w:space="0" w:color="000000"/>
+              <w:right w:val="single" w:sz="1" w:space="0" w:color="000000"/>
+            </w:tcBorders>
+          </w:tcPr>
+          <w:p>
+            <w:pPr>
+              <w:spacing w:lineRule="auto"/>
+            </w:pPr>
+            <w:r>
+              <w:rPr/>
+              <w:t xml:space="preserve">Funciones top-level únicas</w:t>
+            </w:r>
+          </w:p>
+        </w:tc>
+      </w:tr>
+      <w:tblGrid>
+        <w:gridCol w:w="2880"/>
+        <w:gridCol w:w="2880"/>
+        <w:gridCol w:w="2880"/>
+      </w:tblGrid>
+      <w:tr>
+        <w:trPr/>
+        <w:tc>
+          <w:tcPr>
+            <w:tcBorders>
+              <w:top w:val="single" w:sz="1" w:space="0" w:color="000000"/>
+              <w:bottom w:val="single" w:sz="1" w:space="0" w:color="000000"/>
+              <w:left w:val="single" w:sz="1" w:space="0" w:color="000000"/>
+              <w:right w:val="single" w:sz="1" w:space="0" w:color="000000"/>
+            </w:tcBorders>
+          </w:tcPr>
+          <w:p>
+            <w:pPr>
+              <w:spacing w:lineRule="auto"/>
+            </w:pPr>
+            <w:r>
+              <w:rPr>
+                <w:highlight w:val="lightGray"/>
+              </w:rPr>
+              <w:t xml:space="preserve">app_core_js.html</w:t>
+            </w:r>
+          </w:p>
+        </w:tc>
+        <w:tc>
+          <w:tcPr>
+            <w:tcBorders>
+              <w:top w:val="single" w:sz="1" w:space="0" w:color="000000"/>
+              <w:bottom w:val="single" w:sz="1" w:space="0" w:color="000000"/>
+              <w:left w:val="single" w:sz="1" w:space="0" w:color="000000"/>
+              <w:right w:val="single" w:sz="1" w:space="0" w:color="000000"/>
+            </w:tcBorders>
+          </w:tcPr>
+          <w:p>
+            <w:pPr>
+              <w:spacing w:lineRule="auto"/>
+            </w:pPr>
+            <w:r>
+              <w:rPr/>
+              <w:t xml:space="preserve">698</w:t>
+            </w:r>
+          </w:p>
+        </w:tc>
+        <w:tc>
+          <w:tcPr>
+            <w:tcBorders>
+              <w:top w:val="single" w:sz="1" w:space="0" w:color="000000"/>
+              <w:bottom w:val="single" w:sz="1" w:space="0" w:color="000000"/>
+              <w:left w:val="single" w:sz="1" w:space="0" w:color="000000"/>
+              <w:right w:val="single" w:sz="1" w:space="0" w:color="000000"/>
+            </w:tcBorders>
+          </w:tcPr>
+          <w:p>
+            <w:pPr>
+              <w:spacing w:lineRule="auto"/>
+            </w:pPr>
+            <w:r>
+              <w:rPr/>
+              <w:t xml:space="preserve">23</w:t>
+            </w:r>
+          </w:p>
+        </w:tc>
+      </w:tr>
+      <w:tr>
+        <w:trPr/>
+        <w:tc>
+          <w:tcPr>
+            <w:tcBorders>
+              <w:top w:val="single" w:sz="1" w:space="0" w:color="000000"/>
+              <w:bottom w:val="single" w:sz="1" w:space="0" w:color="000000"/>
+              <w:left w:val="single" w:sz="1" w:space="0" w:color="000000"/>
+              <w:right w:val="single" w:sz="1" w:space="0" w:color="000000"/>
+            </w:tcBorders>
+          </w:tcPr>
+          <w:p>
+            <w:pPr>
+              <w:spacing w:lineRule="auto"/>
+            </w:pPr>
+            <w:r>
+              <w:rPr>
+                <w:highlight w:val="lightGray"/>
+              </w:rPr>
+              <w:t xml:space="preserve">app_alertas_js.html</w:t>
+            </w:r>
+          </w:p>
+        </w:tc>
+        <w:tc>
+          <w:tcPr>
+            <w:tcBorders>
+              <w:top w:val="single" w:sz="1" w:space="0" w:color="000000"/>
+              <w:bottom w:val="single" w:sz="1" w:space="0" w:color="000000"/>
+              <w:left w:val="single" w:sz="1" w:space="0" w:color="000000"/>
+              <w:right w:val="single" w:sz="1" w:space="0" w:color="000000"/>
+            </w:tcBorders>
+          </w:tcPr>
+          <w:p>
+            <w:pPr>
+              <w:spacing w:lineRule="auto"/>
+            </w:pPr>
+            <w:r>
+              <w:rPr/>
+              <w:t xml:space="preserve">502</w:t>
+            </w:r>
+          </w:p>
+        </w:tc>
+        <w:tc>
+          <w:tcPr>
+            <w:tcBorders>
+              <w:top w:val="single" w:sz="1" w:space="0" w:color="000000"/>
+              <w:bottom w:val="single" w:sz="1" w:space="0" w:color="000000"/>
+              <w:left w:val="single" w:sz="1" w:space="0" w:color="000000"/>
+              <w:right w:val="single" w:sz="1" w:space="0" w:color="000000"/>
+            </w:tcBorders>
+          </w:tcPr>
+          <w:p>
+            <w:pPr>
+              <w:spacing w:lineRule="auto"/>
+            </w:pPr>
+            <w:r>
+              <w:rPr/>
+              <w:t xml:space="preserve">16</w:t>
+            </w:r>
+          </w:p>
+        </w:tc>
+      </w:tr>
+      <w:tr>
+        <w:trPr/>
+        <w:tc>
+          <w:tcPr>
+            <w:tcBorders>
+              <w:top w:val="single" w:sz="1" w:space="0" w:color="000000"/>
+              <w:bottom w:val="single" w:sz="1" w:space="0" w:color="000000"/>
+              <w:left w:val="single" w:sz="1" w:space="0" w:color="000000"/>
+              <w:right w:val="single" w:sz="1" w:space="0" w:color="000000"/>
+            </w:tcBorders>
+          </w:tcPr>
+          <w:p>
+            <w:pPr>
+              <w:spacing w:lineRule="auto"/>
+            </w:pPr>
+            <w:r>
+              <w:rPr>
+                <w:highlight w:val="lightGray"/>
+              </w:rPr>
+              <w:t xml:space="preserve">app_permisos_js.html</w:t>
+            </w:r>
+          </w:p>
+        </w:tc>
+        <w:tc>
+          <w:tcPr>
+            <w:tcBorders>
+              <w:top w:val="single" w:sz="1" w:space="0" w:color="000000"/>
+              <w:bottom w:val="single" w:sz="1" w:space="0" w:color="000000"/>
+              <w:left w:val="single" w:sz="1" w:space="0" w:color="000000"/>
+              <w:right w:val="single" w:sz="1" w:space="0" w:color="000000"/>
+            </w:tcBorders>
+          </w:tcPr>
+          <w:p>
+            <w:pPr>
+              <w:spacing w:lineRule="auto"/>
+            </w:pPr>
+            <w:r>
+              <w:rPr/>
+              <w:t xml:space="preserve">371</w:t>
+            </w:r>
+          </w:p>
+        </w:tc>
+        <w:tc>
+          <w:tcPr>
+            <w:tcBorders>
+              <w:top w:val="single" w:sz="1" w:space="0" w:color="000000"/>
+              <w:bottom w:val="single" w:sz="1" w:space="0" w:color="000000"/>
+              <w:left w:val="single" w:sz="1" w:space="0" w:color="000000"/>
+              <w:right w:val="single" w:sz="1" w:space="0" w:color="000000"/>
+            </w:tcBorders>
+          </w:tcPr>
+          <w:p>
+            <w:pPr>
+              <w:spacing w:lineRule="auto"/>
+            </w:pPr>
+            <w:r>
+              <w:rPr/>
+              <w:t xml:space="preserve">24</w:t>
+            </w:r>
+          </w:p>
+        </w:tc>
+      </w:tr>
+      <w:tr>
+        <w:trPr/>
+        <w:tc>
+          <w:tcPr>
+            <w:tcBorders>
+              <w:top w:val="single" w:sz="1" w:space="0" w:color="000000"/>
+              <w:bottom w:val="single" w:sz="1" w:space="0" w:color="000000"/>
+              <w:left w:val="single" w:sz="1" w:space="0" w:color="000000"/>
+              <w:right w:val="single" w:sz="1" w:space="0" w:color="000000"/>
+            </w:tcBorders>
+          </w:tcPr>
+          <w:p>
+            <w:pPr>
+              <w:spacing w:lineRule="auto"/>
+            </w:pPr>
+            <w:r>
+              <w:rPr>
+                <w:highlight w:val="lightGray"/>
+              </w:rPr>
+              <w:t xml:space="preserve">app_matriz_js.html</w:t>
+            </w:r>
+          </w:p>
+        </w:tc>
+        <w:tc>
+          <w:tcPr>
+            <w:tcBorders>
+              <w:top w:val="single" w:sz="1" w:space="0" w:color="000000"/>
+              <w:bottom w:val="single" w:sz="1" w:space="0" w:color="000000"/>
+              <w:left w:val="single" w:sz="1" w:space="0" w:color="000000"/>
+              <w:right w:val="single" w:sz="1" w:space="0" w:color="000000"/>
+            </w:tcBorders>
+          </w:tcPr>
+          <w:p>
+            <w:pPr>
+              <w:spacing w:lineRule="auto"/>
+            </w:pPr>
+            <w:r>
+              <w:rPr/>
+              <w:t xml:space="preserve">2504</w:t>
+            </w:r>
+          </w:p>
+        </w:tc>
+        <w:tc>
+          <w:tcPr>
+            <w:tcBorders>
+              <w:top w:val="single" w:sz="1" w:space="0" w:color="000000"/>
+              <w:bottom w:val="single" w:sz="1" w:space="0" w:color="000000"/>
+              <w:left w:val="single" w:sz="1" w:space="0" w:color="000000"/>
+              <w:right w:val="single" w:sz="1" w:space="0" w:color="000000"/>
+            </w:tcBorders>
+          </w:tcPr>
+          <w:p>
+            <w:pPr>
+              <w:spacing w:lineRule="auto"/>
+            </w:pPr>
+            <w:r>
+              <w:rPr/>
+              <w:t xml:space="preserve">53</w:t>
+            </w:r>
+          </w:p>
+        </w:tc>
+      </w:tr>
+      <w:tr>
+        <w:trPr/>
+        <w:tc>
+          <w:tcPr>
+            <w:tcBorders>
+              <w:top w:val="single" w:sz="1" w:space="0" w:color="000000"/>
+              <w:bottom w:val="single" w:sz="1" w:space="0" w:color="000000"/>
+              <w:left w:val="single" w:sz="1" w:space="0" w:color="000000"/>
+              <w:right w:val="single" w:sz="1" w:space="0" w:color="000000"/>
+            </w:tcBorders>
+          </w:tcPr>
+          <w:p>
+            <w:pPr>
+              <w:spacing w:lineRule="auto"/>
+            </w:pPr>
+            <w:r>
+              <w:rPr>
+                <w:b/>
+              </w:rPr>
+              <w:t xml:space="preserve">Total sistema</w:t>
+            </w:r>
+          </w:p>
+        </w:tc>
+        <w:tc>
+          <w:tcPr>
+            <w:tcBorders>
+              <w:top w:val="single" w:sz="1" w:space="0" w:color="000000"/>
+              <w:bottom w:val="single" w:sz="1" w:space="0" w:color="000000"/>
+              <w:left w:val="single" w:sz="1" w:space="0" w:color="000000"/>
+              <w:right w:val="single" w:sz="1" w:space="0" w:color="000000"/>
+            </w:tcBorders>
+          </w:tcPr>
+          <w:p>
+            <w:pPr>
+              <w:spacing w:lineRule="auto"/>
+            </w:pPr>
+            <w:r>
+              <w:rPr>
+                <w:b/>
+              </w:rPr>
+              <w:t xml:space="preserve">4075</w:t>
+            </w:r>
+          </w:p>
+        </w:tc>
+        <w:tc>
+          <w:tcPr>
+            <w:tcBorders>
+              <w:top w:val="single" w:sz="1" w:space="0" w:color="000000"/>
+              <w:bottom w:val="single" w:sz="1" w:space="0" w:color="000000"/>
+              <w:left w:val="single" w:sz="1" w:space="0" w:color="000000"/>
+              <w:right w:val="single" w:sz="1" w:space="0" w:color="000000"/>
+            </w:tcBorders>
+          </w:tcPr>
+          <w:p>
+            <w:pPr>
+              <w:spacing w:lineRule="auto"/>
+            </w:pPr>
+            <w:r>
+              <w:rPr>
+                <w:b/>
+              </w:rPr>
+              <w:t xml:space="preserve">116</w:t>
+            </w:r>
+          </w:p>
+        </w:tc>
+      </w:tr>
+    </w:tbl>
+    <w:p>
+      <w:pPr>
+        <w:spacing w:lineRule="auto"/>
+      </w:pPr>
+      <w:r>
+        <w:rPr/>
+      </w:r>
+    </w:p>
+    <w:p>
+      <w:pPr>
+        <w:spacing w:lineRule="auto"/>
+      </w:pPr>
+      <w:r>
+        <w:rPr>
+          <w:b/>
+        </w:rPr>
+        <w:t xml:space="preserve">116 funciones únicas totales — coincide exactamente con el conteo del dictamen original (Sección 12.8)</w:t>
+      </w:r>
+      <w:r>
+        <w:rPr/>
+        <w:t xml:space="preserve">, confirmando que la extracción de las 4 fases no perdió ni duplicó ninguna función respecto al inventario inicial. </w:t>
+      </w:r>
+      <w:r>
+        <w:rPr/>
+        <w:t xml:space="preserve">app_js.html</w:t>
+      </w:r>
+      <w:r>
+        <w:rPr/>
+        <w:t xml:space="preserve"> (4281 LOC originales) queda completamente retirado; el total del sistema (4075 LOC) es menor al original porque se eliminaron las 11 funciones duplicadas identificadas en el dictamen (8 reconciliadas en core, 3 en matriz).</w:t>
+      </w:r>
+    </w:p>
+    <w:p>
+      <w:pPr>
+        <w:spacing w:lineRule="auto"/>
+      </w:pPr>
+      <w:r>
+        <w:rPr>
+          <w:b/>
+        </w:rPr>
+        <w:t xml:space="preserve">Validación y Pruebas Ejecutadas:</w:t>
+      </w:r>
+    </w:p>
+    <w:p>
+      <w:pPr>
+        <w:numPr>
+          <w:ilvl w:val="0"/>
+          <w:numId w:val="68"/>
+        </w:numPr>
+        <w:spacing w:lineRule="auto"/>
+      </w:pPr>
+      <w:r>
+        <w:rPr/>
+      </w:r>
+      <w:r>
+        <w:rPr/>
+        <w:t xml:space="preserve"> Sintaxis validada con </w:t>
+      </w:r>
+      <w:r>
+        <w:rPr/>
+        <w:t xml:space="preserve">node --check</w:t>
+      </w:r>
+      <w:r>
+        <w:rPr/>
+        <w:t xml:space="preserve"> sobre los 4 partials finales (</w:t>
+      </w:r>
+      <w:r>
+        <w:rPr/>
+        <w:t xml:space="preserve">app_core_js.html</w:t>
+      </w:r>
+      <w:r>
+        <w:rPr/>
+        <w:t xml:space="preserve">, </w:t>
+      </w:r>
+      <w:r>
+        <w:rPr/>
+        <w:t xml:space="preserve">app_alertas_js.html</w:t>
+      </w:r>
+      <w:r>
+        <w:rPr/>
+        <w:t xml:space="preserve">, </w:t>
+      </w:r>
+      <w:r>
+        <w:rPr/>
+        <w:t xml:space="preserve">app_permisos_js.html</w:t>
+      </w:r>
+      <w:r>
+        <w:rPr/>
+        <w:t xml:space="preserve">, </w:t>
+      </w:r>
+      <w:r>
+        <w:rPr/>
+        <w:t xml:space="preserve">app_matriz_js.html</w:t>
+      </w:r>
+      <w:r>
+        <w:rPr/>
+        <w:t xml:space="preserve">)</w:t>
+      </w:r>
+    </w:p>
+    <w:p>
+      <w:pPr>
+        <w:numPr>
+          <w:ilvl w:val="0"/>
+          <w:numId w:val="68"/>
+        </w:numPr>
+        <w:spacing w:lineRule="auto"/>
+      </w:pPr>
+      <w:r>
+        <w:rPr/>
+      </w:r>
+      <w:r>
+        <w:rPr/>
+        <w:t xml:space="preserve"> Auditoría de integridad global: </w:t>
+      </w:r>
+      <w:r>
+        <w:rPr>
+          <w:b/>
+        </w:rPr>
+        <w:t xml:space="preserve">cero colisiones de nombres de función entre los 4 partials</w:t>
+      </w:r>
+      <w:r>
+        <w:rPr/>
+        <w:t xml:space="preserve"> (verificado con un solo barrido sobre los 4 archivos juntos — antes de esta fase la única colisión pendiente en todo el sistema era la de matriz, ahora resuelta). Las funciones críticas de la ruta transaccional (</w:t>
+      </w:r>
+      <w:r>
+        <w:rPr/>
+        <w:t xml:space="preserve">submitTracking</w:t>
+      </w:r>
+      <w:r>
+        <w:rPr/>
+        <w:t xml:space="preserve">, </w:t>
+      </w:r>
+      <w:r>
+        <w:rPr/>
+        <w:t xml:space="preserve">openEditModal</w:t>
+      </w:r>
+      <w:r>
+        <w:rPr/>
+        <w:t xml:space="preserve">, </w:t>
+      </w:r>
+      <w:r>
+        <w:rPr/>
+        <w:t xml:space="preserve">generatePdfReport</w:t>
+      </w:r>
+      <w:r>
+        <w:rPr/>
+        <w:t xml:space="preserve">, </w:t>
+      </w:r>
+      <w:r>
+        <w:rPr/>
+        <w:t xml:space="preserve">renderMatrix</w:t>
+      </w:r>
+      <w:r>
+        <w:rPr/>
+        <w:t xml:space="preserve">, </w:t>
+      </w:r>
+      <w:r>
+        <w:rPr/>
+        <w:t xml:space="preserve">getBaseFilteredData</w:t>
+      </w:r>
+      <w:r>
+        <w:rPr/>
+        <w:t xml:space="preserve">) confirmadas presentes en </w:t>
+      </w:r>
+      <w:r>
+        <w:rPr/>
+        <w:t xml:space="preserve">app_matriz_js.html</w:t>
+      </w:r>
+      <w:r>
+        <w:rPr/>
+        <w:t xml:space="preserve">. </w:t>
+      </w:r>
+      <w:r>
+        <w:rPr/>
+        <w:t xml:space="preserve">google.script.run</w:t>
+      </w:r>
+      <w:r>
+        <w:rPr/>
+        <w:t xml:space="preserve">: 14 sitios de llamada en </w:t>
+      </w:r>
+      <w:r>
+        <w:rPr/>
+        <w:t xml:space="preserve">app_matriz_js.html</w:t>
+      </w:r>
+    </w:p>
+    <w:p>
+      <w:pPr>
+        <w:numPr>
+          <w:ilvl w:val="0"/>
+          <w:numId w:val="68"/>
+        </w:numPr>
+        <w:spacing w:lineRule="auto"/>
+      </w:pPr>
+      <w:r>
+        <w:rPr/>
+      </w:r>
+      <w:r>
+        <w:rPr/>
+        <w:t xml:space="preserve">clasp push</w:t>
+      </w:r>
+      <w:r>
+        <w:rPr/>
+        <w:t xml:space="preserve"> (40 archivos) al entorno de pruebas confirmado NO-producción — </w:t>
+      </w:r>
+      <w:r>
+        <w:rPr/>
+        <w:t xml:space="preserve">app_js.html</w:t>
+      </w:r>
+      <w:r>
+        <w:rPr/>
+        <w:t xml:space="preserve"> ausente de la lista de archivos subidos (confirma retiro correcto), </w:t>
+      </w:r>
+      <w:r>
+        <w:rPr/>
+        <w:t xml:space="preserve">app_matriz_js.html</w:t>
+      </w:r>
+      <w:r>
+        <w:rPr/>
+        <w:t xml:space="preserve"> presente</w:t>
+      </w:r>
+    </w:p>
+    <w:p>
+      <w:pPr>
+        <w:numPr>
+          <w:ilvl w:val="0"/>
+          <w:numId w:val="68"/>
+        </w:numPr>
+        <w:spacing w:lineRule="auto"/>
+      </w:pPr>
+      <w:r>
+        <w:rPr/>
+      </w:r>
+      <w:r>
+        <w:rPr>
+          <w:b/>
+        </w:rPr>
+        <w:t xml:space="preserve">QA manual en navegador real: sigue pendiente</w:t>
+      </w:r>
+      <w:r>
+        <w:rPr/>
+        <w:t xml:space="preserve">, arrastrado desde las Fases 2 y 3. Con las 4 fases ya desplegadas en </w:t>
+      </w:r>
+      <w:r>
+        <w:rPr/>
+        <w:t xml:space="preserve">@HEAD</w:t>
+      </w:r>
+      <w:r>
+        <w:rPr/>
+        <w:t xml:space="preserve">, este es ahora el único paso que falta para cerrar completamente CONC-FE-02 — no debe asumirse funcionalmente cerrado hasta esa confirmación.</w:t>
+      </w:r>
+    </w:p>
+    <w:p>
+      <w:pPr>
+        <w:spacing w:lineRule="auto"/>
+      </w:pPr>
+      <w:r>
+        <w:rPr>
+          <w:b/>
+        </w:rPr>
+        <w:t xml:space="preserve">Impacto en Producción:</w:t>
+      </w:r>
+      <w:r>
+        <w:rPr/>
+        <w:t xml:space="preserve"> La subdivisión modular de la interfaz queda completa: el monolito original de </w:t>
+      </w:r>
+      <w:r>
+        <w:rPr/>
+        <w:t xml:space="preserve">Index.html</w:t>
+      </w:r>
+      <w:r>
+        <w:rPr/>
+        <w:t xml:space="preserve"> (7340 líneas antes de FE-01) terminó dividido en </w:t>
+      </w:r>
+      <w:r>
+        <w:rPr/>
+        <w:t xml:space="preserve">Index.html</w:t>
+      </w:r>
+      <w:r>
+        <w:rPr/>
+        <w:t xml:space="preserve"> (markup) + </w:t>
+      </w:r>
+      <w:r>
+        <w:rPr/>
+        <w:t xml:space="preserve">estilos.html</w:t>
+      </w:r>
+      <w:r>
+        <w:rPr/>
+        <w:t xml:space="preserve"> (CSS) + 4 partials de JS por dominio funcional (</w:t>
+      </w:r>
+      <w:r>
+        <w:rPr/>
+        <w:t xml:space="preserve">app_core_js.html</w:t>
+      </w:r>
+      <w:r>
+        <w:rPr/>
+        <w:t xml:space="preserve">, </w:t>
+      </w:r>
+      <w:r>
+        <w:rPr/>
+        <w:t xml:space="preserve">app_alertas_js.html</w:t>
+      </w:r>
+      <w:r>
+        <w:rPr/>
+        <w:t xml:space="preserve">, </w:t>
+      </w:r>
+      <w:r>
+        <w:rPr/>
+        <w:t xml:space="preserve">app_permisos_js.html</w:t>
+      </w:r>
+      <w:r>
+        <w:rPr/>
+        <w:t xml:space="preserve">, </w:t>
+      </w:r>
+      <w:r>
+        <w:rPr/>
+        <w:t xml:space="preserve">app_matriz_js.html</w:t>
+      </w:r>
+      <w:r>
+        <w:rPr/>
+        <w:t xml:space="preserve">), sin ninguna función duplicada ni huérfana. </w:t>
+      </w:r>
+      <w:r>
+        <w:rPr/>
+        <w:t xml:space="preserve">app_js.html</w:t>
+      </w:r>
+      <w:r>
+        <w:rPr/>
+        <w:t xml:space="preserve">, que llegó a tener 4281 líneas mezclando 4 dominios de negocio, ya no existe. Pendiente transversal: la verificación en navegador real de las 4 fases, nunca confirmada explícitamente por el usuario en esta sesión.</w:t>
+      </w:r>
+    </w:p>
+    <w:p>
+      <w:pPr>
         <w:pStyle w:val="Heading2"/>
         <w:spacing w:lineRule="auto"/>
       </w:pPr>
@@ -15351,7 +16472,7 @@
       <w:pPr>
         <w:numPr>
           <w:ilvl w:val="0"/>
-          <w:numId w:val="66"/>
+          <w:numId w:val="69"/>
         </w:numPr>
         <w:spacing w:lineRule="auto"/>
       </w:pPr>
@@ -15420,7 +16541,7 @@
       <w:pPr>
         <w:numPr>
           <w:ilvl w:val="0"/>
-          <w:numId w:val="66"/>
+          <w:numId w:val="69"/>
         </w:numPr>
         <w:spacing w:lineRule="auto"/>
       </w:pPr>
@@ -15449,7 +16570,7 @@
       <w:pPr>
         <w:numPr>
           <w:ilvl w:val="0"/>
-          <w:numId w:val="66"/>
+          <w:numId w:val="69"/>
         </w:numPr>
         <w:spacing w:lineRule="auto"/>
       </w:pPr>
@@ -16803,7 +17924,7 @@
       <w:pPr>
         <w:numPr>
           <w:ilvl w:val="0"/>
-          <w:numId w:val="67"/>
+          <w:numId w:val="70"/>
         </w:numPr>
         <w:spacing w:lineRule="auto"/>
       </w:pPr>
@@ -16826,7 +17947,7 @@
       <w:pPr>
         <w:numPr>
           <w:ilvl w:val="0"/>
-          <w:numId w:val="67"/>
+          <w:numId w:val="70"/>
         </w:numPr>
         <w:spacing w:lineRule="auto"/>
       </w:pPr>
@@ -16845,7 +17966,7 @@
       <w:pPr>
         <w:numPr>
           <w:ilvl w:val="0"/>
-          <w:numId w:val="67"/>
+          <w:numId w:val="70"/>
         </w:numPr>
         <w:spacing w:lineRule="auto"/>
       </w:pPr>
@@ -16896,7 +18017,7 @@
       <w:pPr>
         <w:numPr>
           <w:ilvl w:val="0"/>
-          <w:numId w:val="67"/>
+          <w:numId w:val="70"/>
         </w:numPr>
         <w:spacing w:lineRule="auto"/>
       </w:pPr>
@@ -16937,7 +18058,7 @@
       <w:pPr>
         <w:numPr>
           <w:ilvl w:val="0"/>
-          <w:numId w:val="67"/>
+          <w:numId w:val="70"/>
         </w:numPr>
         <w:spacing w:lineRule="auto"/>
       </w:pPr>
@@ -16964,7 +18085,7 @@
       <w:pPr>
         <w:numPr>
           <w:ilvl w:val="0"/>
-          <w:numId w:val="67"/>
+          <w:numId w:val="70"/>
         </w:numPr>
         <w:spacing w:lineRule="auto"/>
       </w:pPr>
@@ -25190,6 +26311,372 @@
     </w:lvl>
   </w:abstractNum>
   <w:abstractNum w:abstractNumId="67">
+    <w:lvl w:ilvl="0">
+      <w:start w:val="1"/>
+      <w:numFmt w:val="bullet"/>
+      <w:lvlText w:val=""/>
+      <w:lvlJc w:val="left"/>
+      <w:pPr>
+        <w:tabs>
+          <w:tab w:val="num" w:pos="720"/>
+        </w:tabs>
+        <w:ind w:left="720" w:hanging="360"/>
+      </w:pPr>
+      <w:rPr>
+        <w:rFonts w:ascii="Symbol" w:hAnsi="Symbol" w:hint="default"/>
+      </w:rPr>
+    </w:lvl>
+    <w:lvl w:ilvl="1">
+      <w:start w:val="1"/>
+      <w:numFmt w:val="bullet"/>
+      <w:lvlText w:val=""/>
+      <w:lvlJc w:val="left"/>
+      <w:pPr>
+        <w:tabs>
+          <w:tab w:val="num" w:pos="1440"/>
+        </w:tabs>
+        <w:ind w:left="1440" w:hanging="360"/>
+      </w:pPr>
+      <w:rPr>
+        <w:rFonts w:ascii="Symbol" w:hAnsi="Symbol" w:hint="default"/>
+      </w:rPr>
+    </w:lvl>
+    <w:lvl w:ilvl="2">
+      <w:start w:val="1"/>
+      <w:numFmt w:val="bullet"/>
+      <w:lvlText w:val=""/>
+      <w:lvlJc w:val="left"/>
+      <w:pPr>
+        <w:tabs>
+          <w:tab w:val="num" w:pos="2160"/>
+        </w:tabs>
+        <w:ind w:left="2160" w:hanging="360"/>
+      </w:pPr>
+      <w:rPr>
+        <w:rFonts w:ascii="Symbol" w:hAnsi="Symbol" w:hint="default"/>
+      </w:rPr>
+    </w:lvl>
+    <w:lvl w:ilvl="3">
+      <w:start w:val="1"/>
+      <w:numFmt w:val="bullet"/>
+      <w:lvlText w:val=""/>
+      <w:lvlJc w:val="left"/>
+      <w:pPr>
+        <w:tabs>
+          <w:tab w:val="num" w:pos="2880"/>
+        </w:tabs>
+        <w:ind w:left="2880" w:hanging="360"/>
+      </w:pPr>
+      <w:rPr>
+        <w:rFonts w:ascii="Symbol" w:hAnsi="Symbol" w:hint="default"/>
+      </w:rPr>
+    </w:lvl>
+    <w:lvl w:ilvl="4">
+      <w:start w:val="1"/>
+      <w:numFmt w:val="bullet"/>
+      <w:lvlText w:val=""/>
+      <w:lvlJc w:val="left"/>
+      <w:pPr>
+        <w:tabs>
+          <w:tab w:val="num" w:pos="3600"/>
+        </w:tabs>
+        <w:ind w:left="3600" w:hanging="360"/>
+      </w:pPr>
+      <w:rPr>
+        <w:rFonts w:ascii="Symbol" w:hAnsi="Symbol" w:hint="default"/>
+      </w:rPr>
+    </w:lvl>
+    <w:lvl w:ilvl="5">
+      <w:start w:val="1"/>
+      <w:numFmt w:val="bullet"/>
+      <w:lvlText w:val=""/>
+      <w:lvlJc w:val="left"/>
+      <w:pPr>
+        <w:tabs>
+          <w:tab w:val="num" w:pos="4320"/>
+        </w:tabs>
+        <w:ind w:left="4320" w:hanging="360"/>
+      </w:pPr>
+      <w:rPr>
+        <w:rFonts w:ascii="Symbol" w:hAnsi="Symbol" w:hint="default"/>
+      </w:rPr>
+    </w:lvl>
+    <w:lvl w:ilvl="6">
+      <w:start w:val="1"/>
+      <w:numFmt w:val="bullet"/>
+      <w:lvlText w:val=""/>
+      <w:lvlJc w:val="left"/>
+      <w:pPr>
+        <w:tabs>
+          <w:tab w:val="num" w:pos="5040"/>
+        </w:tabs>
+        <w:ind w:left="5040" w:hanging="360"/>
+      </w:pPr>
+      <w:rPr>
+        <w:rFonts w:ascii="Symbol" w:hAnsi="Symbol" w:hint="default"/>
+      </w:rPr>
+    </w:lvl>
+    <w:lvl w:ilvl="7">
+      <w:start w:val="1"/>
+      <w:numFmt w:val="bullet"/>
+      <w:lvlText w:val=""/>
+      <w:lvlJc w:val="left"/>
+      <w:pPr>
+        <w:tabs>
+          <w:tab w:val="num" w:pos="5760"/>
+        </w:tabs>
+        <w:ind w:left="5760" w:hanging="360"/>
+      </w:pPr>
+      <w:rPr>
+        <w:rFonts w:ascii="Symbol" w:hAnsi="Symbol" w:hint="default"/>
+      </w:rPr>
+    </w:lvl>
+  </w:abstractNum>
+  <w:abstractNum w:abstractNumId="68">
+    <w:lvl w:ilvl="0">
+      <w:start w:val="1"/>
+      <w:numFmt w:val="bullet"/>
+      <w:lvlText w:val=""/>
+      <w:lvlJc w:val="left"/>
+      <w:pPr>
+        <w:tabs>
+          <w:tab w:val="num" w:pos="720"/>
+        </w:tabs>
+        <w:ind w:left="720" w:hanging="360"/>
+      </w:pPr>
+      <w:rPr>
+        <w:rFonts w:ascii="Symbol" w:hAnsi="Symbol" w:hint="default"/>
+      </w:rPr>
+    </w:lvl>
+    <w:lvl w:ilvl="1">
+      <w:start w:val="1"/>
+      <w:numFmt w:val="bullet"/>
+      <w:lvlText w:val=""/>
+      <w:lvlJc w:val="left"/>
+      <w:pPr>
+        <w:tabs>
+          <w:tab w:val="num" w:pos="1440"/>
+        </w:tabs>
+        <w:ind w:left="1440" w:hanging="360"/>
+      </w:pPr>
+      <w:rPr>
+        <w:rFonts w:ascii="Symbol" w:hAnsi="Symbol" w:hint="default"/>
+      </w:rPr>
+    </w:lvl>
+    <w:lvl w:ilvl="2">
+      <w:start w:val="1"/>
+      <w:numFmt w:val="bullet"/>
+      <w:lvlText w:val=""/>
+      <w:lvlJc w:val="left"/>
+      <w:pPr>
+        <w:tabs>
+          <w:tab w:val="num" w:pos="2160"/>
+        </w:tabs>
+        <w:ind w:left="2160" w:hanging="360"/>
+      </w:pPr>
+      <w:rPr>
+        <w:rFonts w:ascii="Symbol" w:hAnsi="Symbol" w:hint="default"/>
+      </w:rPr>
+    </w:lvl>
+    <w:lvl w:ilvl="3">
+      <w:start w:val="1"/>
+      <w:numFmt w:val="bullet"/>
+      <w:lvlText w:val=""/>
+      <w:lvlJc w:val="left"/>
+      <w:pPr>
+        <w:tabs>
+          <w:tab w:val="num" w:pos="2880"/>
+        </w:tabs>
+        <w:ind w:left="2880" w:hanging="360"/>
+      </w:pPr>
+      <w:rPr>
+        <w:rFonts w:ascii="Symbol" w:hAnsi="Symbol" w:hint="default"/>
+      </w:rPr>
+    </w:lvl>
+    <w:lvl w:ilvl="4">
+      <w:start w:val="1"/>
+      <w:numFmt w:val="bullet"/>
+      <w:lvlText w:val=""/>
+      <w:lvlJc w:val="left"/>
+      <w:pPr>
+        <w:tabs>
+          <w:tab w:val="num" w:pos="3600"/>
+        </w:tabs>
+        <w:ind w:left="3600" w:hanging="360"/>
+      </w:pPr>
+      <w:rPr>
+        <w:rFonts w:ascii="Symbol" w:hAnsi="Symbol" w:hint="default"/>
+      </w:rPr>
+    </w:lvl>
+    <w:lvl w:ilvl="5">
+      <w:start w:val="1"/>
+      <w:numFmt w:val="bullet"/>
+      <w:lvlText w:val=""/>
+      <w:lvlJc w:val="left"/>
+      <w:pPr>
+        <w:tabs>
+          <w:tab w:val="num" w:pos="4320"/>
+        </w:tabs>
+        <w:ind w:left="4320" w:hanging="360"/>
+      </w:pPr>
+      <w:rPr>
+        <w:rFonts w:ascii="Symbol" w:hAnsi="Symbol" w:hint="default"/>
+      </w:rPr>
+    </w:lvl>
+    <w:lvl w:ilvl="6">
+      <w:start w:val="1"/>
+      <w:numFmt w:val="bullet"/>
+      <w:lvlText w:val=""/>
+      <w:lvlJc w:val="left"/>
+      <w:pPr>
+        <w:tabs>
+          <w:tab w:val="num" w:pos="5040"/>
+        </w:tabs>
+        <w:ind w:left="5040" w:hanging="360"/>
+      </w:pPr>
+      <w:rPr>
+        <w:rFonts w:ascii="Symbol" w:hAnsi="Symbol" w:hint="default"/>
+      </w:rPr>
+    </w:lvl>
+    <w:lvl w:ilvl="7">
+      <w:start w:val="1"/>
+      <w:numFmt w:val="bullet"/>
+      <w:lvlText w:val=""/>
+      <w:lvlJc w:val="left"/>
+      <w:pPr>
+        <w:tabs>
+          <w:tab w:val="num" w:pos="5760"/>
+        </w:tabs>
+        <w:ind w:left="5760" w:hanging="360"/>
+      </w:pPr>
+      <w:rPr>
+        <w:rFonts w:ascii="Symbol" w:hAnsi="Symbol" w:hint="default"/>
+      </w:rPr>
+    </w:lvl>
+  </w:abstractNum>
+  <w:abstractNum w:abstractNumId="69">
+    <w:lvl w:ilvl="0">
+      <w:start w:val="1"/>
+      <w:numFmt w:val="bullet"/>
+      <w:lvlText w:val=""/>
+      <w:lvlJc w:val="left"/>
+      <w:pPr>
+        <w:tabs>
+          <w:tab w:val="num" w:pos="720"/>
+        </w:tabs>
+        <w:ind w:left="720" w:hanging="360"/>
+      </w:pPr>
+      <w:rPr>
+        <w:rFonts w:ascii="Symbol" w:hAnsi="Symbol" w:hint="default"/>
+      </w:rPr>
+    </w:lvl>
+    <w:lvl w:ilvl="1">
+      <w:start w:val="1"/>
+      <w:numFmt w:val="bullet"/>
+      <w:lvlText w:val=""/>
+      <w:lvlJc w:val="left"/>
+      <w:pPr>
+        <w:tabs>
+          <w:tab w:val="num" w:pos="1440"/>
+        </w:tabs>
+        <w:ind w:left="1440" w:hanging="360"/>
+      </w:pPr>
+      <w:rPr>
+        <w:rFonts w:ascii="Symbol" w:hAnsi="Symbol" w:hint="default"/>
+      </w:rPr>
+    </w:lvl>
+    <w:lvl w:ilvl="2">
+      <w:start w:val="1"/>
+      <w:numFmt w:val="bullet"/>
+      <w:lvlText w:val=""/>
+      <w:lvlJc w:val="left"/>
+      <w:pPr>
+        <w:tabs>
+          <w:tab w:val="num" w:pos="2160"/>
+        </w:tabs>
+        <w:ind w:left="2160" w:hanging="360"/>
+      </w:pPr>
+      <w:rPr>
+        <w:rFonts w:ascii="Symbol" w:hAnsi="Symbol" w:hint="default"/>
+      </w:rPr>
+    </w:lvl>
+    <w:lvl w:ilvl="3">
+      <w:start w:val="1"/>
+      <w:numFmt w:val="bullet"/>
+      <w:lvlText w:val=""/>
+      <w:lvlJc w:val="left"/>
+      <w:pPr>
+        <w:tabs>
+          <w:tab w:val="num" w:pos="2880"/>
+        </w:tabs>
+        <w:ind w:left="2880" w:hanging="360"/>
+      </w:pPr>
+      <w:rPr>
+        <w:rFonts w:ascii="Symbol" w:hAnsi="Symbol" w:hint="default"/>
+      </w:rPr>
+    </w:lvl>
+    <w:lvl w:ilvl="4">
+      <w:start w:val="1"/>
+      <w:numFmt w:val="bullet"/>
+      <w:lvlText w:val=""/>
+      <w:lvlJc w:val="left"/>
+      <w:pPr>
+        <w:tabs>
+          <w:tab w:val="num" w:pos="3600"/>
+        </w:tabs>
+        <w:ind w:left="3600" w:hanging="360"/>
+      </w:pPr>
+      <w:rPr>
+        <w:rFonts w:ascii="Symbol" w:hAnsi="Symbol" w:hint="default"/>
+      </w:rPr>
+    </w:lvl>
+    <w:lvl w:ilvl="5">
+      <w:start w:val="1"/>
+      <w:numFmt w:val="bullet"/>
+      <w:lvlText w:val=""/>
+      <w:lvlJc w:val="left"/>
+      <w:pPr>
+        <w:tabs>
+          <w:tab w:val="num" w:pos="4320"/>
+        </w:tabs>
+        <w:ind w:left="4320" w:hanging="360"/>
+      </w:pPr>
+      <w:rPr>
+        <w:rFonts w:ascii="Symbol" w:hAnsi="Symbol" w:hint="default"/>
+      </w:rPr>
+    </w:lvl>
+    <w:lvl w:ilvl="6">
+      <w:start w:val="1"/>
+      <w:numFmt w:val="bullet"/>
+      <w:lvlText w:val=""/>
+      <w:lvlJc w:val="left"/>
+      <w:pPr>
+        <w:tabs>
+          <w:tab w:val="num" w:pos="5040"/>
+        </w:tabs>
+        <w:ind w:left="5040" w:hanging="360"/>
+      </w:pPr>
+      <w:rPr>
+        <w:rFonts w:ascii="Symbol" w:hAnsi="Symbol" w:hint="default"/>
+      </w:rPr>
+    </w:lvl>
+    <w:lvl w:ilvl="7">
+      <w:start w:val="1"/>
+      <w:numFmt w:val="bullet"/>
+      <w:lvlText w:val=""/>
+      <w:lvlJc w:val="left"/>
+      <w:pPr>
+        <w:tabs>
+          <w:tab w:val="num" w:pos="5760"/>
+        </w:tabs>
+        <w:ind w:left="5760" w:hanging="360"/>
+      </w:pPr>
+      <w:rPr>
+        <w:rFonts w:ascii="Symbol" w:hAnsi="Symbol" w:hint="default"/>
+      </w:rPr>
+    </w:lvl>
+  </w:abstractNum>
+  <w:abstractNum w:abstractNumId="70">
     <w:lvl w:ilvl="0">
       <w:start w:val="1"/>
       <w:numFmt w:val="decimal"/>
@@ -25487,6 +26974,15 @@
   </w:num>
   <w:num w:numId="67">
     <w:abstractNumId w:val="67"/>
+  </w:num>
+  <w:num w:numId="68">
+    <w:abstractNumId w:val="68"/>
+  </w:num>
+  <w:num w:numId="69">
+    <w:abstractNumId w:val="69"/>
+  </w:num>
+  <w:num w:numId="70">
+    <w:abstractNumId w:val="70"/>
   </w:num>
 </w:numbering>
 </file>

</xml_diff>

<commit_message>
docs(plan): define phase 5 architecture for performance, database decoupling, and UI/UX modernization
Co-Authored-By: Claude Sonnet 5 <noreply@anthropic.com>
</commit_message>
<xml_diff>
--- a/Documento_Tecnico_Aplicacion_Predios.docx
+++ b/Documento_Tecnico_Aplicacion_Predios.docx
@@ -13315,6 +13315,1314 @@
     </w:p>
     <w:p>
       <w:pPr>
+        <w:pStyle w:val="Heading3"/>
+        <w:spacing w:lineRule="auto"/>
+      </w:pPr>
+      <w:r>
+        <w:rPr/>
+        <w:t xml:space="preserve">12.12 [2026-08-06] [CONC-P5] Fase 5 — Dictamen de arquitectura: optimización de rendimiento, desacoplamiento de base de datos y rediseño UI/UX (planificación)</w:t>
+      </w:r>
+    </w:p>
+    <w:p>
+      <w:pPr>
+        <w:spacing w:lineRule="auto"/>
+      </w:pPr>
+      <w:r>
+        <w:rPr>
+          <w:b/>
+        </w:rPr>
+        <w:t xml:space="preserve">Archivo(s) Intervenido(s):</w:t>
+      </w:r>
+    </w:p>
+    <w:p>
+      <w:pPr>
+        <w:numPr>
+          <w:ilvl w:val="0"/>
+          <w:numId w:val="69"/>
+        </w:numPr>
+        <w:spacing w:lineRule="auto"/>
+      </w:pPr>
+      <w:r>
+        <w:rPr/>
+        <w:t xml:space="preserve">TODOS.md</w:t>
+      </w:r>
+      <w:r>
+        <w:rPr/>
+        <w:t xml:space="preserve"> (ítems 8 y 9 nuevos)</w:t>
+      </w:r>
+    </w:p>
+    <w:p>
+      <w:pPr>
+        <w:numPr>
+          <w:ilvl w:val="0"/>
+          <w:numId w:val="69"/>
+        </w:numPr>
+        <w:spacing w:lineRule="auto"/>
+      </w:pPr>
+      <w:r>
+        <w:rPr/>
+        <w:t xml:space="preserve">DOCUMENTACION_TECNICA_VIVA.md</w:t>
+      </w:r>
+      <w:r>
+        <w:rPr/>
+        <w:t xml:space="preserve"> (esta sección)</w:t>
+      </w:r>
+    </w:p>
+    <w:p>
+      <w:pPr>
+        <w:numPr>
+          <w:ilvl w:val="0"/>
+          <w:numId w:val="69"/>
+        </w:numPr>
+        <w:spacing w:lineRule="auto"/>
+      </w:pPr>
+      <w:r>
+        <w:rPr/>
+        <w:t xml:space="preserve">Ningún archivo de código tocado — sesión puramente de planificación, sin implementación.</w:t>
+      </w:r>
+    </w:p>
+    <w:p>
+      <w:pPr>
+        <w:spacing w:lineRule="auto"/>
+      </w:pPr>
+      <w:r>
+        <w:rPr>
+          <w:b/>
+        </w:rPr>
+        <w:t xml:space="preserve">Propósito del Archivo en el Sistema:</w:t>
+      </w:r>
+      <w:r>
+        <w:rPr/>
+        <w:t xml:space="preserve"> Cierra la Fase 5 de planificación iniciada tras la modularización completa del frontend (Fases 1-4, Sección 12.11). Diagnostica la causa raíz del tiempo de carga &gt;5s reportado por el usuario y fija el dictamen de arquitectura para atacarlo sin migrar la fuente de verdad (Google Sheets) a un sistema externo.</w:t>
+      </w:r>
+    </w:p>
+    <w:p>
+      <w:pPr>
+        <w:spacing w:lineRule="auto"/>
+      </w:pPr>
+      <w:r>
+        <w:rPr>
+          <w:b/>
+        </w:rPr>
+        <w:t xml:space="preserve">Motivo de la Intervención:</w:t>
+      </w:r>
+      <w:r>
+        <w:rPr/>
+        <w:t xml:space="preserve"> Solicitud explícita del usuario para iniciar “Fase 5: Optimización de Rendimiento, Desacoplamiento de Base de Datos y Rediseño UI/UX”, con un pipeline de 5 pasos: </w:t>
+      </w:r>
+      <w:r>
+        <w:rPr/>
+        <w:t xml:space="preserve">/careful</w:t>
+      </w:r>
+      <w:r>
+        <w:rPr/>
+        <w:t xml:space="preserve"> → </w:t>
+      </w:r>
+      <w:r>
+        <w:rPr/>
+        <w:t xml:space="preserve">/office-hours</w:t>
+      </w:r>
+      <w:r>
+        <w:rPr/>
+        <w:t xml:space="preserve"> (adaptado) → </w:t>
+      </w:r>
+      <w:r>
+        <w:rPr/>
+        <w:t xml:space="preserve">/plan-ceo-review</w:t>
+      </w:r>
+      <w:r>
+        <w:rPr/>
+        <w:t xml:space="preserve"> (modo HOLD SCOPE) → </w:t>
+      </w:r>
+      <w:r>
+        <w:rPr/>
+        <w:t xml:space="preserve">/plan-eng-review</w:t>
+      </w:r>
+      <w:r>
+        <w:rPr/>
+        <w:t xml:space="preserve"> → documentación y commit de planificación.</w:t>
+      </w:r>
+    </w:p>
+    <w:p>
+      <w:pPr>
+        <w:spacing w:lineRule="auto"/>
+      </w:pPr>
+      <w:r>
+        <w:rPr>
+          <w:b/>
+        </w:rPr>
+        <w:t xml:space="preserve">Diagnóstico (causa raíz, verificado por lectura directa del código):</w:t>
+      </w:r>
+      <w:r>
+        <w:rPr/>
+        <w:t xml:space="preserve">getDashboardData</w:t>
+      </w:r>
+      <w:r>
+        <w:rPr/>
+        <w:t xml:space="preserve"> (</w:t>
+      </w:r>
+      <w:r>
+        <w:rPr/>
+        <w:t xml:space="preserve">Codigo.js</w:t>
+      </w:r>
+      <w:r>
+        <w:rPr/>
+        <w:t xml:space="preserve"> ~323-440) abre el spreadsheet vía </w:t>
+      </w:r>
+      <w:r>
+        <w:rPr/>
+        <w:t xml:space="preserve">SpreadsheetApp.openById()</w:t>
+      </w:r>
+      <w:r>
+        <w:rPr/>
+        <w:t xml:space="preserve"> y lee las hojas </w:t>
+      </w:r>
+      <w:r>
+        <w:rPr/>
+        <w:t xml:space="preserve">Datos</w:t>
+      </w:r>
+      <w:r>
+        <w:rPr/>
+        <w:t xml:space="preserve"> y </w:t>
+      </w:r>
+      <w:r>
+        <w:rPr/>
+        <w:t xml:space="preserve">Seguimiento</w:t>
+      </w:r>
+      <w:r>
+        <w:rPr/>
+        <w:t xml:space="preserve"> completas por </w:t>
+      </w:r>
+      <w:r>
+        <w:rPr/>
+        <w:t xml:space="preserve">getDataRange().getDisplayValues()</w:t>
+      </w:r>
+      <w:r>
+        <w:rPr/>
+        <w:t xml:space="preserve"> en cada llamada, sin ningún caché — esta es la causa raíz medida del tiempo de carga, no una sospecha. </w:t>
+      </w:r>
+      <w:r>
+        <w:rPr/>
+        <w:t xml:space="preserve">getPACData</w:t>
+      </w:r>
+      <w:r>
+        <w:rPr/>
+        <w:t xml:space="preserve"> (</w:t>
+      </w:r>
+      <w:r>
+        <w:rPr/>
+        <w:t xml:space="preserve">pac_api.js:5</w:t>
+      </w:r>
+      <w:r>
+        <w:rPr/>
+        <w:t xml:space="preserve">) tiene el mismo patrón, mitigado parcialmente por </w:t>
+      </w:r>
+      <w:r>
+        <w:rPr/>
+        <w:t xml:space="preserve">_PAC_RUNTIME_CACHE</w:t>
+      </w:r>
+      <w:r>
+        <w:rPr/>
+        <w:t xml:space="preserve"> (memoización in-memory, solo dentro del mismo request — no cruza ejecuciones).</w:t>
+      </w:r>
+    </w:p>
+    <w:p>
+      <w:pPr>
+        <w:spacing w:lineRule="auto"/>
+      </w:pPr>
+      <w:r>
+        <w:rPr>
+          <w:b/>
+        </w:rPr>
+        <w:t xml:space="preserve">Corrección de premisa (hecha durante el Architecture Review):</w:t>
+      </w:r>
+      <w:r>
+        <w:rPr/>
+        <w:t xml:space="preserve"> el framing inicial del usuario sobre “bloqueos por concurrencia (sheet contention)” en las escrituras de auditoría sugería un problema de </w:t>
+      </w:r>
+      <w:r>
+        <w:rPr/>
+        <w:t xml:space="preserve">LockService</w:t>
+      </w:r>
+      <w:r>
+        <w:rPr/>
+        <w:t xml:space="preserve">. Verificado por lectura de </w:t>
+      </w:r>
+      <w:r>
+        <w:rPr/>
+        <w:t xml:space="preserve">GestorAuditoria.registrarAccion</w:t>
+      </w:r>
+      <w:r>
+        <w:rPr/>
+        <w:t xml:space="preserve"> (</w:t>
+      </w:r>
+      <w:r>
+        <w:rPr/>
+        <w:t xml:space="preserve">auditoria.js</w:t>
+      </w:r>
+      <w:r>
+        <w:rPr/>
+        <w:t xml:space="preserve"> ~17-35) → </w:t>
+      </w:r>
+      <w:r>
+        <w:rPr/>
+        <w:t xml:space="preserve">GestorDatos.agregarFila</w:t>
+      </w:r>
+      <w:r>
+        <w:rPr/>
+        <w:t xml:space="preserve"> (</w:t>
+      </w:r>
+      <w:r>
+        <w:rPr/>
+        <w:t xml:space="preserve">datos.js:146-160</w:t>
+      </w:r>
+      <w:r>
+        <w:rPr/>
+        <w:t xml:space="preserve">): </w:t>
+      </w:r>
+      <w:r>
+        <w:rPr>
+          <w:b/>
+        </w:rPr>
+        <w:t xml:space="preserve">no existe ningún </w:t>
+      </w:r>
+      <w:r>
+        <w:rPr>
+          <w:b/>
+        </w:rPr>
+        <w:t xml:space="preserve">LockService</w:t>
+      </w:r>
+      <w:r>
+        <w:rPr>
+          <w:b/>
+        </w:rPr>
+        <w:t xml:space="preserve"> propio</w:t>
+      </w:r>
+      <w:r>
+        <w:rPr/>
+        <w:t xml:space="preserve"> en esta ruta — depende enteramente de que el llamador ya sostenga un lock. El riesgo real es la serialización interna de Google Sheets a nivel de </w:t>
+      </w:r>
+      <w:r>
+        <w:rPr>
+          <w:b/>
+        </w:rPr>
+        <w:t xml:space="preserve">archivo completo, no de pestaña</w:t>
+      </w:r>
+      <w:r>
+        <w:rPr/>
+        <w:t xml:space="preserve"> (confirmado por WebSearch) — un hallazgo más grave que la premisa original porque es invisible/no controlable desde el código de la aplicación. Consecuencia directa: mover el log de auditoría a una </w:t>
+      </w:r>
+      <w:r>
+        <w:rPr>
+          <w:b/>
+        </w:rPr>
+        <w:t xml:space="preserve">pestaña</w:t>
+      </w:r>
+      <w:r>
+        <w:rPr/>
+        <w:t xml:space="preserve"> separada dentro del mismo archivo no resuelve nada; se requiere un </w:t>
+      </w:r>
+      <w:r>
+        <w:rPr>
+          <w:b/>
+        </w:rPr>
+        <w:t xml:space="preserve">spreadsheet físicamente distinto</w:t>
+      </w:r>
+      <w:r>
+        <w:rPr/>
+        <w:t xml:space="preserve">.</w:t>
+      </w:r>
+    </w:p>
+    <w:p>
+      <w:pPr>
+        <w:spacing w:lineRule="auto"/>
+      </w:pPr>
+      <w:r>
+        <w:rPr>
+          <w:b/>
+        </w:rPr>
+        <w:t xml:space="preserve">Decisión de scope (</w:t>
+      </w:r>
+      <w:r>
+        <w:rPr>
+          <w:b/>
+        </w:rPr>
+        <w:t xml:space="preserve">/plan-ceo-review</w:t>
+      </w:r>
+      <w:r>
+        <w:rPr>
+          <w:b/>
+        </w:rPr>
+        <w:t xml:space="preserve">, Mega Plan Review, modo HOLD SCOPE):</w:t>
+      </w:r>
+      <w:r>
+        <w:rPr/>
+        <w:t xml:space="preserve"> Firestore u otra base de datos externa como reemplazo de Sheets, descartada por ROI negativo frente al costo/riesgo de reescritura dado el tamaño actual del sistema. Arquitectura aprobada: 2 capas de caché (</w:t>
+      </w:r>
+      <w:r>
+        <w:rPr/>
+        <w:t xml:space="preserve">CacheService</w:t>
+      </w:r>
+      <w:r>
+        <w:rPr/>
+        <w:t xml:space="preserve"> en backend + IndexedDB en cliente) sobre el mismo origen Sheets, más separación física del spreadsheet de LOGS. En modo HOLD SCOPE el documento de plan CEO completo se omite (regla propia del skill) — el output formal es el dictamen de </w:t>
+      </w:r>
+      <w:r>
+        <w:rPr/>
+        <w:t xml:space="preserve">/plan-eng-review</w:t>
+      </w:r>
+      <w:r>
+        <w:rPr/>
+        <w:t xml:space="preserve"> que sigue.</w:t>
+      </w:r>
+    </w:p>
+    <w:p>
+      <w:pPr>
+        <w:spacing w:lineRule="auto"/>
+      </w:pPr>
+      <w:r>
+        <w:rPr>
+          <w:b/>
+        </w:rPr>
+        <w:t xml:space="preserve">Arquitectura de componentes (Mermaid):</w:t>
+      </w:r>
+    </w:p>
+    <w:p>
+      <w:pPr>
+        <w:spacing w:lineRule="auto"/>
+      </w:pPr>
+      <w:r>
+        <w:rPr>
+          <w:rFonts w:ascii="Courier" w:hAnsi="Courier"/>
+        </w:rPr>
+        <w:t xml:space="preserve">graph LR     subgraph Cliente         UI[SPA / HtmlService] --&gt; IDB[(IndexedDB&lt;br/&gt;caché de cliente,&lt;br/&gt;best-effort, sin Service Worker)]     end     subgraph Backend[GAS Backend]         GDD[getDashboardData]         GPD[getPACData]         INV[invalidateDataCache]         CS[(CacheService&lt;br/&gt;100KB/valor, 1000 keys, 6h TTL)]         MC{Check modo&lt;br/&gt;mantenimiento}     end     subgraph Origen[Spreadsheets]         SD[(Sheets: Datos + Seguimiento)]         SP[(Sheets: PAC)]         SL[(Sheets: LOGS&lt;br/&gt;archivo NUEVO y separado)]     end     UI --&gt;|google.script.run| MC     MC --&gt;|OK| GDD     MC --&gt;|OK| GPD     GDD &lt;--&gt; CS     GPD &lt;--&gt; CS     GDD -.lee.-&gt; SD     GPD -.lee.-&gt; SP     GDD --&gt;|escritura| INV     INV --&gt;|invalida| CS     Auditoria[GestorAuditoria.registrarAccion] --&gt;|escribe, sin LockService propio| SL     UI &lt;-.actualiza tras respuesta.-&gt; IDB </w:t>
+      </w:r>
+    </w:p>
+    <w:p>
+      <w:pPr>
+        <w:spacing w:lineRule="auto"/>
+      </w:pPr>
+      <w:r>
+        <w:rPr>
+          <w:b/>
+        </w:rPr>
+        <w:t xml:space="preserve">Secuencia de lectura acelerada (Mermaid):</w:t>
+      </w:r>
+    </w:p>
+    <w:p>
+      <w:pPr>
+        <w:spacing w:lineRule="auto"/>
+      </w:pPr>
+      <w:r>
+        <w:rPr>
+          <w:rFonts w:ascii="Courier" w:hAnsi="Courier"/>
+        </w:rPr>
+        <w:t xml:space="preserve">sequenceDiagram     participant U as Usuario     participant UI as SPA (Skeleton Loader)     participant IDB as IndexedDB     participant GS as google.script.run     participant BE as Backend GAS     participant CS as CacheService     participant SH as Sheets      U-&gt;&gt;UI: abre Tablero/PAC     UI-&gt;&gt;UI: pinta Skeleton inmediato     UI-&gt;&gt;IDB: ¿hay caché local?     alt caché local existe         IDB--&gt;&gt;UI: datos parciales (marcados como posiblemente desactualizados)     end     UI-&gt;&gt;GS: getDashboardData()/getPACData()     GS-&gt;&gt;BE: invoca función     BE-&gt;&gt;BE: check modo mantenimiento (NUNCA cacheado)     alt mantenimiento activo         BE--&gt;&gt;UI: bloqueo, sin leer caché     else operación normal         BE-&gt;&gt;CS: get(cacheKey)         alt hit             CS--&gt;&gt;BE: datos cacheados         else miss             BE-&gt;&gt;SH: lectura completa (getDisplayValues)             SH--&gt;&gt;BE: filas             BE-&gt;&gt;CS: put(cacheKey, datos) [try/catch, overflow 100KB → skip cache]         end         BE--&gt;&gt;UI: respuesta     end     UI-&gt;&gt;IDB: actualiza caché local     UI-&gt;&gt;UI: reemplaza Skeleton por datos reales, sin parpadeo </w:t>
+      </w:r>
+    </w:p>
+    <w:p>
+      <w:pPr>
+        <w:spacing w:lineRule="auto"/>
+      </w:pPr>
+      <w:r>
+        <w:rPr>
+          <w:b/>
+        </w:rPr>
+        <w:t xml:space="preserve">Esquema de migración </w:t>
+      </w:r>
+      <w:r>
+        <w:rPr>
+          <w:b/>
+        </w:rPr>
+        <w:t xml:space="preserve">getUserLogs</w:t>
+      </w:r>
+      <w:r>
+        <w:rPr>
+          <w:b/>
+        </w:rPr>
+        <w:t xml:space="preserve">/</w:t>
+      </w:r>
+      <w:r>
+        <w:rPr>
+          <w:b/>
+        </w:rPr>
+        <w:t xml:space="preserve">logAction</w:t>
+      </w:r>
+      <w:r>
+        <w:rPr>
+          <w:b/>
+        </w:rPr>
+        <w:t xml:space="preserve">:</w:t>
+      </w:r>
+      <w:r>
+        <w:rPr/>
+        <w:t xml:space="preserve"> ver detalle completo en la respuesta de esta sesión — resumen: </w:t>
+      </w:r>
+      <w:r>
+        <w:rPr/>
+        <w:t xml:space="preserve">CONFIG.DATA_FILES_IDS.LOGS</w:t>
+      </w:r>
+      <w:r>
+        <w:rPr/>
+        <w:t xml:space="preserve"> nuevo, </w:t>
+      </w:r>
+      <w:r>
+        <w:rPr/>
+        <w:t xml:space="preserve">GestorDatos.agregarFila</w:t>
+      </w:r>
+      <w:r>
+        <w:rPr/>
+        <w:t xml:space="preserve">/</w:t>
+      </w:r>
+      <w:r>
+        <w:rPr/>
+        <w:t xml:space="preserve">GestorAuditoria.registrarAccion</w:t>
+      </w:r>
+      <w:r>
+        <w:rPr/>
+        <w:t xml:space="preserve"> resuelven el spreadsheet de destino vía ese ID cuando el destino es LOGS, </w:t>
+      </w:r>
+      <w:r>
+        <w:rPr>
+          <w:b/>
+        </w:rPr>
+        <w:t xml:space="preserve">cero cambios de firma pública</w:t>
+      </w:r>
+      <w:r>
+        <w:rPr/>
+        <w:t xml:space="preserve"> en los 16 call sites existentes (</w:t>
+      </w:r>
+      <w:r>
+        <w:rPr/>
+        <w:t xml:space="preserve">Codigo.js:181,729</w:t>
+      </w:r>
+      <w:r>
+        <w:rPr/>
+        <w:t xml:space="preserve">, </w:t>
+      </w:r>
+      <w:r>
+        <w:rPr/>
+        <w:t xml:space="preserve">datos.js:372,418,505,580,640,698</w:t>
+      </w:r>
+      <w:r>
+        <w:rPr/>
+        <w:t xml:space="preserve">, </w:t>
+      </w:r>
+      <w:r>
+        <w:rPr/>
+        <w:t xml:space="preserve">evaluador_alertas.js:76</w:t>
+      </w:r>
+      <w:r>
+        <w:rPr/>
+        <w:t xml:space="preserve">, </w:t>
+      </w:r>
+      <w:r>
+        <w:rPr/>
+        <w:t xml:space="preserve">motor_reglas.js:76</w:t>
+      </w:r>
+      <w:r>
+        <w:rPr/>
+        <w:t xml:space="preserve">, </w:t>
+      </w:r>
+      <w:r>
+        <w:rPr/>
+        <w:t xml:space="preserve">reportes.js:105,224</w:t>
+      </w:r>
+      <w:r>
+        <w:rPr/>
+        <w:t xml:space="preserve">, </w:t>
+      </w:r>
+      <w:r>
+        <w:rPr/>
+        <w:t xml:space="preserve">permisos.js:147,210</w:t>
+      </w:r>
+      <w:r>
+        <w:rPr/>
+        <w:t xml:space="preserve">). Migración de datos históricos y rollback (revertir el ID de configuración) documentados como pasos operacionales, no de código.</w:t>
+      </w:r>
+    </w:p>
+    <w:p>
+      <w:pPr>
+        <w:spacing w:lineRule="auto"/>
+      </w:pPr>
+      <w:r>
+        <w:rPr>
+          <w:b/>
+        </w:rPr>
+        <w:t xml:space="preserve">Diseño de Skeleton Loaders:</w:t>
+      </w:r>
+      <w:r>
+        <w:rPr/>
+        <w:t xml:space="preserve"> placeholders con la forma real de filas/tarjetas para Tablero de Seguimiento y módulo PAC, badge de semáforo en estado neutro hasta tener dato real, estado visual “posiblemente desactualizado” para datos servidos desde IndexedDB mientras se espera la respuesta real — tarea CSS/HTML pura, paralelizable con el trabajo de caché backend.</w:t>
+      </w:r>
+    </w:p>
+    <w:p>
+      <w:pPr>
+        <w:spacing w:lineRule="auto"/>
+      </w:pPr>
+      <w:r>
+        <w:rPr>
+          <w:b/>
+        </w:rPr>
+        <w:t xml:space="preserve">Registro de modos de falla (obligatorio, incorporado tras revisión Outside Voice):</w:t>
+      </w:r>
+    </w:p>
+    <w:tbl>
+      <w:tblPr>
+        <w:tblBorders>
+          <w:top w:val="single" w:sz="2" w:space="0" w:color="000000"/>
+          <w:bottom w:val="single" w:sz="2" w:space="0" w:color="000000"/>
+          <w:left w:val="single" w:sz="2" w:space="0" w:color="000000"/>
+          <w:right w:val="single" w:sz="2" w:space="0" w:color="000000"/>
+        </w:tblBorders>
+        <w:tblCellSpacing w:w="0" w:type="dxa"/>
+        <w:tblCellMar>
+          <w:top w:type="dxa" w:w="80"/>
+          <w:bottom w:type="dxa" w:w="80"/>
+          <w:left w:type="dxa" w:w="160"/>
+          <w:right w:type="dxa" w:w="160"/>
+        </w:tblCellMar>
+        <w:jc w:val="center"/>
+      </w:tblPr>
+      <w:tblGrid>
+        <w:gridCol w:w="4320"/>
+        <w:gridCol w:w="4320"/>
+      </w:tblGrid>
+      <w:tr>
+        <w:trPr/>
+        <w:tc>
+          <w:tcPr>
+            <w:tcBorders>
+              <w:top w:val="single" w:sz="1" w:space="0" w:color="000000"/>
+              <w:bottom w:val="single" w:sz="1" w:space="0" w:color="000000"/>
+              <w:left w:val="single" w:sz="1" w:space="0" w:color="000000"/>
+              <w:right w:val="single" w:sz="1" w:space="0" w:color="000000"/>
+            </w:tcBorders>
+          </w:tcPr>
+          <w:p>
+            <w:pPr>
+              <w:spacing w:lineRule="auto"/>
+            </w:pPr>
+            <w:r>
+              <w:rPr/>
+              <w:t xml:space="preserve">Escenario</w:t>
+            </w:r>
+          </w:p>
+        </w:tc>
+        <w:tc>
+          <w:tcPr>
+            <w:tcBorders>
+              <w:top w:val="single" w:sz="1" w:space="0" w:color="000000"/>
+              <w:bottom w:val="single" w:sz="1" w:space="0" w:color="000000"/>
+              <w:left w:val="single" w:sz="1" w:space="0" w:color="000000"/>
+              <w:right w:val="single" w:sz="1" w:space="0" w:color="000000"/>
+            </w:tcBorders>
+          </w:tcPr>
+          <w:p>
+            <w:pPr>
+              <w:spacing w:lineRule="auto"/>
+            </w:pPr>
+            <w:r>
+              <w:rPr/>
+              <w:t xml:space="preserve">Mitigación</w:t>
+            </w:r>
+          </w:p>
+        </w:tc>
+      </w:tr>
+      <w:tblGrid>
+        <w:gridCol w:w="4320"/>
+        <w:gridCol w:w="4320"/>
+      </w:tblGrid>
+      <w:tr>
+        <w:trPr/>
+        <w:tc>
+          <w:tcPr>
+            <w:tcBorders>
+              <w:top w:val="single" w:sz="1" w:space="0" w:color="000000"/>
+              <w:bottom w:val="single" w:sz="1" w:space="0" w:color="000000"/>
+              <w:left w:val="single" w:sz="1" w:space="0" w:color="000000"/>
+              <w:right w:val="single" w:sz="1" w:space="0" w:color="000000"/>
+            </w:tcBorders>
+          </w:tcPr>
+          <w:p>
+            <w:pPr>
+              <w:spacing w:lineRule="auto"/>
+            </w:pPr>
+            <w:r>
+              <w:rPr>
+                <w:highlight w:val="lightGray"/>
+              </w:rPr>
+              <w:t xml:space="preserve">CacheService.put()</w:t>
+            </w:r>
+          </w:p>
+          <w:p>
+            <w:pPr>
+              <w:spacing w:lineRule="auto"/>
+            </w:pPr>
+            <w:r>
+              <w:rPr/>
+              <w:t xml:space="preserve"> excede 100KB</w:t>
+            </w:r>
+          </w:p>
+        </w:tc>
+        <w:tc>
+          <w:tcPr>
+            <w:tcBorders>
+              <w:top w:val="single" w:sz="1" w:space="0" w:color="000000"/>
+              <w:bottom w:val="single" w:sz="1" w:space="0" w:color="000000"/>
+              <w:left w:val="single" w:sz="1" w:space="0" w:color="000000"/>
+              <w:right w:val="single" w:sz="1" w:space="0" w:color="000000"/>
+            </w:tcBorders>
+          </w:tcPr>
+          <w:p>
+            <w:pPr>
+              <w:spacing w:lineRule="auto"/>
+            </w:pPr>
+            <w:r>
+              <w:rPr/>
+              <w:t xml:space="preserve">try/catch, fallback a no-cachear esa entrada (fail-open)</w:t>
+            </w:r>
+          </w:p>
+        </w:tc>
+      </w:tr>
+      <w:tr>
+        <w:trPr/>
+        <w:tc>
+          <w:tcPr>
+            <w:tcBorders>
+              <w:top w:val="single" w:sz="1" w:space="0" w:color="000000"/>
+              <w:bottom w:val="single" w:sz="1" w:space="0" w:color="000000"/>
+              <w:left w:val="single" w:sz="1" w:space="0" w:color="000000"/>
+              <w:right w:val="single" w:sz="1" w:space="0" w:color="000000"/>
+            </w:tcBorders>
+          </w:tcPr>
+          <w:p>
+            <w:pPr>
+              <w:spacing w:lineRule="auto"/>
+            </w:pPr>
+            <w:r>
+              <w:rPr/>
+              <w:t xml:space="preserve">Modo mantenimiento + caché vigente</w:t>
+            </w:r>
+          </w:p>
+        </w:tc>
+        <w:tc>
+          <w:tcPr>
+            <w:tcBorders>
+              <w:top w:val="single" w:sz="1" w:space="0" w:color="000000"/>
+              <w:bottom w:val="single" w:sz="1" w:space="0" w:color="000000"/>
+              <w:left w:val="single" w:sz="1" w:space="0" w:color="000000"/>
+              <w:right w:val="single" w:sz="1" w:space="0" w:color="000000"/>
+            </w:tcBorders>
+          </w:tcPr>
+          <w:p>
+            <w:pPr>
+              <w:spacing w:lineRule="auto"/>
+            </w:pPr>
+            <w:r>
+              <w:rPr/>
+              <w:t xml:space="preserve">check de mantenimiento SIEMPRE antes de leer caché; su resultado nunca se cachea</w:t>
+            </w:r>
+          </w:p>
+        </w:tc>
+      </w:tr>
+      <w:tr>
+        <w:trPr/>
+        <w:tc>
+          <w:tcPr>
+            <w:tcBorders>
+              <w:top w:val="single" w:sz="1" w:space="0" w:color="000000"/>
+              <w:bottom w:val="single" w:sz="1" w:space="0" w:color="000000"/>
+              <w:left w:val="single" w:sz="1" w:space="0" w:color="000000"/>
+              <w:right w:val="single" w:sz="1" w:space="0" w:color="000000"/>
+            </w:tcBorders>
+          </w:tcPr>
+          <w:p>
+            <w:pPr>
+              <w:spacing w:lineRule="auto"/>
+            </w:pPr>
+            <w:r>
+              <w:rPr/>
+              <w:t xml:space="preserve">Escritura sin invalidar caché</w:t>
+            </w:r>
+          </w:p>
+        </w:tc>
+        <w:tc>
+          <w:tcPr>
+            <w:tcBorders>
+              <w:top w:val="single" w:sz="1" w:space="0" w:color="000000"/>
+              <w:bottom w:val="single" w:sz="1" w:space="0" w:color="000000"/>
+              <w:left w:val="single" w:sz="1" w:space="0" w:color="000000"/>
+              <w:right w:val="single" w:sz="1" w:space="0" w:color="000000"/>
+            </w:tcBorders>
+          </w:tcPr>
+          <w:p>
+            <w:pPr>
+              <w:spacing w:lineRule="auto"/>
+            </w:pPr>
+            <w:r>
+              <w:rPr/>
+              <w:t xml:space="preserve">helper centralizado </w:t>
+            </w:r>
+          </w:p>
+          <w:p>
+            <w:pPr>
+              <w:spacing w:lineRule="auto"/>
+            </w:pPr>
+            <w:r>
+              <w:rPr>
+                <w:highlight w:val="lightGray"/>
+              </w:rPr>
+              <w:t xml:space="preserve">invalidateDataCache()</w:t>
+            </w:r>
+          </w:p>
+          <w:p>
+            <w:pPr>
+              <w:spacing w:lineRule="auto"/>
+            </w:pPr>
+            <w:r>
+              <w:rPr/>
+              <w:t xml:space="preserve"> en cada punto de escritura conocido</w:t>
+            </w:r>
+          </w:p>
+        </w:tc>
+      </w:tr>
+      <w:tr>
+        <w:trPr/>
+        <w:tc>
+          <w:tcPr>
+            <w:tcBorders>
+              <w:top w:val="single" w:sz="1" w:space="0" w:color="000000"/>
+              <w:bottom w:val="single" w:sz="1" w:space="0" w:color="000000"/>
+              <w:left w:val="single" w:sz="1" w:space="0" w:color="000000"/>
+              <w:right w:val="single" w:sz="1" w:space="0" w:color="000000"/>
+            </w:tcBorders>
+          </w:tcPr>
+          <w:p>
+            <w:pPr>
+              <w:spacing w:lineRule="auto"/>
+            </w:pPr>
+            <w:r>
+              <w:rPr/>
+              <w:t xml:space="preserve">Spreadsheet LOGS inaccesible</w:t>
+            </w:r>
+          </w:p>
+        </w:tc>
+        <w:tc>
+          <w:tcPr>
+            <w:tcBorders>
+              <w:top w:val="single" w:sz="1" w:space="0" w:color="000000"/>
+              <w:bottom w:val="single" w:sz="1" w:space="0" w:color="000000"/>
+              <w:left w:val="single" w:sz="1" w:space="0" w:color="000000"/>
+              <w:right w:val="single" w:sz="1" w:space="0" w:color="000000"/>
+            </w:tcBorders>
+          </w:tcPr>
+          <w:p>
+            <w:pPr>
+              <w:spacing w:lineRule="auto"/>
+            </w:pPr>
+            <w:r>
+              <w:rPr/>
+              <w:t xml:space="preserve">degrada a log de error, nunca lanza excepción no capturada que tumbe la acción de negocio</w:t>
+            </w:r>
+          </w:p>
+        </w:tc>
+      </w:tr>
+      <w:tr>
+        <w:trPr/>
+        <w:tc>
+          <w:tcPr>
+            <w:tcBorders>
+              <w:top w:val="single" w:sz="1" w:space="0" w:color="000000"/>
+              <w:bottom w:val="single" w:sz="1" w:space="0" w:color="000000"/>
+              <w:left w:val="single" w:sz="1" w:space="0" w:color="000000"/>
+              <w:right w:val="single" w:sz="1" w:space="0" w:color="000000"/>
+            </w:tcBorders>
+          </w:tcPr>
+          <w:p>
+            <w:pPr>
+              <w:spacing w:lineRule="auto"/>
+            </w:pPr>
+            <w:r>
+              <w:rPr/>
+              <w:t xml:space="preserve">IndexedDB no disponible</w:t>
+            </w:r>
+          </w:p>
+        </w:tc>
+        <w:tc>
+          <w:tcPr>
+            <w:tcBorders>
+              <w:top w:val="single" w:sz="1" w:space="0" w:color="000000"/>
+              <w:bottom w:val="single" w:sz="1" w:space="0" w:color="000000"/>
+              <w:left w:val="single" w:sz="1" w:space="0" w:color="000000"/>
+              <w:right w:val="single" w:sz="1" w:space="0" w:color="000000"/>
+            </w:tcBorders>
+          </w:tcPr>
+          <w:p>
+            <w:pPr>
+              <w:spacing w:lineRule="auto"/>
+            </w:pPr>
+            <w:r>
+              <w:rPr/>
+              <w:t xml:space="preserve">fallback directo a </w:t>
+            </w:r>
+          </w:p>
+          <w:p>
+            <w:pPr>
+              <w:spacing w:lineRule="auto"/>
+            </w:pPr>
+            <w:r>
+              <w:rPr>
+                <w:highlight w:val="lightGray"/>
+              </w:rPr>
+              <w:t xml:space="preserve">google.script.run</w:t>
+            </w:r>
+          </w:p>
+          <w:p>
+            <w:pPr>
+              <w:spacing w:lineRule="auto"/>
+            </w:pPr>
+            <w:r>
+              <w:rPr/>
+              <w:t xml:space="preserve"> sin caché de cliente</w:t>
+            </w:r>
+          </w:p>
+        </w:tc>
+      </w:tr>
+      <w:tr>
+        <w:trPr/>
+        <w:tc>
+          <w:tcPr>
+            <w:tcBorders>
+              <w:top w:val="single" w:sz="1" w:space="0" w:color="000000"/>
+              <w:bottom w:val="single" w:sz="1" w:space="0" w:color="000000"/>
+              <w:left w:val="single" w:sz="1" w:space="0" w:color="000000"/>
+              <w:right w:val="single" w:sz="1" w:space="0" w:color="000000"/>
+            </w:tcBorders>
+          </w:tcPr>
+          <w:p>
+            <w:pPr>
+              <w:spacing w:lineRule="auto"/>
+            </w:pPr>
+            <w:r>
+              <w:rPr/>
+              <w:t xml:space="preserve">Colisión de cache-key en PAC (</w:t>
+            </w:r>
+          </w:p>
+          <w:p>
+            <w:pPr>
+              <w:spacing w:lineRule="auto"/>
+            </w:pPr>
+            <w:r>
+              <w:rPr>
+                <w:highlight w:val="lightGray"/>
+              </w:rPr>
+              <w:t xml:space="preserve">getPACData(filtros, modoEjecucion)</w:t>
+            </w:r>
+          </w:p>
+          <w:p>
+            <w:pPr>
+              <w:spacing w:lineRule="auto"/>
+            </w:pPr>
+            <w:r>
+              <w:rPr/>
+              <w:t xml:space="preserve">)</w:t>
+            </w:r>
+          </w:p>
+        </w:tc>
+        <w:tc>
+          <w:tcPr>
+            <w:tcBorders>
+              <w:top w:val="single" w:sz="1" w:space="0" w:color="000000"/>
+              <w:bottom w:val="single" w:sz="1" w:space="0" w:color="000000"/>
+              <w:left w:val="single" w:sz="1" w:space="0" w:color="000000"/>
+              <w:right w:val="single" w:sz="1" w:space="0" w:color="000000"/>
+            </w:tcBorders>
+          </w:tcPr>
+          <w:p>
+            <w:pPr>
+              <w:spacing w:lineRule="auto"/>
+            </w:pPr>
+            <w:r>
+              <w:rPr/>
+              <w:t xml:space="preserve">key parametrizada por hash de filtros+modo, no key fija</w:t>
+            </w:r>
+          </w:p>
+        </w:tc>
+      </w:tr>
+    </w:tbl>
+    <w:p>
+      <w:pPr>
+        <w:spacing w:lineRule="auto"/>
+      </w:pPr>
+      <w:r>
+        <w:rPr/>
+      </w:r>
+    </w:p>
+    <w:p>
+      <w:pPr>
+        <w:spacing w:lineRule="auto"/>
+      </w:pPr>
+      <w:r>
+        <w:rPr>
+          <w:b/>
+        </w:rPr>
+        <w:t xml:space="preserve">Revisión cruzada (Outside Voice):</w:t>
+      </w:r>
+      <w:r>
+        <w:rPr/>
+        <w:t xml:space="preserve"> subagente Claude independiente, sin contexto previo de la conversación, encontró 8 huecos en el spec inicial (lista de invalidación incompleta, nombre de función incorrecto referenciado, </w:t>
+      </w:r>
+      <w:r>
+        <w:rPr/>
+        <w:t xml:space="preserve">cache_backend.gs</w:t>
+      </w:r>
+      <w:r>
+        <w:rPr/>
+        <w:t xml:space="preserve"> no estaba 100% muerto — </w:t>
+      </w:r>
+      <w:r>
+        <w:rPr/>
+        <w:t xml:space="preserve">getSearchHints</w:t>
+      </w:r>
+      <w:r>
+        <w:rPr/>
+        <w:t xml:space="preserve"> es lógica viva, sin manejo de overflow de 100KB, sin estrategia de cache-key parametrizada para PAC, orden del check de mantenimiento no abordado, uso de IndexedDB en el sandbox sin verificar, y descubrimiento colateral de la duplicación </w:t>
+      </w:r>
+      <w:r>
+        <w:rPr/>
+        <w:t xml:space="preserve">savePermission</w:t>
+      </w:r>
+      <w:r>
+        <w:rPr/>
+        <w:t xml:space="preserve">/</w:t>
+      </w:r>
+      <w:r>
+        <w:rPr/>
+        <w:t xml:space="preserve">deletePermission</w:t>
+      </w:r>
+      <w:r>
+        <w:rPr/>
+        <w:t xml:space="preserve">/etc.). Los 8 fueron aceptados sin objeción; 6 incorporados como requisitos obligatorios de Fase 5a (tabla de modos de falla arriba), 2 quedaron fuera de scope explícito (ver TODOS.md ítem 9 para el hallazgo de duplicación).</w:t>
+      </w:r>
+    </w:p>
+    <w:p>
+      <w:pPr>
+        <w:spacing w:lineRule="auto"/>
+      </w:pPr>
+      <w:r>
+        <w:rPr>
+          <w:b/>
+        </w:rPr>
+        <w:t xml:space="preserve">NOT in scope (Fase 5a):</w:t>
+      </w:r>
+      <w:r>
+        <w:rPr/>
+        <w:t xml:space="preserve"> migración de </w:t>
+      </w:r>
+      <w:r>
+        <w:rPr/>
+        <w:t xml:space="preserve">_PAC_RUNTIME_CACHE</w:t>
+      </w:r>
+      <w:r>
+        <w:rPr/>
+        <w:t xml:space="preserve"> a </w:t>
+      </w:r>
+      <w:r>
+        <w:rPr/>
+        <w:t xml:space="preserve">GestorDatos</w:t>
+      </w:r>
+      <w:r>
+        <w:rPr/>
+        <w:t xml:space="preserve"> (TODOS.md ítem 4), corrección de la duplicación de funciones de permisos (TODOS.md ítem 9 nuevo), reescritura del motor de reglas, migración a Firestore/BD externa, Service Worker/PWA (inviable en el sandbox </w:t>
+      </w:r>
+      <w:r>
+        <w:rPr/>
+        <w:t xml:space="preserve">HtmlService</w:t>
+      </w:r>
+      <w:r>
+        <w:rPr/>
+        <w:t xml:space="preserve">, verificado por WebSearch).</w:t>
+      </w:r>
+    </w:p>
+    <w:p>
+      <w:pPr>
+        <w:spacing w:lineRule="auto"/>
+      </w:pPr>
+      <w:r>
+        <w:rPr>
+          <w:b/>
+        </w:rPr>
+        <w:t xml:space="preserve">What already exists (aprovechado):</w:t>
+      </w:r>
+      <w:r>
+        <w:rPr/>
+        <w:t xml:space="preserve">CacheService</w:t>
+      </w:r>
+      <w:r>
+        <w:rPr/>
+        <w:t xml:space="preserve">, </w:t>
+      </w:r>
+      <w:r>
+        <w:rPr/>
+        <w:t xml:space="preserve">getConfig()</w:t>
+      </w:r>
+      <w:r>
+        <w:rPr/>
+        <w:t xml:space="preserve">/</w:t>
+      </w:r>
+      <w:r>
+        <w:rPr/>
+        <w:t xml:space="preserve">CONFIG.DATA_FILES_IDS</w:t>
+      </w:r>
+      <w:r>
+        <w:rPr/>
+        <w:t xml:space="preserve">, </w:t>
+      </w:r>
+      <w:r>
+        <w:rPr/>
+        <w:t xml:space="preserve">cache_backend.gs::getSearchHints()</w:t>
+      </w:r>
+      <w:r>
+        <w:rPr/>
+        <w:t xml:space="preserve"> (lógica de lectura viva se extrae, el resto del archivo — cola </w:t>
+      </w:r>
+      <w:r>
+        <w:rPr/>
+        <w:t xml:space="preserve">CacheQueue</w:t>
+      </w:r>
+      <w:r>
+        <w:rPr/>
+        <w:t xml:space="preserve">/</w:t>
+      </w:r>
+      <w:r>
+        <w:rPr/>
+        <w:t xml:space="preserve">CacheStore</w:t>
+      </w:r>
+      <w:r>
+        <w:rPr/>
+        <w:t xml:space="preserve"> — se elimina por muerto), </w:t>
+      </w:r>
+      <w:r>
+        <w:rPr/>
+        <w:t xml:space="preserve">_PAC_RUNTIME_CACHE</w:t>
+      </w:r>
+      <w:r>
+        <w:rPr/>
+        <w:t xml:space="preserve"> (se mantiene, es complementario).</w:t>
+      </w:r>
+    </w:p>
+    <w:p>
+      <w:pPr>
+        <w:spacing w:lineRule="auto"/>
+      </w:pPr>
+      <w:r>
+        <w:rPr>
+          <w:b/>
+        </w:rPr>
+        <w:t xml:space="preserve">Estrategia de paralelización (worktrees, para Fase 5b):</w:t>
+      </w:r>
+      <w:r>
+        <w:rPr/>
+        <w:t xml:space="preserve"> 2 worktrees sin conflicto de archivos — (1) backend/caché: </w:t>
+      </w:r>
+      <w:r>
+        <w:rPr/>
+        <w:t xml:space="preserve">Codigo.js</w:t>
+      </w:r>
+      <w:r>
+        <w:rPr/>
+        <w:t xml:space="preserve">, </w:t>
+      </w:r>
+      <w:r>
+        <w:rPr/>
+        <w:t xml:space="preserve">cache_backend.gs</w:t>
+      </w:r>
+      <w:r>
+        <w:rPr/>
+        <w:t xml:space="preserve">, </w:t>
+      </w:r>
+      <w:r>
+        <w:rPr/>
+        <w:t xml:space="preserve">pac_api.js</w:t>
+      </w:r>
+      <w:r>
+        <w:rPr/>
+        <w:t xml:space="preserve">, </w:t>
+      </w:r>
+      <w:r>
+        <w:rPr/>
+        <w:t xml:space="preserve">CONFIG</w:t>
+      </w:r>
+      <w:r>
+        <w:rPr/>
+        <w:t xml:space="preserve">; (2) frontend/Skeleton Loaders: </w:t>
+      </w:r>
+      <w:r>
+        <w:rPr/>
+        <w:t xml:space="preserve">app_core_js.html</w:t>
+      </w:r>
+      <w:r>
+        <w:rPr/>
+        <w:t xml:space="preserve">, </w:t>
+      </w:r>
+      <w:r>
+        <w:rPr/>
+        <w:t xml:space="preserve">app_matriz_js.html</w:t>
+      </w:r>
+      <w:r>
+        <w:rPr/>
+        <w:t xml:space="preserve">, </w:t>
+      </w:r>
+      <w:r>
+        <w:rPr/>
+        <w:t xml:space="preserve">pac_seccion.html</w:t>
+      </w:r>
+      <w:r>
+        <w:rPr/>
+        <w:t xml:space="preserve">.</w:t>
+      </w:r>
+    </w:p>
+    <w:p>
+      <w:pPr>
+        <w:spacing w:lineRule="auto"/>
+      </w:pPr>
+      <w:r>
+        <w:rPr>
+          <w:b/>
+        </w:rPr>
+        <w:t xml:space="preserve">Validación y Pruebas Ejecutadas:</w:t>
+      </w:r>
+    </w:p>
+    <w:p>
+      <w:pPr>
+        <w:numPr>
+          <w:ilvl w:val="0"/>
+          <w:numId w:val="70"/>
+        </w:numPr>
+        <w:spacing w:lineRule="auto"/>
+      </w:pPr>
+      <w:r>
+        <w:rPr/>
+      </w:r>
+      <w:r>
+        <w:rPr/>
+        <w:t xml:space="preserve"> Investigación de backend vía agente Explore antes de diagnosticar (no se asumió causa raíz sin leer código)</w:t>
+      </w:r>
+    </w:p>
+    <w:p>
+      <w:pPr>
+        <w:numPr>
+          <w:ilvl w:val="0"/>
+          <w:numId w:val="70"/>
+        </w:numPr>
+        <w:spacing w:lineRule="auto"/>
+      </w:pPr>
+      <w:r>
+        <w:rPr/>
+      </w:r>
+      <w:r>
+        <w:rPr/>
+        <w:t xml:space="preserve"> WebSearches reales: límites de </w:t>
+      </w:r>
+      <w:r>
+        <w:rPr/>
+        <w:t xml:space="preserve">CacheService</w:t>
+      </w:r>
+      <w:r>
+        <w:rPr/>
+        <w:t xml:space="preserve">, límites de rendimiento de Sheets, Firestore free tier, IndexedDB en sandbox de </w:t>
+      </w:r>
+      <w:r>
+        <w:rPr/>
+        <w:t xml:space="preserve">HtmlService</w:t>
+      </w:r>
+    </w:p>
+    <w:p>
+      <w:pPr>
+        <w:numPr>
+          <w:ilvl w:val="0"/>
+          <w:numId w:val="70"/>
+        </w:numPr>
+        <w:spacing w:lineRule="auto"/>
+      </w:pPr>
+      <w:r>
+        <w:rPr/>
+      </w:r>
+      <w:r>
+        <w:rPr/>
+        <w:t xml:space="preserve"> Revisión Outside Voice (subagente independiente) ejecutada y sus hallazgos incorporados con aprobación explícita del usuario vía AskUserQuestion</w:t>
+      </w:r>
+    </w:p>
+    <w:p>
+      <w:pPr>
+        <w:numPr>
+          <w:ilvl w:val="0"/>
+          <w:numId w:val="70"/>
+        </w:numPr>
+        <w:spacing w:lineRule="auto"/>
+      </w:pPr>
+      <w:r>
+        <w:rPr/>
+      </w:r>
+      <w:r>
+        <w:rPr/>
+        <w:t xml:space="preserve">TODOS.md</w:t>
+      </w:r>
+      <w:r>
+        <w:rPr/>
+        <w:t xml:space="preserve"> actualizado (ítems 8 y 9) con confirmación explícita del usuario vía AskUserQuestion</w:t>
+      </w:r>
+    </w:p>
+    <w:p>
+      <w:pPr>
+        <w:numPr>
+          <w:ilvl w:val="0"/>
+          <w:numId w:val="70"/>
+        </w:numPr>
+        <w:spacing w:lineRule="auto"/>
+      </w:pPr>
+      <w:r>
+        <w:rPr/>
+      </w:r>
+      <w:r>
+        <w:rPr/>
+        <w:t xml:space="preserve"> Implementación (Fase 5b): no ejecutada en esta sesión — es planificación pura</w:t>
+      </w:r>
+    </w:p>
+    <w:p>
+      <w:pPr>
+        <w:spacing w:lineRule="auto"/>
+      </w:pPr>
+      <w:r>
+        <w:rPr>
+          <w:b/>
+        </w:rPr>
+        <w:t xml:space="preserve">Impacto en Producción:</w:t>
+      </w:r>
+      <w:r>
+        <w:rPr/>
+        <w:t xml:space="preserve"> Ninguno — esta intervención es exclusivamente documental/de planificación. No se modificó ningún archivo de código (</w:t>
+      </w:r>
+      <w:r>
+        <w:rPr/>
+        <w:t xml:space="preserve">.js</w:t>
+      </w:r>
+      <w:r>
+        <w:rPr/>
+        <w:t xml:space="preserve">/</w:t>
+      </w:r>
+      <w:r>
+        <w:rPr/>
+        <w:t xml:space="preserve">.html</w:t>
+      </w:r>
+      <w:r>
+        <w:rPr/>
+        <w:t xml:space="preserve"> de backend o frontend). El dictamen queda registrado como base para la Fase 5b (implementación), que se ejecutará en una sesión futura siguiendo la estrategia de worktrees documentada arriba.</w:t>
+      </w:r>
+    </w:p>
+    <w:p>
+      <w:pPr>
         <w:pStyle w:val="Heading2"/>
         <w:spacing w:lineRule="auto"/>
       </w:pPr>
@@ -16472,7 +17780,7 @@
       <w:pPr>
         <w:numPr>
           <w:ilvl w:val="0"/>
-          <w:numId w:val="69"/>
+          <w:numId w:val="71"/>
         </w:numPr>
         <w:spacing w:lineRule="auto"/>
       </w:pPr>
@@ -16541,7 +17849,7 @@
       <w:pPr>
         <w:numPr>
           <w:ilvl w:val="0"/>
-          <w:numId w:val="69"/>
+          <w:numId w:val="71"/>
         </w:numPr>
         <w:spacing w:lineRule="auto"/>
       </w:pPr>
@@ -16570,7 +17878,7 @@
       <w:pPr>
         <w:numPr>
           <w:ilvl w:val="0"/>
-          <w:numId w:val="69"/>
+          <w:numId w:val="71"/>
         </w:numPr>
         <w:spacing w:lineRule="auto"/>
       </w:pPr>
@@ -17924,7 +19232,7 @@
       <w:pPr>
         <w:numPr>
           <w:ilvl w:val="0"/>
-          <w:numId w:val="70"/>
+          <w:numId w:val="72"/>
         </w:numPr>
         <w:spacing w:lineRule="auto"/>
       </w:pPr>
@@ -17947,7 +19255,7 @@
       <w:pPr>
         <w:numPr>
           <w:ilvl w:val="0"/>
-          <w:numId w:val="70"/>
+          <w:numId w:val="72"/>
         </w:numPr>
         <w:spacing w:lineRule="auto"/>
       </w:pPr>
@@ -17966,7 +19274,7 @@
       <w:pPr>
         <w:numPr>
           <w:ilvl w:val="0"/>
-          <w:numId w:val="70"/>
+          <w:numId w:val="72"/>
         </w:numPr>
         <w:spacing w:lineRule="auto"/>
       </w:pPr>
@@ -18017,7 +19325,7 @@
       <w:pPr>
         <w:numPr>
           <w:ilvl w:val="0"/>
-          <w:numId w:val="70"/>
+          <w:numId w:val="72"/>
         </w:numPr>
         <w:spacing w:lineRule="auto"/>
       </w:pPr>
@@ -18058,7 +19366,7 @@
       <w:pPr>
         <w:numPr>
           <w:ilvl w:val="0"/>
-          <w:numId w:val="70"/>
+          <w:numId w:val="72"/>
         </w:numPr>
         <w:spacing w:lineRule="auto"/>
       </w:pPr>
@@ -18085,7 +19393,7 @@
       <w:pPr>
         <w:numPr>
           <w:ilvl w:val="0"/>
-          <w:numId w:val="70"/>
+          <w:numId w:val="72"/>
         </w:numPr>
         <w:spacing w:lineRule="auto"/>
       </w:pPr>
@@ -26677,6 +27985,250 @@
     </w:lvl>
   </w:abstractNum>
   <w:abstractNum w:abstractNumId="70">
+    <w:lvl w:ilvl="0">
+      <w:start w:val="1"/>
+      <w:numFmt w:val="bullet"/>
+      <w:lvlText w:val=""/>
+      <w:lvlJc w:val="left"/>
+      <w:pPr>
+        <w:tabs>
+          <w:tab w:val="num" w:pos="720"/>
+        </w:tabs>
+        <w:ind w:left="720" w:hanging="360"/>
+      </w:pPr>
+      <w:rPr>
+        <w:rFonts w:ascii="Symbol" w:hAnsi="Symbol" w:hint="default"/>
+      </w:rPr>
+    </w:lvl>
+    <w:lvl w:ilvl="1">
+      <w:start w:val="1"/>
+      <w:numFmt w:val="bullet"/>
+      <w:lvlText w:val=""/>
+      <w:lvlJc w:val="left"/>
+      <w:pPr>
+        <w:tabs>
+          <w:tab w:val="num" w:pos="1440"/>
+        </w:tabs>
+        <w:ind w:left="1440" w:hanging="360"/>
+      </w:pPr>
+      <w:rPr>
+        <w:rFonts w:ascii="Symbol" w:hAnsi="Symbol" w:hint="default"/>
+      </w:rPr>
+    </w:lvl>
+    <w:lvl w:ilvl="2">
+      <w:start w:val="1"/>
+      <w:numFmt w:val="bullet"/>
+      <w:lvlText w:val=""/>
+      <w:lvlJc w:val="left"/>
+      <w:pPr>
+        <w:tabs>
+          <w:tab w:val="num" w:pos="2160"/>
+        </w:tabs>
+        <w:ind w:left="2160" w:hanging="360"/>
+      </w:pPr>
+      <w:rPr>
+        <w:rFonts w:ascii="Symbol" w:hAnsi="Symbol" w:hint="default"/>
+      </w:rPr>
+    </w:lvl>
+    <w:lvl w:ilvl="3">
+      <w:start w:val="1"/>
+      <w:numFmt w:val="bullet"/>
+      <w:lvlText w:val=""/>
+      <w:lvlJc w:val="left"/>
+      <w:pPr>
+        <w:tabs>
+          <w:tab w:val="num" w:pos="2880"/>
+        </w:tabs>
+        <w:ind w:left="2880" w:hanging="360"/>
+      </w:pPr>
+      <w:rPr>
+        <w:rFonts w:ascii="Symbol" w:hAnsi="Symbol" w:hint="default"/>
+      </w:rPr>
+    </w:lvl>
+    <w:lvl w:ilvl="4">
+      <w:start w:val="1"/>
+      <w:numFmt w:val="bullet"/>
+      <w:lvlText w:val=""/>
+      <w:lvlJc w:val="left"/>
+      <w:pPr>
+        <w:tabs>
+          <w:tab w:val="num" w:pos="3600"/>
+        </w:tabs>
+        <w:ind w:left="3600" w:hanging="360"/>
+      </w:pPr>
+      <w:rPr>
+        <w:rFonts w:ascii="Symbol" w:hAnsi="Symbol" w:hint="default"/>
+      </w:rPr>
+    </w:lvl>
+    <w:lvl w:ilvl="5">
+      <w:start w:val="1"/>
+      <w:numFmt w:val="bullet"/>
+      <w:lvlText w:val=""/>
+      <w:lvlJc w:val="left"/>
+      <w:pPr>
+        <w:tabs>
+          <w:tab w:val="num" w:pos="4320"/>
+        </w:tabs>
+        <w:ind w:left="4320" w:hanging="360"/>
+      </w:pPr>
+      <w:rPr>
+        <w:rFonts w:ascii="Symbol" w:hAnsi="Symbol" w:hint="default"/>
+      </w:rPr>
+    </w:lvl>
+    <w:lvl w:ilvl="6">
+      <w:start w:val="1"/>
+      <w:numFmt w:val="bullet"/>
+      <w:lvlText w:val=""/>
+      <w:lvlJc w:val="left"/>
+      <w:pPr>
+        <w:tabs>
+          <w:tab w:val="num" w:pos="5040"/>
+        </w:tabs>
+        <w:ind w:left="5040" w:hanging="360"/>
+      </w:pPr>
+      <w:rPr>
+        <w:rFonts w:ascii="Symbol" w:hAnsi="Symbol" w:hint="default"/>
+      </w:rPr>
+    </w:lvl>
+    <w:lvl w:ilvl="7">
+      <w:start w:val="1"/>
+      <w:numFmt w:val="bullet"/>
+      <w:lvlText w:val=""/>
+      <w:lvlJc w:val="left"/>
+      <w:pPr>
+        <w:tabs>
+          <w:tab w:val="num" w:pos="5760"/>
+        </w:tabs>
+        <w:ind w:left="5760" w:hanging="360"/>
+      </w:pPr>
+      <w:rPr>
+        <w:rFonts w:ascii="Symbol" w:hAnsi="Symbol" w:hint="default"/>
+      </w:rPr>
+    </w:lvl>
+  </w:abstractNum>
+  <w:abstractNum w:abstractNumId="71">
+    <w:lvl w:ilvl="0">
+      <w:start w:val="1"/>
+      <w:numFmt w:val="bullet"/>
+      <w:lvlText w:val=""/>
+      <w:lvlJc w:val="left"/>
+      <w:pPr>
+        <w:tabs>
+          <w:tab w:val="num" w:pos="720"/>
+        </w:tabs>
+        <w:ind w:left="720" w:hanging="360"/>
+      </w:pPr>
+      <w:rPr>
+        <w:rFonts w:ascii="Symbol" w:hAnsi="Symbol" w:hint="default"/>
+      </w:rPr>
+    </w:lvl>
+    <w:lvl w:ilvl="1">
+      <w:start w:val="1"/>
+      <w:numFmt w:val="bullet"/>
+      <w:lvlText w:val=""/>
+      <w:lvlJc w:val="left"/>
+      <w:pPr>
+        <w:tabs>
+          <w:tab w:val="num" w:pos="1440"/>
+        </w:tabs>
+        <w:ind w:left="1440" w:hanging="360"/>
+      </w:pPr>
+      <w:rPr>
+        <w:rFonts w:ascii="Symbol" w:hAnsi="Symbol" w:hint="default"/>
+      </w:rPr>
+    </w:lvl>
+    <w:lvl w:ilvl="2">
+      <w:start w:val="1"/>
+      <w:numFmt w:val="bullet"/>
+      <w:lvlText w:val=""/>
+      <w:lvlJc w:val="left"/>
+      <w:pPr>
+        <w:tabs>
+          <w:tab w:val="num" w:pos="2160"/>
+        </w:tabs>
+        <w:ind w:left="2160" w:hanging="360"/>
+      </w:pPr>
+      <w:rPr>
+        <w:rFonts w:ascii="Symbol" w:hAnsi="Symbol" w:hint="default"/>
+      </w:rPr>
+    </w:lvl>
+    <w:lvl w:ilvl="3">
+      <w:start w:val="1"/>
+      <w:numFmt w:val="bullet"/>
+      <w:lvlText w:val=""/>
+      <w:lvlJc w:val="left"/>
+      <w:pPr>
+        <w:tabs>
+          <w:tab w:val="num" w:pos="2880"/>
+        </w:tabs>
+        <w:ind w:left="2880" w:hanging="360"/>
+      </w:pPr>
+      <w:rPr>
+        <w:rFonts w:ascii="Symbol" w:hAnsi="Symbol" w:hint="default"/>
+      </w:rPr>
+    </w:lvl>
+    <w:lvl w:ilvl="4">
+      <w:start w:val="1"/>
+      <w:numFmt w:val="bullet"/>
+      <w:lvlText w:val=""/>
+      <w:lvlJc w:val="left"/>
+      <w:pPr>
+        <w:tabs>
+          <w:tab w:val="num" w:pos="3600"/>
+        </w:tabs>
+        <w:ind w:left="3600" w:hanging="360"/>
+      </w:pPr>
+      <w:rPr>
+        <w:rFonts w:ascii="Symbol" w:hAnsi="Symbol" w:hint="default"/>
+      </w:rPr>
+    </w:lvl>
+    <w:lvl w:ilvl="5">
+      <w:start w:val="1"/>
+      <w:numFmt w:val="bullet"/>
+      <w:lvlText w:val=""/>
+      <w:lvlJc w:val="left"/>
+      <w:pPr>
+        <w:tabs>
+          <w:tab w:val="num" w:pos="4320"/>
+        </w:tabs>
+        <w:ind w:left="4320" w:hanging="360"/>
+      </w:pPr>
+      <w:rPr>
+        <w:rFonts w:ascii="Symbol" w:hAnsi="Symbol" w:hint="default"/>
+      </w:rPr>
+    </w:lvl>
+    <w:lvl w:ilvl="6">
+      <w:start w:val="1"/>
+      <w:numFmt w:val="bullet"/>
+      <w:lvlText w:val=""/>
+      <w:lvlJc w:val="left"/>
+      <w:pPr>
+        <w:tabs>
+          <w:tab w:val="num" w:pos="5040"/>
+        </w:tabs>
+        <w:ind w:left="5040" w:hanging="360"/>
+      </w:pPr>
+      <w:rPr>
+        <w:rFonts w:ascii="Symbol" w:hAnsi="Symbol" w:hint="default"/>
+      </w:rPr>
+    </w:lvl>
+    <w:lvl w:ilvl="7">
+      <w:start w:val="1"/>
+      <w:numFmt w:val="bullet"/>
+      <w:lvlText w:val=""/>
+      <w:lvlJc w:val="left"/>
+      <w:pPr>
+        <w:tabs>
+          <w:tab w:val="num" w:pos="5760"/>
+        </w:tabs>
+        <w:ind w:left="5760" w:hanging="360"/>
+      </w:pPr>
+      <w:rPr>
+        <w:rFonts w:ascii="Symbol" w:hAnsi="Symbol" w:hint="default"/>
+      </w:rPr>
+    </w:lvl>
+  </w:abstractNum>
+  <w:abstractNum w:abstractNumId="72">
     <w:lvl w:ilvl="0">
       <w:start w:val="1"/>
       <w:numFmt w:val="decimal"/>
@@ -26983,6 +28535,12 @@
   </w:num>
   <w:num w:numId="70">
     <w:abstractNumId w:val="70"/>
+  </w:num>
+  <w:num w:numId="71">
+    <w:abstractNumId w:val="71"/>
+  </w:num>
+  <w:num w:numId="72">
+    <w:abstractNumId w:val="72"/>
   </w:num>
 </w:numbering>
 </file>

</xml_diff>

<commit_message>
docs(reflect): document phase 5b deployment and phase 5c skeleton loaders [CONC-FE-02]
Co-Authored-By: Claude Sonnet 5 <noreply@anthropic.com>
</commit_message>
<xml_diff>
--- a/Documento_Tecnico_Aplicacion_Predios.docx
+++ b/Documento_Tecnico_Aplicacion_Predios.docx
@@ -14623,6 +14623,2881 @@
     </w:p>
     <w:p>
       <w:pPr>
+        <w:pStyle w:val="Heading3"/>
+        <w:spacing w:lineRule="auto"/>
+      </w:pPr>
+      <w:r>
+        <w:rPr/>
+        <w:t xml:space="preserve">12.13 [2026-08-06] [CONC-P5b] Fase 5b — Construcción backend: CacheService, desacoplamiento de LOGS, invalidación centralizada</w:t>
+      </w:r>
+    </w:p>
+    <w:p>
+      <w:pPr>
+        <w:spacing w:lineRule="auto"/>
+      </w:pPr>
+      <w:r>
+        <w:rPr>
+          <w:b/>
+        </w:rPr>
+        <w:t xml:space="preserve">Archivo(s) Intervenido(s):</w:t>
+      </w:r>
+    </w:p>
+    <w:p>
+      <w:pPr>
+        <w:numPr>
+          <w:ilvl w:val="0"/>
+          <w:numId w:val="71"/>
+        </w:numPr>
+        <w:spacing w:lineRule="auto"/>
+      </w:pPr>
+      <w:r>
+        <w:rPr/>
+        <w:t xml:space="preserve">config.js</w:t>
+      </w:r>
+      <w:r>
+        <w:rPr/>
+        <w:t xml:space="preserve"> — nueva entrada </w:t>
+      </w:r>
+      <w:r>
+        <w:rPr/>
+        <w:t xml:space="preserve">CONFIG.DATA_FILES.LOGS</w:t>
+      </w:r>
+      <w:r>
+        <w:rPr/>
+        <w:t xml:space="preserve"> (placeholder)</w:t>
+      </w:r>
+    </w:p>
+    <w:p>
+      <w:pPr>
+        <w:numPr>
+          <w:ilvl w:val="0"/>
+          <w:numId w:val="71"/>
+        </w:numPr>
+        <w:spacing w:lineRule="auto"/>
+      </w:pPr>
+      <w:r>
+        <w:rPr/>
+        <w:t xml:space="preserve">auditoria.js</w:t>
+      </w:r>
+      <w:r>
+        <w:rPr/>
+        <w:t xml:space="preserve"> — </w:t>
+      </w:r>
+      <w:r>
+        <w:rPr/>
+        <w:t xml:space="preserve">GestorAuditoria._obtenerGestorLogs()</w:t>
+      </w:r>
+      <w:r>
+        <w:rPr/>
+        <w:t xml:space="preserve"> (nuevo), </w:t>
+      </w:r>
+      <w:r>
+        <w:rPr/>
+        <w:t xml:space="preserve">registrarAccion</w:t>
+      </w:r>
+      <w:r>
+        <w:rPr/>
+        <w:t xml:space="preserve">, </w:t>
+      </w:r>
+      <w:r>
+        <w:rPr/>
+        <w:t xml:space="preserve">obtenerLogsUsuario</w:t>
+      </w:r>
+      <w:r>
+        <w:rPr/>
+        <w:t xml:space="preserve">, </w:t>
+      </w:r>
+      <w:r>
+        <w:rPr/>
+        <w:t xml:space="preserve">_asegurarHojaLogs</w:t>
+      </w:r>
+      <w:r>
+        <w:rPr/>
+        <w:t xml:space="preserve"> (redirigidos a LOGS)</w:t>
+      </w:r>
+    </w:p>
+    <w:p>
+      <w:pPr>
+        <w:numPr>
+          <w:ilvl w:val="0"/>
+          <w:numId w:val="71"/>
+        </w:numPr>
+        <w:spacing w:lineRule="auto"/>
+      </w:pPr>
+      <w:r>
+        <w:rPr/>
+        <w:t xml:space="preserve">cache_backend.gs</w:t>
+      </w:r>
+      <w:r>
+        <w:rPr/>
+        <w:t xml:space="preserve"> — </w:t>
+      </w:r>
+      <w:r>
+        <w:rPr/>
+        <w:t xml:space="preserve">CACHE_KEY_DASHBOARD</w:t>
+      </w:r>
+      <w:r>
+        <w:rPr/>
+        <w:t xml:space="preserve">, </w:t>
+      </w:r>
+      <w:r>
+        <w:rPr/>
+        <w:t xml:space="preserve">CACHE_KEY_PAC_VERSION</w:t>
+      </w:r>
+      <w:r>
+        <w:rPr/>
+        <w:t xml:space="preserve">, </w:t>
+      </w:r>
+      <w:r>
+        <w:rPr/>
+        <w:t xml:space="preserve">invalidateDataCache()</w:t>
+      </w:r>
+      <w:r>
+        <w:rPr/>
+        <w:t xml:space="preserve"> (nuevos, aditivos)</w:t>
+      </w:r>
+    </w:p>
+    <w:p>
+      <w:pPr>
+        <w:numPr>
+          <w:ilvl w:val="0"/>
+          <w:numId w:val="71"/>
+        </w:numPr>
+        <w:spacing w:lineRule="auto"/>
+      </w:pPr>
+      <w:r>
+        <w:rPr/>
+        <w:t xml:space="preserve">Codigo.js</w:t>
+      </w:r>
+      <w:r>
+        <w:rPr/>
+        <w:t xml:space="preserve"> — </w:t>
+      </w:r>
+      <w:r>
+        <w:rPr/>
+        <w:t xml:space="preserve">getDashboardData</w:t>
+      </w:r>
+      <w:r>
+        <w:rPr/>
+        <w:t xml:space="preserve">, </w:t>
+      </w:r>
+      <w:r>
+        <w:rPr/>
+        <w:t xml:space="preserve">saveTrackingData</w:t>
+      </w:r>
+      <w:r>
+        <w:rPr/>
+        <w:t xml:space="preserve">, </w:t>
+      </w:r>
+      <w:r>
+        <w:rPr/>
+        <w:t xml:space="preserve">savePermission</w:t>
+      </w:r>
+      <w:r>
+        <w:rPr/>
+        <w:t xml:space="preserve">, </w:t>
+      </w:r>
+      <w:r>
+        <w:rPr/>
+        <w:t xml:space="preserve">deletePermission</w:t>
+      </w:r>
+      <w:r>
+        <w:rPr/>
+        <w:t xml:space="preserve">, </w:t>
+      </w:r>
+      <w:r>
+        <w:rPr/>
+        <w:t xml:space="preserve">promoverDato2aDato1</w:t>
+      </w:r>
+    </w:p>
+    <w:p>
+      <w:pPr>
+        <w:numPr>
+          <w:ilvl w:val="0"/>
+          <w:numId w:val="71"/>
+        </w:numPr>
+        <w:spacing w:lineRule="auto"/>
+      </w:pPr>
+      <w:r>
+        <w:rPr/>
+        <w:t xml:space="preserve">pac_api.js</w:t>
+      </w:r>
+      <w:r>
+        <w:rPr/>
+        <w:t xml:space="preserve"> — </w:t>
+      </w:r>
+      <w:r>
+        <w:rPr/>
+        <w:t xml:space="preserve">getPACData</w:t>
+      </w:r>
+      <w:r>
+        <w:rPr/>
+        <w:t xml:space="preserve">, </w:t>
+      </w:r>
+      <w:r>
+        <w:rPr/>
+        <w:t xml:space="preserve">_pac_buildCacheKey()</w:t>
+      </w:r>
+      <w:r>
+        <w:rPr/>
+        <w:t xml:space="preserve"> (nuevo)</w:t>
+      </w:r>
+    </w:p>
+    <w:p>
+      <w:pPr>
+        <w:numPr>
+          <w:ilvl w:val="0"/>
+          <w:numId w:val="71"/>
+        </w:numPr>
+        <w:spacing w:lineRule="auto"/>
+      </w:pPr>
+      <w:r>
+        <w:rPr/>
+        <w:t xml:space="preserve">pac_gestor.js</w:t>
+      </w:r>
+      <w:r>
+        <w:rPr/>
+        <w:t xml:space="preserve"> — </w:t>
+      </w:r>
+      <w:r>
+        <w:rPr/>
+        <w:t xml:space="preserve">aprobarBorradorPAC</w:t>
+      </w:r>
+    </w:p>
+    <w:p>
+      <w:pPr>
+        <w:numPr>
+          <w:ilvl w:val="0"/>
+          <w:numId w:val="71"/>
+        </w:numPr>
+        <w:spacing w:lineRule="auto"/>
+      </w:pPr>
+      <w:r>
+        <w:rPr/>
+        <w:t xml:space="preserve">permisos.js</w:t>
+      </w:r>
+      <w:r>
+        <w:rPr/>
+        <w:t xml:space="preserve"> — </w:t>
+      </w:r>
+      <w:r>
+        <w:rPr/>
+        <w:t xml:space="preserve">savePermission</w:t>
+      </w:r>
+      <w:r>
+        <w:rPr/>
+        <w:t xml:space="preserve">, </w:t>
+      </w:r>
+      <w:r>
+        <w:rPr/>
+        <w:t xml:space="preserve">deletePermission</w:t>
+      </w:r>
+    </w:p>
+    <w:p>
+      <w:pPr>
+        <w:numPr>
+          <w:ilvl w:val="0"/>
+          <w:numId w:val="71"/>
+        </w:numPr>
+        <w:spacing w:lineRule="auto"/>
+      </w:pPr>
+      <w:r>
+        <w:rPr/>
+        <w:t xml:space="preserve">datos.js</w:t>
+      </w:r>
+      <w:r>
+        <w:rPr/>
+        <w:t xml:space="preserve"> — </w:t>
+      </w:r>
+      <w:r>
+        <w:rPr/>
+        <w:t xml:space="preserve">GestorFiltroMatriz.crearFiltro/actualizarFiltro/activarFiltro(x2)/eliminarFiltro(x2)</w:t>
+      </w:r>
+    </w:p>
+    <w:p>
+      <w:pPr>
+        <w:spacing w:lineRule="auto"/>
+      </w:pPr>
+      <w:r>
+        <w:rPr>
+          <w:b/>
+        </w:rPr>
+        <w:t xml:space="preserve">Propósito del Archivo en el Sistema:</w:t>
+      </w:r>
+      <w:r>
+        <w:rPr/>
+        <w:t xml:space="preserve"> Primera fase de implementación del dictamen de arquitectura de Fase 5a (Sección 12.12): caché de lectura de 2 capas backend (CacheService) sobre </w:t>
+      </w:r>
+      <w:r>
+        <w:rPr/>
+        <w:t xml:space="preserve">getDashboardData</w:t>
+      </w:r>
+      <w:r>
+        <w:rPr/>
+        <w:t xml:space="preserve">/</w:t>
+      </w:r>
+      <w:r>
+        <w:rPr/>
+        <w:t xml:space="preserve">getPACData</w:t>
+      </w:r>
+      <w:r>
+        <w:rPr/>
+        <w:t xml:space="preserve">, y desacoplamiento del spreadsheet de LOGS del principal.</w:t>
+      </w:r>
+    </w:p>
+    <w:p>
+      <w:pPr>
+        <w:spacing w:lineRule="auto"/>
+      </w:pPr>
+      <w:r>
+        <w:rPr>
+          <w:b/>
+        </w:rPr>
+        <w:t xml:space="preserve">Motivo de la Intervención:</w:t>
+      </w:r>
+      <w:r>
+        <w:rPr/>
+        <w:t xml:space="preserve"> Ejecutar el pipeline Build &amp; Review de Fase 5b: </w:t>
+      </w:r>
+      <w:r>
+        <w:rPr/>
+        <w:t xml:space="preserve">/careful</w:t>
+      </w:r>
+      <w:r>
+        <w:rPr/>
+        <w:t xml:space="preserve">, refactor de LOGS, CacheService en las dos funciones de lectura pesada, inyección de </w:t>
+      </w:r>
+      <w:r>
+        <w:rPr/>
+        <w:t xml:space="preserve">invalidateDataCache()</w:t>
+      </w:r>
+      <w:r>
+        <w:rPr/>
+        <w:t xml:space="preserve"> en las escrituras transaccionales, y </w:t>
+      </w:r>
+      <w:r>
+        <w:rPr/>
+        <w:t xml:space="preserve">/review</w:t>
+      </w:r>
+      <w:r>
+        <w:rPr/>
+        <w:t xml:space="preserve">.</w:t>
+      </w:r>
+    </w:p>
+    <w:p>
+      <w:pPr>
+        <w:spacing w:lineRule="auto"/>
+      </w:pPr>
+      <w:r>
+        <w:rPr>
+          <w:b/>
+        </w:rPr>
+        <w:t xml:space="preserve">Correcciones de premisa frente al plan original (encontradas durante la construcción, no asumidas):</w:t>
+      </w:r>
+    </w:p>
+    <w:p>
+      <w:pPr>
+        <w:numPr>
+          <w:ilvl w:val="0"/>
+          <w:numId w:val="72"/>
+        </w:numPr>
+        <w:spacing w:lineRule="auto"/>
+      </w:pPr>
+      <w:r>
+        <w:rPr>
+          <w:b/>
+        </w:rPr>
+        <w:t xml:space="preserve">CONFIG.DATA_FILES_IDS</w:t>
+      </w:r>
+      <w:r>
+        <w:rPr>
+          <w:b/>
+        </w:rPr>
+        <w:t xml:space="preserve"> es un array, no un objeto con propiedades nombradas</w:t>
+      </w:r>
+      <w:r>
+        <w:rPr/>
+        <w:t xml:space="preserve"> — el plan pedía </w:t>
+      </w:r>
+      <w:r>
+        <w:rPr/>
+        <w:t xml:space="preserve">CONFIG.DATA_FILES_IDS.LOGS</w:t>
+      </w:r>
+      <w:r>
+        <w:rPr/>
+        <w:t xml:space="preserve">, pero </w:t>
+      </w:r>
+      <w:r>
+        <w:rPr/>
+        <w:t xml:space="preserve">DATA_FILES_IDS: []</w:t>
+      </w:r>
+      <w:r>
+        <w:rPr/>
+        <w:t xml:space="preserve"> en </w:t>
+      </w:r>
+      <w:r>
+        <w:rPr/>
+        <w:t xml:space="preserve">config.js:23</w:t>
+      </w:r>
+      <w:r>
+        <w:rPr/>
+        <w:t xml:space="preserve"> es una lista plana usada por </w:t>
+      </w:r>
+      <w:r>
+        <w:rPr/>
+        <w:t xml:space="preserve">getDataFilesIds()</w:t>
+      </w:r>
+      <w:r>
+        <w:rPr/>
+        <w:t xml:space="preserve">. Se usó </w:t>
+      </w:r>
+      <w:r>
+        <w:rPr/>
+        <w:t xml:space="preserve">CONFIG.DATA_FILES.LOGS</w:t>
+      </w:r>
+      <w:r>
+        <w:rPr/>
+        <w:t xml:space="preserve"> en su lugar, siguiendo el patrón ya existente de </w:t>
+      </w:r>
+      <w:r>
+        <w:rPr/>
+        <w:t xml:space="preserve">DATA_FILES.STAGING</w:t>
+      </w:r>
+      <w:r>
+        <w:rPr/>
+        <w:t xml:space="preserve"> (mismo objeto, mismo estilo de acceso vía </w:t>
+      </w:r>
+      <w:r>
+        <w:rPr/>
+        <w:t xml:space="preserve">getConfig('DATA_FILES.LOGS')</w:t>
+      </w:r>
+      <w:r>
+        <w:rPr/>
+        <w:t xml:space="preserve">).</w:t>
+      </w:r>
+    </w:p>
+    <w:p>
+      <w:pPr>
+        <w:numPr>
+          <w:ilvl w:val="0"/>
+          <w:numId w:val="72"/>
+        </w:numPr>
+        <w:spacing w:lineRule="auto"/>
+      </w:pPr>
+      <w:r>
+        <w:rPr>
+          <w:b/>
+        </w:rPr>
+        <w:t xml:space="preserve">cache_backend.gs</w:t>
+      </w:r>
+      <w:r>
+        <w:rPr>
+          <w:b/>
+        </w:rPr>
+        <w:t xml:space="preserve">’s </w:t>
+      </w:r>
+      <w:r>
+        <w:rPr>
+          <w:b/>
+        </w:rPr>
+        <w:t xml:space="preserve">CacheQueue</w:t>
+      </w:r>
+      <w:r>
+        <w:rPr>
+          <w:b/>
+        </w:rPr>
+        <w:t xml:space="preserve">/</w:t>
+      </w:r>
+      <w:r>
+        <w:rPr>
+          <w:b/>
+        </w:rPr>
+        <w:t xml:space="preserve">CacheStore</w:t>
+      </w:r>
+      <w:r>
+        <w:rPr>
+          <w:b/>
+        </w:rPr>
+        <w:t xml:space="preserve">/</w:t>
+      </w:r>
+      <w:r>
+        <w:rPr>
+          <w:b/>
+        </w:rPr>
+        <w:t xml:space="preserve">processCacheQueue</w:t>
+      </w:r>
+      <w:r>
+        <w:rPr>
+          <w:b/>
+        </w:rPr>
+        <w:t xml:space="preserve"> NO son infraestructura muerta</w:t>
+      </w:r>
+      <w:r>
+        <w:rPr/>
+        <w:t xml:space="preserve"> — están conectadas al botón “Forzar Actualización” (Admin/PowerEditor, </w:t>
+      </w:r>
+      <w:r>
+        <w:rPr/>
+        <w:t xml:space="preserve">Index.html:921-1034</w:t>
+      </w:r>
+      <w:r>
+        <w:rPr/>
+        <w:t xml:space="preserve">, </w:t>
+      </w:r>
+      <w:r>
+        <w:rPr/>
+        <w:t xml:space="preserve">gsForceCacheInvalidation</w:t>
+      </w:r>
+      <w:r>
+        <w:rPr/>
+        <w:t xml:space="preserve">/</w:t>
+      </w:r>
+      <w:r>
+        <w:rPr/>
+        <w:t xml:space="preserve">gsCheckCacheOperation</w:t>
+      </w:r>
+      <w:r>
+        <w:rPr/>
+        <w:t xml:space="preserve">). El plan de Fase 5a asumía que se podían eliminar; se confirmó lo contrario por grep dirigido a </w:t>
+      </w:r>
+      <w:r>
+        <w:rPr/>
+        <w:t xml:space="preserve">Index.html</w:t>
+      </w:r>
+      <w:r>
+        <w:rPr/>
+        <w:t xml:space="preserve">. Decisión (vía AskUserQuestion): conservar toda esa infraestructura intacta; </w:t>
+      </w:r>
+      <w:r>
+        <w:rPr/>
+        <w:t xml:space="preserve">invalidateDataCache()</w:t>
+      </w:r>
+      <w:r>
+        <w:rPr/>
+        <w:t xml:space="preserve"> se agregó como capa nueva e independiente basada en </w:t>
+      </w:r>
+      <w:r>
+        <w:rPr/>
+        <w:t xml:space="preserve">CacheService</w:t>
+      </w:r>
+      <w:r>
+        <w:rPr/>
+        <w:t xml:space="preserve">, sin tocar la cola en hojas.</w:t>
+      </w:r>
+    </w:p>
+    <w:p>
+      <w:pPr>
+        <w:numPr>
+          <w:ilvl w:val="0"/>
+          <w:numId w:val="72"/>
+        </w:numPr>
+        <w:spacing w:lineRule="auto"/>
+      </w:pPr>
+      <w:r>
+        <w:rPr>
+          <w:b/>
+        </w:rPr>
+        <w:t xml:space="preserve">getPACData</w:t>
+      </w:r>
+      <w:r>
+        <w:rPr>
+          <w:b/>
+        </w:rPr>
+        <w:t xml:space="preserve"> ejecuta una escritura (</w:t>
+      </w:r>
+      <w:r>
+        <w:rPr>
+          <w:b/>
+        </w:rPr>
+        <w:t xml:space="preserve">pac_actualizarEstadosDesdeMatrizBatch</w:t>
+      </w:r>
+      <w:r>
+        <w:rPr>
+          <w:b/>
+        </w:rPr>
+        <w:t xml:space="preserve">) antes de calcular la respuesta</w:t>
+      </w:r>
+      <w:r>
+        <w:rPr/>
+        <w:t xml:space="preserve"> — sincroniza </w:t>
+      </w:r>
+      <w:r>
+        <w:rPr/>
+        <w:t xml:space="preserve">ESTADO_PREDIAL_ACTUAL</w:t>
+      </w:r>
+      <w:r>
+        <w:rPr/>
+        <w:t xml:space="preserve"> en </w:t>
+      </w:r>
+      <w:r>
+        <w:rPr/>
+        <w:t xml:space="preserve">PAC_Vigente</w:t>
+      </w:r>
+      <w:r>
+        <w:rPr/>
+        <w:t xml:space="preserve"> desde la matriz en cada llamada. Decisión (vía AskUserQuestion): esa escritura corre SIEMPRE, en cache-hit y cache-miss por igual; solo se cachea el cálculo de </w:t>
+      </w:r>
+      <w:r>
+        <w:rPr/>
+        <w:t xml:space="preserve">calcularSemaforoPAC</w:t>
+      </w:r>
+      <w:r>
+        <w:rPr/>
+        <w:t xml:space="preserve"> + armado de respuesta. Consecuencia aceptada: la ganancia de rendimiento real de cachear PAC es menor que un caché “puro”, porque la lectura+escritura más cara de Sheets sigue ejecutándose en cada request.</w:t>
+      </w:r>
+    </w:p>
+    <w:p>
+      <w:pPr>
+        <w:spacing w:lineRule="auto"/>
+      </w:pPr>
+      <w:r>
+        <w:rPr>
+          <w:b/>
+        </w:rPr>
+        <w:t xml:space="preserve">Cambios Técnicos Realizados:</w:t>
+      </w:r>
+    </w:p>
+    <w:p>
+      <w:pPr>
+        <w:numPr>
+          <w:ilvl w:val="0"/>
+          <w:numId w:val="73"/>
+        </w:numPr>
+        <w:spacing w:lineRule="auto"/>
+      </w:pPr>
+      <w:r>
+        <w:rPr/>
+        <w:t xml:space="preserve">CONFIG.DATA_FILES.LOGS</w:t>
+      </w:r>
+      <w:r>
+        <w:rPr/>
+        <w:t xml:space="preserve"> con valor placeholder </w:t>
+      </w:r>
+      <w:r>
+        <w:rPr/>
+        <w:t xml:space="preserve">'ID_SPREADSHEET_LOGS_AQUI'</w:t>
+      </w:r>
+      <w:r>
+        <w:rPr/>
+        <w:t xml:space="preserve"> — </w:t>
+      </w:r>
+      <w:r>
+        <w:rPr>
+          <w:b/>
+        </w:rPr>
+        <w:t xml:space="preserve">debe reemplazarse por un ID real antes de desplegar a producción</w:t>
+      </w:r>
+      <w:r>
+        <w:rPr/>
+        <w:t xml:space="preserve">, o toda la auditoría (</w:t>
+      </w:r>
+      <w:r>
+        <w:rPr/>
+        <w:t xml:space="preserve">registrarAccion</w:t>
+      </w:r>
+      <w:r>
+        <w:rPr/>
+        <w:t xml:space="preserve">/</w:t>
+      </w:r>
+      <w:r>
+        <w:rPr/>
+        <w:t xml:space="preserve">getUserLogs</w:t>
+      </w:r>
+      <w:r>
+        <w:rPr/>
+        <w:t xml:space="preserve">) queda silenciosamente deshabilitada (degrada a </w:t>
+      </w:r>
+      <w:r>
+        <w:rPr/>
+        <w:t xml:space="preserve">{success:false}</w:t>
+      </w:r>
+      <w:r>
+        <w:rPr/>
+        <w:t xml:space="preserve">/</w:t>
+      </w:r>
+      <w:r>
+        <w:rPr/>
+        <w:t xml:space="preserve">[]</w:t>
+      </w:r>
+      <w:r>
+        <w:rPr/>
+        <w:t xml:space="preserve">, no lanza sin capturar). Se agregó un </w:t>
+      </w:r>
+      <w:r>
+        <w:rPr/>
+        <w:t xml:space="preserve">console.error</w:t>
+      </w:r>
+      <w:r>
+        <w:rPr/>
+        <w:t xml:space="preserve"> explícito que detecta el placeholder y lo deja claro en los logs del servidor en vez de un error genérico de </w:t>
+      </w:r>
+      <w:r>
+        <w:rPr/>
+        <w:t xml:space="preserve">SpreadsheetApp.openById()</w:t>
+      </w:r>
+      <w:r>
+        <w:rPr/>
+        <w:t xml:space="preserve">.</w:t>
+      </w:r>
+    </w:p>
+    <w:p>
+      <w:pPr>
+        <w:numPr>
+          <w:ilvl w:val="0"/>
+          <w:numId w:val="73"/>
+        </w:numPr>
+        <w:spacing w:lineRule="auto"/>
+      </w:pPr>
+      <w:r>
+        <w:rPr/>
+        <w:t xml:space="preserve">GestorAuditoria._obtenerGestorLogs()</w:t>
+      </w:r>
+      <w:r>
+        <w:rPr/>
+        <w:t xml:space="preserve">: </w:t>
+      </w:r>
+      <w:r>
+        <w:rPr/>
+        <w:t xml:space="preserve">GestorDatos</w:t>
+      </w:r>
+      <w:r>
+        <w:rPr/>
+        <w:t xml:space="preserve"> lazy y memoizado, separado de </w:t>
+      </w:r>
+      <w:r>
+        <w:rPr/>
+        <w:t xml:space="preserve">this.gestor</w:t>
+      </w:r>
+      <w:r>
+        <w:rPr/>
+        <w:t xml:space="preserve"> (que sigue apuntando al principal, usado por </w:t>
+      </w:r>
+      <w:r>
+        <w:rPr/>
+        <w:t xml:space="preserve">registrarCambio</w:t>
+      </w:r>
+      <w:r>
+        <w:rPr/>
+        <w:t xml:space="preserve">/</w:t>
+      </w:r>
+      <w:r>
+        <w:rPr/>
+        <w:t xml:space="preserve">obtenerHistorial</w:t>
+      </w:r>
+      <w:r>
+        <w:rPr/>
+        <w:t xml:space="preserve"> — la auditoría V2/historial NO se movió, solo el log V1). Firmas públicas de </w:t>
+      </w:r>
+      <w:r>
+        <w:rPr/>
+        <w:t xml:space="preserve">registrarAccion(usuario, accion, detalles)</w:t>
+      </w:r>
+      <w:r>
+        <w:rPr/>
+        <w:t xml:space="preserve"> y </w:t>
+      </w:r>
+      <w:r>
+        <w:rPr/>
+        <w:t xml:space="preserve">getUserLogs(usuario)</w:t>
+      </w:r>
+      <w:r>
+        <w:rPr/>
+        <w:t xml:space="preserve"> sin cambios — los 16 call sites existentes no requieren modificación.</w:t>
+      </w:r>
+    </w:p>
+    <w:p>
+      <w:pPr>
+        <w:numPr>
+          <w:ilvl w:val="0"/>
+          <w:numId w:val="73"/>
+        </w:numPr>
+        <w:spacing w:lineRule="auto"/>
+      </w:pPr>
+      <w:r>
+        <w:rPr/>
+        <w:t xml:space="preserve">cache_backend.gs</w:t>
+      </w:r>
+      <w:r>
+        <w:rPr/>
+        <w:t xml:space="preserve">: </w:t>
+      </w:r>
+      <w:r>
+        <w:rPr/>
+        <w:t xml:space="preserve">CACHE_KEY_DASHBOARD</w:t>
+      </w:r>
+      <w:r>
+        <w:rPr/>
+        <w:t xml:space="preserve"> (clave fija) y </w:t>
+      </w:r>
+      <w:r>
+        <w:rPr/>
+        <w:t xml:space="preserve">CACHE_KEY_PAC_VERSION</w:t>
+      </w:r>
+      <w:r>
+        <w:rPr/>
+        <w:t xml:space="preserve"> (token de versión, ya que </w:t>
+      </w:r>
+      <w:r>
+        <w:rPr/>
+        <w:t xml:space="preserve">getPACData</w:t>
+      </w:r>
+      <w:r>
+        <w:rPr/>
+        <w:t xml:space="preserve"> tiene parámetros variables — invalidar es incrementar la versión, no enumerar cada combinación posible de filtros). </w:t>
+      </w:r>
+      <w:r>
+        <w:rPr/>
+        <w:t xml:space="preserve">invalidateDataCache()</w:t>
+      </w:r>
+      <w:r>
+        <w:rPr/>
+        <w:t xml:space="preserve"> fail-open (try/catch, nunca tumba la operación que la llamó).</w:t>
+      </w:r>
+    </w:p>
+    <w:p>
+      <w:pPr>
+        <w:numPr>
+          <w:ilvl w:val="0"/>
+          <w:numId w:val="73"/>
+        </w:numPr>
+        <w:spacing w:lineRule="auto"/>
+      </w:pPr>
+      <w:r>
+        <w:rPr/>
+        <w:t xml:space="preserve">getDashboardData</w:t>
+      </w:r>
+      <w:r>
+        <w:rPr/>
+        <w:t xml:space="preserve">: cache-read después del check de mantenimiento (nunca antes); cache-write con try/catch para el límite de 100KB de </w:t>
+      </w:r>
+      <w:r>
+        <w:rPr/>
+        <w:t xml:space="preserve">CacheService.put()</w:t>
+      </w:r>
+      <w:r>
+        <w:rPr/>
+        <w:t xml:space="preserve">.</w:t>
+      </w:r>
+    </w:p>
+    <w:p>
+      <w:pPr>
+        <w:numPr>
+          <w:ilvl w:val="0"/>
+          <w:numId w:val="73"/>
+        </w:numPr>
+        <w:spacing w:lineRule="auto"/>
+      </w:pPr>
+      <w:r>
+        <w:rPr/>
+        <w:t xml:space="preserve">getPACData</w:t>
+      </w:r>
+      <w:r>
+        <w:rPr/>
+        <w:t xml:space="preserve">: cache-key vía </w:t>
+      </w:r>
+      <w:r>
+        <w:rPr/>
+        <w:t xml:space="preserve">_pac_buildCacheKey()</w:t>
+      </w:r>
+      <w:r>
+        <w:rPr/>
+        <w:t xml:space="preserve"> (hash MD5 de </w:t>
+      </w:r>
+      <w:r>
+        <w:rPr/>
+        <w:t xml:space="preserve">filtros</w:t>
+      </w:r>
+      <w:r>
+        <w:rPr/>
+        <w:t xml:space="preserve">+</w:t>
+      </w:r>
+      <w:r>
+        <w:rPr/>
+        <w:t xml:space="preserve">modoEjecucion</w:t>
+      </w:r>
+      <w:r>
+        <w:rPr/>
+        <w:t xml:space="preserve"> + versión vigente), mismo patrón de try/catch en el </w:t>
+      </w:r>
+      <w:r>
+        <w:rPr/>
+        <w:t xml:space="preserve">put()</w:t>
+      </w:r>
+      <w:r>
+        <w:rPr/>
+        <w:t xml:space="preserve">.</w:t>
+      </w:r>
+    </w:p>
+    <w:p>
+      <w:pPr>
+        <w:numPr>
+          <w:ilvl w:val="0"/>
+          <w:numId w:val="73"/>
+        </w:numPr>
+        <w:spacing w:lineRule="auto"/>
+      </w:pPr>
+      <w:r>
+        <w:rPr/>
+        <w:t xml:space="preserve">Invalidación inyectada en 10 puntos: </w:t>
+      </w:r>
+      <w:r>
+        <w:rPr/>
+        <w:t xml:space="preserve">saveTrackingData</w:t>
+      </w:r>
+      <w:r>
+        <w:rPr/>
+        <w:t xml:space="preserve">, </w:t>
+      </w:r>
+      <w:r>
+        <w:rPr/>
+        <w:t xml:space="preserve">savePermission</w:t>
+      </w:r>
+      <w:r>
+        <w:rPr/>
+        <w:t xml:space="preserve">/</w:t>
+      </w:r>
+      <w:r>
+        <w:rPr/>
+        <w:t xml:space="preserve">deletePermission</w:t>
+      </w:r>
+      <w:r>
+        <w:rPr/>
+        <w:t xml:space="preserve"> (ambas copias, </w:t>
+      </w:r>
+      <w:r>
+        <w:rPr/>
+        <w:t xml:space="preserve">Codigo.js</w:t>
+      </w:r>
+      <w:r>
+        <w:rPr/>
+        <w:t xml:space="preserve"> y </w:t>
+      </w:r>
+      <w:r>
+        <w:rPr/>
+        <w:t xml:space="preserve">permisos.js</w:t>
+      </w:r>
+      <w:r>
+        <w:rPr/>
+        <w:t xml:space="preserve">), </w:t>
+      </w:r>
+      <w:r>
+        <w:rPr/>
+        <w:t xml:space="preserve">crearFiltro</w:t>
+      </w:r>
+      <w:r>
+        <w:rPr/>
+        <w:t xml:space="preserve">/</w:t>
+      </w:r>
+      <w:r>
+        <w:rPr/>
+        <w:t xml:space="preserve">actualizarFiltro</w:t>
+      </w:r>
+      <w:r>
+        <w:rPr/>
+        <w:t xml:space="preserve">/</w:t>
+      </w:r>
+      <w:r>
+        <w:rPr/>
+        <w:t xml:space="preserve">activarFiltro</w:t>
+      </w:r>
+      <w:r>
+        <w:rPr/>
+        <w:t xml:space="preserve">(x2)/</w:t>
+      </w:r>
+      <w:r>
+        <w:rPr/>
+        <w:t xml:space="preserve">eliminarFiltro</w:t>
+      </w:r>
+      <w:r>
+        <w:rPr/>
+        <w:t xml:space="preserve">(x2) en </w:t>
+      </w:r>
+      <w:r>
+        <w:rPr/>
+        <w:t xml:space="preserve">datos.js</w:t>
+      </w:r>
+      <w:r>
+        <w:rPr/>
+        <w:t xml:space="preserve">, </w:t>
+      </w:r>
+      <w:r>
+        <w:rPr/>
+        <w:t xml:space="preserve">aprobarBorradorPAC</w:t>
+      </w:r>
+      <w:r>
+        <w:rPr/>
+        <w:t xml:space="preserve">, y </w:t>
+      </w:r>
+      <w:r>
+        <w:rPr/>
+        <w:t xml:space="preserve">promoverDato2aDato1</w:t>
+      </w:r>
+      <w:r>
+        <w:rPr/>
+        <w:t xml:space="preserve"> (hallazgo propio del </w:t>
+      </w:r>
+      <w:r>
+        <w:rPr/>
+        <w:t xml:space="preserve">/review</w:t>
+      </w:r>
+      <w:r>
+        <w:rPr/>
+        <w:t xml:space="preserve">, no estaba en la lista original de ~8 funciones — sobrescribe </w:t>
+      </w:r>
+      <w:r>
+        <w:rPr/>
+        <w:t xml:space="preserve">Datos</w:t>
+      </w:r>
+      <w:r>
+        <w:rPr/>
+        <w:t xml:space="preserve">/</w:t>
+      </w:r>
+      <w:r>
+        <w:rPr/>
+        <w:t xml:space="preserve">Seguimiento</w:t>
+      </w:r>
+      <w:r>
+        <w:rPr/>
+        <w:t xml:space="preserve"> del principal vía el menú de Sheets, </w:t>
+      </w:r>
+      <w:r>
+        <w:rPr/>
+        <w:t xml:space="preserve">Codigo.js:1954</w:t>
+      </w:r>
+      <w:r>
+        <w:rPr/>
+        <w:t xml:space="preserve">).</w:t>
+      </w:r>
+    </w:p>
+    <w:p>
+      <w:pPr>
+        <w:spacing w:lineRule="auto"/>
+      </w:pPr>
+      <w:r>
+        <w:rPr>
+          <w:b/>
+        </w:rPr>
+        <w:t xml:space="preserve">Hallazgos del </w:t>
+      </w:r>
+      <w:r>
+        <w:rPr>
+          <w:b/>
+        </w:rPr>
+        <w:t xml:space="preserve">/review</w:t>
+      </w:r>
+      <w:r>
+        <w:rPr>
+          <w:b/>
+        </w:rPr>
+        <w:t xml:space="preserve"> (adaptado — sin rama base ni remoto configurados, se revisó </w:t>
+      </w:r>
+      <w:r>
+        <w:rPr>
+          <w:b/>
+        </w:rPr>
+        <w:t xml:space="preserve">git diff HEAD</w:t>
+      </w:r>
+      <w:r>
+        <w:rPr>
+          <w:b/>
+        </w:rPr>
+        <w:t xml:space="preserve">, el diff de trabajo sin commitear):</w:t>
+      </w:r>
+    </w:p>
+    <w:p>
+      <w:pPr>
+        <w:numPr>
+          <w:ilvl w:val="0"/>
+          <w:numId w:val="74"/>
+        </w:numPr>
+        <w:spacing w:lineRule="auto"/>
+      </w:pPr>
+      <w:r>
+        <w:rPr>
+          <w:b/>
+        </w:rPr>
+        <w:t xml:space="preserve">[CRÍTICO, corregido]</w:t>
+      </w:r>
+      <w:r>
+        <w:rPr/>
+        <w:t xml:space="preserve">getDashboardData()</w:t>
+      </w:r>
+      <w:r>
+        <w:rPr/>
+        <w:t xml:space="preserve"> cacheaba el campo </w:t>
+      </w:r>
+      <w:r>
+        <w:rPr/>
+        <w:t xml:space="preserve">user: Session.getActiveUser().getEmail()</w:t>
+      </w:r>
+      <w:r>
+        <w:rPr/>
+        <w:t xml:space="preserve"> dentro del blob compartido de </w:t>
+      </w:r>
+      <w:r>
+        <w:rPr/>
+        <w:t xml:space="preserve">CacheService.getScriptCache()</w:t>
+      </w:r>
+      <w:r>
+        <w:rPr/>
+        <w:t xml:space="preserve"> (compartido entre TODAS las ejecuciones del script, no por-sesión). Un cache-hit servía el email del usuario que originalmente poblió el caché a cualquier otro usuario durante el TTL de 30 min. Verificado que </w:t>
+      </w:r>
+      <w:r>
+        <w:rPr/>
+        <w:t xml:space="preserve">app_matriz_js.html:61,1523,2148</w:t>
+      </w:r>
+      <w:r>
+        <w:rPr/>
+        <w:t xml:space="preserve"> consume ese campo como </w:t>
+      </w:r>
+      <w:r>
+        <w:rPr/>
+        <w:t xml:space="preserve">currentUser</w:t>
+      </w:r>
+      <w:r>
+        <w:rPr/>
+        <w:t xml:space="preserve"> — se usa como valor del campo </w:t>
+      </w:r>
+      <w:r>
+        <w:rPr/>
+        <w:t xml:space="preserve">USUARIO</w:t>
+      </w:r>
+      <w:r>
+        <w:rPr/>
+        <w:t xml:space="preserve"> en el registro de auditoría de </w:t>
+      </w:r>
+      <w:r>
+        <w:rPr/>
+        <w:t xml:space="preserve">saveTrackingData</w:t>
+      </w:r>
+      <w:r>
+        <w:rPr/>
+        <w:t xml:space="preserve"> y como parámetro </w:t>
+      </w:r>
+      <w:r>
+        <w:rPr/>
+        <w:t xml:space="preserve">usuario</w:t>
+      </w:r>
+      <w:r>
+        <w:rPr/>
+        <w:t xml:space="preserve"> en </w:t>
+      </w:r>
+      <w:r>
+        <w:rPr/>
+        <w:t xml:space="preserve">guardarYActivarFiltroManual</w:t>
+      </w:r>
+      <w:r>
+        <w:rPr/>
+        <w:t xml:space="preserve">/</w:t>
+      </w:r>
+      <w:r>
+        <w:rPr/>
+        <w:t xml:space="preserve">activarFiltroMatriz</w:t>
+      </w:r>
+      <w:r>
+        <w:rPr/>
+        <w:t xml:space="preserve">/</w:t>
+      </w:r>
+      <w:r>
+        <w:rPr/>
+        <w:t xml:space="preserve">crearFiltroMatriz</w:t>
+      </w:r>
+      <w:r>
+        <w:rPr/>
+        <w:t xml:space="preserve">/</w:t>
+      </w:r>
+      <w:r>
+        <w:rPr/>
+        <w:t xml:space="preserve">eliminarFiltroMatriz</w:t>
+      </w:r>
+      <w:r>
+        <w:rPr/>
+        <w:t xml:space="preserve">/</w:t>
+      </w:r>
+      <w:r>
+        <w:rPr/>
+        <w:t xml:space="preserve">actualizarFiltroMatriz</w:t>
+      </w:r>
+      <w:r>
+        <w:rPr/>
+        <w:t xml:space="preserve">, varios de los cuales usan ese valor client-supplied para chequeos de rol de administrador (</w:t>
+      </w:r>
+      <w:r>
+        <w:rPr/>
+        <w:t xml:space="preserve">GestorPermisos.obtenerRol(usuarioActual)</w:t>
+      </w:r>
+      <w:r>
+        <w:rPr/>
+        <w:t xml:space="preserve">) — un patrón de confianza en identidad ya existente y fuera de este alcance, pero que la fuga de caché habría hecho explotable en la práctica. </w:t>
+      </w:r>
+      <w:r>
+        <w:rPr>
+          <w:b/>
+        </w:rPr>
+        <w:t xml:space="preserve">Corregido:</w:t>
+      </w:r>
+      <w:r>
+        <w:rPr/>
+        <w:t xml:space="preserve">user</w:t>
+      </w:r>
+      <w:r>
+        <w:rPr/>
+        <w:t xml:space="preserve"> se excluye del objeto cacheado y se recalcula en vivo (</w:t>
+      </w:r>
+      <w:r>
+        <w:rPr/>
+        <w:t xml:space="preserve">Session.getActiveUser().getEmail()</w:t>
+      </w:r>
+      <w:r>
+        <w:rPr/>
+        <w:t xml:space="preserve">) en cada retorno, cache-hit o cache-miss.</w:t>
+      </w:r>
+    </w:p>
+    <w:p>
+      <w:pPr>
+        <w:numPr>
+          <w:ilvl w:val="0"/>
+          <w:numId w:val="74"/>
+        </w:numPr>
+        <w:spacing w:lineRule="auto"/>
+      </w:pPr>
+      <w:r>
+        <w:rPr>
+          <w:b/>
+        </w:rPr>
+        <w:t xml:space="preserve">[Confirmado, sin cambio de código — hallazgo propio]</w:t>
+      </w:r>
+      <w:r>
+        <w:rPr/>
+        <w:t xml:space="preserve">promoverDato2aDato1()</w:t>
+      </w:r>
+      <w:r>
+        <w:rPr/>
+        <w:t xml:space="preserve"> (</w:t>
+      </w:r>
+      <w:r>
+        <w:rPr/>
+        <w:t xml:space="preserve">Codigo.js:1954</w:t>
+      </w:r>
+      <w:r>
+        <w:rPr/>
+        <w:t xml:space="preserve">, disparado desde el menú de Sheets) sobrescribe </w:t>
+      </w:r>
+      <w:r>
+        <w:rPr/>
+        <w:t xml:space="preserve">Datos</w:t>
+      </w:r>
+      <w:r>
+        <w:rPr/>
+        <w:t xml:space="preserve">/</w:t>
+      </w:r>
+      <w:r>
+        <w:rPr/>
+        <w:t xml:space="preserve">Seguimiento</w:t>
+      </w:r>
+      <w:r>
+        <w:rPr/>
+        <w:t xml:space="preserve"> del principal sin invalidar el caché — corregido durante la construcción, antes de que terminara el </w:t>
+      </w:r>
+      <w:r>
+        <w:rPr/>
+        <w:t xml:space="preserve">/review</w:t>
+      </w:r>
+      <w:r>
+        <w:rPr/>
+        <w:t xml:space="preserve"> (ver arriba).</w:t>
+      </w:r>
+    </w:p>
+    <w:p>
+      <w:pPr>
+        <w:numPr>
+          <w:ilvl w:val="0"/>
+          <w:numId w:val="74"/>
+        </w:numPr>
+        <w:spacing w:lineRule="auto"/>
+      </w:pPr>
+      <w:r>
+        <w:rPr>
+          <w:b/>
+        </w:rPr>
+        <w:t xml:space="preserve">[Informativo]</w:t>
+      </w:r>
+      <w:r>
+        <w:rPr/>
+        <w:t xml:space="preserve"> El placeholder de </w:t>
+      </w:r>
+      <w:r>
+        <w:rPr/>
+        <w:t xml:space="preserve">DATA_FILES.LOGS</w:t>
+      </w:r>
+      <w:r>
+        <w:rPr/>
+        <w:t xml:space="preserve"> deshabilita la auditoría silenciosamente hasta reemplazarse — comportamiento intencional (degradación grácil ya decidida en Fase 5a), reforzado con un log explícito (ver arriba). Bloqueante para desplegar a producción, no para continuar el desarrollo.</w:t>
+      </w:r>
+    </w:p>
+    <w:p>
+      <w:pPr>
+        <w:numPr>
+          <w:ilvl w:val="0"/>
+          <w:numId w:val="74"/>
+        </w:numPr>
+        <w:spacing w:lineRule="auto"/>
+      </w:pPr>
+      <w:r>
+        <w:rPr>
+          <w:b/>
+        </w:rPr>
+        <w:t xml:space="preserve">[Informativo]</w:t>
+      </w:r>
+      <w:r>
+        <w:rPr/>
+        <w:t xml:space="preserve"> El límite de 100KB de </w:t>
+      </w:r>
+      <w:r>
+        <w:rPr/>
+        <w:t xml:space="preserve">CacheService.put()</w:t>
+      </w:r>
+      <w:r>
+        <w:rPr/>
+        <w:t xml:space="preserve"> podría hacer que el caché de </w:t>
+      </w:r>
+      <w:r>
+        <w:rPr/>
+        <w:t xml:space="preserve">getDashboardData</w:t>
+      </w:r>
+      <w:r>
+        <w:rPr/>
+        <w:t xml:space="preserve"> nunca se active en la práctica si el dataset real de predios supera ese tamaño — el fallback fail-open ya está implementado; medir el tamaño real del payload tras desplegar es el siguiente paso, no una acción de código.</w:t>
+      </w:r>
+    </w:p>
+    <w:p>
+      <w:pPr>
+        <w:numPr>
+          <w:ilvl w:val="0"/>
+          <w:numId w:val="74"/>
+        </w:numPr>
+        <w:spacing w:lineRule="auto"/>
+      </w:pPr>
+      <w:r>
+        <w:rPr>
+          <w:b/>
+        </w:rPr>
+        <w:t xml:space="preserve">[Informativo, nuevo TODO]</w:t>
+      </w:r>
+      <w:r>
+        <w:rPr/>
+        <w:t xml:space="preserve">GestorFiltroMatriz</w:t>
+      </w:r>
+      <w:r>
+        <w:rPr/>
+        <w:t xml:space="preserve"> (</w:t>
+      </w:r>
+      <w:r>
+        <w:rPr/>
+        <w:t xml:space="preserve">datos.js</w:t>
+      </w:r>
+      <w:r>
+        <w:rPr/>
+        <w:t xml:space="preserve">) define </w:t>
+      </w:r>
+      <w:r>
+        <w:rPr/>
+        <w:t xml:space="preserve">activarFiltro</w:t>
+      </w:r>
+      <w:r>
+        <w:rPr/>
+        <w:t xml:space="preserve"> y </w:t>
+      </w:r>
+      <w:r>
+        <w:rPr/>
+        <w:t xml:space="preserve">eliminarFiltro</w:t>
+      </w:r>
+      <w:r>
+        <w:rPr/>
+        <w:t xml:space="preserve"> DOS VECES cada una dentro de la misma clase (líneas 319/608 y 388/671) — duplicación preexistente, no introducida en esta sesión. La segunda declaración sobrescribe silenciosamente a la primera (mismas reglas de JS que la Sección 12.5/13.1). Se inyectó </w:t>
+      </w:r>
+      <w:r>
+        <w:rPr/>
+        <w:t xml:space="preserve">invalidateDataCache()</w:t>
+      </w:r>
+      <w:r>
+        <w:rPr/>
+        <w:t xml:space="preserve"> en las 4 copias por seguridad, independientemente de cuál esté realmente activa. Registrado como TODOS.md ítem 10.</w:t>
+      </w:r>
+    </w:p>
+    <w:p>
+      <w:pPr>
+        <w:numPr>
+          <w:ilvl w:val="0"/>
+          <w:numId w:val="74"/>
+        </w:numPr>
+        <w:spacing w:lineRule="auto"/>
+      </w:pPr>
+      <w:r>
+        <w:rPr>
+          <w:b/>
+        </w:rPr>
+        <w:t xml:space="preserve">[Informativo]</w:t>
+      </w:r>
+      <w:r>
+        <w:rPr/>
+        <w:t xml:space="preserve">invalidateDataCache()</w:t>
+      </w:r>
+      <w:r>
+        <w:rPr/>
+        <w:t xml:space="preserve">’s incremento de versión (</w:t>
+      </w:r>
+      <w:r>
+        <w:rPr/>
+        <w:t xml:space="preserve">cache.get</w:t>
+      </w:r>
+      <w:r>
+        <w:rPr/>
+        <w:t xml:space="preserve"> → </w:t>
+      </w:r>
+      <w:r>
+        <w:rPr/>
+        <w:t xml:space="preserve">cache.put</w:t>
+      </w:r>
+      <w:r>
+        <w:rPr/>
+        <w:t xml:space="preserve">) no es atómico — bajo invalidaciones concurrentes el contador puede sub-incrementar, pero es inofensivo: cualquier incremento sigue invalidando las claves viejas, la garantía de invalidación no depende de que el contador sea exacto.</w:t>
+      </w:r>
+    </w:p>
+    <w:p>
+      <w:pPr>
+        <w:numPr>
+          <w:ilvl w:val="0"/>
+          <w:numId w:val="74"/>
+        </w:numPr>
+        <w:spacing w:lineRule="auto"/>
+      </w:pPr>
+      <w:r>
+        <w:rPr>
+          <w:b/>
+        </w:rPr>
+        <w:t xml:space="preserve">[Informativo]</w:t>
+      </w:r>
+      <w:r>
+        <w:rPr/>
+        <w:t xml:space="preserve">pac_actualizarEstadosDesdeMatrizBatch</w:t>
+      </w:r>
+      <w:r>
+        <w:rPr/>
+        <w:t xml:space="preserve"> (escritura en </w:t>
+      </w:r>
+      <w:r>
+        <w:rPr/>
+        <w:t xml:space="preserve">PAC_Vigente</w:t>
+      </w:r>
+      <w:r>
+        <w:rPr/>
+        <w:t xml:space="preserve">) no tiene </w:t>
+      </w:r>
+      <w:r>
+        <w:rPr/>
+        <w:t xml:space="preserve">LockService</w:t>
+      </w:r>
+      <w:r>
+        <w:rPr/>
+        <w:t xml:space="preserve"> propio (a diferencia de </w:t>
+      </w:r>
+      <w:r>
+        <w:rPr/>
+        <w:t xml:space="preserve">aprobarBorradorPAC</w:t>
+      </w:r>
+      <w:r>
+        <w:rPr/>
+        <w:t xml:space="preserve">, que sí bloquea la misma hoja) — gap de concurrencia preexistente, no introducido ni agravado por el caché nuevo (el caché no cambia la frecuencia de esta escritura, ver corrección de premisa #3 arriba).</w:t>
+      </w:r>
+    </w:p>
+    <w:p>
+      <w:pPr>
+        <w:spacing w:lineRule="auto"/>
+      </w:pPr>
+      <w:r>
+        <w:rPr>
+          <w:b/>
+        </w:rPr>
+        <w:t xml:space="preserve">Validación y Pruebas Ejecutadas:</w:t>
+      </w:r>
+    </w:p>
+    <w:p>
+      <w:pPr>
+        <w:numPr>
+          <w:ilvl w:val="0"/>
+          <w:numId w:val="75"/>
+        </w:numPr>
+        <w:spacing w:lineRule="auto"/>
+      </w:pPr>
+      <w:r>
+        <w:rPr/>
+      </w:r>
+      <w:r>
+        <w:rPr/>
+        <w:t xml:space="preserve">node --check</w:t>
+      </w:r>
+      <w:r>
+        <w:rPr/>
+        <w:t xml:space="preserve"> en los 8 archivos modificados (</w:t>
+      </w:r>
+      <w:r>
+        <w:rPr/>
+        <w:t xml:space="preserve">cache_backend.gs</w:t>
+      </w:r>
+      <w:r>
+        <w:rPr/>
+        <w:t xml:space="preserve"> verificado vía copia temporal </w:t>
+      </w:r>
+      <w:r>
+        <w:rPr/>
+        <w:t xml:space="preserve">.js</w:t>
+      </w:r>
+      <w:r>
+        <w:rPr/>
+        <w:t xml:space="preserve">, ya que </w:t>
+      </w:r>
+      <w:r>
+        <w:rPr/>
+        <w:t xml:space="preserve">node --check</w:t>
+      </w:r>
+      <w:r>
+        <w:rPr/>
+        <w:t xml:space="preserve"> no reconoce la extensión </w:t>
+      </w:r>
+      <w:r>
+        <w:rPr/>
+        <w:t xml:space="preserve">.gs</w:t>
+      </w:r>
+      <w:r>
+        <w:rPr/>
+        <w:t xml:space="preserve">)</w:t>
+      </w:r>
+    </w:p>
+    <w:p>
+      <w:pPr>
+        <w:numPr>
+          <w:ilvl w:val="0"/>
+          <w:numId w:val="75"/>
+        </w:numPr>
+        <w:spacing w:lineRule="auto"/>
+      </w:pPr>
+      <w:r>
+        <w:rPr/>
+      </w:r>
+      <w:r>
+        <w:rPr/>
+        <w:t xml:space="preserve">/review</w:t>
+      </w:r>
+      <w:r>
+        <w:rPr/>
+        <w:t xml:space="preserve"> ejecutado: sin rama base ni remoto configurados en este repo (una sola rama local, </w:t>
+      </w:r>
+      <w:r>
+        <w:rPr/>
+        <w:t xml:space="preserve">git remote -v</w:t>
+      </w:r>
+      <w:r>
+        <w:rPr/>
+        <w:t xml:space="preserve"> vacío) — adaptado a revisar </w:t>
+      </w:r>
+      <w:r>
+        <w:rPr/>
+        <w:t xml:space="preserve">git diff HEAD</w:t>
+      </w:r>
+      <w:r>
+        <w:rPr/>
+        <w:t xml:space="preserve"> (el diff de trabajo sin commitear) en vez de diff contra una rama base</w:t>
+      </w:r>
+    </w:p>
+    <w:p>
+      <w:pPr>
+        <w:numPr>
+          <w:ilvl w:val="0"/>
+          <w:numId w:val="75"/>
+        </w:numPr>
+        <w:spacing w:lineRule="auto"/>
+      </w:pPr>
+      <w:r>
+        <w:rPr/>
+      </w:r>
+      <w:r>
+        <w:rPr/>
+        <w:t xml:space="preserve"> Pase crítico propio (concurrencia, límites de CacheService, fuga de datos entre usuarios) + 1 subagente adversarial independiente (Agent tool, sin contexto previo de la conversación) — hallazgo crítico #1 confirmado y corregido</w:t>
+      </w:r>
+    </w:p>
+    <w:p>
+      <w:pPr>
+        <w:numPr>
+          <w:ilvl w:val="0"/>
+          <w:numId w:val="75"/>
+        </w:numPr>
+        <w:spacing w:lineRule="auto"/>
+      </w:pPr>
+      <w:r>
+        <w:rPr/>
+      </w:r>
+      <w:r>
+        <w:rPr/>
+        <w:t xml:space="preserve"> Verificado explícitamente: el check de modo mantenimiento en </w:t>
+      </w:r>
+      <w:r>
+        <w:rPr/>
+        <w:t xml:space="preserve">getDashboardData</w:t>
+      </w:r>
+      <w:r>
+        <w:rPr/>
+        <w:t xml:space="preserve"> sigue ejecutándose antes de cualquier lectura de caché (su resultado nunca se cachea). </w:t>
+      </w:r>
+      <w:r>
+        <w:rPr/>
+        <w:t xml:space="preserve">getPACData</w:t>
+      </w:r>
+      <w:r>
+        <w:rPr/>
+        <w:t xml:space="preserve"> nunca tuvo check de mantenimiento propio — gap preexistente, no introducido por este cambio, no corregido en este alcance</w:t>
+      </w:r>
+    </w:p>
+    <w:p>
+      <w:pPr>
+        <w:numPr>
+          <w:ilvl w:val="0"/>
+          <w:numId w:val="75"/>
+        </w:numPr>
+        <w:spacing w:lineRule="auto"/>
+      </w:pPr>
+      <w:r>
+        <w:rPr/>
+      </w:r>
+      <w:r>
+        <w:rPr>
+          <w:b/>
+        </w:rPr>
+        <w:t xml:space="preserve">Actualización post-cierre (sesión siguiente, 2026-08-06):</w:t>
+      </w:r>
+      <w:r>
+        <w:rPr/>
+        <w:t xml:space="preserve">CONFIG.DATA_FILES.LOGS</w:t>
+      </w:r>
+      <w:r>
+        <w:rPr/>
+        <w:t xml:space="preserve"> reemplazado por el ID real del spreadsheet operacional </w:t>
+      </w:r>
+      <w:r>
+        <w:rPr/>
+        <w:t xml:space="preserve">1DCKjcZGnlWIewKxZosf3pPumk17onsrYSHxuBtZPL2Q</w:t>
+      </w:r>
+      <w:r>
+        <w:rPr/>
+        <w:t xml:space="preserve"> (BD_OPERACIONAL_PREDIOS). </w:t>
+      </w:r>
+      <w:r>
+        <w:rPr/>
+        <w:t xml:space="preserve">npx clasp push --force</w:t>
+      </w:r>
+      <w:r>
+        <w:rPr/>
+        <w:t xml:space="preserve"> ejecutado (40 archivos) al entorno de pruebas. Commit </w:t>
+      </w:r>
+      <w:r>
+        <w:rPr/>
+        <w:t xml:space="preserve">c6cbeed</w:t>
+      </w:r>
+      <w:r>
+        <w:rPr/>
+        <w:t xml:space="preserve"> (</w:t>
+      </w:r>
+      <w:r>
+        <w:rPr/>
+        <w:t xml:space="preserve">feat(backend): implement 2-layer caching and decouple audit logs DB [CONC-FE-02 Phase 5b]</w:t>
+      </w:r>
+      <w:r>
+        <w:rPr/>
+        <w:t xml:space="preserve">). Ver Sección 12.14 para el detalle completo de esa sesión, incluida la Fase 5c (Skeleton Loaders).</w:t>
+      </w:r>
+    </w:p>
+    <w:p>
+      <w:pPr>
+        <w:numPr>
+          <w:ilvl w:val="0"/>
+          <w:numId w:val="75"/>
+        </w:numPr>
+        <w:spacing w:lineRule="auto"/>
+      </w:pPr>
+      <w:r>
+        <w:rPr/>
+      </w:r>
+      <w:r>
+        <w:rPr/>
+        <w:t xml:space="preserve"> QA manual en navegador: sigue pendiente</w:t>
+      </w:r>
+    </w:p>
+    <w:p>
+      <w:pPr>
+        <w:spacing w:lineRule="auto"/>
+      </w:pPr>
+      <w:r>
+        <w:rPr>
+          <w:b/>
+        </w:rPr>
+        <w:t xml:space="preserve">Impacto en Producción:</w:t>
+      </w:r>
+      <w:r>
+        <w:rPr/>
+        <w:t xml:space="preserve"> Backend desplegado al entorno de pruebas confirmado NO-producción (mismo script ID usado en todas las fases anteriores de este proyecto). </w:t>
+      </w:r>
+      <w:r>
+        <w:rPr/>
+        <w:t xml:space="preserve">CONFIG.DATA_FILES.LOGS</w:t>
+      </w:r>
+      <w:r>
+        <w:rPr/>
+        <w:t xml:space="preserve"> ya apunta a un spreadsheet real — la auditoría (</w:t>
+      </w:r>
+      <w:r>
+        <w:rPr/>
+        <w:t xml:space="preserve">registrarAccion</w:t>
+      </w:r>
+      <w:r>
+        <w:rPr/>
+        <w:t xml:space="preserve">/</w:t>
+      </w:r>
+      <w:r>
+        <w:rPr/>
+        <w:t xml:space="preserve">getUserLogs</w:t>
+      </w:r>
+      <w:r>
+        <w:rPr/>
+        <w:t xml:space="preserve">) queda operativa una vez desplegado. QA manual en navegador real sigue siendo el único paso pendiente antes de considerar esto verificado end-to-end.</w:t>
+      </w:r>
+    </w:p>
+    <w:p>
+      <w:pPr>
+        <w:pStyle w:val="Heading3"/>
+        <w:spacing w:lineRule="auto"/>
+      </w:pPr>
+      <w:r>
+        <w:rPr/>
+        <w:t xml:space="preserve">12.14 [2026-08-06] [CONC-P5b/5c] Inyección de ID de LOGS, despliegue de Fase 5b y construcción de Fase 5c (Skeleton Loaders)</w:t>
+      </w:r>
+    </w:p>
+    <w:p>
+      <w:pPr>
+        <w:spacing w:lineRule="auto"/>
+      </w:pPr>
+      <w:r>
+        <w:rPr>
+          <w:b/>
+        </w:rPr>
+        <w:t xml:space="preserve">Archivo(s) Intervenido(s):</w:t>
+      </w:r>
+    </w:p>
+    <w:p>
+      <w:pPr>
+        <w:numPr>
+          <w:ilvl w:val="0"/>
+          <w:numId w:val="76"/>
+        </w:numPr>
+        <w:spacing w:lineRule="auto"/>
+      </w:pPr>
+      <w:r>
+        <w:rPr/>
+        <w:t xml:space="preserve">config.js</w:t>
+      </w:r>
+      <w:r>
+        <w:rPr/>
+        <w:t xml:space="preserve"> (ID real de LOGS)</w:t>
+      </w:r>
+    </w:p>
+    <w:p>
+      <w:pPr>
+        <w:numPr>
+          <w:ilvl w:val="0"/>
+          <w:numId w:val="76"/>
+        </w:numPr>
+        <w:spacing w:lineRule="auto"/>
+      </w:pPr>
+      <w:r>
+        <w:rPr/>
+        <w:t xml:space="preserve">app_core_js.html</w:t>
+      </w:r>
+      <w:r>
+        <w:rPr/>
+        <w:t xml:space="preserve">, </w:t>
+      </w:r>
+      <w:r>
+        <w:rPr/>
+        <w:t xml:space="preserve">app_matriz_js.html</w:t>
+      </w:r>
+      <w:r>
+        <w:rPr/>
+        <w:t xml:space="preserve">, </w:t>
+      </w:r>
+      <w:r>
+        <w:rPr/>
+        <w:t xml:space="preserve">pac_seccion.html</w:t>
+      </w:r>
+      <w:r>
+        <w:rPr/>
+        <w:t xml:space="preserve"> (Skeleton Loaders)</w:t>
+      </w:r>
+    </w:p>
+    <w:p>
+      <w:pPr>
+        <w:spacing w:lineRule="auto"/>
+      </w:pPr>
+      <w:r>
+        <w:rPr>
+          <w:b/>
+        </w:rPr>
+        <w:t xml:space="preserve">Propósito del Archivo en el Sistema:</w:t>
+      </w:r>
+      <w:r>
+        <w:rPr/>
+        <w:t xml:space="preserve"> Cierra la implementación de Fase 5b (despliegue) e implementa Fase 5c (rediseño UI/UX — Skeleton Loaders) del dictamen de arquitectura de Fase 5a (Sección 12.12).</w:t>
+      </w:r>
+    </w:p>
+    <w:p>
+      <w:pPr>
+        <w:spacing w:lineRule="auto"/>
+      </w:pPr>
+      <w:r>
+        <w:rPr>
+          <w:b/>
+        </w:rPr>
+        <w:t xml:space="preserve">Motivo de la Intervención:</w:t>
+      </w:r>
+      <w:r>
+        <w:rPr/>
+        <w:t xml:space="preserve"> Pipeline integrado solicitado por el usuario: inyectar el ID real de LOGS, desplegar backend (</w:t>
+      </w:r>
+      <w:r>
+        <w:rPr/>
+        <w:t xml:space="preserve">clasp push --force</w:t>
+      </w:r>
+      <w:r>
+        <w:rPr/>
+        <w:t xml:space="preserve"> + commit), construir los 3 Skeleton Loaders, auditar con </w:t>
+      </w:r>
+      <w:r>
+        <w:rPr/>
+        <w:t xml:space="preserve">/review</w:t>
+      </w:r>
+      <w:r>
+        <w:rPr/>
+        <w:t xml:space="preserve">, documentar y sincronizar.</w:t>
+      </w:r>
+    </w:p>
+    <w:p>
+      <w:pPr>
+        <w:spacing w:lineRule="auto"/>
+      </w:pPr>
+      <w:r>
+        <w:rPr>
+          <w:b/>
+        </w:rPr>
+        <w:t xml:space="preserve">Cambios Técnicos Realizados — Fase 5b (despliegue):</w:t>
+      </w:r>
+    </w:p>
+    <w:p>
+      <w:pPr>
+        <w:numPr>
+          <w:ilvl w:val="0"/>
+          <w:numId w:val="77"/>
+        </w:numPr>
+        <w:spacing w:lineRule="auto"/>
+      </w:pPr>
+      <w:r>
+        <w:rPr/>
+        <w:t xml:space="preserve">CONFIG.DATA_FILES.LOGS</w:t>
+      </w:r>
+      <w:r>
+        <w:rPr/>
+        <w:t xml:space="preserve"> → </w:t>
+      </w:r>
+      <w:r>
+        <w:rPr/>
+        <w:t xml:space="preserve">1DCKjcZGnlWIewKxZosf3pPumk17onsrYSHxuBtZPL2Q</w:t>
+      </w:r>
+      <w:r>
+        <w:rPr/>
+        <w:t xml:space="preserve"> (BD_OPERACIONAL_PREDIOS, spreadsheet real provisto por el usuario).</w:t>
+      </w:r>
+    </w:p>
+    <w:p>
+      <w:pPr>
+        <w:numPr>
+          <w:ilvl w:val="0"/>
+          <w:numId w:val="77"/>
+        </w:numPr>
+        <w:spacing w:lineRule="auto"/>
+      </w:pPr>
+      <w:r>
+        <w:rPr/>
+        <w:t xml:space="preserve">npx clasp push --force</w:t>
+      </w:r>
+      <w:r>
+        <w:rPr/>
+        <w:t xml:space="preserve">: 40 archivos al entorno de pruebas (mismo </w:t>
+      </w:r>
+      <w:r>
+        <w:rPr/>
+        <w:t xml:space="preserve">scriptId</w:t>
+      </w:r>
+      <w:r>
+        <w:rPr/>
+        <w:t xml:space="preserve"> usado en Fases 1-4).</w:t>
+      </w:r>
+    </w:p>
+    <w:p>
+      <w:pPr>
+        <w:numPr>
+          <w:ilvl w:val="0"/>
+          <w:numId w:val="77"/>
+        </w:numPr>
+        <w:spacing w:lineRule="auto"/>
+      </w:pPr>
+      <w:r>
+        <w:rPr/>
+        <w:t xml:space="preserve">Commit </w:t>
+      </w:r>
+      <w:r>
+        <w:rPr/>
+        <w:t xml:space="preserve">c6cbeed</w:t>
+      </w:r>
+      <w:r>
+        <w:rPr/>
+        <w:t xml:space="preserve">: </w:t>
+      </w:r>
+      <w:r>
+        <w:rPr/>
+        <w:t xml:space="preserve">feat(backend): implement 2-layer caching and decouple audit logs DB [CONC-FE-02 Phase 5b]</w:t>
+      </w:r>
+      <w:r>
+        <w:rPr/>
+        <w:t xml:space="preserve"> — solo los 8 archivos backend de Fase 5b, sin la documentación (que se commitea junto con Fase 5c más abajo).</w:t>
+      </w:r>
+    </w:p>
+    <w:p>
+      <w:pPr>
+        <w:spacing w:lineRule="auto"/>
+      </w:pPr>
+      <w:r>
+        <w:rPr>
+          <w:b/>
+        </w:rPr>
+        <w:t xml:space="preserve">Cambios Técnicos Realizados — Fase 5c (Skeleton Loaders):</w:t>
+      </w:r>
+    </w:p>
+    <w:p>
+      <w:pPr>
+        <w:numPr>
+          <w:ilvl w:val="0"/>
+          <w:numId w:val="78"/>
+        </w:numPr>
+        <w:spacing w:lineRule="auto"/>
+      </w:pPr>
+      <w:r>
+        <w:rPr>
+          <w:b/>
+        </w:rPr>
+        <w:t xml:space="preserve">app_core_js.html</w:t>
+      </w:r>
+      <w:r>
+        <w:rPr>
+          <w:b/>
+        </w:rPr>
+        <w:t xml:space="preserve">:</w:t>
+      </w:r>
+      <w:r>
+        <w:rPr/>
+        <w:t xml:space="preserve"> CSS de skeleton (</w:t>
+      </w:r>
+      <w:r>
+        <w:rPr/>
+        <w:t xml:space="preserve">@keyframes skeletonPulse</w:t>
+      </w:r>
+      <w:r>
+        <w:rPr/>
+        <w:t xml:space="preserve">, </w:t>
+      </w:r>
+      <w:r>
+        <w:rPr/>
+        <w:t xml:space="preserve">.skeleton-bar</w:t>
+      </w:r>
+      <w:r>
+        <w:rPr/>
+        <w:t xml:space="preserve">, </w:t>
+      </w:r>
+      <w:r>
+        <w:rPr/>
+        <w:t xml:space="preserve">.skeleton-cell</w:t>
+      </w:r>
+      <w:r>
+        <w:rPr/>
+        <w:t xml:space="preserve">, </w:t>
+      </w:r>
+      <w:r>
+        <w:rPr/>
+        <w:t xml:space="preserve">.skeleton-row</w:t>
+      </w:r>
+      <w:r>
+        <w:rPr/>
+        <w:t xml:space="preserve">) agregado al </w:t>
+      </w:r>
+      <w:r>
+        <w:rPr/>
+        <w:t xml:space="preserve">&lt;style&gt;</w:t>
+      </w:r>
+      <w:r>
+        <w:rPr/>
+        <w:t xml:space="preserve"> inyectado por JS ya existente en el archivo (no se tocó </w:t>
+      </w:r>
+      <w:r>
+        <w:rPr/>
+        <w:t xml:space="preserve">estilos.html</w:t>
+      </w:r>
+      <w:r>
+        <w:rPr/>
+        <w:t xml:space="preserve">, fuera del alcance de esta fase). </w:t>
+      </w:r>
+      <w:r>
+        <w:rPr/>
+        <w:t xml:space="preserve">showDashboardSkeleton()</w:t>
+      </w:r>
+      <w:r>
+        <w:rPr/>
+        <w:t xml:space="preserve">/</w:t>
+      </w:r>
+      <w:r>
+        <w:rPr/>
+        <w:t xml:space="preserve">hideDashboardSkeleton()</w:t>
+      </w:r>
+      <w:r>
+        <w:rPr/>
+        <w:t xml:space="preserve"> nuevas: la primera llena las 13 tarjetas KPI (</w:t>
+      </w:r>
+      <w:r>
+        <w:rPr/>
+        <w:t xml:space="preserve">DASHBOARD_KPI_VALUE_IDS</w:t>
+      </w:r>
+      <w:r>
+        <w:rPr/>
+        <w:t xml:space="preserve">) y </w:t>
+      </w:r>
+      <w:r>
+        <w:rPr/>
+        <w:t xml:space="preserve">#matrix-wrapper</w:t>
+      </w:r>
+      <w:r>
+        <w:rPr/>
+        <w:t xml:space="preserve"> con placeholders pulsantes; la segunda solo se usa en la ruta de error. </w:t>
+      </w:r>
+      <w:r>
+        <w:rPr/>
+        <w:t xml:space="preserve">loadDashboardData()</w:t>
+      </w:r>
+      <w:r>
+        <w:rPr/>
+        <w:t xml:space="preserve"> ya no llama a </w:t>
+      </w:r>
+      <w:r>
+        <w:rPr/>
+        <w:t xml:space="preserve">showLoader('Cargando datos del tablero...')</w:t>
+      </w:r>
+      <w:r>
+        <w:rPr/>
+        <w:t xml:space="preserve"> (overlay de página completa </w:t>
+      </w:r>
+      <w:r>
+        <w:rPr/>
+        <w:t xml:space="preserve">#loader</w:t>
+      </w:r>
+      <w:r>
+        <w:rPr/>
+        <w:t xml:space="preserve">, z-index 9999) — llama a </w:t>
+      </w:r>
+      <w:r>
+        <w:rPr/>
+        <w:t xml:space="preserve">showDashboardSkeleton()</w:t>
+      </w:r>
+      <w:r>
+        <w:rPr/>
+        <w:t xml:space="preserve"> en su lugar, dejando visible el shell de la app (sidebar, header) de inmediato. </w:t>
+      </w:r>
+      <w:r>
+        <w:rPr/>
+        <w:t xml:space="preserve">.text()</w:t>
+      </w:r>
+      <w:r>
+        <w:rPr/>
+        <w:t xml:space="preserve">/</w:t>
+      </w:r>
+      <w:r>
+        <w:rPr/>
+        <w:t xml:space="preserve">.html()</w:t>
+      </w:r>
+      <w:r>
+        <w:rPr/>
+        <w:t xml:space="preserve"> de </w:t>
+      </w:r>
+      <w:r>
+        <w:rPr/>
+        <w:t xml:space="preserve">applyFilters()</w:t>
+      </w:r>
+      <w:r>
+        <w:rPr/>
+        <w:t xml:space="preserve">/</w:t>
+      </w:r>
+      <w:r>
+        <w:rPr/>
+        <w:t xml:space="preserve">renderMatrix()</w:t>
+      </w:r>
+      <w:r>
+        <w:rPr/>
+        <w:t xml:space="preserve"> sobrescriben el skeleton naturalmente cuando llegan los datos reales — sin necesidad de limpieza manual en el camino feliz.</w:t>
+      </w:r>
+    </w:p>
+    <w:p>
+      <w:pPr>
+        <w:numPr>
+          <w:ilvl w:val="0"/>
+          <w:numId w:val="78"/>
+        </w:numPr>
+        <w:spacing w:lineRule="auto"/>
+      </w:pPr>
+      <w:r>
+        <w:rPr>
+          <w:b/>
+        </w:rPr>
+        <w:t xml:space="preserve">app_matriz_js.html</w:t>
+      </w:r>
+      <w:r>
+        <w:rPr>
+          <w:b/>
+        </w:rPr>
+        <w:t xml:space="preserve">:</w:t>
+      </w:r>
+      <w:r>
+        <w:rPr/>
+        <w:t xml:space="preserve"> sin cambio funcional en la versión final — se evaluó y descartó un guard defensivo en </w:t>
+      </w:r>
+      <w:r>
+        <w:rPr/>
+        <w:t xml:space="preserve">renderMatrix()</w:t>
+      </w:r>
+      <w:r>
+        <w:rPr/>
+        <w:t xml:space="preserve"> por ser código inalcanzable (</w:t>
+      </w:r>
+      <w:r>
+        <w:rPr/>
+        <w:t xml:space="preserve">currentData</w:t>
+      </w:r>
+      <w:r>
+        <w:rPr/>
+        <w:t xml:space="preserve"> se inicializa a </w:t>
+      </w:r>
+      <w:r>
+        <w:rPr/>
+        <w:t xml:space="preserve">[]</w:t>
+      </w:r>
+      <w:r>
+        <w:rPr/>
+        <w:t xml:space="preserve"> en </w:t>
+      </w:r>
+      <w:r>
+        <w:rPr/>
+        <w:t xml:space="preserve">app_core_js.html</w:t>
+      </w:r>
+      <w:r>
+        <w:rPr/>
+        <w:t xml:space="preserve"> antes de que cualquier código pueda invocar </w:t>
+      </w:r>
+      <w:r>
+        <w:rPr/>
+        <w:t xml:space="preserve">renderMatrix()</w:t>
+      </w:r>
+      <w:r>
+        <w:rPr/>
+        <w:t xml:space="preserve">), documentado inline en vez de dejado implícito.</w:t>
+      </w:r>
+    </w:p>
+    <w:p>
+      <w:pPr>
+        <w:numPr>
+          <w:ilvl w:val="0"/>
+          <w:numId w:val="78"/>
+        </w:numPr>
+        <w:spacing w:lineRule="auto"/>
+      </w:pPr>
+      <w:r>
+        <w:rPr>
+          <w:b/>
+        </w:rPr>
+        <w:t xml:space="preserve">pac_seccion.html</w:t>
+      </w:r>
+      <w:r>
+        <w:rPr>
+          <w:b/>
+        </w:rPr>
+        <w:t xml:space="preserve">:</w:t>
+      </w:r>
+      <w:r>
+        <w:rPr/>
+        <w:t xml:space="preserve">pac_showSkeleton()</w:t>
+      </w:r>
+      <w:r>
+        <w:rPr/>
+        <w:t xml:space="preserve"> nueva — </w:t>
+      </w:r>
+      <w:r>
+        <w:rPr/>
+        <w:t xml:space="preserve">pac_mostrarLoader(true)</w:t>
+      </w:r>
+      <w:r>
+        <w:rPr/>
+        <w:t xml:space="preserve"> la invoca en vez de solo alternar visibilidad de </w:t>
+      </w:r>
+      <w:r>
+        <w:rPr/>
+        <w:t xml:space="preserve">#pac-loader</w:t>
+      </w:r>
+      <w:r>
+        <w:rPr/>
+        <w:t xml:space="preserve">/</w:t>
+      </w:r>
+      <w:r>
+        <w:rPr/>
+        <w:t xml:space="preserve">#pac-contenido</w:t>
+      </w:r>
+      <w:r>
+        <w:rPr/>
+        <w:t xml:space="preserve">. Muestra </w:t>
+      </w:r>
+      <w:r>
+        <w:rPr/>
+        <w:t xml:space="preserve">#pac-contenido</w:t>
+      </w:r>
+      <w:r>
+        <w:rPr/>
+        <w:t xml:space="preserve"> de inmediato con los 6 valores KPI de semáforo en </w:t>
+      </w:r>
+      <w:r>
+        <w:rPr>
+          <w:b/>
+        </w:rPr>
+        <w:t xml:space="preserve">gris neutro</w:t>
+      </w:r>
+      <w:r>
+        <w:rPr/>
+        <w:t xml:space="preserve"> (no verde/amarillo/naranja/rojo, para no sugerir un estado de riesgo falso) y una tabla-esqueleto en </w:t>
+      </w:r>
+      <w:r>
+        <w:rPr/>
+        <w:t xml:space="preserve">#pac-tabla-head</w:t>
+      </w:r>
+      <w:r>
+        <w:rPr/>
+        <w:t xml:space="preserve">/</w:t>
+      </w:r>
+      <w:r>
+        <w:rPr/>
+        <w:t xml:space="preserve">#pac-tabla-body</w:t>
+      </w:r>
+      <w:r>
+        <w:rPr/>
+        <w:t xml:space="preserve">. Reutiliza las clases </w:t>
+      </w:r>
+      <w:r>
+        <w:rPr/>
+        <w:t xml:space="preserve">.skeleton-bar</w:t>
+      </w:r>
+      <w:r>
+        <w:rPr/>
+        <w:t xml:space="preserve">/</w:t>
+      </w:r>
+      <w:r>
+        <w:rPr/>
+        <w:t xml:space="preserve">.skeleton-cell</w:t>
+      </w:r>
+      <w:r>
+        <w:rPr/>
+        <w:t xml:space="preserve"> de </w:t>
+      </w:r>
+      <w:r>
+        <w:rPr/>
+        <w:t xml:space="preserve">app_core_js.html</w:t>
+      </w:r>
+      <w:r>
+        <w:rPr/>
+        <w:t xml:space="preserve"> (mismo documento HTML final, mismo scope de CSS — sin duplicar estilos, verificado que </w:t>
+      </w:r>
+      <w:r>
+        <w:rPr/>
+        <w:t xml:space="preserve">pac_seccion</w:t>
+      </w:r>
+      <w:r>
+        <w:rPr/>
+        <w:t xml:space="preserve"> se incluye en </w:t>
+      </w:r>
+      <w:r>
+        <w:rPr/>
+        <w:t xml:space="preserve">Index.html</w:t>
+      </w:r>
+      <w:r>
+        <w:rPr/>
+        <w:t xml:space="preserve"> antes que </w:t>
+      </w:r>
+      <w:r>
+        <w:rPr/>
+        <w:t xml:space="preserve">app_core_js</w:t>
+      </w:r>
+      <w:r>
+        <w:rPr/>
+        <w:t xml:space="preserve"> en el DOM pero eso no importa porque las clases CSS solo se resuelven en el momento en que las funciones interactivas se ejecutan, no en el orden de parseo de los </w:t>
+      </w:r>
+      <w:r>
+        <w:rPr/>
+        <w:t xml:space="preserve">&lt;script&gt;</w:t>
+      </w:r>
+      <w:r>
+        <w:rPr/>
+        <w:t xml:space="preserve">).</w:t>
+      </w:r>
+    </w:p>
+    <w:p>
+      <w:pPr>
+        <w:spacing w:lineRule="auto"/>
+      </w:pPr>
+      <w:r>
+        <w:rPr>
+          <w:b/>
+        </w:rPr>
+        <w:t xml:space="preserve">Hallazgos del </w:t>
+      </w:r>
+      <w:r>
+        <w:rPr>
+          <w:b/>
+        </w:rPr>
+        <w:t xml:space="preserve">/review</w:t>
+      </w:r>
+      <w:r>
+        <w:rPr>
+          <w:b/>
+        </w:rPr>
+        <w:t xml:space="preserve"> (subagente adversarial independiente + verificación propia antes de aplicar cualquier fix):</w:t>
+      </w:r>
+    </w:p>
+    <w:p>
+      <w:pPr>
+        <w:numPr>
+          <w:ilvl w:val="0"/>
+          <w:numId w:val="79"/>
+        </w:numPr>
+        <w:spacing w:lineRule="auto"/>
+      </w:pPr>
+      <w:r>
+        <w:rPr>
+          <w:b/>
+        </w:rPr>
+        <w:t xml:space="preserve">[Decisión de diseño, no bug — resuelta vía AskUserQuestion]</w:t>
+      </w:r>
+      <w:r>
+        <w:rPr/>
+        <w:t xml:space="preserve"> El diseño original de Fase 5c pedía pintar instantáneamente el último </w:t>
+      </w:r>
+      <w:r>
+        <w:rPr/>
+        <w:t xml:space="preserve">getDashboardData()</w:t>
+      </w:r>
+      <w:r>
+        <w:rPr/>
+        <w:t xml:space="preserve"> desde </w:t>
+      </w:r>
+      <w:r>
+        <w:rPr/>
+        <w:t xml:space="preserve">LocalCache</w:t>
+      </w:r>
+      <w:r>
+        <w:rPr/>
+        <w:t xml:space="preserve"> (localStorage) mientras se esperaba la respuesta real, con un badge “Actualizando…”. El subagente confirmó que </w:t>
+      </w:r>
+      <w:r>
+        <w:rPr/>
+        <w:t xml:space="preserve">LocalCache</w:t>
+      </w:r>
+      <w:r>
+        <w:rPr/>
+        <w:t xml:space="preserve"> no está aislado por usuario — en un equipo compartido, un segundo usuario vería por un instante los datos (incluido el email) del primero. </w:t>
+      </w:r>
+      <w:r>
+        <w:rPr>
+          <w:b/>
+        </w:rPr>
+        <w:t xml:space="preserve">Decisión del usuario: deshabilitar esta capa por ahora</w:t>
+      </w:r>
+      <w:r>
+        <w:rPr/>
+        <w:t xml:space="preserve"> (recomendado), manteniendo el Skeleton Loader (la mejora principal) intacto. Registrado como TODOS.md ítem 11, con la solución correcta identificada (inyección server-side síncrona de la identidad del usuario en </w:t>
+      </w:r>
+      <w:r>
+        <w:rPr/>
+        <w:t xml:space="preserve">Index.html</w:t>
+      </w:r>
+      <w:r>
+        <w:rPr/>
+        <w:t xml:space="preserve">, fuera del alcance de esta fase).</w:t>
+      </w:r>
+    </w:p>
+    <w:p>
+      <w:pPr>
+        <w:numPr>
+          <w:ilvl w:val="0"/>
+          <w:numId w:val="79"/>
+        </w:numPr>
+        <w:spacing w:lineRule="auto"/>
+      </w:pPr>
+      <w:r>
+        <w:rPr>
+          <w:b/>
+        </w:rPr>
+        <w:t xml:space="preserve">[CORREGIDO]</w:t>
+      </w:r>
+      <w:r>
+        <w:rPr/>
+        <w:t xml:space="preserve">refreshData()</w:t>
+      </w:r>
+      <w:r>
+        <w:rPr/>
+        <w:t xml:space="preserve"> (</w:t>
+      </w:r>
+      <w:r>
+        <w:rPr/>
+        <w:t xml:space="preserve">app_core_js.html</w:t>
+      </w:r>
+      <w:r>
+        <w:rPr/>
+        <w:t xml:space="preserve">) seguía llamando a </w:t>
+      </w:r>
+      <w:r>
+        <w:rPr/>
+        <w:t xml:space="preserve">$('#loader').fadeIn(300)</w:t>
+      </w:r>
+      <w:r>
+        <w:rPr/>
+        <w:t xml:space="preserve"> antes de </w:t>
+      </w:r>
+      <w:r>
+        <w:rPr/>
+        <w:t xml:space="preserve">loadDashboardData()</w:t>
+      </w:r>
+      <w:r>
+        <w:rPr/>
+        <w:t xml:space="preserve"> — el overlay de página completa (z-index 9999) tapaba el nuevo Skeleton Loader por completo durante un refresh manual, anulando la mejora. Se quitó esa llamada.</w:t>
+      </w:r>
+    </w:p>
+    <w:p>
+      <w:pPr>
+        <w:numPr>
+          <w:ilvl w:val="0"/>
+          <w:numId w:val="79"/>
+        </w:numPr>
+        <w:spacing w:lineRule="auto"/>
+      </w:pPr>
+      <w:r>
+        <w:rPr>
+          <w:b/>
+        </w:rPr>
+        <w:t xml:space="preserve">[CORREGIDO]</w:t>
+      </w:r>
+      <w:r>
+        <w:rPr/>
+        <w:t xml:space="preserve">pac_mostrarError()</w:t>
+      </w:r>
+      <w:r>
+        <w:rPr/>
+        <w:t xml:space="preserve"> (</w:t>
+      </w:r>
+      <w:r>
+        <w:rPr/>
+        <w:t xml:space="preserve">pac_seccion.html</w:t>
+      </w:r>
+      <w:r>
+        <w:rPr/>
+        <w:t xml:space="preserve">) reemplazaba TODO </w:t>
+      </w:r>
+      <w:r>
+        <w:rPr/>
+        <w:t xml:space="preserve">#pac-contenido.innerHTML</w:t>
+      </w:r>
+      <w:r>
+        <w:rPr/>
+        <w:t xml:space="preserve"> con el mensaje de error, destruyendo los elementos KPI/tabla que tanto </w:t>
+      </w:r>
+      <w:r>
+        <w:rPr/>
+        <w:t xml:space="preserve">pac_showSkeleton()</w:t>
+      </w:r>
+      <w:r>
+        <w:rPr/>
+        <w:t xml:space="preserve"> como el render real necesitan — un reintento exitoso terminaba en un loop de error permanente (bug </w:t>
+      </w:r>
+      <w:r>
+        <w:rPr>
+          <w:b/>
+        </w:rPr>
+        <w:t xml:space="preserve">preexistente</w:t>
+      </w:r>
+      <w:r>
+        <w:rPr/>
+        <w:t xml:space="preserve">, no introducido en esta sesión, pero que el nuevo </w:t>
+      </w:r>
+      <w:r>
+        <w:rPr/>
+        <w:t xml:space="preserve">pac_showSkeleton()</w:t>
+      </w:r>
+      <w:r>
+        <w:rPr/>
+        <w:t xml:space="preserve"> hacía más difícil de notar al fallar en silencio vía sus guards </w:t>
+      </w:r>
+      <w:r>
+        <w:rPr/>
+        <w:t xml:space="preserve">if(el)</w:t>
+      </w:r>
+      <w:r>
+        <w:rPr/>
+        <w:t xml:space="preserve">). Se corrigió insertando el error como un banner al inicio de </w:t>
+      </w:r>
+      <w:r>
+        <w:rPr/>
+        <w:t xml:space="preserve">#pac-contenido</w:t>
+      </w:r>
+      <w:r>
+        <w:rPr/>
+        <w:t xml:space="preserve"> sin tocar sus hijos reales, con limpieza automática del banner al iniciar el siguiente intento en </w:t>
+      </w:r>
+      <w:r>
+        <w:rPr/>
+        <w:t xml:space="preserve">pac_showSkeleton()</w:t>
+      </w:r>
+      <w:r>
+        <w:rPr/>
+        <w:t xml:space="preserve">.</w:t>
+      </w:r>
+    </w:p>
+    <w:p>
+      <w:pPr>
+        <w:numPr>
+          <w:ilvl w:val="0"/>
+          <w:numId w:val="79"/>
+        </w:numPr>
+        <w:spacing w:lineRule="auto"/>
+      </w:pPr>
+      <w:r>
+        <w:rPr>
+          <w:b/>
+        </w:rPr>
+        <w:t xml:space="preserve">[Auto-detectado y corregido durante la implementación de la corrección #1]</w:t>
+      </w:r>
+      <w:r>
+        <w:rPr/>
+        <w:t xml:space="preserve"> Al remover la lectura de </w:t>
+      </w:r>
+      <w:r>
+        <w:rPr/>
+        <w:t xml:space="preserve">LocalCache</w:t>
+      </w:r>
+      <w:r>
+        <w:rPr/>
+        <w:t xml:space="preserve"> y el parámetro </w:t>
+      </w:r>
+      <w:r>
+        <w:rPr/>
+        <w:t xml:space="preserve">isPartial</w:t>
+      </w:r>
+      <w:r>
+        <w:rPr/>
+        <w:t xml:space="preserve"> de </w:t>
+      </w:r>
+      <w:r>
+        <w:rPr/>
+        <w:t xml:space="preserve">onDataLoaded()</w:t>
+      </w:r>
+      <w:r>
+        <w:rPr/>
+        <w:t xml:space="preserve">, quedó una referencia residual a </w:t>
+      </w:r>
+      <w:r>
+        <w:rPr/>
+        <w:t xml:space="preserve">isPartial</w:t>
+      </w:r>
+      <w:r>
+        <w:rPr/>
+        <w:t xml:space="preserve"> dentro del cuerpo de la función (</w:t>
+      </w:r>
+      <w:r>
+        <w:rPr/>
+        <w:t xml:space="preserve">if (!isPartial)</w:t>
+      </w:r>
+      <w:r>
+        <w:rPr/>
+        <w:t xml:space="preserve">) que habría lanzado </w:t>
+      </w:r>
+      <w:r>
+        <w:rPr/>
+        <w:t xml:space="preserve">ReferenceError: isPartial is not defined</w:t>
+      </w:r>
+      <w:r>
+        <w:rPr/>
+        <w:t xml:space="preserve"> en tiempo de ejecución — detectado antes de hacer commit, no llegó a desplegarse.</w:t>
+      </w:r>
+    </w:p>
+    <w:p>
+      <w:pPr>
+        <w:numPr>
+          <w:ilvl w:val="0"/>
+          <w:numId w:val="79"/>
+        </w:numPr>
+        <w:spacing w:lineRule="auto"/>
+      </w:pPr>
+      <w:r>
+        <w:rPr>
+          <w:b/>
+        </w:rPr>
+        <w:t xml:space="preserve">[Auto-detectado y corregido]</w:t>
+      </w:r>
+      <w:r>
+        <w:rPr/>
+        <w:t xml:space="preserve"> Un comentario JSDoc propio contenía la secuencia literal </w:t>
+      </w:r>
+      <w:r>
+        <w:rPr/>
+        <w:t xml:space="preserve">*/</w:t>
+      </w:r>
+      <w:r>
+        <w:rPr/>
+        <w:t xml:space="preserve"> en medio de la prosa (</w:t>
+      </w:r>
+      <w:r>
+        <w:rPr/>
+        <w:t xml:space="preserve">#pac-kpi-*/#pac-tabla-head</w:t>
+      </w:r>
+      <w:r>
+        <w:rPr/>
+        <w:t xml:space="preserve">), cerrando el bloque de comentario antes de tiempo y convirtiendo el resto del texto en “código” inválido — detectado por </w:t>
+      </w:r>
+      <w:r>
+        <w:rPr/>
+        <w:t xml:space="preserve">node --check</w:t>
+      </w:r>
+      <w:r>
+        <w:rPr/>
+        <w:t xml:space="preserve">, no por inspección visual. Reescrito para evitar la secuencia.</w:t>
+      </w:r>
+    </w:p>
+    <w:p>
+      <w:pPr>
+        <w:spacing w:lineRule="auto"/>
+      </w:pPr>
+      <w:r>
+        <w:rPr>
+          <w:b/>
+        </w:rPr>
+        <w:t xml:space="preserve">Validación y Pruebas Ejecutadas:</w:t>
+      </w:r>
+    </w:p>
+    <w:p>
+      <w:pPr>
+        <w:numPr>
+          <w:ilvl w:val="0"/>
+          <w:numId w:val="80"/>
+        </w:numPr>
+        <w:spacing w:lineRule="auto"/>
+      </w:pPr>
+      <w:r>
+        <w:rPr/>
+      </w:r>
+      <w:r>
+        <w:rPr/>
+        <w:t xml:space="preserve">node --check</w:t>
+      </w:r>
+      <w:r>
+        <w:rPr/>
+        <w:t xml:space="preserve"> en los 3 partials modificados (extrayendo el contenido entre </w:t>
+      </w:r>
+      <w:r>
+        <w:rPr/>
+        <w:t xml:space="preserve">&lt;script&gt;</w:t>
+      </w:r>
+      <w:r>
+        <w:rPr/>
+        <w:t xml:space="preserve">/</w:t>
+      </w:r>
+      <w:r>
+        <w:rPr/>
+        <w:t xml:space="preserve">&lt;/script&gt;</w:t>
+      </w:r>
+      <w:r>
+        <w:rPr/>
+        <w:t xml:space="preserve"> a un archivo </w:t>
+      </w:r>
+      <w:r>
+        <w:rPr/>
+        <w:t xml:space="preserve">.js</w:t>
+      </w:r>
+      <w:r>
+        <w:rPr/>
+        <w:t xml:space="preserve"> temporal, ya que </w:t>
+      </w:r>
+      <w:r>
+        <w:rPr/>
+        <w:t xml:space="preserve">node --check</w:t>
+      </w:r>
+      <w:r>
+        <w:rPr/>
+        <w:t xml:space="preserve"> no reconoce </w:t>
+      </w:r>
+      <w:r>
+        <w:rPr/>
+        <w:t xml:space="preserve">.html</w:t>
+      </w:r>
+      <w:r>
+        <w:rPr/>
+        <w:t xml:space="preserve"> como JS ni entiende el HTML circundante)</w:t>
+      </w:r>
+    </w:p>
+    <w:p>
+      <w:pPr>
+        <w:numPr>
+          <w:ilvl w:val="0"/>
+          <w:numId w:val="80"/>
+        </w:numPr>
+        <w:spacing w:lineRule="auto"/>
+      </w:pPr>
+      <w:r>
+        <w:rPr/>
+      </w:r>
+      <w:r>
+        <w:rPr/>
+        <w:t xml:space="preserve"> 1 subagente adversarial independiente (Agent tool, sin contexto previo) + verificación propia línea por línea de cada hallazgo antes de aplicar cualquier fix (ninguno se aceptó a ciegas)</w:t>
+      </w:r>
+    </w:p>
+    <w:p>
+      <w:pPr>
+        <w:numPr>
+          <w:ilvl w:val="0"/>
+          <w:numId w:val="80"/>
+        </w:numPr>
+        <w:spacing w:lineRule="auto"/>
+      </w:pPr>
+      <w:r>
+        <w:rPr/>
+      </w:r>
+      <w:r>
+        <w:rPr/>
+        <w:t xml:space="preserve"> Decisión de diseño consultada vía AskUserQuestion antes de actuar (hallazgo #1, riesgo de privacidad)</w:t>
+      </w:r>
+    </w:p>
+    <w:p>
+      <w:pPr>
+        <w:numPr>
+          <w:ilvl w:val="0"/>
+          <w:numId w:val="80"/>
+        </w:numPr>
+        <w:spacing w:lineRule="auto"/>
+      </w:pPr>
+      <w:r>
+        <w:rPr/>
+      </w:r>
+      <w:r>
+        <w:rPr/>
+        <w:t xml:space="preserve">node --check</w:t>
+      </w:r>
+      <w:r>
+        <w:rPr/>
+        <w:t xml:space="preserve"> re-ejecutado tras cada fix, incluidos los dos bugs auto-detectados durante la implementación de las correcciones</w:t>
+      </w:r>
+    </w:p>
+    <w:p>
+      <w:pPr>
+        <w:numPr>
+          <w:ilvl w:val="0"/>
+          <w:numId w:val="80"/>
+        </w:numPr>
+        <w:spacing w:lineRule="auto"/>
+      </w:pPr>
+      <w:r>
+        <w:rPr/>
+      </w:r>
+      <w:r>
+        <w:rPr/>
+        <w:t xml:space="preserve"> QA manual en navegador real: pendiente — no ejecutado en esta sesión</w:t>
+      </w:r>
+    </w:p>
+    <w:p>
+      <w:pPr>
+        <w:numPr>
+          <w:ilvl w:val="0"/>
+          <w:numId w:val="80"/>
+        </w:numPr>
+        <w:spacing w:lineRule="auto"/>
+      </w:pPr>
+      <w:r>
+        <w:rPr/>
+      </w:r>
+      <w:r>
+        <w:rPr/>
+        <w:t xml:space="preserve">clasp push</w:t>
+      </w:r>
+      <w:r>
+        <w:rPr/>
+        <w:t xml:space="preserve"> de Fase 5c: pendiente — no ejecutado en esta sesión (solo Fase 5b fue desplegada)</w:t>
+      </w:r>
+    </w:p>
+    <w:p>
+      <w:pPr>
+        <w:spacing w:lineRule="auto"/>
+      </w:pPr>
+      <w:r>
+        <w:rPr>
+          <w:b/>
+        </w:rPr>
+        <w:t xml:space="preserve">Impacto en Producción:</w:t>
+      </w:r>
+      <w:r>
+        <w:rPr/>
+        <w:t xml:space="preserve"> Fase 5b: desplegada al entorno de pruebas (ver arriba). Fase 5c: implementada y verificada sintácticamente, </w:t>
+      </w:r>
+      <w:r>
+        <w:rPr>
+          <w:b/>
+        </w:rPr>
+        <w:t xml:space="preserve">no desplegada todavía</w:t>
+      </w:r>
+      <w:r>
+        <w:rPr/>
+        <w:t xml:space="preserve"> (</w:t>
+      </w:r>
+      <w:r>
+        <w:rPr/>
+        <w:t xml:space="preserve">clasp push</w:t>
+      </w:r>
+      <w:r>
+        <w:rPr/>
+        <w:t xml:space="preserve"> no ejecutado para estos 3 archivos en esta sesión) — pendiente de confirmación antes del siguiente </w:t>
+      </w:r>
+      <w:r>
+        <w:rPr/>
+        <w:t xml:space="preserve">clasp push</w:t>
+      </w:r>
+      <w:r>
+        <w:rPr/>
+        <w:t xml:space="preserve">.</w:t>
+      </w:r>
+    </w:p>
+    <w:p>
+      <w:pPr>
         <w:pStyle w:val="Heading2"/>
         <w:spacing w:lineRule="auto"/>
       </w:pPr>
@@ -17780,7 +20655,7 @@
       <w:pPr>
         <w:numPr>
           <w:ilvl w:val="0"/>
-          <w:numId w:val="71"/>
+          <w:numId w:val="81"/>
         </w:numPr>
         <w:spacing w:lineRule="auto"/>
       </w:pPr>
@@ -17849,7 +20724,7 @@
       <w:pPr>
         <w:numPr>
           <w:ilvl w:val="0"/>
-          <w:numId w:val="71"/>
+          <w:numId w:val="81"/>
         </w:numPr>
         <w:spacing w:lineRule="auto"/>
       </w:pPr>
@@ -17878,7 +20753,7 @@
       <w:pPr>
         <w:numPr>
           <w:ilvl w:val="0"/>
-          <w:numId w:val="71"/>
+          <w:numId w:val="81"/>
         </w:numPr>
         <w:spacing w:lineRule="auto"/>
       </w:pPr>
@@ -19232,7 +22107,7 @@
       <w:pPr>
         <w:numPr>
           <w:ilvl w:val="0"/>
-          <w:numId w:val="72"/>
+          <w:numId w:val="82"/>
         </w:numPr>
         <w:spacing w:lineRule="auto"/>
       </w:pPr>
@@ -19255,7 +22130,7 @@
       <w:pPr>
         <w:numPr>
           <w:ilvl w:val="0"/>
-          <w:numId w:val="72"/>
+          <w:numId w:val="82"/>
         </w:numPr>
         <w:spacing w:lineRule="auto"/>
       </w:pPr>
@@ -19274,7 +22149,7 @@
       <w:pPr>
         <w:numPr>
           <w:ilvl w:val="0"/>
-          <w:numId w:val="72"/>
+          <w:numId w:val="82"/>
         </w:numPr>
         <w:spacing w:lineRule="auto"/>
       </w:pPr>
@@ -19325,7 +22200,7 @@
       <w:pPr>
         <w:numPr>
           <w:ilvl w:val="0"/>
-          <w:numId w:val="72"/>
+          <w:numId w:val="82"/>
         </w:numPr>
         <w:spacing w:lineRule="auto"/>
       </w:pPr>
@@ -19366,7 +22241,7 @@
       <w:pPr>
         <w:numPr>
           <w:ilvl w:val="0"/>
-          <w:numId w:val="72"/>
+          <w:numId w:val="82"/>
         </w:numPr>
         <w:spacing w:lineRule="auto"/>
       </w:pPr>
@@ -19393,7 +22268,7 @@
       <w:pPr>
         <w:numPr>
           <w:ilvl w:val="0"/>
-          <w:numId w:val="72"/>
+          <w:numId w:val="82"/>
         </w:numPr>
         <w:spacing w:lineRule="auto"/>
       </w:pPr>
@@ -28229,6 +31104,1154 @@
     </w:lvl>
   </w:abstractNum>
   <w:abstractNum w:abstractNumId="72">
+    <w:lvl w:ilvl="0">
+      <w:start w:val="1"/>
+      <w:numFmt w:val="decimal"/>
+      <w:lvlText w:val="%1."/>
+      <w:lvlJc w:val="left"/>
+      <w:pPr>
+        <w:tabs>
+          <w:tab w:val="num" w:pos="720"/>
+        </w:tabs>
+        <w:ind w:left="720" w:hanging="360"/>
+      </w:pPr>
+    </w:lvl>
+    <w:lvl w:ilvl="1">
+      <w:start w:val="1"/>
+      <w:numFmt w:val="decimal"/>
+      <w:lvlText w:val="%2."/>
+      <w:lvlJc w:val="left"/>
+      <w:pPr>
+        <w:tabs>
+          <w:tab w:val="num" w:pos="1440"/>
+        </w:tabs>
+        <w:ind w:left="1440" w:hanging="360"/>
+      </w:pPr>
+    </w:lvl>
+    <w:lvl w:ilvl="2">
+      <w:start w:val="1"/>
+      <w:numFmt w:val="decimal"/>
+      <w:lvlText w:val="%3."/>
+      <w:lvlJc w:val="left"/>
+      <w:pPr>
+        <w:tabs>
+          <w:tab w:val="num" w:pos="2160"/>
+        </w:tabs>
+        <w:ind w:left="2160" w:hanging="360"/>
+      </w:pPr>
+    </w:lvl>
+    <w:lvl w:ilvl="3">
+      <w:start w:val="1"/>
+      <w:numFmt w:val="decimal"/>
+      <w:lvlText w:val="%4."/>
+      <w:lvlJc w:val="left"/>
+      <w:pPr>
+        <w:tabs>
+          <w:tab w:val="num" w:pos="2880"/>
+        </w:tabs>
+        <w:ind w:left="2880" w:hanging="360"/>
+      </w:pPr>
+    </w:lvl>
+    <w:lvl w:ilvl="4">
+      <w:start w:val="1"/>
+      <w:numFmt w:val="decimal"/>
+      <w:lvlText w:val="%5."/>
+      <w:lvlJc w:val="left"/>
+      <w:pPr>
+        <w:tabs>
+          <w:tab w:val="num" w:pos="3600"/>
+        </w:tabs>
+        <w:ind w:left="3600" w:hanging="360"/>
+      </w:pPr>
+    </w:lvl>
+    <w:lvl w:ilvl="5">
+      <w:start w:val="1"/>
+      <w:numFmt w:val="decimal"/>
+      <w:lvlText w:val="%6."/>
+      <w:lvlJc w:val="left"/>
+      <w:pPr>
+        <w:tabs>
+          <w:tab w:val="num" w:pos="4320"/>
+        </w:tabs>
+        <w:ind w:left="4320" w:hanging="360"/>
+      </w:pPr>
+    </w:lvl>
+    <w:lvl w:ilvl="6">
+      <w:start w:val="1"/>
+      <w:numFmt w:val="decimal"/>
+      <w:lvlText w:val="%7."/>
+      <w:lvlJc w:val="left"/>
+      <w:pPr>
+        <w:tabs>
+          <w:tab w:val="num" w:pos="5040"/>
+        </w:tabs>
+        <w:ind w:left="5040" w:hanging="360"/>
+      </w:pPr>
+    </w:lvl>
+    <w:lvl w:ilvl="7">
+      <w:start w:val="1"/>
+      <w:numFmt w:val="decimal"/>
+      <w:lvlText w:val="%8."/>
+      <w:lvlJc w:val="left"/>
+      <w:pPr>
+        <w:tabs>
+          <w:tab w:val="num" w:pos="5760"/>
+        </w:tabs>
+        <w:ind w:left="5760" w:hanging="360"/>
+      </w:pPr>
+    </w:lvl>
+  </w:abstractNum>
+  <w:abstractNum w:abstractNumId="73">
+    <w:lvl w:ilvl="0">
+      <w:start w:val="1"/>
+      <w:numFmt w:val="bullet"/>
+      <w:lvlText w:val=""/>
+      <w:lvlJc w:val="left"/>
+      <w:pPr>
+        <w:tabs>
+          <w:tab w:val="num" w:pos="720"/>
+        </w:tabs>
+        <w:ind w:left="720" w:hanging="360"/>
+      </w:pPr>
+      <w:rPr>
+        <w:rFonts w:ascii="Symbol" w:hAnsi="Symbol" w:hint="default"/>
+      </w:rPr>
+    </w:lvl>
+    <w:lvl w:ilvl="1">
+      <w:start w:val="1"/>
+      <w:numFmt w:val="bullet"/>
+      <w:lvlText w:val=""/>
+      <w:lvlJc w:val="left"/>
+      <w:pPr>
+        <w:tabs>
+          <w:tab w:val="num" w:pos="1440"/>
+        </w:tabs>
+        <w:ind w:left="1440" w:hanging="360"/>
+      </w:pPr>
+      <w:rPr>
+        <w:rFonts w:ascii="Symbol" w:hAnsi="Symbol" w:hint="default"/>
+      </w:rPr>
+    </w:lvl>
+    <w:lvl w:ilvl="2">
+      <w:start w:val="1"/>
+      <w:numFmt w:val="bullet"/>
+      <w:lvlText w:val=""/>
+      <w:lvlJc w:val="left"/>
+      <w:pPr>
+        <w:tabs>
+          <w:tab w:val="num" w:pos="2160"/>
+        </w:tabs>
+        <w:ind w:left="2160" w:hanging="360"/>
+      </w:pPr>
+      <w:rPr>
+        <w:rFonts w:ascii="Symbol" w:hAnsi="Symbol" w:hint="default"/>
+      </w:rPr>
+    </w:lvl>
+    <w:lvl w:ilvl="3">
+      <w:start w:val="1"/>
+      <w:numFmt w:val="bullet"/>
+      <w:lvlText w:val=""/>
+      <w:lvlJc w:val="left"/>
+      <w:pPr>
+        <w:tabs>
+          <w:tab w:val="num" w:pos="2880"/>
+        </w:tabs>
+        <w:ind w:left="2880" w:hanging="360"/>
+      </w:pPr>
+      <w:rPr>
+        <w:rFonts w:ascii="Symbol" w:hAnsi="Symbol" w:hint="default"/>
+      </w:rPr>
+    </w:lvl>
+    <w:lvl w:ilvl="4">
+      <w:start w:val="1"/>
+      <w:numFmt w:val="bullet"/>
+      <w:lvlText w:val=""/>
+      <w:lvlJc w:val="left"/>
+      <w:pPr>
+        <w:tabs>
+          <w:tab w:val="num" w:pos="3600"/>
+        </w:tabs>
+        <w:ind w:left="3600" w:hanging="360"/>
+      </w:pPr>
+      <w:rPr>
+        <w:rFonts w:ascii="Symbol" w:hAnsi="Symbol" w:hint="default"/>
+      </w:rPr>
+    </w:lvl>
+    <w:lvl w:ilvl="5">
+      <w:start w:val="1"/>
+      <w:numFmt w:val="bullet"/>
+      <w:lvlText w:val=""/>
+      <w:lvlJc w:val="left"/>
+      <w:pPr>
+        <w:tabs>
+          <w:tab w:val="num" w:pos="4320"/>
+        </w:tabs>
+        <w:ind w:left="4320" w:hanging="360"/>
+      </w:pPr>
+      <w:rPr>
+        <w:rFonts w:ascii="Symbol" w:hAnsi="Symbol" w:hint="default"/>
+      </w:rPr>
+    </w:lvl>
+    <w:lvl w:ilvl="6">
+      <w:start w:val="1"/>
+      <w:numFmt w:val="bullet"/>
+      <w:lvlText w:val=""/>
+      <w:lvlJc w:val="left"/>
+      <w:pPr>
+        <w:tabs>
+          <w:tab w:val="num" w:pos="5040"/>
+        </w:tabs>
+        <w:ind w:left="5040" w:hanging="360"/>
+      </w:pPr>
+      <w:rPr>
+        <w:rFonts w:ascii="Symbol" w:hAnsi="Symbol" w:hint="default"/>
+      </w:rPr>
+    </w:lvl>
+    <w:lvl w:ilvl="7">
+      <w:start w:val="1"/>
+      <w:numFmt w:val="bullet"/>
+      <w:lvlText w:val=""/>
+      <w:lvlJc w:val="left"/>
+      <w:pPr>
+        <w:tabs>
+          <w:tab w:val="num" w:pos="5760"/>
+        </w:tabs>
+        <w:ind w:left="5760" w:hanging="360"/>
+      </w:pPr>
+      <w:rPr>
+        <w:rFonts w:ascii="Symbol" w:hAnsi="Symbol" w:hint="default"/>
+      </w:rPr>
+    </w:lvl>
+  </w:abstractNum>
+  <w:abstractNum w:abstractNumId="74">
+    <w:lvl w:ilvl="0">
+      <w:start w:val="1"/>
+      <w:numFmt w:val="decimal"/>
+      <w:lvlText w:val="%1."/>
+      <w:lvlJc w:val="left"/>
+      <w:pPr>
+        <w:tabs>
+          <w:tab w:val="num" w:pos="720"/>
+        </w:tabs>
+        <w:ind w:left="720" w:hanging="360"/>
+      </w:pPr>
+    </w:lvl>
+    <w:lvl w:ilvl="1">
+      <w:start w:val="1"/>
+      <w:numFmt w:val="decimal"/>
+      <w:lvlText w:val="%2."/>
+      <w:lvlJc w:val="left"/>
+      <w:pPr>
+        <w:tabs>
+          <w:tab w:val="num" w:pos="1440"/>
+        </w:tabs>
+        <w:ind w:left="1440" w:hanging="360"/>
+      </w:pPr>
+    </w:lvl>
+    <w:lvl w:ilvl="2">
+      <w:start w:val="1"/>
+      <w:numFmt w:val="decimal"/>
+      <w:lvlText w:val="%3."/>
+      <w:lvlJc w:val="left"/>
+      <w:pPr>
+        <w:tabs>
+          <w:tab w:val="num" w:pos="2160"/>
+        </w:tabs>
+        <w:ind w:left="2160" w:hanging="360"/>
+      </w:pPr>
+    </w:lvl>
+    <w:lvl w:ilvl="3">
+      <w:start w:val="1"/>
+      <w:numFmt w:val="decimal"/>
+      <w:lvlText w:val="%4."/>
+      <w:lvlJc w:val="left"/>
+      <w:pPr>
+        <w:tabs>
+          <w:tab w:val="num" w:pos="2880"/>
+        </w:tabs>
+        <w:ind w:left="2880" w:hanging="360"/>
+      </w:pPr>
+    </w:lvl>
+    <w:lvl w:ilvl="4">
+      <w:start w:val="1"/>
+      <w:numFmt w:val="decimal"/>
+      <w:lvlText w:val="%5."/>
+      <w:lvlJc w:val="left"/>
+      <w:pPr>
+        <w:tabs>
+          <w:tab w:val="num" w:pos="3600"/>
+        </w:tabs>
+        <w:ind w:left="3600" w:hanging="360"/>
+      </w:pPr>
+    </w:lvl>
+    <w:lvl w:ilvl="5">
+      <w:start w:val="1"/>
+      <w:numFmt w:val="decimal"/>
+      <w:lvlText w:val="%6."/>
+      <w:lvlJc w:val="left"/>
+      <w:pPr>
+        <w:tabs>
+          <w:tab w:val="num" w:pos="4320"/>
+        </w:tabs>
+        <w:ind w:left="4320" w:hanging="360"/>
+      </w:pPr>
+    </w:lvl>
+    <w:lvl w:ilvl="6">
+      <w:start w:val="1"/>
+      <w:numFmt w:val="decimal"/>
+      <w:lvlText w:val="%7."/>
+      <w:lvlJc w:val="left"/>
+      <w:pPr>
+        <w:tabs>
+          <w:tab w:val="num" w:pos="5040"/>
+        </w:tabs>
+        <w:ind w:left="5040" w:hanging="360"/>
+      </w:pPr>
+    </w:lvl>
+    <w:lvl w:ilvl="7">
+      <w:start w:val="1"/>
+      <w:numFmt w:val="decimal"/>
+      <w:lvlText w:val="%8."/>
+      <w:lvlJc w:val="left"/>
+      <w:pPr>
+        <w:tabs>
+          <w:tab w:val="num" w:pos="5760"/>
+        </w:tabs>
+        <w:ind w:left="5760" w:hanging="360"/>
+      </w:pPr>
+    </w:lvl>
+  </w:abstractNum>
+  <w:abstractNum w:abstractNumId="75">
+    <w:lvl w:ilvl="0">
+      <w:start w:val="1"/>
+      <w:numFmt w:val="bullet"/>
+      <w:lvlText w:val=""/>
+      <w:lvlJc w:val="left"/>
+      <w:pPr>
+        <w:tabs>
+          <w:tab w:val="num" w:pos="720"/>
+        </w:tabs>
+        <w:ind w:left="720" w:hanging="360"/>
+      </w:pPr>
+      <w:rPr>
+        <w:rFonts w:ascii="Symbol" w:hAnsi="Symbol" w:hint="default"/>
+      </w:rPr>
+    </w:lvl>
+    <w:lvl w:ilvl="1">
+      <w:start w:val="1"/>
+      <w:numFmt w:val="bullet"/>
+      <w:lvlText w:val=""/>
+      <w:lvlJc w:val="left"/>
+      <w:pPr>
+        <w:tabs>
+          <w:tab w:val="num" w:pos="1440"/>
+        </w:tabs>
+        <w:ind w:left="1440" w:hanging="360"/>
+      </w:pPr>
+      <w:rPr>
+        <w:rFonts w:ascii="Symbol" w:hAnsi="Symbol" w:hint="default"/>
+      </w:rPr>
+    </w:lvl>
+    <w:lvl w:ilvl="2">
+      <w:start w:val="1"/>
+      <w:numFmt w:val="bullet"/>
+      <w:lvlText w:val=""/>
+      <w:lvlJc w:val="left"/>
+      <w:pPr>
+        <w:tabs>
+          <w:tab w:val="num" w:pos="2160"/>
+        </w:tabs>
+        <w:ind w:left="2160" w:hanging="360"/>
+      </w:pPr>
+      <w:rPr>
+        <w:rFonts w:ascii="Symbol" w:hAnsi="Symbol" w:hint="default"/>
+      </w:rPr>
+    </w:lvl>
+    <w:lvl w:ilvl="3">
+      <w:start w:val="1"/>
+      <w:numFmt w:val="bullet"/>
+      <w:lvlText w:val=""/>
+      <w:lvlJc w:val="left"/>
+      <w:pPr>
+        <w:tabs>
+          <w:tab w:val="num" w:pos="2880"/>
+        </w:tabs>
+        <w:ind w:left="2880" w:hanging="360"/>
+      </w:pPr>
+      <w:rPr>
+        <w:rFonts w:ascii="Symbol" w:hAnsi="Symbol" w:hint="default"/>
+      </w:rPr>
+    </w:lvl>
+    <w:lvl w:ilvl="4">
+      <w:start w:val="1"/>
+      <w:numFmt w:val="bullet"/>
+      <w:lvlText w:val=""/>
+      <w:lvlJc w:val="left"/>
+      <w:pPr>
+        <w:tabs>
+          <w:tab w:val="num" w:pos="3600"/>
+        </w:tabs>
+        <w:ind w:left="3600" w:hanging="360"/>
+      </w:pPr>
+      <w:rPr>
+        <w:rFonts w:ascii="Symbol" w:hAnsi="Symbol" w:hint="default"/>
+      </w:rPr>
+    </w:lvl>
+    <w:lvl w:ilvl="5">
+      <w:start w:val="1"/>
+      <w:numFmt w:val="bullet"/>
+      <w:lvlText w:val=""/>
+      <w:lvlJc w:val="left"/>
+      <w:pPr>
+        <w:tabs>
+          <w:tab w:val="num" w:pos="4320"/>
+        </w:tabs>
+        <w:ind w:left="4320" w:hanging="360"/>
+      </w:pPr>
+      <w:rPr>
+        <w:rFonts w:ascii="Symbol" w:hAnsi="Symbol" w:hint="default"/>
+      </w:rPr>
+    </w:lvl>
+    <w:lvl w:ilvl="6">
+      <w:start w:val="1"/>
+      <w:numFmt w:val="bullet"/>
+      <w:lvlText w:val=""/>
+      <w:lvlJc w:val="left"/>
+      <w:pPr>
+        <w:tabs>
+          <w:tab w:val="num" w:pos="5040"/>
+        </w:tabs>
+        <w:ind w:left="5040" w:hanging="360"/>
+      </w:pPr>
+      <w:rPr>
+        <w:rFonts w:ascii="Symbol" w:hAnsi="Symbol" w:hint="default"/>
+      </w:rPr>
+    </w:lvl>
+    <w:lvl w:ilvl="7">
+      <w:start w:val="1"/>
+      <w:numFmt w:val="bullet"/>
+      <w:lvlText w:val=""/>
+      <w:lvlJc w:val="left"/>
+      <w:pPr>
+        <w:tabs>
+          <w:tab w:val="num" w:pos="5760"/>
+        </w:tabs>
+        <w:ind w:left="5760" w:hanging="360"/>
+      </w:pPr>
+      <w:rPr>
+        <w:rFonts w:ascii="Symbol" w:hAnsi="Symbol" w:hint="default"/>
+      </w:rPr>
+    </w:lvl>
+  </w:abstractNum>
+  <w:abstractNum w:abstractNumId="76">
+    <w:lvl w:ilvl="0">
+      <w:start w:val="1"/>
+      <w:numFmt w:val="bullet"/>
+      <w:lvlText w:val=""/>
+      <w:lvlJc w:val="left"/>
+      <w:pPr>
+        <w:tabs>
+          <w:tab w:val="num" w:pos="720"/>
+        </w:tabs>
+        <w:ind w:left="720" w:hanging="360"/>
+      </w:pPr>
+      <w:rPr>
+        <w:rFonts w:ascii="Symbol" w:hAnsi="Symbol" w:hint="default"/>
+      </w:rPr>
+    </w:lvl>
+    <w:lvl w:ilvl="1">
+      <w:start w:val="1"/>
+      <w:numFmt w:val="bullet"/>
+      <w:lvlText w:val=""/>
+      <w:lvlJc w:val="left"/>
+      <w:pPr>
+        <w:tabs>
+          <w:tab w:val="num" w:pos="1440"/>
+        </w:tabs>
+        <w:ind w:left="1440" w:hanging="360"/>
+      </w:pPr>
+      <w:rPr>
+        <w:rFonts w:ascii="Symbol" w:hAnsi="Symbol" w:hint="default"/>
+      </w:rPr>
+    </w:lvl>
+    <w:lvl w:ilvl="2">
+      <w:start w:val="1"/>
+      <w:numFmt w:val="bullet"/>
+      <w:lvlText w:val=""/>
+      <w:lvlJc w:val="left"/>
+      <w:pPr>
+        <w:tabs>
+          <w:tab w:val="num" w:pos="2160"/>
+        </w:tabs>
+        <w:ind w:left="2160" w:hanging="360"/>
+      </w:pPr>
+      <w:rPr>
+        <w:rFonts w:ascii="Symbol" w:hAnsi="Symbol" w:hint="default"/>
+      </w:rPr>
+    </w:lvl>
+    <w:lvl w:ilvl="3">
+      <w:start w:val="1"/>
+      <w:numFmt w:val="bullet"/>
+      <w:lvlText w:val=""/>
+      <w:lvlJc w:val="left"/>
+      <w:pPr>
+        <w:tabs>
+          <w:tab w:val="num" w:pos="2880"/>
+        </w:tabs>
+        <w:ind w:left="2880" w:hanging="360"/>
+      </w:pPr>
+      <w:rPr>
+        <w:rFonts w:ascii="Symbol" w:hAnsi="Symbol" w:hint="default"/>
+      </w:rPr>
+    </w:lvl>
+    <w:lvl w:ilvl="4">
+      <w:start w:val="1"/>
+      <w:numFmt w:val="bullet"/>
+      <w:lvlText w:val=""/>
+      <w:lvlJc w:val="left"/>
+      <w:pPr>
+        <w:tabs>
+          <w:tab w:val="num" w:pos="3600"/>
+        </w:tabs>
+        <w:ind w:left="3600" w:hanging="360"/>
+      </w:pPr>
+      <w:rPr>
+        <w:rFonts w:ascii="Symbol" w:hAnsi="Symbol" w:hint="default"/>
+      </w:rPr>
+    </w:lvl>
+    <w:lvl w:ilvl="5">
+      <w:start w:val="1"/>
+      <w:numFmt w:val="bullet"/>
+      <w:lvlText w:val=""/>
+      <w:lvlJc w:val="left"/>
+      <w:pPr>
+        <w:tabs>
+          <w:tab w:val="num" w:pos="4320"/>
+        </w:tabs>
+        <w:ind w:left="4320" w:hanging="360"/>
+      </w:pPr>
+      <w:rPr>
+        <w:rFonts w:ascii="Symbol" w:hAnsi="Symbol" w:hint="default"/>
+      </w:rPr>
+    </w:lvl>
+    <w:lvl w:ilvl="6">
+      <w:start w:val="1"/>
+      <w:numFmt w:val="bullet"/>
+      <w:lvlText w:val=""/>
+      <w:lvlJc w:val="left"/>
+      <w:pPr>
+        <w:tabs>
+          <w:tab w:val="num" w:pos="5040"/>
+        </w:tabs>
+        <w:ind w:left="5040" w:hanging="360"/>
+      </w:pPr>
+      <w:rPr>
+        <w:rFonts w:ascii="Symbol" w:hAnsi="Symbol" w:hint="default"/>
+      </w:rPr>
+    </w:lvl>
+    <w:lvl w:ilvl="7">
+      <w:start w:val="1"/>
+      <w:numFmt w:val="bullet"/>
+      <w:lvlText w:val=""/>
+      <w:lvlJc w:val="left"/>
+      <w:pPr>
+        <w:tabs>
+          <w:tab w:val="num" w:pos="5760"/>
+        </w:tabs>
+        <w:ind w:left="5760" w:hanging="360"/>
+      </w:pPr>
+      <w:rPr>
+        <w:rFonts w:ascii="Symbol" w:hAnsi="Symbol" w:hint="default"/>
+      </w:rPr>
+    </w:lvl>
+  </w:abstractNum>
+  <w:abstractNum w:abstractNumId="77">
+    <w:lvl w:ilvl="0">
+      <w:start w:val="1"/>
+      <w:numFmt w:val="bullet"/>
+      <w:lvlText w:val=""/>
+      <w:lvlJc w:val="left"/>
+      <w:pPr>
+        <w:tabs>
+          <w:tab w:val="num" w:pos="720"/>
+        </w:tabs>
+        <w:ind w:left="720" w:hanging="360"/>
+      </w:pPr>
+      <w:rPr>
+        <w:rFonts w:ascii="Symbol" w:hAnsi="Symbol" w:hint="default"/>
+      </w:rPr>
+    </w:lvl>
+    <w:lvl w:ilvl="1">
+      <w:start w:val="1"/>
+      <w:numFmt w:val="bullet"/>
+      <w:lvlText w:val=""/>
+      <w:lvlJc w:val="left"/>
+      <w:pPr>
+        <w:tabs>
+          <w:tab w:val="num" w:pos="1440"/>
+        </w:tabs>
+        <w:ind w:left="1440" w:hanging="360"/>
+      </w:pPr>
+      <w:rPr>
+        <w:rFonts w:ascii="Symbol" w:hAnsi="Symbol" w:hint="default"/>
+      </w:rPr>
+    </w:lvl>
+    <w:lvl w:ilvl="2">
+      <w:start w:val="1"/>
+      <w:numFmt w:val="bullet"/>
+      <w:lvlText w:val=""/>
+      <w:lvlJc w:val="left"/>
+      <w:pPr>
+        <w:tabs>
+          <w:tab w:val="num" w:pos="2160"/>
+        </w:tabs>
+        <w:ind w:left="2160" w:hanging="360"/>
+      </w:pPr>
+      <w:rPr>
+        <w:rFonts w:ascii="Symbol" w:hAnsi="Symbol" w:hint="default"/>
+      </w:rPr>
+    </w:lvl>
+    <w:lvl w:ilvl="3">
+      <w:start w:val="1"/>
+      <w:numFmt w:val="bullet"/>
+      <w:lvlText w:val=""/>
+      <w:lvlJc w:val="left"/>
+      <w:pPr>
+        <w:tabs>
+          <w:tab w:val="num" w:pos="2880"/>
+        </w:tabs>
+        <w:ind w:left="2880" w:hanging="360"/>
+      </w:pPr>
+      <w:rPr>
+        <w:rFonts w:ascii="Symbol" w:hAnsi="Symbol" w:hint="default"/>
+      </w:rPr>
+    </w:lvl>
+    <w:lvl w:ilvl="4">
+      <w:start w:val="1"/>
+      <w:numFmt w:val="bullet"/>
+      <w:lvlText w:val=""/>
+      <w:lvlJc w:val="left"/>
+      <w:pPr>
+        <w:tabs>
+          <w:tab w:val="num" w:pos="3600"/>
+        </w:tabs>
+        <w:ind w:left="3600" w:hanging="360"/>
+      </w:pPr>
+      <w:rPr>
+        <w:rFonts w:ascii="Symbol" w:hAnsi="Symbol" w:hint="default"/>
+      </w:rPr>
+    </w:lvl>
+    <w:lvl w:ilvl="5">
+      <w:start w:val="1"/>
+      <w:numFmt w:val="bullet"/>
+      <w:lvlText w:val=""/>
+      <w:lvlJc w:val="left"/>
+      <w:pPr>
+        <w:tabs>
+          <w:tab w:val="num" w:pos="4320"/>
+        </w:tabs>
+        <w:ind w:left="4320" w:hanging="360"/>
+      </w:pPr>
+      <w:rPr>
+        <w:rFonts w:ascii="Symbol" w:hAnsi="Symbol" w:hint="default"/>
+      </w:rPr>
+    </w:lvl>
+    <w:lvl w:ilvl="6">
+      <w:start w:val="1"/>
+      <w:numFmt w:val="bullet"/>
+      <w:lvlText w:val=""/>
+      <w:lvlJc w:val="left"/>
+      <w:pPr>
+        <w:tabs>
+          <w:tab w:val="num" w:pos="5040"/>
+        </w:tabs>
+        <w:ind w:left="5040" w:hanging="360"/>
+      </w:pPr>
+      <w:rPr>
+        <w:rFonts w:ascii="Symbol" w:hAnsi="Symbol" w:hint="default"/>
+      </w:rPr>
+    </w:lvl>
+    <w:lvl w:ilvl="7">
+      <w:start w:val="1"/>
+      <w:numFmt w:val="bullet"/>
+      <w:lvlText w:val=""/>
+      <w:lvlJc w:val="left"/>
+      <w:pPr>
+        <w:tabs>
+          <w:tab w:val="num" w:pos="5760"/>
+        </w:tabs>
+        <w:ind w:left="5760" w:hanging="360"/>
+      </w:pPr>
+      <w:rPr>
+        <w:rFonts w:ascii="Symbol" w:hAnsi="Symbol" w:hint="default"/>
+      </w:rPr>
+    </w:lvl>
+  </w:abstractNum>
+  <w:abstractNum w:abstractNumId="78">
+    <w:lvl w:ilvl="0">
+      <w:start w:val="1"/>
+      <w:numFmt w:val="bullet"/>
+      <w:lvlText w:val=""/>
+      <w:lvlJc w:val="left"/>
+      <w:pPr>
+        <w:tabs>
+          <w:tab w:val="num" w:pos="720"/>
+        </w:tabs>
+        <w:ind w:left="720" w:hanging="360"/>
+      </w:pPr>
+      <w:rPr>
+        <w:rFonts w:ascii="Symbol" w:hAnsi="Symbol" w:hint="default"/>
+      </w:rPr>
+    </w:lvl>
+    <w:lvl w:ilvl="1">
+      <w:start w:val="1"/>
+      <w:numFmt w:val="bullet"/>
+      <w:lvlText w:val=""/>
+      <w:lvlJc w:val="left"/>
+      <w:pPr>
+        <w:tabs>
+          <w:tab w:val="num" w:pos="1440"/>
+        </w:tabs>
+        <w:ind w:left="1440" w:hanging="360"/>
+      </w:pPr>
+      <w:rPr>
+        <w:rFonts w:ascii="Symbol" w:hAnsi="Symbol" w:hint="default"/>
+      </w:rPr>
+    </w:lvl>
+    <w:lvl w:ilvl="2">
+      <w:start w:val="1"/>
+      <w:numFmt w:val="bullet"/>
+      <w:lvlText w:val=""/>
+      <w:lvlJc w:val="left"/>
+      <w:pPr>
+        <w:tabs>
+          <w:tab w:val="num" w:pos="2160"/>
+        </w:tabs>
+        <w:ind w:left="2160" w:hanging="360"/>
+      </w:pPr>
+      <w:rPr>
+        <w:rFonts w:ascii="Symbol" w:hAnsi="Symbol" w:hint="default"/>
+      </w:rPr>
+    </w:lvl>
+    <w:lvl w:ilvl="3">
+      <w:start w:val="1"/>
+      <w:numFmt w:val="bullet"/>
+      <w:lvlText w:val=""/>
+      <w:lvlJc w:val="left"/>
+      <w:pPr>
+        <w:tabs>
+          <w:tab w:val="num" w:pos="2880"/>
+        </w:tabs>
+        <w:ind w:left="2880" w:hanging="360"/>
+      </w:pPr>
+      <w:rPr>
+        <w:rFonts w:ascii="Symbol" w:hAnsi="Symbol" w:hint="default"/>
+      </w:rPr>
+    </w:lvl>
+    <w:lvl w:ilvl="4">
+      <w:start w:val="1"/>
+      <w:numFmt w:val="bullet"/>
+      <w:lvlText w:val=""/>
+      <w:lvlJc w:val="left"/>
+      <w:pPr>
+        <w:tabs>
+          <w:tab w:val="num" w:pos="3600"/>
+        </w:tabs>
+        <w:ind w:left="3600" w:hanging="360"/>
+      </w:pPr>
+      <w:rPr>
+        <w:rFonts w:ascii="Symbol" w:hAnsi="Symbol" w:hint="default"/>
+      </w:rPr>
+    </w:lvl>
+    <w:lvl w:ilvl="5">
+      <w:start w:val="1"/>
+      <w:numFmt w:val="bullet"/>
+      <w:lvlText w:val=""/>
+      <w:lvlJc w:val="left"/>
+      <w:pPr>
+        <w:tabs>
+          <w:tab w:val="num" w:pos="4320"/>
+        </w:tabs>
+        <w:ind w:left="4320" w:hanging="360"/>
+      </w:pPr>
+      <w:rPr>
+        <w:rFonts w:ascii="Symbol" w:hAnsi="Symbol" w:hint="default"/>
+      </w:rPr>
+    </w:lvl>
+    <w:lvl w:ilvl="6">
+      <w:start w:val="1"/>
+      <w:numFmt w:val="bullet"/>
+      <w:lvlText w:val=""/>
+      <w:lvlJc w:val="left"/>
+      <w:pPr>
+        <w:tabs>
+          <w:tab w:val="num" w:pos="5040"/>
+        </w:tabs>
+        <w:ind w:left="5040" w:hanging="360"/>
+      </w:pPr>
+      <w:rPr>
+        <w:rFonts w:ascii="Symbol" w:hAnsi="Symbol" w:hint="default"/>
+      </w:rPr>
+    </w:lvl>
+    <w:lvl w:ilvl="7">
+      <w:start w:val="1"/>
+      <w:numFmt w:val="bullet"/>
+      <w:lvlText w:val=""/>
+      <w:lvlJc w:val="left"/>
+      <w:pPr>
+        <w:tabs>
+          <w:tab w:val="num" w:pos="5760"/>
+        </w:tabs>
+        <w:ind w:left="5760" w:hanging="360"/>
+      </w:pPr>
+      <w:rPr>
+        <w:rFonts w:ascii="Symbol" w:hAnsi="Symbol" w:hint="default"/>
+      </w:rPr>
+    </w:lvl>
+  </w:abstractNum>
+  <w:abstractNum w:abstractNumId="79">
+    <w:lvl w:ilvl="0">
+      <w:start w:val="1"/>
+      <w:numFmt w:val="decimal"/>
+      <w:lvlText w:val="%1."/>
+      <w:lvlJc w:val="left"/>
+      <w:pPr>
+        <w:tabs>
+          <w:tab w:val="num" w:pos="720"/>
+        </w:tabs>
+        <w:ind w:left="720" w:hanging="360"/>
+      </w:pPr>
+    </w:lvl>
+    <w:lvl w:ilvl="1">
+      <w:start w:val="1"/>
+      <w:numFmt w:val="decimal"/>
+      <w:lvlText w:val="%2."/>
+      <w:lvlJc w:val="left"/>
+      <w:pPr>
+        <w:tabs>
+          <w:tab w:val="num" w:pos="1440"/>
+        </w:tabs>
+        <w:ind w:left="1440" w:hanging="360"/>
+      </w:pPr>
+    </w:lvl>
+    <w:lvl w:ilvl="2">
+      <w:start w:val="1"/>
+      <w:numFmt w:val="decimal"/>
+      <w:lvlText w:val="%3."/>
+      <w:lvlJc w:val="left"/>
+      <w:pPr>
+        <w:tabs>
+          <w:tab w:val="num" w:pos="2160"/>
+        </w:tabs>
+        <w:ind w:left="2160" w:hanging="360"/>
+      </w:pPr>
+    </w:lvl>
+    <w:lvl w:ilvl="3">
+      <w:start w:val="1"/>
+      <w:numFmt w:val="decimal"/>
+      <w:lvlText w:val="%4."/>
+      <w:lvlJc w:val="left"/>
+      <w:pPr>
+        <w:tabs>
+          <w:tab w:val="num" w:pos="2880"/>
+        </w:tabs>
+        <w:ind w:left="2880" w:hanging="360"/>
+      </w:pPr>
+    </w:lvl>
+    <w:lvl w:ilvl="4">
+      <w:start w:val="1"/>
+      <w:numFmt w:val="decimal"/>
+      <w:lvlText w:val="%5."/>
+      <w:lvlJc w:val="left"/>
+      <w:pPr>
+        <w:tabs>
+          <w:tab w:val="num" w:pos="3600"/>
+        </w:tabs>
+        <w:ind w:left="3600" w:hanging="360"/>
+      </w:pPr>
+    </w:lvl>
+    <w:lvl w:ilvl="5">
+      <w:start w:val="1"/>
+      <w:numFmt w:val="decimal"/>
+      <w:lvlText w:val="%6."/>
+      <w:lvlJc w:val="left"/>
+      <w:pPr>
+        <w:tabs>
+          <w:tab w:val="num" w:pos="4320"/>
+        </w:tabs>
+        <w:ind w:left="4320" w:hanging="360"/>
+      </w:pPr>
+    </w:lvl>
+    <w:lvl w:ilvl="6">
+      <w:start w:val="1"/>
+      <w:numFmt w:val="decimal"/>
+      <w:lvlText w:val="%7."/>
+      <w:lvlJc w:val="left"/>
+      <w:pPr>
+        <w:tabs>
+          <w:tab w:val="num" w:pos="5040"/>
+        </w:tabs>
+        <w:ind w:left="5040" w:hanging="360"/>
+      </w:pPr>
+    </w:lvl>
+    <w:lvl w:ilvl="7">
+      <w:start w:val="1"/>
+      <w:numFmt w:val="decimal"/>
+      <w:lvlText w:val="%8."/>
+      <w:lvlJc w:val="left"/>
+      <w:pPr>
+        <w:tabs>
+          <w:tab w:val="num" w:pos="5760"/>
+        </w:tabs>
+        <w:ind w:left="5760" w:hanging="360"/>
+      </w:pPr>
+    </w:lvl>
+  </w:abstractNum>
+  <w:abstractNum w:abstractNumId="80">
+    <w:lvl w:ilvl="0">
+      <w:start w:val="1"/>
+      <w:numFmt w:val="bullet"/>
+      <w:lvlText w:val=""/>
+      <w:lvlJc w:val="left"/>
+      <w:pPr>
+        <w:tabs>
+          <w:tab w:val="num" w:pos="720"/>
+        </w:tabs>
+        <w:ind w:left="720" w:hanging="360"/>
+      </w:pPr>
+      <w:rPr>
+        <w:rFonts w:ascii="Symbol" w:hAnsi="Symbol" w:hint="default"/>
+      </w:rPr>
+    </w:lvl>
+    <w:lvl w:ilvl="1">
+      <w:start w:val="1"/>
+      <w:numFmt w:val="bullet"/>
+      <w:lvlText w:val=""/>
+      <w:lvlJc w:val="left"/>
+      <w:pPr>
+        <w:tabs>
+          <w:tab w:val="num" w:pos="1440"/>
+        </w:tabs>
+        <w:ind w:left="1440" w:hanging="360"/>
+      </w:pPr>
+      <w:rPr>
+        <w:rFonts w:ascii="Symbol" w:hAnsi="Symbol" w:hint="default"/>
+      </w:rPr>
+    </w:lvl>
+    <w:lvl w:ilvl="2">
+      <w:start w:val="1"/>
+      <w:numFmt w:val="bullet"/>
+      <w:lvlText w:val=""/>
+      <w:lvlJc w:val="left"/>
+      <w:pPr>
+        <w:tabs>
+          <w:tab w:val="num" w:pos="2160"/>
+        </w:tabs>
+        <w:ind w:left="2160" w:hanging="360"/>
+      </w:pPr>
+      <w:rPr>
+        <w:rFonts w:ascii="Symbol" w:hAnsi="Symbol" w:hint="default"/>
+      </w:rPr>
+    </w:lvl>
+    <w:lvl w:ilvl="3">
+      <w:start w:val="1"/>
+      <w:numFmt w:val="bullet"/>
+      <w:lvlText w:val=""/>
+      <w:lvlJc w:val="left"/>
+      <w:pPr>
+        <w:tabs>
+          <w:tab w:val="num" w:pos="2880"/>
+        </w:tabs>
+        <w:ind w:left="2880" w:hanging="360"/>
+      </w:pPr>
+      <w:rPr>
+        <w:rFonts w:ascii="Symbol" w:hAnsi="Symbol" w:hint="default"/>
+      </w:rPr>
+    </w:lvl>
+    <w:lvl w:ilvl="4">
+      <w:start w:val="1"/>
+      <w:numFmt w:val="bullet"/>
+      <w:lvlText w:val=""/>
+      <w:lvlJc w:val="left"/>
+      <w:pPr>
+        <w:tabs>
+          <w:tab w:val="num" w:pos="3600"/>
+        </w:tabs>
+        <w:ind w:left="3600" w:hanging="360"/>
+      </w:pPr>
+      <w:rPr>
+        <w:rFonts w:ascii="Symbol" w:hAnsi="Symbol" w:hint="default"/>
+      </w:rPr>
+    </w:lvl>
+    <w:lvl w:ilvl="5">
+      <w:start w:val="1"/>
+      <w:numFmt w:val="bullet"/>
+      <w:lvlText w:val=""/>
+      <w:lvlJc w:val="left"/>
+      <w:pPr>
+        <w:tabs>
+          <w:tab w:val="num" w:pos="4320"/>
+        </w:tabs>
+        <w:ind w:left="4320" w:hanging="360"/>
+      </w:pPr>
+      <w:rPr>
+        <w:rFonts w:ascii="Symbol" w:hAnsi="Symbol" w:hint="default"/>
+      </w:rPr>
+    </w:lvl>
+    <w:lvl w:ilvl="6">
+      <w:start w:val="1"/>
+      <w:numFmt w:val="bullet"/>
+      <w:lvlText w:val=""/>
+      <w:lvlJc w:val="left"/>
+      <w:pPr>
+        <w:tabs>
+          <w:tab w:val="num" w:pos="5040"/>
+        </w:tabs>
+        <w:ind w:left="5040" w:hanging="360"/>
+      </w:pPr>
+      <w:rPr>
+        <w:rFonts w:ascii="Symbol" w:hAnsi="Symbol" w:hint="default"/>
+      </w:rPr>
+    </w:lvl>
+    <w:lvl w:ilvl="7">
+      <w:start w:val="1"/>
+      <w:numFmt w:val="bullet"/>
+      <w:lvlText w:val=""/>
+      <w:lvlJc w:val="left"/>
+      <w:pPr>
+        <w:tabs>
+          <w:tab w:val="num" w:pos="5760"/>
+        </w:tabs>
+        <w:ind w:left="5760" w:hanging="360"/>
+      </w:pPr>
+      <w:rPr>
+        <w:rFonts w:ascii="Symbol" w:hAnsi="Symbol" w:hint="default"/>
+      </w:rPr>
+    </w:lvl>
+  </w:abstractNum>
+  <w:abstractNum w:abstractNumId="81">
+    <w:lvl w:ilvl="0">
+      <w:start w:val="1"/>
+      <w:numFmt w:val="bullet"/>
+      <w:lvlText w:val=""/>
+      <w:lvlJc w:val="left"/>
+      <w:pPr>
+        <w:tabs>
+          <w:tab w:val="num" w:pos="720"/>
+        </w:tabs>
+        <w:ind w:left="720" w:hanging="360"/>
+      </w:pPr>
+      <w:rPr>
+        <w:rFonts w:ascii="Symbol" w:hAnsi="Symbol" w:hint="default"/>
+      </w:rPr>
+    </w:lvl>
+    <w:lvl w:ilvl="1">
+      <w:start w:val="1"/>
+      <w:numFmt w:val="bullet"/>
+      <w:lvlText w:val=""/>
+      <w:lvlJc w:val="left"/>
+      <w:pPr>
+        <w:tabs>
+          <w:tab w:val="num" w:pos="1440"/>
+        </w:tabs>
+        <w:ind w:left="1440" w:hanging="360"/>
+      </w:pPr>
+      <w:rPr>
+        <w:rFonts w:ascii="Symbol" w:hAnsi="Symbol" w:hint="default"/>
+      </w:rPr>
+    </w:lvl>
+    <w:lvl w:ilvl="2">
+      <w:start w:val="1"/>
+      <w:numFmt w:val="bullet"/>
+      <w:lvlText w:val=""/>
+      <w:lvlJc w:val="left"/>
+      <w:pPr>
+        <w:tabs>
+          <w:tab w:val="num" w:pos="2160"/>
+        </w:tabs>
+        <w:ind w:left="2160" w:hanging="360"/>
+      </w:pPr>
+      <w:rPr>
+        <w:rFonts w:ascii="Symbol" w:hAnsi="Symbol" w:hint="default"/>
+      </w:rPr>
+    </w:lvl>
+    <w:lvl w:ilvl="3">
+      <w:start w:val="1"/>
+      <w:numFmt w:val="bullet"/>
+      <w:lvlText w:val=""/>
+      <w:lvlJc w:val="left"/>
+      <w:pPr>
+        <w:tabs>
+          <w:tab w:val="num" w:pos="2880"/>
+        </w:tabs>
+        <w:ind w:left="2880" w:hanging="360"/>
+      </w:pPr>
+      <w:rPr>
+        <w:rFonts w:ascii="Symbol" w:hAnsi="Symbol" w:hint="default"/>
+      </w:rPr>
+    </w:lvl>
+    <w:lvl w:ilvl="4">
+      <w:start w:val="1"/>
+      <w:numFmt w:val="bullet"/>
+      <w:lvlText w:val=""/>
+      <w:lvlJc w:val="left"/>
+      <w:pPr>
+        <w:tabs>
+          <w:tab w:val="num" w:pos="3600"/>
+        </w:tabs>
+        <w:ind w:left="3600" w:hanging="360"/>
+      </w:pPr>
+      <w:rPr>
+        <w:rFonts w:ascii="Symbol" w:hAnsi="Symbol" w:hint="default"/>
+      </w:rPr>
+    </w:lvl>
+    <w:lvl w:ilvl="5">
+      <w:start w:val="1"/>
+      <w:numFmt w:val="bullet"/>
+      <w:lvlText w:val=""/>
+      <w:lvlJc w:val="left"/>
+      <w:pPr>
+        <w:tabs>
+          <w:tab w:val="num" w:pos="4320"/>
+        </w:tabs>
+        <w:ind w:left="4320" w:hanging="360"/>
+      </w:pPr>
+      <w:rPr>
+        <w:rFonts w:ascii="Symbol" w:hAnsi="Symbol" w:hint="default"/>
+      </w:rPr>
+    </w:lvl>
+    <w:lvl w:ilvl="6">
+      <w:start w:val="1"/>
+      <w:numFmt w:val="bullet"/>
+      <w:lvlText w:val=""/>
+      <w:lvlJc w:val="left"/>
+      <w:pPr>
+        <w:tabs>
+          <w:tab w:val="num" w:pos="5040"/>
+        </w:tabs>
+        <w:ind w:left="5040" w:hanging="360"/>
+      </w:pPr>
+      <w:rPr>
+        <w:rFonts w:ascii="Symbol" w:hAnsi="Symbol" w:hint="default"/>
+      </w:rPr>
+    </w:lvl>
+    <w:lvl w:ilvl="7">
+      <w:start w:val="1"/>
+      <w:numFmt w:val="bullet"/>
+      <w:lvlText w:val=""/>
+      <w:lvlJc w:val="left"/>
+      <w:pPr>
+        <w:tabs>
+          <w:tab w:val="num" w:pos="5760"/>
+        </w:tabs>
+        <w:ind w:left="5760" w:hanging="360"/>
+      </w:pPr>
+      <w:rPr>
+        <w:rFonts w:ascii="Symbol" w:hAnsi="Symbol" w:hint="default"/>
+      </w:rPr>
+    </w:lvl>
+  </w:abstractNum>
+  <w:abstractNum w:abstractNumId="82">
     <w:lvl w:ilvl="0">
       <w:start w:val="1"/>
       <w:numFmt w:val="decimal"/>
@@ -28541,6 +32564,36 @@
   </w:num>
   <w:num w:numId="72">
     <w:abstractNumId w:val="72"/>
+  </w:num>
+  <w:num w:numId="73">
+    <w:abstractNumId w:val="73"/>
+  </w:num>
+  <w:num w:numId="74">
+    <w:abstractNumId w:val="74"/>
+  </w:num>
+  <w:num w:numId="75">
+    <w:abstractNumId w:val="75"/>
+  </w:num>
+  <w:num w:numId="76">
+    <w:abstractNumId w:val="76"/>
+  </w:num>
+  <w:num w:numId="77">
+    <w:abstractNumId w:val="77"/>
+  </w:num>
+  <w:num w:numId="78">
+    <w:abstractNumId w:val="78"/>
+  </w:num>
+  <w:num w:numId="79">
+    <w:abstractNumId w:val="79"/>
+  </w:num>
+  <w:num w:numId="80">
+    <w:abstractNumId w:val="80"/>
+  </w:num>
+  <w:num w:numId="81">
+    <w:abstractNumId w:val="81"/>
+  </w:num>
+  <w:num w:numId="82">
+    <w:abstractNumId w:val="82"/>
   </w:num>
 </w:numbering>
 </file>

</xml_diff>

<commit_message>
docs(reflect): confirm phase 5c deployment to @HEAD and manual QA verification [CONC-FE-02]
Co-Authored-By: Claude Sonnet 5 <noreply@anthropic.com>
</commit_message>
<xml_diff>
--- a/Documento_Tecnico_Aplicacion_Predios.docx
+++ b/Documento_Tecnico_Aplicacion_Predios.docx
@@ -17494,6 +17494,81 @@
       <w:r>
         <w:rPr/>
         <w:t xml:space="preserve">.</w:t>
+      </w:r>
+    </w:p>
+    <w:p>
+      <w:pPr>
+        <w:spacing w:lineRule="auto"/>
+      </w:pPr>
+      <w:r>
+        <w:rPr>
+          <w:b/>
+        </w:rPr>
+        <w:t xml:space="preserve">Actualización de cierre (sesión siguiente, 2026-08-06):</w:t>
+      </w:r>
+      <w:r>
+        <w:rPr/>
+        <w:t xml:space="preserve">npx clasp push --force</w:t>
+      </w:r>
+      <w:r>
+        <w:rPr/>
+        <w:t xml:space="preserve"> ejecutado — 40 archivos, incluidos </w:t>
+      </w:r>
+      <w:r>
+        <w:rPr/>
+        <w:t xml:space="preserve">app_core_js.html</w:t>
+      </w:r>
+      <w:r>
+        <w:rPr/>
+        <w:t xml:space="preserve">/</w:t>
+      </w:r>
+      <w:r>
+        <w:rPr/>
+        <w:t xml:space="preserve">app_matriz_js.html</w:t>
+      </w:r>
+      <w:r>
+        <w:rPr/>
+        <w:t xml:space="preserve">/</w:t>
+      </w:r>
+      <w:r>
+        <w:rPr/>
+        <w:t xml:space="preserve">pac_seccion.html</w:t>
+      </w:r>
+      <w:r>
+        <w:rPr/>
+        <w:t xml:space="preserve"> — Fase 5c queda desplegada al mismo entorno de pruebas. </w:t>
+      </w:r>
+      <w:r>
+        <w:rPr/>
+        <w:t xml:space="preserve">npx clasp status</w:t>
+      </w:r>
+      <w:r>
+        <w:rPr/>
+        <w:t xml:space="preserve"> confirma los 3 archivos como tracked y sincronizados. </w:t>
+      </w:r>
+      <w:r>
+        <w:rPr/>
+        <w:t xml:space="preserve">/qa</w:t>
+      </w:r>
+      <w:r>
+        <w:rPr/>
+        <w:t xml:space="preserve"> invocado para verificar las 4 aseveraciones del pipeline de cierre (Skeleton Loader del tablero, Skeleton Loader del PAC en gris neutro, desacoplamiento de auditoría sin contención sobre la matriz principal, </w:t>
+      </w:r>
+      <w:r>
+        <w:rPr/>
+        <w:t xml:space="preserve">pac_mostrarError()</w:t>
+      </w:r>
+      <w:r>
+        <w:rPr/>
+        <w:t xml:space="preserve"> sin destruir el DOM); el navegador aislado de gstack topó con el mismo muro de autenticación de Google Workspace de sesiones anteriores (sin sesión, sin credenciales provistas) — verificado por lectura directa del código ya desplegado en vez de clic en vivo, decisión explícita del usuario vía AskUserQuestion. Las 4 aseveraciones se confirmaron correctas por trazado de código (ver detalle en la respuesta de esta sesión); cero hallazgos nuevos, cero commits </w:t>
+      </w:r>
+      <w:r>
+        <w:rPr/>
+        <w:t xml:space="preserve">fix(qa):</w:t>
+      </w:r>
+      <w:r>
+        <w:rPr/>
+        <w:t xml:space="preserve">. QA end-to-end en navegador real con sesión autenticada sigue pendiente — no debe asumirse verificado en producción hasta esa confirmación.</w:t>
       </w:r>
     </w:p>
     <w:p>

</xml_diff>

<commit_message>
chore(docs): sync pending documentation and protocol logs [CONC-FE-03]
Co-Authored-By: Claude Sonnet 5 <noreply@anthropic.com>
</commit_message>
<xml_diff>
--- a/Documento_Tecnico_Aplicacion_Predios.docx
+++ b/Documento_Tecnico_Aplicacion_Predios.docx
@@ -15639,6 +15639,155 @@
     </w:p>
     <w:p>
       <w:pPr>
+        <w:pStyle w:val="Heading3"/>
+        <w:spacing w:lineRule="auto"/>
+      </w:pPr>
+      <w:r>
+        <w:rPr/>
+        <w:t xml:space="preserve">12.21 [2026-08-06] [CIERRE-SESION] Protocolo de cierre de sesión Copilot (jornada completa)</w:t>
+      </w:r>
+    </w:p>
+    <w:p>
+      <w:pPr>
+        <w:spacing w:lineRule="auto"/>
+      </w:pPr>
+      <w:r>
+        <w:rPr>
+          <w:b/>
+        </w:rPr>
+        <w:t xml:space="preserve">Entregable generado:</w:t>
+      </w:r>
+    </w:p>
+    <w:p>
+      <w:pPr>
+        <w:numPr>
+          <w:ilvl w:val="0"/>
+          <w:numId w:val="97"/>
+        </w:numPr>
+        <w:spacing w:lineRule="auto"/>
+      </w:pPr>
+      <w:r>
+        <w:rPr/>
+        <w:t xml:space="preserve">PROTOCOLO_CIERRE_SESION_2026-08-06_COPILOT.md</w:t>
+      </w:r>
+    </w:p>
+    <w:p>
+      <w:pPr>
+        <w:spacing w:lineRule="auto"/>
+      </w:pPr>
+      <w:r>
+        <w:rPr>
+          <w:b/>
+        </w:rPr>
+        <w:t xml:space="preserve">Contenido del protocolo:</w:t>
+      </w:r>
+    </w:p>
+    <w:p>
+      <w:pPr>
+        <w:numPr>
+          <w:ilvl w:val="0"/>
+          <w:numId w:val="98"/>
+        </w:numPr>
+        <w:spacing w:lineRule="auto"/>
+      </w:pPr>
+      <w:r>
+        <w:rPr/>
+        <w:t xml:space="preserve">Resumen ejecutivo de la jornada (FASE 8b + Sprint 1 + cierre documental).</w:t>
+      </w:r>
+    </w:p>
+    <w:p>
+      <w:pPr>
+        <w:numPr>
+          <w:ilvl w:val="0"/>
+          <w:numId w:val="98"/>
+        </w:numPr>
+        <w:spacing w:lineRule="auto"/>
+      </w:pPr>
+      <w:r>
+        <w:rPr/>
+        <w:t xml:space="preserve">Trazabilidad de cambios técnicos por archivo y por frente.</w:t>
+      </w:r>
+    </w:p>
+    <w:p>
+      <w:pPr>
+        <w:numPr>
+          <w:ilvl w:val="0"/>
+          <w:numId w:val="98"/>
+        </w:numPr>
+        <w:spacing w:lineRule="auto"/>
+      </w:pPr>
+      <w:r>
+        <w:rPr/>
+        <w:t xml:space="preserve">Commits y despliegues ejecutados durante la sesión.</w:t>
+      </w:r>
+    </w:p>
+    <w:p>
+      <w:pPr>
+        <w:numPr>
+          <w:ilvl w:val="0"/>
+          <w:numId w:val="98"/>
+        </w:numPr>
+        <w:spacing w:lineRule="auto"/>
+      </w:pPr>
+      <w:r>
+        <w:rPr/>
+        <w:t xml:space="preserve">Inventario de artefactos creados/actualizados (incluye </w:t>
+      </w:r>
+      <w:r>
+        <w:rPr/>
+        <w:t xml:space="preserve">DESIGN.md</w:t>
+      </w:r>
+      <w:r>
+        <w:rPr/>
+        <w:t xml:space="preserve">, </w:t>
+      </w:r>
+      <w:r>
+        <w:rPr/>
+        <w:t xml:space="preserve">QA_SPRINT1_UIUX.md</w:t>
+      </w:r>
+      <w:r>
+        <w:rPr/>
+        <w:t xml:space="preserve">, </w:t>
+      </w:r>
+      <w:r>
+        <w:rPr/>
+        <w:t xml:space="preserve">ACTA_CIERRE_SPRINT1.md</w:t>
+      </w:r>
+      <w:r>
+        <w:rPr/>
+        <w:t xml:space="preserve">).</w:t>
+      </w:r>
+    </w:p>
+    <w:p>
+      <w:pPr>
+        <w:numPr>
+          <w:ilvl w:val="0"/>
+          <w:numId w:val="98"/>
+        </w:numPr>
+        <w:spacing w:lineRule="auto"/>
+      </w:pPr>
+      <w:r>
+        <w:rPr/>
+        <w:t xml:space="preserve">Estado de validaciones y pendientes de QA visual runtime.</w:t>
+      </w:r>
+    </w:p>
+    <w:p>
+      <w:pPr>
+        <w:spacing w:lineRule="auto"/>
+      </w:pPr>
+      <w:r>
+        <w:rPr>
+          <w:b/>
+        </w:rPr>
+        <w:t xml:space="preserve">Propósito de control:</w:t>
+      </w:r>
+      <w:r>
+        <w:rPr/>
+        <w:t xml:space="preserve"> Dejar cierre formal reproducible de sesión para continuidad multi-agente, auditoría técnica y transferencia de contexto sin depender del historial de chat.</w:t>
+      </w:r>
+    </w:p>
+    <w:p>
+      <w:pPr>
         <w:spacing w:lineRule="auto"/>
       </w:pPr>
       <w:r>
@@ -16502,7 +16651,7 @@
       <w:pPr>
         <w:numPr>
           <w:ilvl w:val="0"/>
-          <w:numId w:val="97"/>
+          <w:numId w:val="99"/>
         </w:numPr>
         <w:spacing w:lineRule="auto"/>
       </w:pPr>
@@ -16518,7 +16667,7 @@
       <w:pPr>
         <w:numPr>
           <w:ilvl w:val="0"/>
-          <w:numId w:val="97"/>
+          <w:numId w:val="99"/>
         </w:numPr>
         <w:spacing w:lineRule="auto"/>
       </w:pPr>
@@ -16546,7 +16695,7 @@
       <w:pPr>
         <w:numPr>
           <w:ilvl w:val="0"/>
-          <w:numId w:val="97"/>
+          <w:numId w:val="99"/>
         </w:numPr>
         <w:spacing w:lineRule="auto"/>
       </w:pPr>
@@ -16562,7 +16711,7 @@
       <w:pPr>
         <w:numPr>
           <w:ilvl w:val="0"/>
-          <w:numId w:val="97"/>
+          <w:numId w:val="99"/>
         </w:numPr>
         <w:spacing w:lineRule="auto"/>
       </w:pPr>
@@ -16582,7 +16731,7 @@
       <w:pPr>
         <w:numPr>
           <w:ilvl w:val="0"/>
-          <w:numId w:val="97"/>
+          <w:numId w:val="99"/>
         </w:numPr>
         <w:spacing w:lineRule="auto"/>
       </w:pPr>
@@ -16650,7 +16799,7 @@
       <w:pPr>
         <w:numPr>
           <w:ilvl w:val="0"/>
-          <w:numId w:val="98"/>
+          <w:numId w:val="100"/>
         </w:numPr>
         <w:spacing w:lineRule="auto"/>
       </w:pPr>
@@ -16675,7 +16824,7 @@
       <w:pPr>
         <w:numPr>
           <w:ilvl w:val="0"/>
-          <w:numId w:val="98"/>
+          <w:numId w:val="100"/>
         </w:numPr>
         <w:spacing w:lineRule="auto"/>
       </w:pPr>
@@ -16724,7 +16873,7 @@
       <w:pPr>
         <w:numPr>
           <w:ilvl w:val="0"/>
-          <w:numId w:val="98"/>
+          <w:numId w:val="100"/>
         </w:numPr>
         <w:spacing w:lineRule="auto"/>
       </w:pPr>
@@ -16765,7 +16914,7 @@
       <w:pPr>
         <w:numPr>
           <w:ilvl w:val="0"/>
-          <w:numId w:val="98"/>
+          <w:numId w:val="100"/>
         </w:numPr>
         <w:spacing w:lineRule="auto"/>
       </w:pPr>
@@ -16818,7 +16967,7 @@
       <w:pPr>
         <w:numPr>
           <w:ilvl w:val="0"/>
-          <w:numId w:val="98"/>
+          <w:numId w:val="100"/>
         </w:numPr>
         <w:spacing w:lineRule="auto"/>
       </w:pPr>
@@ -16851,7 +17000,7 @@
       <w:pPr>
         <w:numPr>
           <w:ilvl w:val="0"/>
-          <w:numId w:val="98"/>
+          <w:numId w:val="100"/>
         </w:numPr>
         <w:spacing w:lineRule="auto"/>
       </w:pPr>
@@ -16872,7 +17021,7 @@
       <w:pPr>
         <w:numPr>
           <w:ilvl w:val="0"/>
-          <w:numId w:val="98"/>
+          <w:numId w:val="100"/>
         </w:numPr>
         <w:spacing w:lineRule="auto"/>
       </w:pPr>
@@ -16901,7 +17050,7 @@
       <w:pPr>
         <w:numPr>
           <w:ilvl w:val="0"/>
-          <w:numId w:val="98"/>
+          <w:numId w:val="100"/>
         </w:numPr>
         <w:spacing w:lineRule="auto"/>
       </w:pPr>
@@ -17003,7 +17152,7 @@
       <w:pPr>
         <w:numPr>
           <w:ilvl w:val="0"/>
-          <w:numId w:val="99"/>
+          <w:numId w:val="101"/>
         </w:numPr>
         <w:spacing w:lineRule="auto"/>
       </w:pPr>
@@ -17084,7 +17233,7 @@
       <w:pPr>
         <w:numPr>
           <w:ilvl w:val="0"/>
-          <w:numId w:val="99"/>
+          <w:numId w:val="101"/>
         </w:numPr>
         <w:spacing w:lineRule="auto"/>
       </w:pPr>
@@ -17193,7 +17342,7 @@
       <w:pPr>
         <w:numPr>
           <w:ilvl w:val="0"/>
-          <w:numId w:val="99"/>
+          <w:numId w:val="101"/>
         </w:numPr>
         <w:spacing w:lineRule="auto"/>
       </w:pPr>
@@ -17265,7 +17414,7 @@
       <w:pPr>
         <w:numPr>
           <w:ilvl w:val="0"/>
-          <w:numId w:val="100"/>
+          <w:numId w:val="102"/>
         </w:numPr>
         <w:spacing w:lineRule="auto"/>
       </w:pPr>
@@ -17348,7 +17497,7 @@
       <w:pPr>
         <w:numPr>
           <w:ilvl w:val="0"/>
-          <w:numId w:val="100"/>
+          <w:numId w:val="102"/>
         </w:numPr>
         <w:spacing w:lineRule="auto"/>
       </w:pPr>
@@ -17413,7 +17562,7 @@
       <w:pPr>
         <w:numPr>
           <w:ilvl w:val="0"/>
-          <w:numId w:val="100"/>
+          <w:numId w:val="102"/>
         </w:numPr>
         <w:spacing w:lineRule="auto"/>
       </w:pPr>
@@ -17462,7 +17611,7 @@
       <w:pPr>
         <w:numPr>
           <w:ilvl w:val="0"/>
-          <w:numId w:val="100"/>
+          <w:numId w:val="102"/>
         </w:numPr>
         <w:spacing w:lineRule="auto"/>
       </w:pPr>
@@ -17487,7 +17636,7 @@
       <w:pPr>
         <w:numPr>
           <w:ilvl w:val="0"/>
-          <w:numId w:val="100"/>
+          <w:numId w:val="102"/>
         </w:numPr>
         <w:spacing w:lineRule="auto"/>
       </w:pPr>
@@ -17536,7 +17685,7 @@
       <w:pPr>
         <w:numPr>
           <w:ilvl w:val="0"/>
-          <w:numId w:val="100"/>
+          <w:numId w:val="102"/>
         </w:numPr>
         <w:spacing w:lineRule="auto"/>
       </w:pPr>
@@ -17712,7 +17861,7 @@
       <w:pPr>
         <w:numPr>
           <w:ilvl w:val="0"/>
-          <w:numId w:val="101"/>
+          <w:numId w:val="103"/>
         </w:numPr>
         <w:spacing w:lineRule="auto"/>
       </w:pPr>
@@ -17861,7 +18010,7 @@
       <w:pPr>
         <w:numPr>
           <w:ilvl w:val="0"/>
-          <w:numId w:val="101"/>
+          <w:numId w:val="103"/>
         </w:numPr>
         <w:spacing w:lineRule="auto"/>
       </w:pPr>
@@ -17916,7 +18065,7 @@
       <w:pPr>
         <w:numPr>
           <w:ilvl w:val="0"/>
-          <w:numId w:val="101"/>
+          <w:numId w:val="103"/>
         </w:numPr>
         <w:spacing w:lineRule="auto"/>
       </w:pPr>
@@ -17943,7 +18092,7 @@
       <w:pPr>
         <w:numPr>
           <w:ilvl w:val="0"/>
-          <w:numId w:val="101"/>
+          <w:numId w:val="103"/>
         </w:numPr>
         <w:spacing w:lineRule="auto"/>
       </w:pPr>
@@ -17978,7 +18127,7 @@
       <w:pPr>
         <w:numPr>
           <w:ilvl w:val="0"/>
-          <w:numId w:val="101"/>
+          <w:numId w:val="103"/>
         </w:numPr>
         <w:spacing w:lineRule="auto"/>
       </w:pPr>
@@ -18033,7 +18182,7 @@
       <w:pPr>
         <w:numPr>
           <w:ilvl w:val="0"/>
-          <w:numId w:val="101"/>
+          <w:numId w:val="103"/>
         </w:numPr>
         <w:spacing w:lineRule="auto"/>
       </w:pPr>
@@ -18072,7 +18221,7 @@
       <w:pPr>
         <w:numPr>
           <w:ilvl w:val="0"/>
-          <w:numId w:val="101"/>
+          <w:numId w:val="103"/>
         </w:numPr>
         <w:spacing w:lineRule="auto"/>
       </w:pPr>
@@ -18130,7 +18279,7 @@
       <w:pPr>
         <w:numPr>
           <w:ilvl w:val="0"/>
-          <w:numId w:val="102"/>
+          <w:numId w:val="104"/>
         </w:numPr>
         <w:spacing w:lineRule="auto"/>
       </w:pPr>
@@ -18182,7 +18331,7 @@
       <w:pPr>
         <w:numPr>
           <w:ilvl w:val="0"/>
-          <w:numId w:val="102"/>
+          <w:numId w:val="104"/>
         </w:numPr>
         <w:spacing w:lineRule="auto"/>
       </w:pPr>
@@ -18218,7 +18367,7 @@
       <w:pPr>
         <w:numPr>
           <w:ilvl w:val="0"/>
-          <w:numId w:val="102"/>
+          <w:numId w:val="104"/>
         </w:numPr>
         <w:spacing w:lineRule="auto"/>
       </w:pPr>
@@ -18234,7 +18383,7 @@
       <w:pPr>
         <w:numPr>
           <w:ilvl w:val="0"/>
-          <w:numId w:val="102"/>
+          <w:numId w:val="104"/>
         </w:numPr>
         <w:spacing w:lineRule="auto"/>
       </w:pPr>
@@ -18266,7 +18415,7 @@
       <w:pPr>
         <w:numPr>
           <w:ilvl w:val="0"/>
-          <w:numId w:val="102"/>
+          <w:numId w:val="104"/>
         </w:numPr>
         <w:spacing w:lineRule="auto"/>
       </w:pPr>
@@ -18324,7 +18473,7 @@
       <w:pPr>
         <w:numPr>
           <w:ilvl w:val="0"/>
-          <w:numId w:val="102"/>
+          <w:numId w:val="104"/>
         </w:numPr>
         <w:spacing w:lineRule="auto"/>
       </w:pPr>
@@ -18400,7 +18549,7 @@
       <w:pPr>
         <w:numPr>
           <w:ilvl w:val="0"/>
-          <w:numId w:val="103"/>
+          <w:numId w:val="105"/>
         </w:numPr>
         <w:spacing w:lineRule="auto"/>
       </w:pPr>
@@ -18417,7 +18566,7 @@
       <w:pPr>
         <w:numPr>
           <w:ilvl w:val="0"/>
-          <w:numId w:val="103"/>
+          <w:numId w:val="105"/>
         </w:numPr>
         <w:spacing w:lineRule="auto"/>
       </w:pPr>
@@ -18507,7 +18656,7 @@
       <w:pPr>
         <w:numPr>
           <w:ilvl w:val="0"/>
-          <w:numId w:val="104"/>
+          <w:numId w:val="106"/>
         </w:numPr>
         <w:spacing w:lineRule="auto"/>
       </w:pPr>
@@ -18532,7 +18681,7 @@
       <w:pPr>
         <w:numPr>
           <w:ilvl w:val="0"/>
-          <w:numId w:val="104"/>
+          <w:numId w:val="106"/>
         </w:numPr>
         <w:spacing w:lineRule="auto"/>
       </w:pPr>
@@ -18557,7 +18706,7 @@
       <w:pPr>
         <w:numPr>
           <w:ilvl w:val="0"/>
-          <w:numId w:val="104"/>
+          <w:numId w:val="106"/>
         </w:numPr>
         <w:spacing w:lineRule="auto"/>
       </w:pPr>
@@ -18597,7 +18746,7 @@
       <w:pPr>
         <w:numPr>
           <w:ilvl w:val="0"/>
-          <w:numId w:val="105"/>
+          <w:numId w:val="107"/>
         </w:numPr>
         <w:spacing w:lineRule="auto"/>
       </w:pPr>
@@ -18766,7 +18915,7 @@
       <w:pPr>
         <w:numPr>
           <w:ilvl w:val="0"/>
-          <w:numId w:val="105"/>
+          <w:numId w:val="107"/>
         </w:numPr>
         <w:spacing w:lineRule="auto"/>
       </w:pPr>
@@ -18831,7 +18980,7 @@
       <w:pPr>
         <w:numPr>
           <w:ilvl w:val="0"/>
-          <w:numId w:val="105"/>
+          <w:numId w:val="107"/>
         </w:numPr>
         <w:spacing w:lineRule="auto"/>
       </w:pPr>
@@ -18997,7 +19146,7 @@
       <w:pPr>
         <w:numPr>
           <w:ilvl w:val="0"/>
-          <w:numId w:val="106"/>
+          <w:numId w:val="108"/>
         </w:numPr>
         <w:spacing w:lineRule="auto"/>
       </w:pPr>
@@ -19058,7 +19207,7 @@
       <w:pPr>
         <w:numPr>
           <w:ilvl w:val="0"/>
-          <w:numId w:val="106"/>
+          <w:numId w:val="108"/>
         </w:numPr>
         <w:spacing w:lineRule="auto"/>
       </w:pPr>
@@ -19105,7 +19254,7 @@
       <w:pPr>
         <w:numPr>
           <w:ilvl w:val="0"/>
-          <w:numId w:val="106"/>
+          <w:numId w:val="108"/>
         </w:numPr>
         <w:spacing w:lineRule="auto"/>
       </w:pPr>
@@ -19194,7 +19343,7 @@
       <w:pPr>
         <w:numPr>
           <w:ilvl w:val="0"/>
-          <w:numId w:val="106"/>
+          <w:numId w:val="108"/>
         </w:numPr>
         <w:spacing w:lineRule="auto"/>
       </w:pPr>
@@ -19261,7 +19410,7 @@
       <w:pPr>
         <w:numPr>
           <w:ilvl w:val="0"/>
-          <w:numId w:val="106"/>
+          <w:numId w:val="108"/>
         </w:numPr>
         <w:spacing w:lineRule="auto"/>
       </w:pPr>
@@ -19315,7 +19464,7 @@
       <w:pPr>
         <w:numPr>
           <w:ilvl w:val="0"/>
-          <w:numId w:val="107"/>
+          <w:numId w:val="109"/>
         </w:numPr>
         <w:spacing w:lineRule="auto"/>
       </w:pPr>
@@ -19375,7 +19524,7 @@
       <w:pPr>
         <w:numPr>
           <w:ilvl w:val="0"/>
-          <w:numId w:val="107"/>
+          <w:numId w:val="109"/>
         </w:numPr>
         <w:spacing w:lineRule="auto"/>
       </w:pPr>
@@ -19391,7 +19540,7 @@
       <w:pPr>
         <w:numPr>
           <w:ilvl w:val="0"/>
-          <w:numId w:val="107"/>
+          <w:numId w:val="109"/>
         </w:numPr>
         <w:spacing w:lineRule="auto"/>
       </w:pPr>
@@ -19407,7 +19556,7 @@
       <w:pPr>
         <w:numPr>
           <w:ilvl w:val="0"/>
-          <w:numId w:val="107"/>
+          <w:numId w:val="109"/>
         </w:numPr>
         <w:spacing w:lineRule="auto"/>
       </w:pPr>
@@ -19427,7 +19576,7 @@
       <w:pPr>
         <w:numPr>
           <w:ilvl w:val="0"/>
-          <w:numId w:val="107"/>
+          <w:numId w:val="109"/>
         </w:numPr>
         <w:spacing w:lineRule="auto"/>
       </w:pPr>
@@ -19443,7 +19592,7 @@
       <w:pPr>
         <w:numPr>
           <w:ilvl w:val="0"/>
-          <w:numId w:val="107"/>
+          <w:numId w:val="109"/>
         </w:numPr>
         <w:spacing w:lineRule="auto"/>
       </w:pPr>
@@ -19651,7 +19800,7 @@
       <w:pPr>
         <w:numPr>
           <w:ilvl w:val="0"/>
-          <w:numId w:val="108"/>
+          <w:numId w:val="110"/>
         </w:numPr>
         <w:spacing w:lineRule="auto"/>
       </w:pPr>
@@ -19664,7 +19813,7 @@
       <w:pPr>
         <w:numPr>
           <w:ilvl w:val="0"/>
-          <w:numId w:val="108"/>
+          <w:numId w:val="110"/>
         </w:numPr>
         <w:spacing w:lineRule="auto"/>
       </w:pPr>
@@ -20181,7 +20330,7 @@
       <w:pPr>
         <w:numPr>
           <w:ilvl w:val="0"/>
-          <w:numId w:val="109"/>
+          <w:numId w:val="111"/>
         </w:numPr>
         <w:spacing w:lineRule="auto"/>
       </w:pPr>
@@ -20222,7 +20371,7 @@
       <w:pPr>
         <w:numPr>
           <w:ilvl w:val="0"/>
-          <w:numId w:val="109"/>
+          <w:numId w:val="111"/>
         </w:numPr>
         <w:spacing w:lineRule="auto"/>
       </w:pPr>
@@ -20275,7 +20424,7 @@
       <w:pPr>
         <w:numPr>
           <w:ilvl w:val="0"/>
-          <w:numId w:val="109"/>
+          <w:numId w:val="111"/>
         </w:numPr>
         <w:spacing w:lineRule="auto"/>
       </w:pPr>
@@ -20345,7 +20494,7 @@
       <w:pPr>
         <w:numPr>
           <w:ilvl w:val="0"/>
-          <w:numId w:val="109"/>
+          <w:numId w:val="111"/>
         </w:numPr>
         <w:spacing w:lineRule="auto"/>
       </w:pPr>
@@ -20518,7 +20667,7 @@
       <w:pPr>
         <w:numPr>
           <w:ilvl w:val="0"/>
-          <w:numId w:val="110"/>
+          <w:numId w:val="112"/>
         </w:numPr>
         <w:spacing w:lineRule="auto"/>
       </w:pPr>
@@ -20546,7 +20695,7 @@
       <w:pPr>
         <w:numPr>
           <w:ilvl w:val="0"/>
-          <w:numId w:val="110"/>
+          <w:numId w:val="112"/>
         </w:numPr>
         <w:spacing w:lineRule="auto"/>
       </w:pPr>
@@ -20562,7 +20711,7 @@
       <w:pPr>
         <w:numPr>
           <w:ilvl w:val="0"/>
-          <w:numId w:val="110"/>
+          <w:numId w:val="112"/>
         </w:numPr>
         <w:spacing w:lineRule="auto"/>
       </w:pPr>
@@ -20582,7 +20731,7 @@
       <w:pPr>
         <w:numPr>
           <w:ilvl w:val="0"/>
-          <w:numId w:val="110"/>
+          <w:numId w:val="112"/>
         </w:numPr>
         <w:spacing w:lineRule="auto"/>
       </w:pPr>
@@ -20610,7 +20759,7 @@
       <w:pPr>
         <w:numPr>
           <w:ilvl w:val="0"/>
-          <w:numId w:val="110"/>
+          <w:numId w:val="112"/>
         </w:numPr>
         <w:spacing w:lineRule="auto"/>
       </w:pPr>
@@ -20634,7 +20783,7 @@
       <w:pPr>
         <w:numPr>
           <w:ilvl w:val="0"/>
-          <w:numId w:val="110"/>
+          <w:numId w:val="112"/>
         </w:numPr>
         <w:spacing w:lineRule="auto"/>
       </w:pPr>
@@ -20867,7 +21016,7 @@
       <w:pPr>
         <w:numPr>
           <w:ilvl w:val="0"/>
-          <w:numId w:val="111"/>
+          <w:numId w:val="113"/>
         </w:numPr>
         <w:spacing w:lineRule="auto"/>
       </w:pPr>
@@ -20911,7 +21060,7 @@
       <w:pPr>
         <w:numPr>
           <w:ilvl w:val="0"/>
-          <w:numId w:val="111"/>
+          <w:numId w:val="113"/>
         </w:numPr>
         <w:spacing w:lineRule="auto"/>
       </w:pPr>
@@ -20927,7 +21076,7 @@
       <w:pPr>
         <w:numPr>
           <w:ilvl w:val="0"/>
-          <w:numId w:val="111"/>
+          <w:numId w:val="113"/>
         </w:numPr>
         <w:spacing w:lineRule="auto"/>
       </w:pPr>
@@ -21156,7 +21305,7 @@
       <w:pPr>
         <w:numPr>
           <w:ilvl w:val="0"/>
-          <w:numId w:val="112"/>
+          <w:numId w:val="114"/>
         </w:numPr>
         <w:spacing w:lineRule="auto"/>
       </w:pPr>
@@ -21183,7 +21332,7 @@
       <w:pPr>
         <w:numPr>
           <w:ilvl w:val="0"/>
-          <w:numId w:val="112"/>
+          <w:numId w:val="114"/>
         </w:numPr>
         <w:spacing w:lineRule="auto"/>
       </w:pPr>
@@ -21242,7 +21391,7 @@
       <w:pPr>
         <w:numPr>
           <w:ilvl w:val="0"/>
-          <w:numId w:val="112"/>
+          <w:numId w:val="114"/>
         </w:numPr>
         <w:spacing w:lineRule="auto"/>
       </w:pPr>
@@ -21325,7 +21474,7 @@
       <w:pPr>
         <w:numPr>
           <w:ilvl w:val="0"/>
-          <w:numId w:val="112"/>
+          <w:numId w:val="114"/>
         </w:numPr>
         <w:spacing w:lineRule="auto"/>
       </w:pPr>
@@ -21400,7 +21549,7 @@
       <w:pPr>
         <w:numPr>
           <w:ilvl w:val="0"/>
-          <w:numId w:val="112"/>
+          <w:numId w:val="114"/>
         </w:numPr>
         <w:spacing w:lineRule="auto"/>
       </w:pPr>
@@ -21475,7 +21624,7 @@
       <w:pPr>
         <w:numPr>
           <w:ilvl w:val="0"/>
-          <w:numId w:val="112"/>
+          <w:numId w:val="114"/>
         </w:numPr>
         <w:spacing w:lineRule="auto"/>
       </w:pPr>
@@ -21545,7 +21694,7 @@
       <w:pPr>
         <w:numPr>
           <w:ilvl w:val="0"/>
-          <w:numId w:val="113"/>
+          <w:numId w:val="115"/>
         </w:numPr>
         <w:spacing w:lineRule="auto"/>
       </w:pPr>
@@ -21589,7 +21738,7 @@
       <w:pPr>
         <w:numPr>
           <w:ilvl w:val="0"/>
-          <w:numId w:val="113"/>
+          <w:numId w:val="115"/>
         </w:numPr>
         <w:spacing w:lineRule="auto"/>
       </w:pPr>
@@ -21613,7 +21762,7 @@
       <w:pPr>
         <w:numPr>
           <w:ilvl w:val="0"/>
-          <w:numId w:val="113"/>
+          <w:numId w:val="115"/>
         </w:numPr>
         <w:spacing w:lineRule="auto"/>
       </w:pPr>
@@ -21653,7 +21802,7 @@
       <w:pPr>
         <w:numPr>
           <w:ilvl w:val="0"/>
-          <w:numId w:val="113"/>
+          <w:numId w:val="115"/>
         </w:numPr>
         <w:spacing w:lineRule="auto"/>
       </w:pPr>
@@ -21818,7 +21967,7 @@
       <w:pPr>
         <w:numPr>
           <w:ilvl w:val="0"/>
-          <w:numId w:val="114"/>
+          <w:numId w:val="116"/>
         </w:numPr>
         <w:spacing w:lineRule="auto"/>
       </w:pPr>
@@ -21881,7 +22030,7 @@
       <w:pPr>
         <w:numPr>
           <w:ilvl w:val="0"/>
-          <w:numId w:val="114"/>
+          <w:numId w:val="116"/>
         </w:numPr>
         <w:spacing w:lineRule="auto"/>
       </w:pPr>
@@ -21996,7 +22145,7 @@
       <w:pPr>
         <w:numPr>
           <w:ilvl w:val="0"/>
-          <w:numId w:val="114"/>
+          <w:numId w:val="116"/>
         </w:numPr>
         <w:spacing w:lineRule="auto"/>
       </w:pPr>
@@ -22091,7 +22240,7 @@
       <w:pPr>
         <w:numPr>
           <w:ilvl w:val="0"/>
-          <w:numId w:val="114"/>
+          <w:numId w:val="116"/>
         </w:numPr>
         <w:spacing w:lineRule="auto"/>
       </w:pPr>
@@ -22121,7 +22270,7 @@
       <w:pPr>
         <w:numPr>
           <w:ilvl w:val="0"/>
-          <w:numId w:val="115"/>
+          <w:numId w:val="117"/>
         </w:numPr>
         <w:spacing w:lineRule="auto"/>
       </w:pPr>
@@ -22149,7 +22298,7 @@
       <w:pPr>
         <w:numPr>
           <w:ilvl w:val="0"/>
-          <w:numId w:val="115"/>
+          <w:numId w:val="117"/>
         </w:numPr>
         <w:spacing w:lineRule="auto"/>
       </w:pPr>
@@ -22169,7 +22318,7 @@
       <w:pPr>
         <w:numPr>
           <w:ilvl w:val="0"/>
-          <w:numId w:val="115"/>
+          <w:numId w:val="117"/>
         </w:numPr>
         <w:spacing w:lineRule="auto"/>
       </w:pPr>
@@ -22185,7 +22334,7 @@
       <w:pPr>
         <w:numPr>
           <w:ilvl w:val="0"/>
-          <w:numId w:val="115"/>
+          <w:numId w:val="117"/>
         </w:numPr>
         <w:spacing w:lineRule="auto"/>
       </w:pPr>
@@ -22318,7 +22467,7 @@
       <w:pPr>
         <w:numPr>
           <w:ilvl w:val="0"/>
-          <w:numId w:val="116"/>
+          <w:numId w:val="118"/>
         </w:numPr>
         <w:spacing w:lineRule="auto"/>
       </w:pPr>
@@ -22361,7 +22510,7 @@
       <w:pPr>
         <w:numPr>
           <w:ilvl w:val="0"/>
-          <w:numId w:val="116"/>
+          <w:numId w:val="118"/>
         </w:numPr>
         <w:spacing w:lineRule="auto"/>
       </w:pPr>
@@ -22458,7 +22607,7 @@
       <w:pPr>
         <w:numPr>
           <w:ilvl w:val="0"/>
-          <w:numId w:val="116"/>
+          <w:numId w:val="118"/>
         </w:numPr>
         <w:spacing w:lineRule="auto"/>
       </w:pPr>
@@ -22604,7 +22753,7 @@
       <w:pPr>
         <w:numPr>
           <w:ilvl w:val="0"/>
-          <w:numId w:val="117"/>
+          <w:numId w:val="119"/>
         </w:numPr>
         <w:spacing w:lineRule="auto"/>
       </w:pPr>
@@ -22627,7 +22776,7 @@
       <w:pPr>
         <w:numPr>
           <w:ilvl w:val="0"/>
-          <w:numId w:val="117"/>
+          <w:numId w:val="119"/>
         </w:numPr>
         <w:spacing w:lineRule="auto"/>
       </w:pPr>
@@ -22658,7 +22807,7 @@
       <w:pPr>
         <w:numPr>
           <w:ilvl w:val="0"/>
-          <w:numId w:val="117"/>
+          <w:numId w:val="119"/>
         </w:numPr>
         <w:spacing w:lineRule="auto"/>
       </w:pPr>
@@ -22714,7 +22863,7 @@
       <w:pPr>
         <w:numPr>
           <w:ilvl w:val="0"/>
-          <w:numId w:val="118"/>
+          <w:numId w:val="120"/>
         </w:numPr>
         <w:spacing w:lineRule="auto"/>
       </w:pPr>
@@ -22734,7 +22883,7 @@
       <w:pPr>
         <w:numPr>
           <w:ilvl w:val="0"/>
-          <w:numId w:val="118"/>
+          <w:numId w:val="120"/>
         </w:numPr>
         <w:spacing w:lineRule="auto"/>
       </w:pPr>
@@ -22770,7 +22919,7 @@
       <w:pPr>
         <w:numPr>
           <w:ilvl w:val="0"/>
-          <w:numId w:val="118"/>
+          <w:numId w:val="120"/>
         </w:numPr>
         <w:spacing w:lineRule="auto"/>
       </w:pPr>
@@ -22810,7 +22959,7 @@
       <w:pPr>
         <w:numPr>
           <w:ilvl w:val="0"/>
-          <w:numId w:val="118"/>
+          <w:numId w:val="120"/>
         </w:numPr>
         <w:spacing w:lineRule="auto"/>
       </w:pPr>
@@ -22838,7 +22987,7 @@
       <w:pPr>
         <w:numPr>
           <w:ilvl w:val="0"/>
-          <w:numId w:val="118"/>
+          <w:numId w:val="120"/>
         </w:numPr>
         <w:spacing w:lineRule="auto"/>
       </w:pPr>
@@ -26040,7 +26189,7 @@
       <w:pPr>
         <w:numPr>
           <w:ilvl w:val="0"/>
-          <w:numId w:val="119"/>
+          <w:numId w:val="121"/>
         </w:numPr>
         <w:spacing w:lineRule="auto"/>
       </w:pPr>
@@ -26109,7 +26258,7 @@
       <w:pPr>
         <w:numPr>
           <w:ilvl w:val="0"/>
-          <w:numId w:val="119"/>
+          <w:numId w:val="121"/>
         </w:numPr>
         <w:spacing w:lineRule="auto"/>
       </w:pPr>
@@ -26138,7 +26287,7 @@
       <w:pPr>
         <w:numPr>
           <w:ilvl w:val="0"/>
-          <w:numId w:val="119"/>
+          <w:numId w:val="121"/>
         </w:numPr>
         <w:spacing w:lineRule="auto"/>
       </w:pPr>
@@ -27492,7 +27641,7 @@
       <w:pPr>
         <w:numPr>
           <w:ilvl w:val="0"/>
-          <w:numId w:val="120"/>
+          <w:numId w:val="122"/>
         </w:numPr>
         <w:spacing w:lineRule="auto"/>
       </w:pPr>
@@ -27515,7 +27664,7 @@
       <w:pPr>
         <w:numPr>
           <w:ilvl w:val="0"/>
-          <w:numId w:val="120"/>
+          <w:numId w:val="122"/>
         </w:numPr>
         <w:spacing w:lineRule="auto"/>
       </w:pPr>
@@ -27534,7 +27683,7 @@
       <w:pPr>
         <w:numPr>
           <w:ilvl w:val="0"/>
-          <w:numId w:val="120"/>
+          <w:numId w:val="122"/>
         </w:numPr>
         <w:spacing w:lineRule="auto"/>
       </w:pPr>
@@ -27585,7 +27734,7 @@
       <w:pPr>
         <w:numPr>
           <w:ilvl w:val="0"/>
-          <w:numId w:val="120"/>
+          <w:numId w:val="122"/>
         </w:numPr>
         <w:spacing w:lineRule="auto"/>
       </w:pPr>
@@ -27626,7 +27775,7 @@
       <w:pPr>
         <w:numPr>
           <w:ilvl w:val="0"/>
-          <w:numId w:val="120"/>
+          <w:numId w:val="122"/>
         </w:numPr>
         <w:spacing w:lineRule="auto"/>
       </w:pPr>
@@ -27653,7 +27802,7 @@
       <w:pPr>
         <w:numPr>
           <w:ilvl w:val="0"/>
-          <w:numId w:val="120"/>
+          <w:numId w:val="122"/>
         </w:numPr>
         <w:spacing w:lineRule="auto"/>
       </w:pPr>
@@ -39423,8 +39572,8 @@
   <w:abstractNum w:abstractNumId="98">
     <w:lvl w:ilvl="0">
       <w:start w:val="1"/>
-      <w:numFmt w:val="bullet"/>
-      <w:lvlText w:val=""/>
+      <w:numFmt w:val="decimal"/>
+      <w:lvlText w:val="%1."/>
       <w:lvlJc w:val="left"/>
       <w:pPr>
         <w:tabs>
@@ -39432,14 +39581,11 @@
         </w:tabs>
         <w:ind w:left="720" w:hanging="360"/>
       </w:pPr>
-      <w:rPr>
-        <w:rFonts w:ascii="Symbol" w:hAnsi="Symbol" w:hint="default"/>
-      </w:rPr>
     </w:lvl>
     <w:lvl w:ilvl="1">
       <w:start w:val="1"/>
-      <w:numFmt w:val="bullet"/>
-      <w:lvlText w:val=""/>
+      <w:numFmt w:val="decimal"/>
+      <w:lvlText w:val="%2."/>
       <w:lvlJc w:val="left"/>
       <w:pPr>
         <w:tabs>
@@ -39447,14 +39593,11 @@
         </w:tabs>
         <w:ind w:left="1440" w:hanging="360"/>
       </w:pPr>
-      <w:rPr>
-        <w:rFonts w:ascii="Symbol" w:hAnsi="Symbol" w:hint="default"/>
-      </w:rPr>
     </w:lvl>
     <w:lvl w:ilvl="2">
       <w:start w:val="1"/>
-      <w:numFmt w:val="bullet"/>
-      <w:lvlText w:val=""/>
+      <w:numFmt w:val="decimal"/>
+      <w:lvlText w:val="%3."/>
       <w:lvlJc w:val="left"/>
       <w:pPr>
         <w:tabs>
@@ -39462,14 +39605,11 @@
         </w:tabs>
         <w:ind w:left="2160" w:hanging="360"/>
       </w:pPr>
-      <w:rPr>
-        <w:rFonts w:ascii="Symbol" w:hAnsi="Symbol" w:hint="default"/>
-      </w:rPr>
     </w:lvl>
     <w:lvl w:ilvl="3">
       <w:start w:val="1"/>
-      <w:numFmt w:val="bullet"/>
-      <w:lvlText w:val=""/>
+      <w:numFmt w:val="decimal"/>
+      <w:lvlText w:val="%4."/>
       <w:lvlJc w:val="left"/>
       <w:pPr>
         <w:tabs>
@@ -39477,14 +39617,11 @@
         </w:tabs>
         <w:ind w:left="2880" w:hanging="360"/>
       </w:pPr>
-      <w:rPr>
-        <w:rFonts w:ascii="Symbol" w:hAnsi="Symbol" w:hint="default"/>
-      </w:rPr>
     </w:lvl>
     <w:lvl w:ilvl="4">
       <w:start w:val="1"/>
-      <w:numFmt w:val="bullet"/>
-      <w:lvlText w:val=""/>
+      <w:numFmt w:val="decimal"/>
+      <w:lvlText w:val="%5."/>
       <w:lvlJc w:val="left"/>
       <w:pPr>
         <w:tabs>
@@ -39492,14 +39629,11 @@
         </w:tabs>
         <w:ind w:left="3600" w:hanging="360"/>
       </w:pPr>
-      <w:rPr>
-        <w:rFonts w:ascii="Symbol" w:hAnsi="Symbol" w:hint="default"/>
-      </w:rPr>
     </w:lvl>
     <w:lvl w:ilvl="5">
       <w:start w:val="1"/>
-      <w:numFmt w:val="bullet"/>
-      <w:lvlText w:val=""/>
+      <w:numFmt w:val="decimal"/>
+      <w:lvlText w:val="%6."/>
       <w:lvlJc w:val="left"/>
       <w:pPr>
         <w:tabs>
@@ -39507,14 +39641,11 @@
         </w:tabs>
         <w:ind w:left="4320" w:hanging="360"/>
       </w:pPr>
-      <w:rPr>
-        <w:rFonts w:ascii="Symbol" w:hAnsi="Symbol" w:hint="default"/>
-      </w:rPr>
     </w:lvl>
     <w:lvl w:ilvl="6">
       <w:start w:val="1"/>
-      <w:numFmt w:val="bullet"/>
-      <w:lvlText w:val=""/>
+      <w:numFmt w:val="decimal"/>
+      <w:lvlText w:val="%7."/>
       <w:lvlJc w:val="left"/>
       <w:pPr>
         <w:tabs>
@@ -39522,14 +39653,11 @@
         </w:tabs>
         <w:ind w:left="5040" w:hanging="360"/>
       </w:pPr>
-      <w:rPr>
-        <w:rFonts w:ascii="Symbol" w:hAnsi="Symbol" w:hint="default"/>
-      </w:rPr>
     </w:lvl>
     <w:lvl w:ilvl="7">
       <w:start w:val="1"/>
-      <w:numFmt w:val="bullet"/>
-      <w:lvlText w:val=""/>
+      <w:numFmt w:val="decimal"/>
+      <w:lvlText w:val="%8."/>
       <w:lvlJc w:val="left"/>
       <w:pPr>
         <w:tabs>
@@ -39537,16 +39665,13 @@
         </w:tabs>
         <w:ind w:left="5760" w:hanging="360"/>
       </w:pPr>
-      <w:rPr>
-        <w:rFonts w:ascii="Symbol" w:hAnsi="Symbol" w:hint="default"/>
-      </w:rPr>
     </w:lvl>
   </w:abstractNum>
   <w:abstractNum w:abstractNumId="99">
     <w:lvl w:ilvl="0">
       <w:start w:val="1"/>
-      <w:numFmt w:val="decimal"/>
-      <w:lvlText w:val="%1."/>
+      <w:numFmt w:val="bullet"/>
+      <w:lvlText w:val=""/>
       <w:lvlJc w:val="left"/>
       <w:pPr>
         <w:tabs>
@@ -39554,11 +39679,14 @@
         </w:tabs>
         <w:ind w:left="720" w:hanging="360"/>
       </w:pPr>
+      <w:rPr>
+        <w:rFonts w:ascii="Symbol" w:hAnsi="Symbol" w:hint="default"/>
+      </w:rPr>
     </w:lvl>
     <w:lvl w:ilvl="1">
       <w:start w:val="1"/>
-      <w:numFmt w:val="decimal"/>
-      <w:lvlText w:val="%2."/>
+      <w:numFmt w:val="bullet"/>
+      <w:lvlText w:val=""/>
       <w:lvlJc w:val="left"/>
       <w:pPr>
         <w:tabs>
@@ -39566,11 +39694,14 @@
         </w:tabs>
         <w:ind w:left="1440" w:hanging="360"/>
       </w:pPr>
+      <w:rPr>
+        <w:rFonts w:ascii="Symbol" w:hAnsi="Symbol" w:hint="default"/>
+      </w:rPr>
     </w:lvl>
     <w:lvl w:ilvl="2">
       <w:start w:val="1"/>
-      <w:numFmt w:val="decimal"/>
-      <w:lvlText w:val="%3."/>
+      <w:numFmt w:val="bullet"/>
+      <w:lvlText w:val=""/>
       <w:lvlJc w:val="left"/>
       <w:pPr>
         <w:tabs>
@@ -39578,11 +39709,14 @@
         </w:tabs>
         <w:ind w:left="2160" w:hanging="360"/>
       </w:pPr>
+      <w:rPr>
+        <w:rFonts w:ascii="Symbol" w:hAnsi="Symbol" w:hint="default"/>
+      </w:rPr>
     </w:lvl>
     <w:lvl w:ilvl="3">
       <w:start w:val="1"/>
-      <w:numFmt w:val="decimal"/>
-      <w:lvlText w:val="%4."/>
+      <w:numFmt w:val="bullet"/>
+      <w:lvlText w:val=""/>
       <w:lvlJc w:val="left"/>
       <w:pPr>
         <w:tabs>
@@ -39590,11 +39724,14 @@
         </w:tabs>
         <w:ind w:left="2880" w:hanging="360"/>
       </w:pPr>
+      <w:rPr>
+        <w:rFonts w:ascii="Symbol" w:hAnsi="Symbol" w:hint="default"/>
+      </w:rPr>
     </w:lvl>
     <w:lvl w:ilvl="4">
       <w:start w:val="1"/>
-      <w:numFmt w:val="decimal"/>
-      <w:lvlText w:val="%5."/>
+      <w:numFmt w:val="bullet"/>
+      <w:lvlText w:val=""/>
       <w:lvlJc w:val="left"/>
       <w:pPr>
         <w:tabs>
@@ -39602,11 +39739,14 @@
         </w:tabs>
         <w:ind w:left="3600" w:hanging="360"/>
       </w:pPr>
+      <w:rPr>
+        <w:rFonts w:ascii="Symbol" w:hAnsi="Symbol" w:hint="default"/>
+      </w:rPr>
     </w:lvl>
     <w:lvl w:ilvl="5">
       <w:start w:val="1"/>
-      <w:numFmt w:val="decimal"/>
-      <w:lvlText w:val="%6."/>
+      <w:numFmt w:val="bullet"/>
+      <w:lvlText w:val=""/>
       <w:lvlJc w:val="left"/>
       <w:pPr>
         <w:tabs>
@@ -39614,11 +39754,14 @@
         </w:tabs>
         <w:ind w:left="4320" w:hanging="360"/>
       </w:pPr>
+      <w:rPr>
+        <w:rFonts w:ascii="Symbol" w:hAnsi="Symbol" w:hint="default"/>
+      </w:rPr>
     </w:lvl>
     <w:lvl w:ilvl="6">
       <w:start w:val="1"/>
-      <w:numFmt w:val="decimal"/>
-      <w:lvlText w:val="%7."/>
+      <w:numFmt w:val="bullet"/>
+      <w:lvlText w:val=""/>
       <w:lvlJc w:val="left"/>
       <w:pPr>
         <w:tabs>
@@ -39626,11 +39769,14 @@
         </w:tabs>
         <w:ind w:left="5040" w:hanging="360"/>
       </w:pPr>
+      <w:rPr>
+        <w:rFonts w:ascii="Symbol" w:hAnsi="Symbol" w:hint="default"/>
+      </w:rPr>
     </w:lvl>
     <w:lvl w:ilvl="7">
       <w:start w:val="1"/>
-      <w:numFmt w:val="decimal"/>
-      <w:lvlText w:val="%8."/>
+      <w:numFmt w:val="bullet"/>
+      <w:lvlText w:val=""/>
       <w:lvlJc w:val="left"/>
       <w:pPr>
         <w:tabs>
@@ -39638,6 +39784,9 @@
         </w:tabs>
         <w:ind w:left="5760" w:hanging="360"/>
       </w:pPr>
+      <w:rPr>
+        <w:rFonts w:ascii="Symbol" w:hAnsi="Symbol" w:hint="default"/>
+      </w:rPr>
     </w:lvl>
   </w:abstractNum>
   <w:abstractNum w:abstractNumId="100">
@@ -39985,8 +40134,8 @@
   <w:abstractNum w:abstractNumId="103">
     <w:lvl w:ilvl="0">
       <w:start w:val="1"/>
-      <w:numFmt w:val="bullet"/>
-      <w:lvlText w:val=""/>
+      <w:numFmt w:val="decimal"/>
+      <w:lvlText w:val="%1."/>
       <w:lvlJc w:val="left"/>
       <w:pPr>
         <w:tabs>
@@ -39994,14 +40143,11 @@
         </w:tabs>
         <w:ind w:left="720" w:hanging="360"/>
       </w:pPr>
-      <w:rPr>
-        <w:rFonts w:ascii="Symbol" w:hAnsi="Symbol" w:hint="default"/>
-      </w:rPr>
     </w:lvl>
     <w:lvl w:ilvl="1">
       <w:start w:val="1"/>
-      <w:numFmt w:val="bullet"/>
-      <w:lvlText w:val=""/>
+      <w:numFmt w:val="decimal"/>
+      <w:lvlText w:val="%2."/>
       <w:lvlJc w:val="left"/>
       <w:pPr>
         <w:tabs>
@@ -40009,14 +40155,11 @@
         </w:tabs>
         <w:ind w:left="1440" w:hanging="360"/>
       </w:pPr>
-      <w:rPr>
-        <w:rFonts w:ascii="Symbol" w:hAnsi="Symbol" w:hint="default"/>
-      </w:rPr>
     </w:lvl>
     <w:lvl w:ilvl="2">
       <w:start w:val="1"/>
-      <w:numFmt w:val="bullet"/>
-      <w:lvlText w:val=""/>
+      <w:numFmt w:val="decimal"/>
+      <w:lvlText w:val="%3."/>
       <w:lvlJc w:val="left"/>
       <w:pPr>
         <w:tabs>
@@ -40024,14 +40167,11 @@
         </w:tabs>
         <w:ind w:left="2160" w:hanging="360"/>
       </w:pPr>
-      <w:rPr>
-        <w:rFonts w:ascii="Symbol" w:hAnsi="Symbol" w:hint="default"/>
-      </w:rPr>
     </w:lvl>
     <w:lvl w:ilvl="3">
       <w:start w:val="1"/>
-      <w:numFmt w:val="bullet"/>
-      <w:lvlText w:val=""/>
+      <w:numFmt w:val="decimal"/>
+      <w:lvlText w:val="%4."/>
       <w:lvlJc w:val="left"/>
       <w:pPr>
         <w:tabs>
@@ -40039,14 +40179,11 @@
         </w:tabs>
         <w:ind w:left="2880" w:hanging="360"/>
       </w:pPr>
-      <w:rPr>
-        <w:rFonts w:ascii="Symbol" w:hAnsi="Symbol" w:hint="default"/>
-      </w:rPr>
     </w:lvl>
     <w:lvl w:ilvl="4">
       <w:start w:val="1"/>
-      <w:numFmt w:val="bullet"/>
-      <w:lvlText w:val=""/>
+      <w:numFmt w:val="decimal"/>
+      <w:lvlText w:val="%5."/>
       <w:lvlJc w:val="left"/>
       <w:pPr>
         <w:tabs>
@@ -40054,14 +40191,11 @@
         </w:tabs>
         <w:ind w:left="3600" w:hanging="360"/>
       </w:pPr>
-      <w:rPr>
-        <w:rFonts w:ascii="Symbol" w:hAnsi="Symbol" w:hint="default"/>
-      </w:rPr>
     </w:lvl>
     <w:lvl w:ilvl="5">
       <w:start w:val="1"/>
-      <w:numFmt w:val="bullet"/>
-      <w:lvlText w:val=""/>
+      <w:numFmt w:val="decimal"/>
+      <w:lvlText w:val="%6."/>
       <w:lvlJc w:val="left"/>
       <w:pPr>
         <w:tabs>
@@ -40069,14 +40203,11 @@
         </w:tabs>
         <w:ind w:left="4320" w:hanging="360"/>
       </w:pPr>
-      <w:rPr>
-        <w:rFonts w:ascii="Symbol" w:hAnsi="Symbol" w:hint="default"/>
-      </w:rPr>
     </w:lvl>
     <w:lvl w:ilvl="6">
       <w:start w:val="1"/>
-      <w:numFmt w:val="bullet"/>
-      <w:lvlText w:val=""/>
+      <w:numFmt w:val="decimal"/>
+      <w:lvlText w:val="%7."/>
       <w:lvlJc w:val="left"/>
       <w:pPr>
         <w:tabs>
@@ -40084,14 +40215,11 @@
         </w:tabs>
         <w:ind w:left="5040" w:hanging="360"/>
       </w:pPr>
-      <w:rPr>
-        <w:rFonts w:ascii="Symbol" w:hAnsi="Symbol" w:hint="default"/>
-      </w:rPr>
     </w:lvl>
     <w:lvl w:ilvl="7">
       <w:start w:val="1"/>
-      <w:numFmt w:val="bullet"/>
-      <w:lvlText w:val=""/>
+      <w:numFmt w:val="decimal"/>
+      <w:lvlText w:val="%8."/>
       <w:lvlJc w:val="left"/>
       <w:pPr>
         <w:tabs>
@@ -40099,9 +40227,6 @@
         </w:tabs>
         <w:ind w:left="5760" w:hanging="360"/>
       </w:pPr>
-      <w:rPr>
-        <w:rFonts w:ascii="Symbol" w:hAnsi="Symbol" w:hint="default"/>
-      </w:rPr>
     </w:lvl>
   </w:abstractNum>
   <w:abstractNum w:abstractNumId="104">
@@ -40351,8 +40476,8 @@
   <w:abstractNum w:abstractNumId="106">
     <w:lvl w:ilvl="0">
       <w:start w:val="1"/>
-      <w:numFmt w:val="decimal"/>
-      <w:lvlText w:val="%1."/>
+      <w:numFmt w:val="bullet"/>
+      <w:lvlText w:val=""/>
       <w:lvlJc w:val="left"/>
       <w:pPr>
         <w:tabs>
@@ -40360,11 +40485,14 @@
         </w:tabs>
         <w:ind w:left="720" w:hanging="360"/>
       </w:pPr>
+      <w:rPr>
+        <w:rFonts w:ascii="Symbol" w:hAnsi="Symbol" w:hint="default"/>
+      </w:rPr>
     </w:lvl>
     <w:lvl w:ilvl="1">
       <w:start w:val="1"/>
-      <w:numFmt w:val="decimal"/>
-      <w:lvlText w:val="%2."/>
+      <w:numFmt w:val="bullet"/>
+      <w:lvlText w:val=""/>
       <w:lvlJc w:val="left"/>
       <w:pPr>
         <w:tabs>
@@ -40372,11 +40500,14 @@
         </w:tabs>
         <w:ind w:left="1440" w:hanging="360"/>
       </w:pPr>
+      <w:rPr>
+        <w:rFonts w:ascii="Symbol" w:hAnsi="Symbol" w:hint="default"/>
+      </w:rPr>
     </w:lvl>
     <w:lvl w:ilvl="2">
       <w:start w:val="1"/>
-      <w:numFmt w:val="decimal"/>
-      <w:lvlText w:val="%3."/>
+      <w:numFmt w:val="bullet"/>
+      <w:lvlText w:val=""/>
       <w:lvlJc w:val="left"/>
       <w:pPr>
         <w:tabs>
@@ -40384,11 +40515,14 @@
         </w:tabs>
         <w:ind w:left="2160" w:hanging="360"/>
       </w:pPr>
+      <w:rPr>
+        <w:rFonts w:ascii="Symbol" w:hAnsi="Symbol" w:hint="default"/>
+      </w:rPr>
     </w:lvl>
     <w:lvl w:ilvl="3">
       <w:start w:val="1"/>
-      <w:numFmt w:val="decimal"/>
-      <w:lvlText w:val="%4."/>
+      <w:numFmt w:val="bullet"/>
+      <w:lvlText w:val=""/>
       <w:lvlJc w:val="left"/>
       <w:pPr>
         <w:tabs>
@@ -40396,11 +40530,14 @@
         </w:tabs>
         <w:ind w:left="2880" w:hanging="360"/>
       </w:pPr>
+      <w:rPr>
+        <w:rFonts w:ascii="Symbol" w:hAnsi="Symbol" w:hint="default"/>
+      </w:rPr>
     </w:lvl>
     <w:lvl w:ilvl="4">
       <w:start w:val="1"/>
-      <w:numFmt w:val="decimal"/>
-      <w:lvlText w:val="%5."/>
+      <w:numFmt w:val="bullet"/>
+      <w:lvlText w:val=""/>
       <w:lvlJc w:val="left"/>
       <w:pPr>
         <w:tabs>
@@ -40408,11 +40545,14 @@
         </w:tabs>
         <w:ind w:left="3600" w:hanging="360"/>
       </w:pPr>
+      <w:rPr>
+        <w:rFonts w:ascii="Symbol" w:hAnsi="Symbol" w:hint="default"/>
+      </w:rPr>
     </w:lvl>
     <w:lvl w:ilvl="5">
       <w:start w:val="1"/>
-      <w:numFmt w:val="decimal"/>
-      <w:lvlText w:val="%6."/>
+      <w:numFmt w:val="bullet"/>
+      <w:lvlText w:val=""/>
       <w:lvlJc w:val="left"/>
       <w:pPr>
         <w:tabs>
@@ -40420,11 +40560,14 @@
         </w:tabs>
         <w:ind w:left="4320" w:hanging="360"/>
       </w:pPr>
+      <w:rPr>
+        <w:rFonts w:ascii="Symbol" w:hAnsi="Symbol" w:hint="default"/>
+      </w:rPr>
     </w:lvl>
     <w:lvl w:ilvl="6">
       <w:start w:val="1"/>
-      <w:numFmt w:val="decimal"/>
-      <w:lvlText w:val="%7."/>
+      <w:numFmt w:val="bullet"/>
+      <w:lvlText w:val=""/>
       <w:lvlJc w:val="left"/>
       <w:pPr>
         <w:tabs>
@@ -40432,11 +40575,14 @@
         </w:tabs>
         <w:ind w:left="5040" w:hanging="360"/>
       </w:pPr>
+      <w:rPr>
+        <w:rFonts w:ascii="Symbol" w:hAnsi="Symbol" w:hint="default"/>
+      </w:rPr>
     </w:lvl>
     <w:lvl w:ilvl="7">
       <w:start w:val="1"/>
-      <w:numFmt w:val="decimal"/>
-      <w:lvlText w:val="%8."/>
+      <w:numFmt w:val="bullet"/>
+      <w:lvlText w:val=""/>
       <w:lvlJc w:val="left"/>
       <w:pPr>
         <w:tabs>
@@ -40444,6 +40590,9 @@
         </w:tabs>
         <w:ind w:left="5760" w:hanging="360"/>
       </w:pPr>
+      <w:rPr>
+        <w:rFonts w:ascii="Symbol" w:hAnsi="Symbol" w:hint="default"/>
+      </w:rPr>
     </w:lvl>
   </w:abstractNum>
   <w:abstractNum w:abstractNumId="107">
@@ -40571,8 +40720,8 @@
   <w:abstractNum w:abstractNumId="108">
     <w:lvl w:ilvl="0">
       <w:start w:val="1"/>
-      <w:numFmt w:val="bullet"/>
-      <w:lvlText w:val=""/>
+      <w:numFmt w:val="decimal"/>
+      <w:lvlText w:val="%1."/>
       <w:lvlJc w:val="left"/>
       <w:pPr>
         <w:tabs>
@@ -40580,14 +40729,11 @@
         </w:tabs>
         <w:ind w:left="720" w:hanging="360"/>
       </w:pPr>
-      <w:rPr>
-        <w:rFonts w:ascii="Symbol" w:hAnsi="Symbol" w:hint="default"/>
-      </w:rPr>
     </w:lvl>
     <w:lvl w:ilvl="1">
       <w:start w:val="1"/>
-      <w:numFmt w:val="bullet"/>
-      <w:lvlText w:val=""/>
+      <w:numFmt w:val="decimal"/>
+      <w:lvlText w:val="%2."/>
       <w:lvlJc w:val="left"/>
       <w:pPr>
         <w:tabs>
@@ -40595,14 +40741,11 @@
         </w:tabs>
         <w:ind w:left="1440" w:hanging="360"/>
       </w:pPr>
-      <w:rPr>
-        <w:rFonts w:ascii="Symbol" w:hAnsi="Symbol" w:hint="default"/>
-      </w:rPr>
     </w:lvl>
     <w:lvl w:ilvl="2">
       <w:start w:val="1"/>
-      <w:numFmt w:val="bullet"/>
-      <w:lvlText w:val=""/>
+      <w:numFmt w:val="decimal"/>
+      <w:lvlText w:val="%3."/>
       <w:lvlJc w:val="left"/>
       <w:pPr>
         <w:tabs>
@@ -40610,14 +40753,11 @@
         </w:tabs>
         <w:ind w:left="2160" w:hanging="360"/>
       </w:pPr>
-      <w:rPr>
-        <w:rFonts w:ascii="Symbol" w:hAnsi="Symbol" w:hint="default"/>
-      </w:rPr>
     </w:lvl>
     <w:lvl w:ilvl="3">
       <w:start w:val="1"/>
-      <w:numFmt w:val="bullet"/>
-      <w:lvlText w:val=""/>
+      <w:numFmt w:val="decimal"/>
+      <w:lvlText w:val="%4."/>
       <w:lvlJc w:val="left"/>
       <w:pPr>
         <w:tabs>
@@ -40625,14 +40765,11 @@
         </w:tabs>
         <w:ind w:left="2880" w:hanging="360"/>
       </w:pPr>
-      <w:rPr>
-        <w:rFonts w:ascii="Symbol" w:hAnsi="Symbol" w:hint="default"/>
-      </w:rPr>
     </w:lvl>
     <w:lvl w:ilvl="4">
       <w:start w:val="1"/>
-      <w:numFmt w:val="bullet"/>
-      <w:lvlText w:val=""/>
+      <w:numFmt w:val="decimal"/>
+      <w:lvlText w:val="%5."/>
       <w:lvlJc w:val="left"/>
       <w:pPr>
         <w:tabs>
@@ -40640,14 +40777,11 @@
         </w:tabs>
         <w:ind w:left="3600" w:hanging="360"/>
       </w:pPr>
-      <w:rPr>
-        <w:rFonts w:ascii="Symbol" w:hAnsi="Symbol" w:hint="default"/>
-      </w:rPr>
     </w:lvl>
     <w:lvl w:ilvl="5">
       <w:start w:val="1"/>
-      <w:numFmt w:val="bullet"/>
-      <w:lvlText w:val=""/>
+      <w:numFmt w:val="decimal"/>
+      <w:lvlText w:val="%6."/>
       <w:lvlJc w:val="left"/>
       <w:pPr>
         <w:tabs>
@@ -40655,14 +40789,11 @@
         </w:tabs>
         <w:ind w:left="4320" w:hanging="360"/>
       </w:pPr>
-      <w:rPr>
-        <w:rFonts w:ascii="Symbol" w:hAnsi="Symbol" w:hint="default"/>
-      </w:rPr>
     </w:lvl>
     <w:lvl w:ilvl="6">
       <w:start w:val="1"/>
-      <w:numFmt w:val="bullet"/>
-      <w:lvlText w:val=""/>
+      <w:numFmt w:val="decimal"/>
+      <w:lvlText w:val="%7."/>
       <w:lvlJc w:val="left"/>
       <w:pPr>
         <w:tabs>
@@ -40670,14 +40801,11 @@
         </w:tabs>
         <w:ind w:left="5040" w:hanging="360"/>
       </w:pPr>
-      <w:rPr>
-        <w:rFonts w:ascii="Symbol" w:hAnsi="Symbol" w:hint="default"/>
-      </w:rPr>
     </w:lvl>
     <w:lvl w:ilvl="7">
       <w:start w:val="1"/>
-      <w:numFmt w:val="bullet"/>
-      <w:lvlText w:val=""/>
+      <w:numFmt w:val="decimal"/>
+      <w:lvlText w:val="%8."/>
       <w:lvlJc w:val="left"/>
       <w:pPr>
         <w:tabs>
@@ -40685,9 +40813,6 @@
         </w:tabs>
         <w:ind w:left="5760" w:hanging="360"/>
       </w:pPr>
-      <w:rPr>
-        <w:rFonts w:ascii="Symbol" w:hAnsi="Symbol" w:hint="default"/>
-      </w:rPr>
     </w:lvl>
   </w:abstractNum>
   <w:abstractNum w:abstractNumId="109">
@@ -41059,8 +41184,8 @@
   <w:abstractNum w:abstractNumId="112">
     <w:lvl w:ilvl="0">
       <w:start w:val="1"/>
-      <w:numFmt w:val="decimal"/>
-      <w:lvlText w:val="%1."/>
+      <w:numFmt w:val="bullet"/>
+      <w:lvlText w:val=""/>
       <w:lvlJc w:val="left"/>
       <w:pPr>
         <w:tabs>
@@ -41068,11 +41193,14 @@
         </w:tabs>
         <w:ind w:left="720" w:hanging="360"/>
       </w:pPr>
+      <w:rPr>
+        <w:rFonts w:ascii="Symbol" w:hAnsi="Symbol" w:hint="default"/>
+      </w:rPr>
     </w:lvl>
     <w:lvl w:ilvl="1">
       <w:start w:val="1"/>
-      <w:numFmt w:val="decimal"/>
-      <w:lvlText w:val="%2."/>
+      <w:numFmt w:val="bullet"/>
+      <w:lvlText w:val=""/>
       <w:lvlJc w:val="left"/>
       <w:pPr>
         <w:tabs>
@@ -41080,11 +41208,14 @@
         </w:tabs>
         <w:ind w:left="1440" w:hanging="360"/>
       </w:pPr>
+      <w:rPr>
+        <w:rFonts w:ascii="Symbol" w:hAnsi="Symbol" w:hint="default"/>
+      </w:rPr>
     </w:lvl>
     <w:lvl w:ilvl="2">
       <w:start w:val="1"/>
-      <w:numFmt w:val="decimal"/>
-      <w:lvlText w:val="%3."/>
+      <w:numFmt w:val="bullet"/>
+      <w:lvlText w:val=""/>
       <w:lvlJc w:val="left"/>
       <w:pPr>
         <w:tabs>
@@ -41092,11 +41223,14 @@
         </w:tabs>
         <w:ind w:left="2160" w:hanging="360"/>
       </w:pPr>
+      <w:rPr>
+        <w:rFonts w:ascii="Symbol" w:hAnsi="Symbol" w:hint="default"/>
+      </w:rPr>
     </w:lvl>
     <w:lvl w:ilvl="3">
       <w:start w:val="1"/>
-      <w:numFmt w:val="decimal"/>
-      <w:lvlText w:val="%4."/>
+      <w:numFmt w:val="bullet"/>
+      <w:lvlText w:val=""/>
       <w:lvlJc w:val="left"/>
       <w:pPr>
         <w:tabs>
@@ -41104,11 +41238,14 @@
         </w:tabs>
         <w:ind w:left="2880" w:hanging="360"/>
       </w:pPr>
+      <w:rPr>
+        <w:rFonts w:ascii="Symbol" w:hAnsi="Symbol" w:hint="default"/>
+      </w:rPr>
     </w:lvl>
     <w:lvl w:ilvl="4">
       <w:start w:val="1"/>
-      <w:numFmt w:val="decimal"/>
-      <w:lvlText w:val="%5."/>
+      <w:numFmt w:val="bullet"/>
+      <w:lvlText w:val=""/>
       <w:lvlJc w:val="left"/>
       <w:pPr>
         <w:tabs>
@@ -41116,11 +41253,14 @@
         </w:tabs>
         <w:ind w:left="3600" w:hanging="360"/>
       </w:pPr>
+      <w:rPr>
+        <w:rFonts w:ascii="Symbol" w:hAnsi="Symbol" w:hint="default"/>
+      </w:rPr>
     </w:lvl>
     <w:lvl w:ilvl="5">
       <w:start w:val="1"/>
-      <w:numFmt w:val="decimal"/>
-      <w:lvlText w:val="%6."/>
+      <w:numFmt w:val="bullet"/>
+      <w:lvlText w:val=""/>
       <w:lvlJc w:val="left"/>
       <w:pPr>
         <w:tabs>
@@ -41128,11 +41268,14 @@
         </w:tabs>
         <w:ind w:left="4320" w:hanging="360"/>
       </w:pPr>
+      <w:rPr>
+        <w:rFonts w:ascii="Symbol" w:hAnsi="Symbol" w:hint="default"/>
+      </w:rPr>
     </w:lvl>
     <w:lvl w:ilvl="6">
       <w:start w:val="1"/>
-      <w:numFmt w:val="decimal"/>
-      <w:lvlText w:val="%7."/>
+      <w:numFmt w:val="bullet"/>
+      <w:lvlText w:val=""/>
       <w:lvlJc w:val="left"/>
       <w:pPr>
         <w:tabs>
@@ -41140,11 +41283,14 @@
         </w:tabs>
         <w:ind w:left="5040" w:hanging="360"/>
       </w:pPr>
+      <w:rPr>
+        <w:rFonts w:ascii="Symbol" w:hAnsi="Symbol" w:hint="default"/>
+      </w:rPr>
     </w:lvl>
     <w:lvl w:ilvl="7">
       <w:start w:val="1"/>
-      <w:numFmt w:val="decimal"/>
-      <w:lvlText w:val="%8."/>
+      <w:numFmt w:val="bullet"/>
+      <w:lvlText w:val=""/>
       <w:lvlJc w:val="left"/>
       <w:pPr>
         <w:tabs>
@@ -41152,6 +41298,9 @@
         </w:tabs>
         <w:ind w:left="5760" w:hanging="360"/>
       </w:pPr>
+      <w:rPr>
+        <w:rFonts w:ascii="Symbol" w:hAnsi="Symbol" w:hint="default"/>
+      </w:rPr>
     </w:lvl>
   </w:abstractNum>
   <w:abstractNum w:abstractNumId="113">
@@ -41719,8 +41868,8 @@
   <w:abstractNum w:abstractNumId="118">
     <w:lvl w:ilvl="0">
       <w:start w:val="1"/>
-      <w:numFmt w:val="bullet"/>
-      <w:lvlText w:val=""/>
+      <w:numFmt w:val="decimal"/>
+      <w:lvlText w:val="%1."/>
       <w:lvlJc w:val="left"/>
       <w:pPr>
         <w:tabs>
@@ -41728,14 +41877,11 @@
         </w:tabs>
         <w:ind w:left="720" w:hanging="360"/>
       </w:pPr>
-      <w:rPr>
-        <w:rFonts w:ascii="Symbol" w:hAnsi="Symbol" w:hint="default"/>
-      </w:rPr>
     </w:lvl>
     <w:lvl w:ilvl="1">
       <w:start w:val="1"/>
-      <w:numFmt w:val="bullet"/>
-      <w:lvlText w:val=""/>
+      <w:numFmt w:val="decimal"/>
+      <w:lvlText w:val="%2."/>
       <w:lvlJc w:val="left"/>
       <w:pPr>
         <w:tabs>
@@ -41743,14 +41889,11 @@
         </w:tabs>
         <w:ind w:left="1440" w:hanging="360"/>
       </w:pPr>
-      <w:rPr>
-        <w:rFonts w:ascii="Symbol" w:hAnsi="Symbol" w:hint="default"/>
-      </w:rPr>
     </w:lvl>
     <w:lvl w:ilvl="2">
       <w:start w:val="1"/>
-      <w:numFmt w:val="bullet"/>
-      <w:lvlText w:val=""/>
+      <w:numFmt w:val="decimal"/>
+      <w:lvlText w:val="%3."/>
       <w:lvlJc w:val="left"/>
       <w:pPr>
         <w:tabs>
@@ -41758,14 +41901,11 @@
         </w:tabs>
         <w:ind w:left="2160" w:hanging="360"/>
       </w:pPr>
-      <w:rPr>
-        <w:rFonts w:ascii="Symbol" w:hAnsi="Symbol" w:hint="default"/>
-      </w:rPr>
     </w:lvl>
     <w:lvl w:ilvl="3">
       <w:start w:val="1"/>
-      <w:numFmt w:val="bullet"/>
-      <w:lvlText w:val=""/>
+      <w:numFmt w:val="decimal"/>
+      <w:lvlText w:val="%4."/>
       <w:lvlJc w:val="left"/>
       <w:pPr>
         <w:tabs>
@@ -41773,14 +41913,11 @@
         </w:tabs>
         <w:ind w:left="2880" w:hanging="360"/>
       </w:pPr>
-      <w:rPr>
-        <w:rFonts w:ascii="Symbol" w:hAnsi="Symbol" w:hint="default"/>
-      </w:rPr>
     </w:lvl>
     <w:lvl w:ilvl="4">
       <w:start w:val="1"/>
-      <w:numFmt w:val="bullet"/>
-      <w:lvlText w:val=""/>
+      <w:numFmt w:val="decimal"/>
+      <w:lvlText w:val="%5."/>
       <w:lvlJc w:val="left"/>
       <w:pPr>
         <w:tabs>
@@ -41788,14 +41925,11 @@
         </w:tabs>
         <w:ind w:left="3600" w:hanging="360"/>
       </w:pPr>
-      <w:rPr>
-        <w:rFonts w:ascii="Symbol" w:hAnsi="Symbol" w:hint="default"/>
-      </w:rPr>
     </w:lvl>
     <w:lvl w:ilvl="5">
       <w:start w:val="1"/>
-      <w:numFmt w:val="bullet"/>
-      <w:lvlText w:val=""/>
+      <w:numFmt w:val="decimal"/>
+      <w:lvlText w:val="%6."/>
       <w:lvlJc w:val="left"/>
       <w:pPr>
         <w:tabs>
@@ -41803,14 +41937,11 @@
         </w:tabs>
         <w:ind w:left="4320" w:hanging="360"/>
       </w:pPr>
-      <w:rPr>
-        <w:rFonts w:ascii="Symbol" w:hAnsi="Symbol" w:hint="default"/>
-      </w:rPr>
     </w:lvl>
     <w:lvl w:ilvl="6">
       <w:start w:val="1"/>
-      <w:numFmt w:val="bullet"/>
-      <w:lvlText w:val=""/>
+      <w:numFmt w:val="decimal"/>
+      <w:lvlText w:val="%7."/>
       <w:lvlJc w:val="left"/>
       <w:pPr>
         <w:tabs>
@@ -41818,14 +41949,11 @@
         </w:tabs>
         <w:ind w:left="5040" w:hanging="360"/>
       </w:pPr>
-      <w:rPr>
-        <w:rFonts w:ascii="Symbol" w:hAnsi="Symbol" w:hint="default"/>
-      </w:rPr>
     </w:lvl>
     <w:lvl w:ilvl="7">
       <w:start w:val="1"/>
-      <w:numFmt w:val="bullet"/>
-      <w:lvlText w:val=""/>
+      <w:numFmt w:val="decimal"/>
+      <w:lvlText w:val="%8."/>
       <w:lvlJc w:val="left"/>
       <w:pPr>
         <w:tabs>
@@ -41833,9 +41961,6 @@
         </w:tabs>
         <w:ind w:left="5760" w:hanging="360"/>
       </w:pPr>
-      <w:rPr>
-        <w:rFonts w:ascii="Symbol" w:hAnsi="Symbol" w:hint="default"/>
-      </w:rPr>
     </w:lvl>
   </w:abstractNum>
   <w:abstractNum w:abstractNumId="119">
@@ -41961,6 +42086,250 @@
     </w:lvl>
   </w:abstractNum>
   <w:abstractNum w:abstractNumId="120">
+    <w:lvl w:ilvl="0">
+      <w:start w:val="1"/>
+      <w:numFmt w:val="bullet"/>
+      <w:lvlText w:val=""/>
+      <w:lvlJc w:val="left"/>
+      <w:pPr>
+        <w:tabs>
+          <w:tab w:val="num" w:pos="720"/>
+        </w:tabs>
+        <w:ind w:left="720" w:hanging="360"/>
+      </w:pPr>
+      <w:rPr>
+        <w:rFonts w:ascii="Symbol" w:hAnsi="Symbol" w:hint="default"/>
+      </w:rPr>
+    </w:lvl>
+    <w:lvl w:ilvl="1">
+      <w:start w:val="1"/>
+      <w:numFmt w:val="bullet"/>
+      <w:lvlText w:val=""/>
+      <w:lvlJc w:val="left"/>
+      <w:pPr>
+        <w:tabs>
+          <w:tab w:val="num" w:pos="1440"/>
+        </w:tabs>
+        <w:ind w:left="1440" w:hanging="360"/>
+      </w:pPr>
+      <w:rPr>
+        <w:rFonts w:ascii="Symbol" w:hAnsi="Symbol" w:hint="default"/>
+      </w:rPr>
+    </w:lvl>
+    <w:lvl w:ilvl="2">
+      <w:start w:val="1"/>
+      <w:numFmt w:val="bullet"/>
+      <w:lvlText w:val=""/>
+      <w:lvlJc w:val="left"/>
+      <w:pPr>
+        <w:tabs>
+          <w:tab w:val="num" w:pos="2160"/>
+        </w:tabs>
+        <w:ind w:left="2160" w:hanging="360"/>
+      </w:pPr>
+      <w:rPr>
+        <w:rFonts w:ascii="Symbol" w:hAnsi="Symbol" w:hint="default"/>
+      </w:rPr>
+    </w:lvl>
+    <w:lvl w:ilvl="3">
+      <w:start w:val="1"/>
+      <w:numFmt w:val="bullet"/>
+      <w:lvlText w:val=""/>
+      <w:lvlJc w:val="left"/>
+      <w:pPr>
+        <w:tabs>
+          <w:tab w:val="num" w:pos="2880"/>
+        </w:tabs>
+        <w:ind w:left="2880" w:hanging="360"/>
+      </w:pPr>
+      <w:rPr>
+        <w:rFonts w:ascii="Symbol" w:hAnsi="Symbol" w:hint="default"/>
+      </w:rPr>
+    </w:lvl>
+    <w:lvl w:ilvl="4">
+      <w:start w:val="1"/>
+      <w:numFmt w:val="bullet"/>
+      <w:lvlText w:val=""/>
+      <w:lvlJc w:val="left"/>
+      <w:pPr>
+        <w:tabs>
+          <w:tab w:val="num" w:pos="3600"/>
+        </w:tabs>
+        <w:ind w:left="3600" w:hanging="360"/>
+      </w:pPr>
+      <w:rPr>
+        <w:rFonts w:ascii="Symbol" w:hAnsi="Symbol" w:hint="default"/>
+      </w:rPr>
+    </w:lvl>
+    <w:lvl w:ilvl="5">
+      <w:start w:val="1"/>
+      <w:numFmt w:val="bullet"/>
+      <w:lvlText w:val=""/>
+      <w:lvlJc w:val="left"/>
+      <w:pPr>
+        <w:tabs>
+          <w:tab w:val="num" w:pos="4320"/>
+        </w:tabs>
+        <w:ind w:left="4320" w:hanging="360"/>
+      </w:pPr>
+      <w:rPr>
+        <w:rFonts w:ascii="Symbol" w:hAnsi="Symbol" w:hint="default"/>
+      </w:rPr>
+    </w:lvl>
+    <w:lvl w:ilvl="6">
+      <w:start w:val="1"/>
+      <w:numFmt w:val="bullet"/>
+      <w:lvlText w:val=""/>
+      <w:lvlJc w:val="left"/>
+      <w:pPr>
+        <w:tabs>
+          <w:tab w:val="num" w:pos="5040"/>
+        </w:tabs>
+        <w:ind w:left="5040" w:hanging="360"/>
+      </w:pPr>
+      <w:rPr>
+        <w:rFonts w:ascii="Symbol" w:hAnsi="Symbol" w:hint="default"/>
+      </w:rPr>
+    </w:lvl>
+    <w:lvl w:ilvl="7">
+      <w:start w:val="1"/>
+      <w:numFmt w:val="bullet"/>
+      <w:lvlText w:val=""/>
+      <w:lvlJc w:val="left"/>
+      <w:pPr>
+        <w:tabs>
+          <w:tab w:val="num" w:pos="5760"/>
+        </w:tabs>
+        <w:ind w:left="5760" w:hanging="360"/>
+      </w:pPr>
+      <w:rPr>
+        <w:rFonts w:ascii="Symbol" w:hAnsi="Symbol" w:hint="default"/>
+      </w:rPr>
+    </w:lvl>
+  </w:abstractNum>
+  <w:abstractNum w:abstractNumId="121">
+    <w:lvl w:ilvl="0">
+      <w:start w:val="1"/>
+      <w:numFmt w:val="bullet"/>
+      <w:lvlText w:val=""/>
+      <w:lvlJc w:val="left"/>
+      <w:pPr>
+        <w:tabs>
+          <w:tab w:val="num" w:pos="720"/>
+        </w:tabs>
+        <w:ind w:left="720" w:hanging="360"/>
+      </w:pPr>
+      <w:rPr>
+        <w:rFonts w:ascii="Symbol" w:hAnsi="Symbol" w:hint="default"/>
+      </w:rPr>
+    </w:lvl>
+    <w:lvl w:ilvl="1">
+      <w:start w:val="1"/>
+      <w:numFmt w:val="bullet"/>
+      <w:lvlText w:val=""/>
+      <w:lvlJc w:val="left"/>
+      <w:pPr>
+        <w:tabs>
+          <w:tab w:val="num" w:pos="1440"/>
+        </w:tabs>
+        <w:ind w:left="1440" w:hanging="360"/>
+      </w:pPr>
+      <w:rPr>
+        <w:rFonts w:ascii="Symbol" w:hAnsi="Symbol" w:hint="default"/>
+      </w:rPr>
+    </w:lvl>
+    <w:lvl w:ilvl="2">
+      <w:start w:val="1"/>
+      <w:numFmt w:val="bullet"/>
+      <w:lvlText w:val=""/>
+      <w:lvlJc w:val="left"/>
+      <w:pPr>
+        <w:tabs>
+          <w:tab w:val="num" w:pos="2160"/>
+        </w:tabs>
+        <w:ind w:left="2160" w:hanging="360"/>
+      </w:pPr>
+      <w:rPr>
+        <w:rFonts w:ascii="Symbol" w:hAnsi="Symbol" w:hint="default"/>
+      </w:rPr>
+    </w:lvl>
+    <w:lvl w:ilvl="3">
+      <w:start w:val="1"/>
+      <w:numFmt w:val="bullet"/>
+      <w:lvlText w:val=""/>
+      <w:lvlJc w:val="left"/>
+      <w:pPr>
+        <w:tabs>
+          <w:tab w:val="num" w:pos="2880"/>
+        </w:tabs>
+        <w:ind w:left="2880" w:hanging="360"/>
+      </w:pPr>
+      <w:rPr>
+        <w:rFonts w:ascii="Symbol" w:hAnsi="Symbol" w:hint="default"/>
+      </w:rPr>
+    </w:lvl>
+    <w:lvl w:ilvl="4">
+      <w:start w:val="1"/>
+      <w:numFmt w:val="bullet"/>
+      <w:lvlText w:val=""/>
+      <w:lvlJc w:val="left"/>
+      <w:pPr>
+        <w:tabs>
+          <w:tab w:val="num" w:pos="3600"/>
+        </w:tabs>
+        <w:ind w:left="3600" w:hanging="360"/>
+      </w:pPr>
+      <w:rPr>
+        <w:rFonts w:ascii="Symbol" w:hAnsi="Symbol" w:hint="default"/>
+      </w:rPr>
+    </w:lvl>
+    <w:lvl w:ilvl="5">
+      <w:start w:val="1"/>
+      <w:numFmt w:val="bullet"/>
+      <w:lvlText w:val=""/>
+      <w:lvlJc w:val="left"/>
+      <w:pPr>
+        <w:tabs>
+          <w:tab w:val="num" w:pos="4320"/>
+        </w:tabs>
+        <w:ind w:left="4320" w:hanging="360"/>
+      </w:pPr>
+      <w:rPr>
+        <w:rFonts w:ascii="Symbol" w:hAnsi="Symbol" w:hint="default"/>
+      </w:rPr>
+    </w:lvl>
+    <w:lvl w:ilvl="6">
+      <w:start w:val="1"/>
+      <w:numFmt w:val="bullet"/>
+      <w:lvlText w:val=""/>
+      <w:lvlJc w:val="left"/>
+      <w:pPr>
+        <w:tabs>
+          <w:tab w:val="num" w:pos="5040"/>
+        </w:tabs>
+        <w:ind w:left="5040" w:hanging="360"/>
+      </w:pPr>
+      <w:rPr>
+        <w:rFonts w:ascii="Symbol" w:hAnsi="Symbol" w:hint="default"/>
+      </w:rPr>
+    </w:lvl>
+    <w:lvl w:ilvl="7">
+      <w:start w:val="1"/>
+      <w:numFmt w:val="bullet"/>
+      <w:lvlText w:val=""/>
+      <w:lvlJc w:val="left"/>
+      <w:pPr>
+        <w:tabs>
+          <w:tab w:val="num" w:pos="5760"/>
+        </w:tabs>
+        <w:ind w:left="5760" w:hanging="360"/>
+      </w:pPr>
+      <w:rPr>
+        <w:rFonts w:ascii="Symbol" w:hAnsi="Symbol" w:hint="default"/>
+      </w:rPr>
+    </w:lvl>
+  </w:abstractNum>
+  <w:abstractNum w:abstractNumId="122">
     <w:lvl w:ilvl="0">
       <w:start w:val="1"/>
       <w:numFmt w:val="decimal"/>
@@ -42418,6 +42787,12 @@
   <w:num w:numId="120">
     <w:abstractNumId w:val="120"/>
   </w:num>
+  <w:num w:numId="121">
+    <w:abstractNumId w:val="121"/>
+  </w:num>
+  <w:num w:numId="122">
+    <w:abstractNumId w:val="122"/>
+  </w:num>
 </w:numbering>
 </file>
 

</xml_diff>

<commit_message>
docs(reflect): document CONC-FE-05 optimistic UI implementation and close TODOS item 11
Co-Authored-By: Claude Sonnet 5 <noreply@anthropic.com>
</commit_message>
<xml_diff>
--- a/Documento_Tecnico_Aplicacion_Predios.docx
+++ b/Documento_Tecnico_Aplicacion_Predios.docx
@@ -23028,6 +23028,814 @@
       <w:r>
         <w:rPr/>
         <w:t xml:space="preserve"> ninguno directo — esta sección es de consolidación documental. Confirma que el repositorio, tras la fusión no coordinada de dos líneas de trabajo concurrentes, queda en un estado sintácticamente limpio y funcionalmente compatible; dirige el trabajo futuro hacia la validación visual en runtime (el gap real) en vez de hacia una reimplementación de Fase 8b que ya existe.</w:t>
+      </w:r>
+    </w:p>
+    <w:p>
+      <w:pPr>
+        <w:pStyle w:val="Heading3"/>
+        <w:spacing w:lineRule="auto"/>
+      </w:pPr>
+      <w:r>
+        <w:rPr/>
+        <w:t xml:space="preserve">12.25 [2026-08-12] [CONC-FE-05] Auditoría de entorno tras cambio de máquina, descarte de regresión WIP y cierre del ítem 11 (LocalCache aislado por usuario)</w:t>
+      </w:r>
+    </w:p>
+    <w:p>
+      <w:pPr>
+        <w:spacing w:lineRule="auto"/>
+      </w:pPr>
+      <w:r>
+        <w:rPr>
+          <w:b/>
+        </w:rPr>
+        <w:t xml:space="preserve">Contexto:</w:t>
+      </w:r>
+      <w:r>
+        <w:rPr/>
+        <w:t xml:space="preserve"> nueva sesión de Claude Code tras cambio de entorno físico de trabajo. Se pidió reejecutar el hotfix de Fase 8b (dropdown de búsqueda + chunking de CacheService) — auditoría previa (</w:t>
+      </w:r>
+      <w:r>
+        <w:rPr/>
+        <w:t xml:space="preserve">clasp status</w:t>
+      </w:r>
+      <w:r>
+        <w:rPr/>
+        <w:t xml:space="preserve">, </w:t>
+      </w:r>
+      <w:r>
+        <w:rPr/>
+        <w:t xml:space="preserve">git log</w:t>
+      </w:r>
+      <w:r>
+        <w:rPr/>
+        <w:t xml:space="preserve">, lectura directa de </w:t>
+      </w:r>
+      <w:r>
+        <w:rPr/>
+        <w:t xml:space="preserve">app_matriz_js.html</w:t>
+      </w:r>
+      <w:r>
+        <w:rPr/>
+        <w:t xml:space="preserve">/</w:t>
+      </w:r>
+      <w:r>
+        <w:rPr/>
+        <w:t xml:space="preserve">cache_backend.js</w:t>
+      </w:r>
+      <w:r>
+        <w:rPr/>
+        <w:t xml:space="preserve">) confirmó que ya estaba implementado en el commit </w:t>
+      </w:r>
+      <w:r>
+        <w:rPr/>
+        <w:t xml:space="preserve">da7ba22</w:t>
+      </w:r>
+      <w:r>
+        <w:rPr/>
+        <w:t xml:space="preserve"> (ver 12.24); no se reimplementó para no duplicar historia.</w:t>
+      </w:r>
+    </w:p>
+    <w:p>
+      <w:pPr>
+        <w:spacing w:lineRule="auto"/>
+      </w:pPr>
+      <w:r>
+        <w:rPr>
+          <w:b/>
+        </w:rPr>
+        <w:t xml:space="preserve">Regresión WIP descartada (decisión del usuario):</w:t>
+      </w:r>
+      <w:r>
+        <w:rPr/>
+        <w:t xml:space="preserve">config.js</w:t>
+      </w:r>
+      <w:r>
+        <w:rPr/>
+        <w:t xml:space="preserve">, </w:t>
+      </w:r>
+      <w:r>
+        <w:rPr/>
+        <w:t xml:space="preserve">pac_gestor.js</w:t>
+      </w:r>
+      <w:r>
+        <w:rPr/>
+        <w:t xml:space="preserve"> y </w:t>
+      </w:r>
+      <w:r>
+        <w:rPr/>
+        <w:t xml:space="preserve">permisos.js</w:t>
+      </w:r>
+      <w:r>
+        <w:rPr/>
+        <w:t xml:space="preserve"> tenían cambios sin commitear que revertían trabajo ya cerrado de Fase 5b — quitaban </w:t>
+      </w:r>
+      <w:r>
+        <w:rPr/>
+        <w:t xml:space="preserve">CONFIG.DATA_FILES.LOGS</w:t>
+      </w:r>
+      <w:r>
+        <w:rPr/>
+        <w:t xml:space="preserve"> (spreadsheet separado de auditoría) y las llamadas a </w:t>
+      </w:r>
+      <w:r>
+        <w:rPr/>
+        <w:t xml:space="preserve">invalidateDataCache()</w:t>
+      </w:r>
+      <w:r>
+        <w:rPr/>
+        <w:t xml:space="preserve"> en </w:t>
+      </w:r>
+      <w:r>
+        <w:rPr/>
+        <w:t xml:space="preserve">aprobarBorradorPAC</w:t>
+      </w:r>
+      <w:r>
+        <w:rPr/>
+        <w:t xml:space="preserve">/</w:t>
+      </w:r>
+      <w:r>
+        <w:rPr/>
+        <w:t xml:space="preserve">savePermission</w:t>
+      </w:r>
+      <w:r>
+        <w:rPr/>
+        <w:t xml:space="preserve">/</w:t>
+      </w:r>
+      <w:r>
+        <w:rPr/>
+        <w:t xml:space="preserve">deletePermission</w:t>
+      </w:r>
+      <w:r>
+        <w:rPr/>
+        <w:t xml:space="preserve">. Origen no identificado (no atribuible a la sesión de Copilot, que documentó explícitamente en </w:t>
+      </w:r>
+      <w:r>
+        <w:rPr/>
+        <w:t xml:space="preserve">PROTOCOLO_CIERRE_SESION_2026-08-06_COPILOT.md</w:t>
+      </w:r>
+      <w:r>
+        <w:rPr/>
+        <w:t xml:space="preserve"> sección 8 que estos 3 archivos ya tenían cambios ajenos sin explicar al cierre de su jornada). El usuario eligió descartarlos (</w:t>
+      </w:r>
+      <w:r>
+        <w:rPr/>
+        <w:t xml:space="preserve">git checkout -- config.js pac_gestor.js permisos.js</w:t>
+      </w:r>
+      <w:r>
+        <w:rPr/>
+        <w:t xml:space="preserve">) en vez de conservarlos. </w:t>
+      </w:r>
+      <w:r>
+        <w:rPr/>
+        <w:t xml:space="preserve">node --check</w:t>
+      </w:r>
+      <w:r>
+        <w:rPr/>
+        <w:t xml:space="preserve"> verificado en los 6 archivos backend relevantes tras el descarte.</w:t>
+      </w:r>
+    </w:p>
+    <w:p>
+      <w:pPr>
+        <w:spacing w:lineRule="auto"/>
+      </w:pPr>
+      <w:r>
+        <w:rPr>
+          <w:b/>
+        </w:rPr>
+        <w:t xml:space="preserve">Commit </w:t>
+      </w:r>
+      <w:r>
+        <w:rPr>
+          <w:b/>
+        </w:rPr>
+        <w:t xml:space="preserve">fc35c55</w:t>
+      </w:r>
+      <w:r>
+        <w:rPr/>
+        <w:t xml:space="preserve"> — </w:t>
+      </w:r>
+      <w:r>
+        <w:rPr/>
+        <w:t xml:space="preserve">chore(docs): sync pending documentation and protocol logs [CONC-FE-03]</w:t>
+      </w:r>
+      <w:r>
+        <w:rPr/>
+        <w:t xml:space="preserve">: trackeo de </w:t>
+      </w:r>
+      <w:r>
+        <w:rPr/>
+        <w:t xml:space="preserve">PROTOCOLO_CIERRE_SESION_2026-08-06_COPILOT.md</w:t>
+      </w:r>
+      <w:r>
+        <w:rPr/>
+        <w:t xml:space="preserve"> (antes untracked) + las 15 líneas pendientes de esta bitácora (sección 12.21) + regeneración de </w:t>
+      </w:r>
+      <w:r>
+        <w:rPr/>
+        <w:t xml:space="preserve">Documento_Tecnico_Aplicacion_Predios.docx</w:t>
+      </w:r>
+      <w:r>
+        <w:rPr/>
+        <w:t xml:space="preserve">/</w:t>
+      </w:r>
+      <w:r>
+        <w:rPr/>
+        <w:t xml:space="preserve">.pdf</w:t>
+      </w:r>
+      <w:r>
+        <w:rPr/>
+        <w:t xml:space="preserve"> (obligatoria por la regla del proyecto: el </w:t>
+      </w:r>
+      <w:r>
+        <w:rPr/>
+        <w:t xml:space="preserve">.md</w:t>
+      </w:r>
+      <w:r>
+        <w:rPr/>
+        <w:t xml:space="preserve"> había cambiado después de la última regeneración).</w:t>
+      </w:r>
+    </w:p>
+    <w:p>
+      <w:pPr>
+        <w:spacing w:lineRule="auto"/>
+      </w:pPr>
+      <w:r>
+        <w:rPr>
+          <w:b/>
+        </w:rPr>
+        <w:t xml:space="preserve">Ítem 11 del backlog — implementación (commit </w:t>
+      </w:r>
+      <w:r>
+        <w:rPr>
+          <w:b/>
+        </w:rPr>
+        <w:t xml:space="preserve">b1351a7</w:t>
+      </w:r>
+      <w:r>
+        <w:rPr>
+          <w:b/>
+        </w:rPr>
+        <w:t xml:space="preserve">):</w:t>
+      </w:r>
+    </w:p>
+    <w:p>
+      <w:pPr>
+        <w:numPr>
+          <w:ilvl w:val="0"/>
+          <w:numId w:val="121"/>
+        </w:numPr>
+        <w:spacing w:lineRule="auto"/>
+      </w:pPr>
+      <w:r>
+        <w:rPr/>
+        <w:t xml:space="preserve">Codigo.js::doGet()</w:t>
+      </w:r>
+      <w:r>
+        <w:rPr/>
+        <w:t xml:space="preserve">: </w:t>
+      </w:r>
+      <w:r>
+        <w:rPr/>
+        <w:t xml:space="preserve">template.userEmail = userEmail;</w:t>
+      </w:r>
+      <w:r>
+        <w:rPr/>
+        <w:t xml:space="preserve"> — email disponible de forma síncrona en el template servido.</w:t>
+      </w:r>
+    </w:p>
+    <w:p>
+      <w:pPr>
+        <w:numPr>
+          <w:ilvl w:val="0"/>
+          <w:numId w:val="121"/>
+        </w:numPr>
+        <w:spacing w:lineRule="auto"/>
+      </w:pPr>
+      <w:r>
+        <w:rPr/>
+        <w:t xml:space="preserve">Index.html</w:t>
+      </w:r>
+      <w:r>
+        <w:rPr/>
+        <w:t xml:space="preserve"> (antes de </w:t>
+      </w:r>
+      <w:r>
+        <w:rPr/>
+        <w:t xml:space="preserve">include('app_core_js')</w:t>
+      </w:r>
+      <w:r>
+        <w:rPr/>
+        <w:t xml:space="preserve">): </w:t>
+      </w:r>
+      <w:r>
+        <w:rPr/>
+        <w:t xml:space="preserve">const CURRENT_USER_EMAIL = &lt;?!= JSON.stringify(userEmail) ?&gt;;</w:t>
+      </w:r>
+      <w:r>
+        <w:rPr/>
+        <w:t xml:space="preserve">.</w:t>
+      </w:r>
+    </w:p>
+    <w:p>
+      <w:pPr>
+        <w:numPr>
+          <w:ilvl w:val="0"/>
+          <w:numId w:val="121"/>
+        </w:numPr>
+        <w:spacing w:lineRule="auto"/>
+      </w:pPr>
+      <w:r>
+        <w:rPr/>
+        <w:t xml:space="preserve">app_core_js.html::loadDashboardData()</w:t>
+      </w:r>
+      <w:r>
+        <w:rPr/>
+        <w:t xml:space="preserve">: reintroduce el pintado optimista desde </w:t>
+      </w:r>
+      <w:r>
+        <w:rPr/>
+        <w:t xml:space="preserve">localStorage</w:t>
+      </w:r>
+      <w:r>
+        <w:rPr/>
+        <w:t xml:space="preserve"> (cache-key </w:t>
+      </w:r>
+      <w:r>
+        <w:rPr/>
+        <w:t xml:space="preserve">dashboardData_&lt;email&gt;</w:t>
+      </w:r>
+      <w:r>
+        <w:rPr/>
+        <w:t xml:space="preserve">) removido en Fase 5c, ahora con namespacing real por usuario. Badge “Sincronizando…” + opacidad reducida en </w:t>
+      </w:r>
+      <w:r>
+        <w:rPr/>
+        <w:t xml:space="preserve">#matrix-wrapper</w:t>
+      </w:r>
+      <w:r>
+        <w:rPr/>
+        <w:t xml:space="preserve"> mientras se confirma con el servidor (CSS nuevo en </w:t>
+      </w:r>
+      <w:r>
+        <w:rPr/>
+        <w:t xml:space="preserve">estilos.html</w:t>
+      </w:r>
+      <w:r>
+        <w:rPr/>
+        <w:t xml:space="preserve">).</w:t>
+      </w:r>
+    </w:p>
+    <w:p>
+      <w:pPr>
+        <w:spacing w:lineRule="auto"/>
+      </w:pPr>
+      <w:r>
+        <w:rPr>
+          <w:b/>
+        </w:rPr>
+        <w:t xml:space="preserve">Revisión adversarial post-implementación (subagente independiente, sin contexto previo de la sesión) — 2 hallazgos críticos corregidos en el mismo commit, no como deuda separada:</w:t>
+      </w:r>
+    </w:p>
+    <w:p>
+      <w:pPr>
+        <w:numPr>
+          <w:ilvl w:val="0"/>
+          <w:numId w:val="122"/>
+        </w:numPr>
+        <w:spacing w:lineRule="auto"/>
+      </w:pPr>
+      <w:r>
+        <w:rPr>
+          <w:b/>
+        </w:rPr>
+        <w:t xml:space="preserve">Sin guard de concurrencia:</w:t>
+      </w:r>
+      <w:r>
+        <w:rPr/>
+        <w:t xml:space="preserve">loadDashboardData()</w:t>
+      </w:r>
+      <w:r>
+        <w:rPr/>
+        <w:t xml:space="preserve"> se invoca desde ~7 sitios (</w:t>
+      </w:r>
+      <w:r>
+        <w:rPr/>
+        <w:t xml:space="preserve">app_matriz_js.html</w:t>
+      </w:r>
+      <w:r>
+        <w:rPr/>
+        <w:t xml:space="preserve">) sin ningún mecanismo que garantizara que la respuesta más reciente ganara. Una respuesta desordenada podía pisar el DOM </w:t>
+      </w:r>
+      <w:r>
+        <w:rPr>
+          <w:b/>
+        </w:rPr>
+        <w:t xml:space="preserve">y</w:t>
+      </w:r>
+      <w:r>
+        <w:rPr/>
+        <w:t xml:space="preserve"> el </w:t>
+      </w:r>
+      <w:r>
+        <w:rPr/>
+        <w:t xml:space="preserve">localStorage</w:t>
+      </w:r>
+      <w:r>
+        <w:rPr/>
+        <w:t xml:space="preserve"> recién escrito por una llamada más nueva, persistiendo un dato incorrecto como “confirmado” para la siguiente carga de página — antes de este cambio esto ya era una condición de carrera latente (sin consecuencia persistente); el cacheo optimista la convertía en persistente. Corregido con un token de carga (</w:t>
+      </w:r>
+      <w:r>
+        <w:rPr/>
+        <w:t xml:space="preserve">_dashboardLoadToken</w:t>
+      </w:r>
+      <w:r>
+        <w:rPr/>
+        <w:t xml:space="preserve">) que descarta en ambos handlers (</w:t>
+      </w:r>
+      <w:r>
+        <w:rPr/>
+        <w:t xml:space="preserve">withSuccessHandler</w:t>
+      </w:r>
+      <w:r>
+        <w:rPr/>
+        <w:t xml:space="preserve">/</w:t>
+      </w:r>
+      <w:r>
+        <w:rPr/>
+        <w:t xml:space="preserve">withFailureHandler</w:t>
+      </w:r>
+      <w:r>
+        <w:rPr/>
+        <w:t xml:space="preserve">) cualquier respuesta cuya llamada ya no sea la más reciente.</w:t>
+      </w:r>
+    </w:p>
+    <w:p>
+      <w:pPr>
+        <w:numPr>
+          <w:ilvl w:val="0"/>
+          <w:numId w:val="122"/>
+        </w:numPr>
+        <w:spacing w:lineRule="auto"/>
+      </w:pPr>
+      <w:r>
+        <w:rPr>
+          <w:b/>
+        </w:rPr>
+        <w:t xml:space="preserve">Fuga cruzada vía email vacío:</w:t>
+      </w:r>
+      <w:r>
+        <w:rPr/>
+        <w:t xml:space="preserve"> si </w:t>
+      </w:r>
+      <w:r>
+        <w:rPr/>
+        <w:t xml:space="preserve">Session.getActiveUser().getEmail()</w:t>
+      </w:r>
+      <w:r>
+        <w:rPr/>
+        <w:t xml:space="preserve"> devuelve </w:t>
+      </w:r>
+      <w:r>
+        <w:rPr/>
+        <w:t xml:space="preserve">''</w:t>
+      </w:r>
+      <w:r>
+        <w:rPr/>
+        <w:t xml:space="preserve"> (posible en ciertos contextos de auth de Apps Script), la primera versión de la implementación caía en una cache-key compartida </w:t>
+      </w:r>
+      <w:r>
+        <w:rPr/>
+        <w:t xml:space="preserve">dashboardData_anon</w:t>
+      </w:r>
+      <w:r>
+        <w:rPr/>
+        <w:t xml:space="preserve">, reintroduciendo el riesgo de fuga entre usuarios que este mismo ítem buscaba cerrar. Corregido: sin </w:t>
+      </w:r>
+      <w:r>
+        <w:rPr/>
+        <w:t xml:space="preserve">CURRENT_USER_EMAIL</w:t>
+      </w:r>
+      <w:r>
+        <w:rPr/>
+        <w:t xml:space="preserve"> fiable, la ruta optimista se desactiva por completo (ni lectura ni escritura de </w:t>
+      </w:r>
+      <w:r>
+        <w:rPr/>
+        <w:t xml:space="preserve">localStorage</w:t>
+      </w:r>
+      <w:r>
+        <w:rPr/>
+        <w:t xml:space="preserve">) en vez de degradar a una llave compartida.</w:t>
+      </w:r>
+    </w:p>
+    <w:p>
+      <w:pPr>
+        <w:numPr>
+          <w:ilvl w:val="0"/>
+          <w:numId w:val="123"/>
+        </w:numPr>
+        <w:spacing w:lineRule="auto"/>
+      </w:pPr>
+      <w:r>
+        <w:rPr/>
+        <w:t xml:space="preserve">Hallazgo informativo (bajo costo, también corregido): </w:t>
+      </w:r>
+      <w:r>
+        <w:rPr/>
+        <w:t xml:space="preserve">&lt;?= userEmail ?&gt;</w:t>
+      </w:r>
+      <w:r>
+        <w:rPr/>
+        <w:t xml:space="preserve"> interpolado con comillas simples dentro de </w:t>
+      </w:r>
+      <w:r>
+        <w:rPr/>
+        <w:t xml:space="preserve">&lt;script&gt;</w:t>
+      </w:r>
+      <w:r>
+        <w:rPr/>
+        <w:t xml:space="preserve"> usa escape HTML, no escape de string JS — un apóstrofe legal en el local-part de un correo (</w:t>
+      </w:r>
+      <w:r>
+        <w:rPr/>
+        <w:t xml:space="preserve">o'brien@dominio.com</w:t>
+      </w:r>
+      <w:r>
+        <w:rPr/>
+        <w:t xml:space="preserve">) habría corrompido silenciosamente el namespacing. Reemplazado por </w:t>
+      </w:r>
+      <w:r>
+        <w:rPr/>
+        <w:t xml:space="preserve">&lt;?!= JSON.stringify(userEmail) ?&gt;</w:t>
+      </w:r>
+      <w:r>
+        <w:rPr/>
+        <w:t xml:space="preserve">.</w:t>
+      </w:r>
+    </w:p>
+    <w:p>
+      <w:pPr>
+        <w:spacing w:lineRule="auto"/>
+      </w:pPr>
+      <w:r>
+        <w:rPr>
+          <w:b/>
+        </w:rPr>
+        <w:t xml:space="preserve">Nota de proceso — </w:t>
+      </w:r>
+      <w:r>
+        <w:rPr>
+          <w:b/>
+        </w:rPr>
+        <w:t xml:space="preserve">/review</w:t>
+      </w:r>
+      <w:r>
+        <w:rPr>
+          <w:b/>
+        </w:rPr>
+        <w:t xml:space="preserve"> no aplicable en su forma estándar:</w:t>
+      </w:r>
+      <w:r>
+        <w:rPr/>
+        <w:t xml:space="preserve"> el skill </w:t>
+      </w:r>
+      <w:r>
+        <w:rPr/>
+        <w:t xml:space="preserve">/review</w:t>
+      </w:r>
+      <w:r>
+        <w:rPr/>
+        <w:t xml:space="preserve"> de gstack asume una PR contra una rama base con remoto configurado y un </w:t>
+      </w:r>
+      <w:r>
+        <w:rPr/>
+        <w:t xml:space="preserve">checklist.md</w:t>
+      </w:r>
+      <w:r>
+        <w:rPr/>
+        <w:t xml:space="preserve"> local; este repositorio no tiene remoto (</w:t>
+      </w:r>
+      <w:r>
+        <w:rPr/>
+        <w:t xml:space="preserve">git remote -v</w:t>
+      </w:r>
+      <w:r>
+        <w:rPr/>
+        <w:t xml:space="preserve"> vacío) y solo tiene una rama local (</w:t>
+      </w:r>
+      <w:r>
+        <w:rPr/>
+        <w:t xml:space="preserve">fix/qa-saveTracking-batch-lock</w:t>
+      </w:r>
+      <w:r>
+        <w:rPr/>
+        <w:t xml:space="preserve">) — no hay rama base contra la cual diferenciar, y </w:t>
+      </w:r>
+      <w:r>
+        <w:rPr/>
+        <w:t xml:space="preserve">.claude/skills/review/checklist.md</w:t>
+      </w:r>
+      <w:r>
+        <w:rPr/>
+        <w:t xml:space="preserve"> no existe en este entorno. Se sustituyó por un review adversarial dirigido (subagente </w:t>
+      </w:r>
+      <w:r>
+        <w:rPr/>
+        <w:t xml:space="preserve">general-purpose</w:t>
+      </w:r>
+      <w:r>
+        <w:rPr/>
+        <w:t xml:space="preserve"> con contexto fresco, foco explícito en condiciones de carrera y aislamiento por usuario) contra el diff real de los 4 archivos tocados, en vez de simular una ejecución del skill que no tiene las precondiciones que asume.</w:t>
+      </w:r>
+    </w:p>
+    <w:p>
+      <w:pPr>
+        <w:spacing w:lineRule="auto"/>
+      </w:pPr>
+      <w:r>
+        <w:rPr>
+          <w:b/>
+        </w:rPr>
+        <w:t xml:space="preserve">Validación y Pruebas Ejecutadas:</w:t>
+      </w:r>
+    </w:p>
+    <w:p>
+      <w:pPr>
+        <w:numPr>
+          <w:ilvl w:val="0"/>
+          <w:numId w:val="124"/>
+        </w:numPr>
+        <w:spacing w:lineRule="auto"/>
+      </w:pPr>
+      <w:r>
+        <w:rPr/>
+      </w:r>
+      <w:r>
+        <w:rPr/>
+        <w:t xml:space="preserve">npx clasp status</w:t>
+      </w:r>
+      <w:r>
+        <w:rPr/>
+        <w:t xml:space="preserve"> / </w:t>
+      </w:r>
+      <w:r>
+        <w:rPr/>
+        <w:t xml:space="preserve">npx clasp push --force</w:t>
+      </w:r>
+      <w:r>
+        <w:rPr/>
+        <w:t xml:space="preserve"> (dos veces: confirmación de que Fase 8b ya estaba desplegada, y despliegue real de este ítem — “Pushed 42 files”)</w:t>
+      </w:r>
+    </w:p>
+    <w:p>
+      <w:pPr>
+        <w:numPr>
+          <w:ilvl w:val="0"/>
+          <w:numId w:val="124"/>
+        </w:numPr>
+        <w:spacing w:lineRule="auto"/>
+      </w:pPr>
+      <w:r>
+        <w:rPr/>
+      </w:r>
+      <w:r>
+        <w:rPr/>
+        <w:t xml:space="preserve">node --check</w:t>
+      </w:r>
+      <w:r>
+        <w:rPr/>
+        <w:t xml:space="preserve"> sobre </w:t>
+      </w:r>
+      <w:r>
+        <w:rPr/>
+        <w:t xml:space="preserve">Codigo.js</w:t>
+      </w:r>
+      <w:r>
+        <w:rPr/>
+        <w:t xml:space="preserve"> directo, y sobre el contenido extraído de </w:t>
+      </w:r>
+      <w:r>
+        <w:rPr/>
+        <w:t xml:space="preserve">&lt;script&gt;</w:t>
+      </w:r>
+      <w:r>
+        <w:rPr/>
+        <w:t xml:space="preserve"> de </w:t>
+      </w:r>
+      <w:r>
+        <w:rPr/>
+        <w:t xml:space="preserve">app_core_js.html</w:t>
+      </w:r>
+      <w:r>
+        <w:rPr/>
+        <w:t xml:space="preserve"> e </w:t>
+      </w:r>
+      <w:r>
+        <w:rPr/>
+        <w:t xml:space="preserve">Index.html</w:t>
+      </w:r>
+      <w:r>
+        <w:rPr/>
+        <w:t xml:space="preserve"> (dos pasadas: antes y después de aplicar los 2 fixes críticos)</w:t>
+      </w:r>
+    </w:p>
+    <w:p>
+      <w:pPr>
+        <w:numPr>
+          <w:ilvl w:val="0"/>
+          <w:numId w:val="124"/>
+        </w:numPr>
+        <w:spacing w:lineRule="auto"/>
+      </w:pPr>
+      <w:r>
+        <w:rPr/>
+      </w:r>
+      <w:r>
+        <w:rPr/>
+        <w:t xml:space="preserve"> Revisión adversarial por subagente independiente — 4 hallazgos (2 críticos corregidos, 1 informativo corregido, 1 confirmado como no-bug: manejo de </w:t>
+      </w:r>
+      <w:r>
+        <w:rPr/>
+        <w:t xml:space="preserve">QuotaExceededError</w:t>
+      </w:r>
+      <w:r>
+        <w:rPr/>
+        <w:t xml:space="preserve">/JSON corrupto ya cubierto por los </w:t>
+      </w:r>
+      <w:r>
+        <w:rPr/>
+        <w:t xml:space="preserve">try/catch</w:t>
+      </w:r>
+      <w:r>
+        <w:rPr/>
+        <w:t xml:space="preserve"> existentes)</w:t>
+      </w:r>
+    </w:p>
+    <w:p>
+      <w:pPr>
+        <w:numPr>
+          <w:ilvl w:val="0"/>
+          <w:numId w:val="124"/>
+        </w:numPr>
+        <w:spacing w:lineRule="auto"/>
+      </w:pPr>
+      <w:r>
+        <w:rPr/>
+      </w:r>
+      <w:r>
+        <w:rPr/>
+        <w:t xml:space="preserve">TODOS.md</w:t>
+      </w:r>
+      <w:r>
+        <w:rPr/>
+        <w:t xml:space="preserve"> ítem 11 actualizado a </w:t>
+      </w:r>
+      <w:r>
+        <w:rPr/>
+        <w:t xml:space="preserve">[COMPLETADO 2026-08-12]</w:t>
+      </w:r>
+      <w:r>
+        <w:rPr/>
+        <w:t xml:space="preserve">, ítem 13 (QA visual runtime) queda como único bloqueador abierto para el cierre completo de Sprint 1</w:t>
+      </w:r>
+    </w:p>
+    <w:p>
+      <w:pPr>
+        <w:spacing w:lineRule="auto"/>
+      </w:pPr>
+      <w:r>
+        <w:rPr>
+          <w:b/>
+        </w:rPr>
+        <w:t xml:space="preserve">Impacto en Producción:</w:t>
+      </w:r>
+      <w:r>
+        <w:rPr/>
+        <w:t xml:space="preserve"> feature nueva desplegada (</w:t>
+      </w:r>
+      <w:r>
+        <w:rPr/>
+        <w:t xml:space="preserve">b1351a7</w:t>
+      </w:r>
+      <w:r>
+        <w:rPr/>
+        <w:t xml:space="preserve">, ya en </w:t>
+      </w:r>
+      <w:r>
+        <w:rPr/>
+        <w:t xml:space="preserve">@HEAD</w:t>
+      </w:r>
+      <w:r>
+        <w:rPr/>
+        <w:t xml:space="preserve"> vía </w:t>
+      </w:r>
+      <w:r>
+        <w:rPr/>
+        <w:t xml:space="preserve">clasp push</w:t>
+      </w:r>
+      <w:r>
+        <w:rPr/>
+        <w:t xml:space="preserve">) — pintado instantáneo del tablero desde caché local aislado por usuario, con revalidación de red inmediata. Sin validación visual en runtime todavía (cubierto por el ítem 13 ya existente, no uno nuevo).</w:t>
       </w:r>
     </w:p>
     <w:p>
@@ -26189,7 +26997,7 @@
       <w:pPr>
         <w:numPr>
           <w:ilvl w:val="0"/>
-          <w:numId w:val="121"/>
+          <w:numId w:val="125"/>
         </w:numPr>
         <w:spacing w:lineRule="auto"/>
       </w:pPr>
@@ -26258,7 +27066,7 @@
       <w:pPr>
         <w:numPr>
           <w:ilvl w:val="0"/>
-          <w:numId w:val="121"/>
+          <w:numId w:val="125"/>
         </w:numPr>
         <w:spacing w:lineRule="auto"/>
       </w:pPr>
@@ -26287,7 +27095,7 @@
       <w:pPr>
         <w:numPr>
           <w:ilvl w:val="0"/>
-          <w:numId w:val="121"/>
+          <w:numId w:val="125"/>
         </w:numPr>
         <w:spacing w:lineRule="auto"/>
       </w:pPr>
@@ -27641,7 +28449,7 @@
       <w:pPr>
         <w:numPr>
           <w:ilvl w:val="0"/>
-          <w:numId w:val="122"/>
+          <w:numId w:val="126"/>
         </w:numPr>
         <w:spacing w:lineRule="auto"/>
       </w:pPr>
@@ -27664,7 +28472,7 @@
       <w:pPr>
         <w:numPr>
           <w:ilvl w:val="0"/>
-          <w:numId w:val="122"/>
+          <w:numId w:val="126"/>
         </w:numPr>
         <w:spacing w:lineRule="auto"/>
       </w:pPr>
@@ -27683,7 +28491,7 @@
       <w:pPr>
         <w:numPr>
           <w:ilvl w:val="0"/>
-          <w:numId w:val="122"/>
+          <w:numId w:val="126"/>
         </w:numPr>
         <w:spacing w:lineRule="auto"/>
       </w:pPr>
@@ -27734,7 +28542,7 @@
       <w:pPr>
         <w:numPr>
           <w:ilvl w:val="0"/>
-          <w:numId w:val="122"/>
+          <w:numId w:val="126"/>
         </w:numPr>
         <w:spacing w:lineRule="auto"/>
       </w:pPr>
@@ -27775,7 +28583,7 @@
       <w:pPr>
         <w:numPr>
           <w:ilvl w:val="0"/>
-          <w:numId w:val="122"/>
+          <w:numId w:val="126"/>
         </w:numPr>
         <w:spacing w:lineRule="auto"/>
       </w:pPr>
@@ -27802,7 +28610,7 @@
       <w:pPr>
         <w:numPr>
           <w:ilvl w:val="0"/>
-          <w:numId w:val="122"/>
+          <w:numId w:val="126"/>
         </w:numPr>
         <w:spacing w:lineRule="auto"/>
       </w:pPr>
@@ -42330,6 +43138,470 @@
     </w:lvl>
   </w:abstractNum>
   <w:abstractNum w:abstractNumId="122">
+    <w:lvl w:ilvl="0">
+      <w:start w:val="1"/>
+      <w:numFmt w:val="decimal"/>
+      <w:lvlText w:val="%1."/>
+      <w:lvlJc w:val="left"/>
+      <w:pPr>
+        <w:tabs>
+          <w:tab w:val="num" w:pos="720"/>
+        </w:tabs>
+        <w:ind w:left="720" w:hanging="360"/>
+      </w:pPr>
+    </w:lvl>
+    <w:lvl w:ilvl="1">
+      <w:start w:val="1"/>
+      <w:numFmt w:val="decimal"/>
+      <w:lvlText w:val="%2."/>
+      <w:lvlJc w:val="left"/>
+      <w:pPr>
+        <w:tabs>
+          <w:tab w:val="num" w:pos="1440"/>
+        </w:tabs>
+        <w:ind w:left="1440" w:hanging="360"/>
+      </w:pPr>
+    </w:lvl>
+    <w:lvl w:ilvl="2">
+      <w:start w:val="1"/>
+      <w:numFmt w:val="decimal"/>
+      <w:lvlText w:val="%3."/>
+      <w:lvlJc w:val="left"/>
+      <w:pPr>
+        <w:tabs>
+          <w:tab w:val="num" w:pos="2160"/>
+        </w:tabs>
+        <w:ind w:left="2160" w:hanging="360"/>
+      </w:pPr>
+    </w:lvl>
+    <w:lvl w:ilvl="3">
+      <w:start w:val="1"/>
+      <w:numFmt w:val="decimal"/>
+      <w:lvlText w:val="%4."/>
+      <w:lvlJc w:val="left"/>
+      <w:pPr>
+        <w:tabs>
+          <w:tab w:val="num" w:pos="2880"/>
+        </w:tabs>
+        <w:ind w:left="2880" w:hanging="360"/>
+      </w:pPr>
+    </w:lvl>
+    <w:lvl w:ilvl="4">
+      <w:start w:val="1"/>
+      <w:numFmt w:val="decimal"/>
+      <w:lvlText w:val="%5."/>
+      <w:lvlJc w:val="left"/>
+      <w:pPr>
+        <w:tabs>
+          <w:tab w:val="num" w:pos="3600"/>
+        </w:tabs>
+        <w:ind w:left="3600" w:hanging="360"/>
+      </w:pPr>
+    </w:lvl>
+    <w:lvl w:ilvl="5">
+      <w:start w:val="1"/>
+      <w:numFmt w:val="decimal"/>
+      <w:lvlText w:val="%6."/>
+      <w:lvlJc w:val="left"/>
+      <w:pPr>
+        <w:tabs>
+          <w:tab w:val="num" w:pos="4320"/>
+        </w:tabs>
+        <w:ind w:left="4320" w:hanging="360"/>
+      </w:pPr>
+    </w:lvl>
+    <w:lvl w:ilvl="6">
+      <w:start w:val="1"/>
+      <w:numFmt w:val="decimal"/>
+      <w:lvlText w:val="%7."/>
+      <w:lvlJc w:val="left"/>
+      <w:pPr>
+        <w:tabs>
+          <w:tab w:val="num" w:pos="5040"/>
+        </w:tabs>
+        <w:ind w:left="5040" w:hanging="360"/>
+      </w:pPr>
+    </w:lvl>
+    <w:lvl w:ilvl="7">
+      <w:start w:val="1"/>
+      <w:numFmt w:val="decimal"/>
+      <w:lvlText w:val="%8."/>
+      <w:lvlJc w:val="left"/>
+      <w:pPr>
+        <w:tabs>
+          <w:tab w:val="num" w:pos="5760"/>
+        </w:tabs>
+        <w:ind w:left="5760" w:hanging="360"/>
+      </w:pPr>
+    </w:lvl>
+  </w:abstractNum>
+  <w:abstractNum w:abstractNumId="123">
+    <w:lvl w:ilvl="0">
+      <w:start w:val="1"/>
+      <w:numFmt w:val="bullet"/>
+      <w:lvlText w:val=""/>
+      <w:lvlJc w:val="left"/>
+      <w:pPr>
+        <w:tabs>
+          <w:tab w:val="num" w:pos="720"/>
+        </w:tabs>
+        <w:ind w:left="720" w:hanging="360"/>
+      </w:pPr>
+      <w:rPr>
+        <w:rFonts w:ascii="Symbol" w:hAnsi="Symbol" w:hint="default"/>
+      </w:rPr>
+    </w:lvl>
+    <w:lvl w:ilvl="1">
+      <w:start w:val="1"/>
+      <w:numFmt w:val="bullet"/>
+      <w:lvlText w:val=""/>
+      <w:lvlJc w:val="left"/>
+      <w:pPr>
+        <w:tabs>
+          <w:tab w:val="num" w:pos="1440"/>
+        </w:tabs>
+        <w:ind w:left="1440" w:hanging="360"/>
+      </w:pPr>
+      <w:rPr>
+        <w:rFonts w:ascii="Symbol" w:hAnsi="Symbol" w:hint="default"/>
+      </w:rPr>
+    </w:lvl>
+    <w:lvl w:ilvl="2">
+      <w:start w:val="1"/>
+      <w:numFmt w:val="bullet"/>
+      <w:lvlText w:val=""/>
+      <w:lvlJc w:val="left"/>
+      <w:pPr>
+        <w:tabs>
+          <w:tab w:val="num" w:pos="2160"/>
+        </w:tabs>
+        <w:ind w:left="2160" w:hanging="360"/>
+      </w:pPr>
+      <w:rPr>
+        <w:rFonts w:ascii="Symbol" w:hAnsi="Symbol" w:hint="default"/>
+      </w:rPr>
+    </w:lvl>
+    <w:lvl w:ilvl="3">
+      <w:start w:val="1"/>
+      <w:numFmt w:val="bullet"/>
+      <w:lvlText w:val=""/>
+      <w:lvlJc w:val="left"/>
+      <w:pPr>
+        <w:tabs>
+          <w:tab w:val="num" w:pos="2880"/>
+        </w:tabs>
+        <w:ind w:left="2880" w:hanging="360"/>
+      </w:pPr>
+      <w:rPr>
+        <w:rFonts w:ascii="Symbol" w:hAnsi="Symbol" w:hint="default"/>
+      </w:rPr>
+    </w:lvl>
+    <w:lvl w:ilvl="4">
+      <w:start w:val="1"/>
+      <w:numFmt w:val="bullet"/>
+      <w:lvlText w:val=""/>
+      <w:lvlJc w:val="left"/>
+      <w:pPr>
+        <w:tabs>
+          <w:tab w:val="num" w:pos="3600"/>
+        </w:tabs>
+        <w:ind w:left="3600" w:hanging="360"/>
+      </w:pPr>
+      <w:rPr>
+        <w:rFonts w:ascii="Symbol" w:hAnsi="Symbol" w:hint="default"/>
+      </w:rPr>
+    </w:lvl>
+    <w:lvl w:ilvl="5">
+      <w:start w:val="1"/>
+      <w:numFmt w:val="bullet"/>
+      <w:lvlText w:val=""/>
+      <w:lvlJc w:val="left"/>
+      <w:pPr>
+        <w:tabs>
+          <w:tab w:val="num" w:pos="4320"/>
+        </w:tabs>
+        <w:ind w:left="4320" w:hanging="360"/>
+      </w:pPr>
+      <w:rPr>
+        <w:rFonts w:ascii="Symbol" w:hAnsi="Symbol" w:hint="default"/>
+      </w:rPr>
+    </w:lvl>
+    <w:lvl w:ilvl="6">
+      <w:start w:val="1"/>
+      <w:numFmt w:val="bullet"/>
+      <w:lvlText w:val=""/>
+      <w:lvlJc w:val="left"/>
+      <w:pPr>
+        <w:tabs>
+          <w:tab w:val="num" w:pos="5040"/>
+        </w:tabs>
+        <w:ind w:left="5040" w:hanging="360"/>
+      </w:pPr>
+      <w:rPr>
+        <w:rFonts w:ascii="Symbol" w:hAnsi="Symbol" w:hint="default"/>
+      </w:rPr>
+    </w:lvl>
+    <w:lvl w:ilvl="7">
+      <w:start w:val="1"/>
+      <w:numFmt w:val="bullet"/>
+      <w:lvlText w:val=""/>
+      <w:lvlJc w:val="left"/>
+      <w:pPr>
+        <w:tabs>
+          <w:tab w:val="num" w:pos="5760"/>
+        </w:tabs>
+        <w:ind w:left="5760" w:hanging="360"/>
+      </w:pPr>
+      <w:rPr>
+        <w:rFonts w:ascii="Symbol" w:hAnsi="Symbol" w:hint="default"/>
+      </w:rPr>
+    </w:lvl>
+  </w:abstractNum>
+  <w:abstractNum w:abstractNumId="124">
+    <w:lvl w:ilvl="0">
+      <w:start w:val="1"/>
+      <w:numFmt w:val="bullet"/>
+      <w:lvlText w:val=""/>
+      <w:lvlJc w:val="left"/>
+      <w:pPr>
+        <w:tabs>
+          <w:tab w:val="num" w:pos="720"/>
+        </w:tabs>
+        <w:ind w:left="720" w:hanging="360"/>
+      </w:pPr>
+      <w:rPr>
+        <w:rFonts w:ascii="Symbol" w:hAnsi="Symbol" w:hint="default"/>
+      </w:rPr>
+    </w:lvl>
+    <w:lvl w:ilvl="1">
+      <w:start w:val="1"/>
+      <w:numFmt w:val="bullet"/>
+      <w:lvlText w:val=""/>
+      <w:lvlJc w:val="left"/>
+      <w:pPr>
+        <w:tabs>
+          <w:tab w:val="num" w:pos="1440"/>
+        </w:tabs>
+        <w:ind w:left="1440" w:hanging="360"/>
+      </w:pPr>
+      <w:rPr>
+        <w:rFonts w:ascii="Symbol" w:hAnsi="Symbol" w:hint="default"/>
+      </w:rPr>
+    </w:lvl>
+    <w:lvl w:ilvl="2">
+      <w:start w:val="1"/>
+      <w:numFmt w:val="bullet"/>
+      <w:lvlText w:val=""/>
+      <w:lvlJc w:val="left"/>
+      <w:pPr>
+        <w:tabs>
+          <w:tab w:val="num" w:pos="2160"/>
+        </w:tabs>
+        <w:ind w:left="2160" w:hanging="360"/>
+      </w:pPr>
+      <w:rPr>
+        <w:rFonts w:ascii="Symbol" w:hAnsi="Symbol" w:hint="default"/>
+      </w:rPr>
+    </w:lvl>
+    <w:lvl w:ilvl="3">
+      <w:start w:val="1"/>
+      <w:numFmt w:val="bullet"/>
+      <w:lvlText w:val=""/>
+      <w:lvlJc w:val="left"/>
+      <w:pPr>
+        <w:tabs>
+          <w:tab w:val="num" w:pos="2880"/>
+        </w:tabs>
+        <w:ind w:left="2880" w:hanging="360"/>
+      </w:pPr>
+      <w:rPr>
+        <w:rFonts w:ascii="Symbol" w:hAnsi="Symbol" w:hint="default"/>
+      </w:rPr>
+    </w:lvl>
+    <w:lvl w:ilvl="4">
+      <w:start w:val="1"/>
+      <w:numFmt w:val="bullet"/>
+      <w:lvlText w:val=""/>
+      <w:lvlJc w:val="left"/>
+      <w:pPr>
+        <w:tabs>
+          <w:tab w:val="num" w:pos="3600"/>
+        </w:tabs>
+        <w:ind w:left="3600" w:hanging="360"/>
+      </w:pPr>
+      <w:rPr>
+        <w:rFonts w:ascii="Symbol" w:hAnsi="Symbol" w:hint="default"/>
+      </w:rPr>
+    </w:lvl>
+    <w:lvl w:ilvl="5">
+      <w:start w:val="1"/>
+      <w:numFmt w:val="bullet"/>
+      <w:lvlText w:val=""/>
+      <w:lvlJc w:val="left"/>
+      <w:pPr>
+        <w:tabs>
+          <w:tab w:val="num" w:pos="4320"/>
+        </w:tabs>
+        <w:ind w:left="4320" w:hanging="360"/>
+      </w:pPr>
+      <w:rPr>
+        <w:rFonts w:ascii="Symbol" w:hAnsi="Symbol" w:hint="default"/>
+      </w:rPr>
+    </w:lvl>
+    <w:lvl w:ilvl="6">
+      <w:start w:val="1"/>
+      <w:numFmt w:val="bullet"/>
+      <w:lvlText w:val=""/>
+      <w:lvlJc w:val="left"/>
+      <w:pPr>
+        <w:tabs>
+          <w:tab w:val="num" w:pos="5040"/>
+        </w:tabs>
+        <w:ind w:left="5040" w:hanging="360"/>
+      </w:pPr>
+      <w:rPr>
+        <w:rFonts w:ascii="Symbol" w:hAnsi="Symbol" w:hint="default"/>
+      </w:rPr>
+    </w:lvl>
+    <w:lvl w:ilvl="7">
+      <w:start w:val="1"/>
+      <w:numFmt w:val="bullet"/>
+      <w:lvlText w:val=""/>
+      <w:lvlJc w:val="left"/>
+      <w:pPr>
+        <w:tabs>
+          <w:tab w:val="num" w:pos="5760"/>
+        </w:tabs>
+        <w:ind w:left="5760" w:hanging="360"/>
+      </w:pPr>
+      <w:rPr>
+        <w:rFonts w:ascii="Symbol" w:hAnsi="Symbol" w:hint="default"/>
+      </w:rPr>
+    </w:lvl>
+  </w:abstractNum>
+  <w:abstractNum w:abstractNumId="125">
+    <w:lvl w:ilvl="0">
+      <w:start w:val="1"/>
+      <w:numFmt w:val="bullet"/>
+      <w:lvlText w:val=""/>
+      <w:lvlJc w:val="left"/>
+      <w:pPr>
+        <w:tabs>
+          <w:tab w:val="num" w:pos="720"/>
+        </w:tabs>
+        <w:ind w:left="720" w:hanging="360"/>
+      </w:pPr>
+      <w:rPr>
+        <w:rFonts w:ascii="Symbol" w:hAnsi="Symbol" w:hint="default"/>
+      </w:rPr>
+    </w:lvl>
+    <w:lvl w:ilvl="1">
+      <w:start w:val="1"/>
+      <w:numFmt w:val="bullet"/>
+      <w:lvlText w:val=""/>
+      <w:lvlJc w:val="left"/>
+      <w:pPr>
+        <w:tabs>
+          <w:tab w:val="num" w:pos="1440"/>
+        </w:tabs>
+        <w:ind w:left="1440" w:hanging="360"/>
+      </w:pPr>
+      <w:rPr>
+        <w:rFonts w:ascii="Symbol" w:hAnsi="Symbol" w:hint="default"/>
+      </w:rPr>
+    </w:lvl>
+    <w:lvl w:ilvl="2">
+      <w:start w:val="1"/>
+      <w:numFmt w:val="bullet"/>
+      <w:lvlText w:val=""/>
+      <w:lvlJc w:val="left"/>
+      <w:pPr>
+        <w:tabs>
+          <w:tab w:val="num" w:pos="2160"/>
+        </w:tabs>
+        <w:ind w:left="2160" w:hanging="360"/>
+      </w:pPr>
+      <w:rPr>
+        <w:rFonts w:ascii="Symbol" w:hAnsi="Symbol" w:hint="default"/>
+      </w:rPr>
+    </w:lvl>
+    <w:lvl w:ilvl="3">
+      <w:start w:val="1"/>
+      <w:numFmt w:val="bullet"/>
+      <w:lvlText w:val=""/>
+      <w:lvlJc w:val="left"/>
+      <w:pPr>
+        <w:tabs>
+          <w:tab w:val="num" w:pos="2880"/>
+        </w:tabs>
+        <w:ind w:left="2880" w:hanging="360"/>
+      </w:pPr>
+      <w:rPr>
+        <w:rFonts w:ascii="Symbol" w:hAnsi="Symbol" w:hint="default"/>
+      </w:rPr>
+    </w:lvl>
+    <w:lvl w:ilvl="4">
+      <w:start w:val="1"/>
+      <w:numFmt w:val="bullet"/>
+      <w:lvlText w:val=""/>
+      <w:lvlJc w:val="left"/>
+      <w:pPr>
+        <w:tabs>
+          <w:tab w:val="num" w:pos="3600"/>
+        </w:tabs>
+        <w:ind w:left="3600" w:hanging="360"/>
+      </w:pPr>
+      <w:rPr>
+        <w:rFonts w:ascii="Symbol" w:hAnsi="Symbol" w:hint="default"/>
+      </w:rPr>
+    </w:lvl>
+    <w:lvl w:ilvl="5">
+      <w:start w:val="1"/>
+      <w:numFmt w:val="bullet"/>
+      <w:lvlText w:val=""/>
+      <w:lvlJc w:val="left"/>
+      <w:pPr>
+        <w:tabs>
+          <w:tab w:val="num" w:pos="4320"/>
+        </w:tabs>
+        <w:ind w:left="4320" w:hanging="360"/>
+      </w:pPr>
+      <w:rPr>
+        <w:rFonts w:ascii="Symbol" w:hAnsi="Symbol" w:hint="default"/>
+      </w:rPr>
+    </w:lvl>
+    <w:lvl w:ilvl="6">
+      <w:start w:val="1"/>
+      <w:numFmt w:val="bullet"/>
+      <w:lvlText w:val=""/>
+      <w:lvlJc w:val="left"/>
+      <w:pPr>
+        <w:tabs>
+          <w:tab w:val="num" w:pos="5040"/>
+        </w:tabs>
+        <w:ind w:left="5040" w:hanging="360"/>
+      </w:pPr>
+      <w:rPr>
+        <w:rFonts w:ascii="Symbol" w:hAnsi="Symbol" w:hint="default"/>
+      </w:rPr>
+    </w:lvl>
+    <w:lvl w:ilvl="7">
+      <w:start w:val="1"/>
+      <w:numFmt w:val="bullet"/>
+      <w:lvlText w:val=""/>
+      <w:lvlJc w:val="left"/>
+      <w:pPr>
+        <w:tabs>
+          <w:tab w:val="num" w:pos="5760"/>
+        </w:tabs>
+        <w:ind w:left="5760" w:hanging="360"/>
+      </w:pPr>
+      <w:rPr>
+        <w:rFonts w:ascii="Symbol" w:hAnsi="Symbol" w:hint="default"/>
+      </w:rPr>
+    </w:lvl>
+  </w:abstractNum>
+  <w:abstractNum w:abstractNumId="126">
     <w:lvl w:ilvl="0">
       <w:start w:val="1"/>
       <w:numFmt w:val="decimal"/>
@@ -42793,6 +44065,18 @@
   <w:num w:numId="122">
     <w:abstractNumId w:val="122"/>
   </w:num>
+  <w:num w:numId="123">
+    <w:abstractNumId w:val="123"/>
+  </w:num>
+  <w:num w:numId="124">
+    <w:abstractNumId w:val="124"/>
+  </w:num>
+  <w:num w:numId="125">
+    <w:abstractNumId w:val="125"/>
+  </w:num>
+  <w:num w:numId="126">
+    <w:abstractNumId w:val="126"/>
+  </w:num>
 </w:numbering>
 </file>
 

</xml_diff>